<commit_message>
docs(value-policy): regenerate spec docx and fix snapshot alert contract
Regenerate both formal spec DOCX files from Markdown with pandoc and
verify the implemented/blocked status plus the two-Phase-1 distinction.
Document the unlabeled committed-order PromQL and the --since audit window.
</commit_message>
<xml_diff>
--- a/docs/specs/points-value-policy-phase-1.docx
+++ b/docs/specs/points-value-policy-phase-1.docx
@@ -6,7 +6,7 @@
       <w:pPr>
         <w:pStyle w:val="Heading1"/>
       </w:pPr>
-      <w:bookmarkStart w:name="speccny-价值政策与订单定价快照phase-1" w:id="20"/>
+      <w:bookmarkStart w:id="20" w:name="speccny-价值政策与订单定价快照phase-1"/>
       <w:r>
         <w:t xml:space="preserve">Spec：CNY 价值政策与订单定价快照（Phase 1）</w:t>
       </w:r>
@@ -15,12 +15,14 @@
     <w:tbl>
       <w:tblPr>
         <w:tblStyle w:val="Table"/>
-        <w:tblW w:w="5000" w:type="pct"/>
-        <w:tblLook w:val="04A0"/>
+        <w:tblW w:type="pct" w:w="0.0"/>
+        <w:tblLook w:firstRow="1"/>
       </w:tblPr>
       <w:tblGrid/>
       <w:tr>
-        <w:trPr/>
+        <w:trPr>
+          <w:cnfStyle w:firstRow="1"/>
+        </w:trPr>
         <w:tc>
           <w:tcPr>
             <w:tcBorders>
@@ -123,7 +125,7 @@
               <w:jc w:val="left"/>
             </w:pPr>
             <w:r>
-              <w:t xml:space="preserve">2026-08-17</w:t>
+              <w:t xml:space="preserve">2026-08-18</w:t>
             </w:r>
           </w:p>
         </w:tc>
@@ -147,7 +149,7 @@
               <w:jc w:val="left"/>
             </w:pPr>
             <w:r>
-              <w:t xml:space="preserve">Ready for Implementation — Production Activation Blocked by D-02</w:t>
+              <w:t xml:space="preserve">Implemented — Production Activation Blocked by D-02/D-03</w:t>
             </w:r>
           </w:p>
         </w:tc>
@@ -201,7 +203,37 @@
               <w:rPr>
                 <w:rStyle w:val="VerbatimChar"/>
               </w:rPr>
-              <w:t xml:space="preserve">origin/develop@46253bc</w:t>
+              <w:t xml:space="preserve">origin/develop@c6d21bb</w:t>
+            </w:r>
+            <w:r>
+              <w:t xml:space="preserve">（PR #144 squash merge）</w:t>
+            </w:r>
+          </w:p>
+        </w:tc>
+      </w:tr>
+      <w:tr>
+        <w:tc>
+          <w:p>
+            <w:pPr>
+              <w:pStyle w:val="Compact"/>
+              <w:jc w:val="left"/>
+            </w:pPr>
+            <w:r>
+              <w:t xml:space="preserve">Closure 分支</w:t>
+            </w:r>
+          </w:p>
+        </w:tc>
+        <w:tc>
+          <w:p>
+            <w:pPr>
+              <w:pStyle w:val="Compact"/>
+              <w:jc w:val="left"/>
+            </w:pPr>
+            <w:r>
+              <w:rPr>
+                <w:rStyle w:val="VerbatimChar"/>
+              </w:rPr>
+              <w:t xml:space="preserve">feat/cny-value-policy-phase-1-closure</w:t>
             </w:r>
           </w:p>
         </w:tc>
@@ -297,7 +329,7 @@
       <w:pPr>
         <w:pStyle w:val="Heading2"/>
       </w:pPr>
-      <w:bookmarkStart w:name="X8bdf336b6fd2404de374dec908efa455727feeb" w:id="21"/>
+      <w:bookmarkStart w:id="21" w:name="已冻结决策"/>
       <w:r>
         <w:t xml:space="preserve">0. 已冻结决策</w:t>
       </w:r>
@@ -307,7 +339,7 @@
       <w:pPr>
         <w:pStyle w:val="Heading3"/>
       </w:pPr>
-      <w:bookmarkStart w:name="X7a330a5b93fcbde18d4249b3e5dc37092f744e6" w:id="22"/>
+      <w:bookmarkStart w:id="22" w:name="已批准"/>
       <w:r>
         <w:t xml:space="preserve">0.1 已批准</w:t>
       </w:r>
@@ -316,12 +348,14 @@
     <w:tbl>
       <w:tblPr>
         <w:tblStyle w:val="Table"/>
-        <w:tblW w:w="5000" w:type="pct"/>
-        <w:tblLook w:val="04A0"/>
+        <w:tblW w:type="pct" w:w="0.0"/>
+        <w:tblLook w:firstRow="1"/>
       </w:tblPr>
       <w:tblGrid/>
       <w:tr>
-        <w:trPr/>
+        <w:trPr>
+          <w:cnfStyle w:firstRow="1"/>
+        </w:trPr>
         <w:tc>
           <w:tcPr>
             <w:tcBorders>
@@ -550,7 +584,10 @@
               <w:jc w:val="left"/>
             </w:pPr>
             <w:r>
-              <w:t xml:space="preserve">保留现有 </w:t>
+              <w:t xml:space="preserve">保留现有</w:t>
+            </w:r>
+            <w:r>
+              <w:t xml:space="preserve"> </w:t>
             </w:r>
             <w:r>
               <w:rPr>
@@ -559,7 +596,10 @@
               <w:t xml:space="preserve">price: number</w:t>
             </w:r>
             <w:r>
-              <w:t xml:space="preserve"> 与旧积分扣减链路；新增字段采用加法式兼容</w:t>
+              <w:t xml:space="preserve"> </w:t>
+            </w:r>
+            <w:r>
+              <w:t xml:space="preserve">与旧积分扣减链路；新增字段采用加法式兼容</w:t>
             </w:r>
           </w:p>
         </w:tc>
@@ -569,7 +609,7 @@
       <w:pPr>
         <w:pStyle w:val="Heading3"/>
       </w:pPr>
-      <w:bookmarkStart w:name="X03d4bd81c6817597a516fea90e71d3155c93d46" w:id="23"/>
+      <w:bookmarkStart w:id="23" w:name="仍待批准"/>
       <w:r>
         <w:t xml:space="preserve">0.2 仍待批准</w:t>
       </w:r>
@@ -578,12 +618,14 @@
     <w:tbl>
       <w:tblPr>
         <w:tblStyle w:val="Table"/>
-        <w:tblW w:w="5000" w:type="pct"/>
-        <w:tblLook w:val="04A0"/>
+        <w:tblW w:type="pct" w:w="0.0"/>
+        <w:tblLook w:firstRow="1"/>
       </w:tblPr>
       <w:tblGrid/>
       <w:tr>
-        <w:trPr/>
+        <w:trPr>
+          <w:cnfStyle w:firstRow="1"/>
+        </w:trPr>
         <w:tc>
           <w:tcPr>
             <w:tcBorders>
@@ -732,7 +774,13 @@
               <w:jc w:val="left"/>
             </w:pPr>
             <w:r>
-              <w:t xml:space="preserve">“参考价值，不代表现金赎回承诺”</w:t>
+              <w:t xml:space="preserve">“</w:t>
+            </w:r>
+            <w:r>
+              <w:t xml:space="preserve">参考价值，不代表现金赎回承诺</w:t>
+            </w:r>
+            <w:r>
+              <w:t xml:space="preserve">”</w:t>
             </w:r>
           </w:p>
         </w:tc>
@@ -754,14 +802,37 @@
         <w:pStyle w:val="BodyText"/>
       </w:pPr>
       <w:r>
-        <w:t xml:space="preserve">代码实现可以开始，但生产激活必须等待 D-02。任何 Agent 都不得把候选比例写成代码常量、默认配置或不可撤销的生产 seed。</w:t>
+        <w:t xml:space="preserve">Phase 1 工程实现已完成，但生产激活必须等待 D-02 与 D-03。任何 Agent 都不得把候选比例写成代码常量、默认配置或不可撤销的生产 seed。</w:t>
+      </w:r>
+    </w:p>
+    <w:p>
+      <w:pPr>
+        <w:pStyle w:val="BodyText"/>
+      </w:pPr>
+      <w:r>
+        <w:t xml:space="preserve">这不是</w:t>
+      </w:r>
+      <w:r>
+        <w:t xml:space="preserve"> </w:t>
+      </w:r>
+      <w:r>
+        <w:rPr>
+          <w:rStyle w:val="VerbatimChar"/>
+        </w:rPr>
+        <w:t xml:space="preserve">SPEC-VALUE-LEDGER-001</w:t>
+      </w:r>
+      <w:r>
+        <w:t xml:space="preserve"> </w:t>
+      </w:r>
+      <w:r>
+        <w:t xml:space="preserve">的大 Phase 1（ledger / lot / 双写）。账本规格后续阶段仍未实施。</w:t>
       </w:r>
     </w:p>
     <w:p>
       <w:pPr>
         <w:pStyle w:val="Heading2"/>
       </w:pPr>
-      <w:bookmarkStart w:name="X662d4400b9c2123b441e8dde308a9af7e4d9bca" w:id="24"/>
+      <w:bookmarkStart w:id="24" w:name="目标"/>
       <w:r>
         <w:t xml:space="preserve">1. 目标</w:t>
       </w:r>
@@ -777,14 +848,17 @@
     </w:p>
     <w:p>
       <w:pPr>
-        <w:pStyle w:val="Compact"/>
         <w:numPr>
           <w:ilvl w:val="0"/>
           <w:numId w:val="1001"/>
         </w:numPr>
-      </w:pPr>
-      <w:r>
-        <w:t xml:space="preserve">用不可变、版本化的 </w:t>
+        <w:pStyle w:val="Compact"/>
+      </w:pPr>
+      <w:r>
+        <w:t xml:space="preserve">用不可变、版本化的</w:t>
+      </w:r>
+      <w:r>
+        <w:t xml:space="preserve"> </w:t>
       </w:r>
       <w:r>
         <w:rPr>
@@ -793,16 +867,19 @@
         <w:t xml:space="preserve">ValuePolicy</w:t>
       </w:r>
       <w:r>
-        <w:t xml:space="preserve"> 表达积分和 CNY 的固定关系；</w:t>
-      </w:r>
-    </w:p>
-    <w:p>
-      <w:pPr>
-        <w:pStyle w:val="Compact"/>
+        <w:t xml:space="preserve"> </w:t>
+      </w:r>
+      <w:r>
+        <w:t xml:space="preserve">表达积分和 CNY 的固定关系；</w:t>
+      </w:r>
+    </w:p>
+    <w:p>
+      <w:pPr>
         <w:numPr>
           <w:ilvl w:val="0"/>
           <w:numId w:val="1001"/>
         </w:numPr>
+        <w:pStyle w:val="Compact"/>
       </w:pPr>
       <w:r>
         <w:t xml:space="preserve">使用 BigInt 有理数完成积分到 CNY 原子单位的确定性换算；</w:t>
@@ -810,11 +887,11 @@
     </w:p>
     <w:p>
       <w:pPr>
-        <w:pStyle w:val="Compact"/>
         <w:numPr>
           <w:ilvl w:val="0"/>
           <w:numId w:val="1001"/>
         </w:numPr>
+        <w:pStyle w:val="Compact"/>
       </w:pPr>
       <w:r>
         <w:t xml:space="preserve">在 checkout preview 返回积分价格、CNY 参考价值和政策 ID；</w:t>
@@ -822,11 +899,11 @@
     </w:p>
     <w:p>
       <w:pPr>
-        <w:pStyle w:val="Compact"/>
         <w:numPr>
           <w:ilvl w:val="0"/>
           <w:numId w:val="1001"/>
         </w:numPr>
+        <w:pStyle w:val="Compact"/>
       </w:pPr>
       <w:r>
         <w:t xml:space="preserve">在订单确认事务内重新解析政策、校验客户端政策 ID，并保存定价快照；</w:t>
@@ -834,11 +911,11 @@
     </w:p>
     <w:p>
       <w:pPr>
-        <w:pStyle w:val="Compact"/>
         <w:numPr>
           <w:ilvl w:val="0"/>
           <w:numId w:val="1001"/>
         </w:numPr>
+        <w:pStyle w:val="Compact"/>
       </w:pPr>
       <w:r>
         <w:t xml:space="preserve">保证后续政策变化不会改变既有订单的参考价值；</w:t>
@@ -846,11 +923,11 @@
     </w:p>
     <w:p>
       <w:pPr>
-        <w:pStyle w:val="Compact"/>
         <w:numPr>
           <w:ilvl w:val="0"/>
           <w:numId w:val="1001"/>
         </w:numPr>
+        <w:pStyle w:val="Compact"/>
       </w:pPr>
       <w:r>
         <w:t xml:space="preserve">在功能关闭时保持当前积分、订单、Settlement 和前端契约不变。</w:t>
@@ -860,7 +937,7 @@
       <w:pPr>
         <w:pStyle w:val="Heading2"/>
       </w:pPr>
-      <w:bookmarkStart w:name="X1ea5d00b406c768a32e5d2c1db73f1fb0f6105c" w:id="25"/>
+      <w:bookmarkStart w:id="25" w:name="非目标"/>
       <w:r>
         <w:t xml:space="preserve">2. 非目标</w:t>
       </w:r>
@@ -876,11 +953,11 @@
     </w:p>
     <w:p>
       <w:pPr>
-        <w:pStyle w:val="Compact"/>
         <w:numPr>
           <w:ilvl w:val="0"/>
           <w:numId w:val="1002"/>
         </w:numPr>
+        <w:pStyle w:val="Compact"/>
       </w:pPr>
       <w:r>
         <w:t xml:space="preserve">新双重记账 ledger、lot、RP/VC/XP 拆分；</w:t>
@@ -888,11 +965,11 @@
     </w:p>
     <w:p>
       <w:pPr>
-        <w:pStyle w:val="Compact"/>
         <w:numPr>
           <w:ilvl w:val="0"/>
           <w:numId w:val="1002"/>
         </w:numPr>
+        <w:pStyle w:val="Compact"/>
       </w:pPr>
       <w:r>
         <w:t xml:space="preserve">CNY、USD 或 USDT 充值与真实付款；</w:t>
@@ -900,14 +977,17 @@
     </w:p>
     <w:p>
       <w:pPr>
-        <w:pStyle w:val="Compact"/>
         <w:numPr>
           <w:ilvl w:val="0"/>
           <w:numId w:val="1002"/>
         </w:numPr>
-      </w:pPr>
-      <w:r>
-        <w:t xml:space="preserve">实时 FX 服务或 </w:t>
+        <w:pStyle w:val="Compact"/>
+      </w:pPr>
+      <w:r>
+        <w:t xml:space="preserve">实时 FX 服务或</w:t>
+      </w:r>
+      <w:r>
+        <w:t xml:space="preserve"> </w:t>
       </w:r>
       <w:r>
         <w:rPr>
@@ -916,16 +996,19 @@
         <w:t xml:space="preserve">FxQuote</w:t>
       </w:r>
       <w:r>
-        <w:t xml:space="preserve"> 数据表；</w:t>
-      </w:r>
-    </w:p>
-    <w:p>
-      <w:pPr>
-        <w:pStyle w:val="Compact"/>
+        <w:t xml:space="preserve"> </w:t>
+      </w:r>
+      <w:r>
+        <w:t xml:space="preserve">数据表；</w:t>
+      </w:r>
+    </w:p>
+    <w:p>
+      <w:pPr>
         <w:numPr>
           <w:ilvl w:val="0"/>
           <w:numId w:val="1002"/>
         </w:numPr>
+        <w:pStyle w:val="Compact"/>
       </w:pPr>
       <w:r>
         <w:t xml:space="preserve">用户转账、提现、现金赎回；</w:t>
@@ -933,11 +1016,11 @@
     </w:p>
     <w:p>
       <w:pPr>
-        <w:pStyle w:val="Compact"/>
         <w:numPr>
           <w:ilvl w:val="0"/>
           <w:numId w:val="1002"/>
         </w:numPr>
+        <w:pStyle w:val="Compact"/>
       </w:pPr>
       <w:r>
         <w:t xml:space="preserve">商家法币或稳定币出款；</w:t>
@@ -945,14 +1028,17 @@
     </w:p>
     <w:p>
       <w:pPr>
-        <w:pStyle w:val="Compact"/>
         <w:numPr>
           <w:ilvl w:val="0"/>
           <w:numId w:val="1002"/>
         </w:numPr>
-      </w:pPr>
-      <w:r>
-        <w:t xml:space="preserve">修改当前 </w:t>
+        <w:pStyle w:val="Compact"/>
+      </w:pPr>
+      <w:r>
+        <w:t xml:space="preserve">修改当前</w:t>
+      </w:r>
+      <w:r>
+        <w:t xml:space="preserve"> </w:t>
       </w:r>
       <w:r>
         <w:rPr>
@@ -970,16 +1056,19 @@
         <w:t xml:space="preserve">PointLog</w:t>
       </w:r>
       <w:r>
-        <w:t xml:space="preserve"> 的权威写入语义；</w:t>
-      </w:r>
-    </w:p>
-    <w:p>
-      <w:pPr>
-        <w:pStyle w:val="Compact"/>
+        <w:t xml:space="preserve"> </w:t>
+      </w:r>
+      <w:r>
+        <w:t xml:space="preserve">的权威写入语义；</w:t>
+      </w:r>
+    </w:p>
+    <w:p>
+      <w:pPr>
         <w:numPr>
           <w:ilvl w:val="0"/>
           <w:numId w:val="1002"/>
         </w:numPr>
+        <w:pStyle w:val="Compact"/>
       </w:pPr>
       <w:r>
         <w:t xml:space="preserve">修改会员成长、排行榜或商家 Settlement 计算；</w:t>
@@ -987,11 +1076,11 @@
     </w:p>
     <w:p>
       <w:pPr>
-        <w:pStyle w:val="Compact"/>
         <w:numPr>
           <w:ilvl w:val="0"/>
           <w:numId w:val="1002"/>
         </w:numPr>
+        <w:pStyle w:val="Compact"/>
       </w:pPr>
       <w:r>
         <w:t xml:space="preserve">多租户模型。README 已明确 multi-tenant white-label SaaS 不在当前产品边界内；本阶段按单一平台作用域实现。</w:t>
@@ -1001,7 +1090,7 @@
       <w:pPr>
         <w:pStyle w:val="Heading2"/>
       </w:pPr>
-      <w:bookmarkStart w:name="X44e37b3a9c9545750fe7ae417192f8508c7a844" w:id="26"/>
+      <w:bookmarkStart w:id="26" w:name="当前代码事实与修改边界"/>
       <w:r>
         <w:t xml:space="preserve">3. 当前代码事实与修改边界</w:t>
       </w:r>
@@ -1010,12 +1099,18 @@
     <w:tbl>
       <w:tblPr>
         <w:tblStyle w:val="Table"/>
-        <w:tblW w:w="5000" w:type="pct"/>
-        <w:tblLook w:val="04A0"/>
+        <w:tblW w:type="pct" w:w="5000.0"/>
+        <w:tblLook w:firstRow="1"/>
       </w:tblPr>
-      <w:tblGrid/>
+      <w:tblGrid>
+        <w:gridCol w:w="2640"/>
+        <w:gridCol w:w="2640"/>
+        <w:gridCol w:w="2640"/>
+      </w:tblGrid>
       <w:tr>
-        <w:trPr/>
+        <w:trPr>
+          <w:cnfStyle w:firstRow="1"/>
+        </w:trPr>
         <w:tc>
           <w:tcPr>
             <w:tcBorders>
@@ -1076,7 +1171,10 @@
               <w:jc w:val="left"/>
             </w:pPr>
             <w:r>
-              <w:t xml:space="preserve">可用/冻结积分为 </w:t>
+              <w:t xml:space="preserve">可用/冻结积分为</w:t>
+            </w:r>
+            <w:r>
+              <w:t xml:space="preserve"> </w:t>
             </w:r>
             <w:r>
               <w:rPr>
@@ -1120,7 +1218,10 @@
               <w:jc w:val="left"/>
             </w:pPr>
             <w:r>
-              <w:t xml:space="preserve">SKU 价格为 </w:t>
+              <w:t xml:space="preserve">SKU 价格为</w:t>
+            </w:r>
+            <w:r>
+              <w:t xml:space="preserve"> </w:t>
             </w:r>
             <w:r>
               <w:rPr>
@@ -1164,7 +1265,10 @@
               <w:jc w:val="left"/>
             </w:pPr>
             <w:r>
-              <w:t xml:space="preserve">checkout preview 返回 </w:t>
+              <w:t xml:space="preserve">checkout preview 返回</w:t>
+            </w:r>
+            <w:r>
+              <w:t xml:space="preserve"> </w:t>
             </w:r>
             <w:r>
               <w:rPr>
@@ -1195,7 +1299,10 @@
               <w:jc w:val="left"/>
             </w:pPr>
             <w:r>
-              <w:t xml:space="preserve">保留并新增 </w:t>
+              <w:t xml:space="preserve">保留并新增</w:t>
+            </w:r>
+            <w:r>
+              <w:t xml:space="preserve"> </w:t>
             </w:r>
             <w:r>
               <w:rPr>
@@ -1204,7 +1311,10 @@
               <w:t xml:space="preserve">pricing</w:t>
             </w:r>
             <w:r>
-              <w:t xml:space="preserve"> 对象</w:t>
+              <w:t xml:space="preserve"> </w:t>
+            </w:r>
+            <w:r>
+              <w:t xml:space="preserve">对象</w:t>
             </w:r>
           </w:p>
         </w:tc>
@@ -1217,7 +1327,10 @@
               <w:jc w:val="left"/>
             </w:pPr>
             <w:r>
-              <w:t xml:space="preserve">创建订单校验 </w:t>
+              <w:t xml:space="preserve">创建订单校验</w:t>
+            </w:r>
+            <w:r>
+              <w:t xml:space="preserve"> </w:t>
             </w:r>
             <w:r>
               <w:rPr>
@@ -1257,7 +1370,10 @@
               <w:jc w:val="left"/>
             </w:pPr>
             <w:r>
-              <w:t xml:space="preserve">新增 </w:t>
+              <w:t xml:space="preserve">新增</w:t>
+            </w:r>
+            <w:r>
+              <w:t xml:space="preserve"> </w:t>
             </w:r>
             <w:r>
               <w:rPr>
@@ -1266,7 +1382,10 @@
               <w:t xml:space="preserve">expectedValuePolicyId</w:t>
             </w:r>
             <w:r>
-              <w:t xml:space="preserve"> 校验</w:t>
+              <w:t xml:space="preserve"> </w:t>
+            </w:r>
+            <w:r>
+              <w:t xml:space="preserve">校验</w:t>
             </w:r>
           </w:p>
         </w:tc>
@@ -1304,7 +1423,10 @@
               <w:jc w:val="left"/>
             </w:pPr>
             <w:r>
-              <w:t xml:space="preserve">新增一对一 </w:t>
+              <w:t xml:space="preserve">新增一对一</w:t>
+            </w:r>
+            <w:r>
+              <w:t xml:space="preserve"> </w:t>
             </w:r>
             <w:r>
               <w:rPr>
@@ -1323,7 +1445,10 @@
               <w:jc w:val="left"/>
             </w:pPr>
             <w:r>
-              <w:t xml:space="preserve">当前佣金使用 </w:t>
+              <w:t xml:space="preserve">当前佣金使用</w:t>
+            </w:r>
+            <w:r>
+              <w:t xml:space="preserve"> </w:t>
             </w:r>
             <w:r>
               <w:rPr>
@@ -1410,7 +1535,7 @@
       <w:pPr>
         <w:pStyle w:val="Heading2"/>
       </w:pPr>
-      <w:bookmarkStart w:name="X9a50f3333a7832096da45188296290e8265d359" w:id="27"/>
+      <w:bookmarkStart w:id="27" w:name="总体流程"/>
       <w:r>
         <w:t xml:space="preserve">4. 总体流程</w:t>
       </w:r>
@@ -1550,7 +1675,7 @@
       <w:pPr>
         <w:pStyle w:val="Heading2"/>
       </w:pPr>
-      <w:bookmarkStart w:name="X604a67222ed80749c6faa92ee1683f37ba079d7" w:id="28"/>
+      <w:bookmarkStart w:id="28" w:name="功能模式与上线安全"/>
       <w:r>
         <w:t xml:space="preserve">5. 功能模式与上线安全</w:t>
       </w:r>
@@ -1578,12 +1703,17 @@
     <w:tbl>
       <w:tblPr>
         <w:tblStyle w:val="Table"/>
-        <w:tblW w:w="5000" w:type="pct"/>
-        <w:tblLook w:val="04A0"/>
+        <w:tblW w:type="pct" w:w="5000.0"/>
+        <w:tblLook w:firstRow="1"/>
       </w:tblPr>
-      <w:tblGrid/>
+      <w:tblGrid>
+        <w:gridCol w:w="3960"/>
+        <w:gridCol w:w="3960"/>
+      </w:tblGrid>
       <w:tr>
-        <w:trPr/>
+        <w:trPr>
+          <w:cnfStyle w:firstRow="1"/>
+        </w:trPr>
         <w:tc>
           <w:tcPr>
             <w:tcBorders>
@@ -1668,7 +1798,10 @@
               <w:jc w:val="left"/>
             </w:pPr>
             <w:r>
-              <w:t xml:space="preserve">要求 active CNY policy；返回并保存新定价数据，但 </w:t>
+              <w:t xml:space="preserve">要求 active CNY policy；返回并保存新定价数据，但</w:t>
+            </w:r>
+            <w:r>
+              <w:t xml:space="preserve"> </w:t>
             </w:r>
             <w:r>
               <w:rPr>
@@ -1677,7 +1810,10 @@
               <w:t xml:space="preserve">expectedValuePolicyId</w:t>
             </w:r>
             <w:r>
-              <w:t xml:space="preserve"> 暂为可选。若客户端传入则必须校验。</w:t>
+              <w:t xml:space="preserve"> </w:t>
+            </w:r>
+            <w:r>
+              <w:t xml:space="preserve">暂为可选。若客户端传入则必须校验。</w:t>
             </w:r>
           </w:p>
         </w:tc>
@@ -1704,7 +1840,10 @@
               <w:jc w:val="left"/>
             </w:pPr>
             <w:r>
-              <w:t xml:space="preserve">要求 active CNY policy；创建订单必须携带 </w:t>
+              <w:t xml:space="preserve">要求 active CNY policy；创建订单必须携带</w:t>
+            </w:r>
+            <w:r>
+              <w:t xml:space="preserve"> </w:t>
             </w:r>
             <w:r>
               <w:rPr>
@@ -1729,14 +1868,17 @@
     </w:p>
     <w:p>
       <w:pPr>
-        <w:pStyle w:val="Compact"/>
         <w:numPr>
           <w:ilvl w:val="0"/>
           <w:numId w:val="1003"/>
         </w:numPr>
-      </w:pPr>
-      <w:r>
-        <w:t xml:space="preserve">生产默认必须是 </w:t>
+        <w:pStyle w:val="Compact"/>
+      </w:pPr>
+      <w:r>
+        <w:t xml:space="preserve">生产默认必须是</w:t>
+      </w:r>
+      <w:r>
+        <w:t xml:space="preserve"> </w:t>
       </w:r>
       <w:r>
         <w:rPr>
@@ -1745,7 +1887,10 @@
         <w:t xml:space="preserve">off</w:t>
       </w:r>
       <w:r>
-        <w:t xml:space="preserve">；D-02 批准前不得切到 </w:t>
+        <w:t xml:space="preserve">；D-02 批准前不得切到</w:t>
+      </w:r>
+      <w:r>
+        <w:t xml:space="preserve"> </w:t>
       </w:r>
       <w:r>
         <w:rPr>
@@ -1754,7 +1899,13 @@
         <w:t xml:space="preserve">shadow</w:t>
       </w:r>
       <w:r>
-        <w:t xml:space="preserve"> 或 </w:t>
+        <w:t xml:space="preserve"> </w:t>
+      </w:r>
+      <w:r>
+        <w:t xml:space="preserve">或</w:t>
+      </w:r>
+      <w:r>
+        <w:t xml:space="preserve"> </w:t>
       </w:r>
       <w:r>
         <w:rPr>
@@ -1768,11 +1919,11 @@
     </w:p>
     <w:p>
       <w:pPr>
-        <w:pStyle w:val="Compact"/>
         <w:numPr>
           <w:ilvl w:val="0"/>
           <w:numId w:val="1003"/>
         </w:numPr>
+        <w:pStyle w:val="Compact"/>
       </w:pPr>
       <w:r>
         <w:t xml:space="preserve">配置值必须在进程启动时验证；非法值启动失败。</w:t>
@@ -1780,11 +1931,11 @@
     </w:p>
     <w:p>
       <w:pPr>
-        <w:pStyle w:val="Compact"/>
         <w:numPr>
           <w:ilvl w:val="0"/>
           <w:numId w:val="1003"/>
         </w:numPr>
+        <w:pStyle w:val="Compact"/>
       </w:pPr>
       <w:r>
         <w:rPr>
@@ -1793,7 +1944,13 @@
         <w:t xml:space="preserve">shadow/enforce</w:t>
       </w:r>
       <w:r>
-        <w:t xml:space="preserve"> 下无唯一 active CNY policy 时 fail closed，返回 </w:t>
+        <w:t xml:space="preserve"> </w:t>
+      </w:r>
+      <w:r>
+        <w:t xml:space="preserve">下无唯一 active CNY policy 时 fail closed，返回</w:t>
+      </w:r>
+      <w:r>
+        <w:t xml:space="preserve"> </w:t>
       </w:r>
       <w:r>
         <w:rPr>
@@ -1807,11 +1964,11 @@
     </w:p>
     <w:p>
       <w:pPr>
-        <w:pStyle w:val="Compact"/>
         <w:numPr>
           <w:ilvl w:val="0"/>
           <w:numId w:val="1003"/>
         </w:numPr>
+        <w:pStyle w:val="Compact"/>
       </w:pPr>
       <w:r>
         <w:t xml:space="preserve">不得在请求失败时回退到猜测比例或最新历史政策。</w:t>
@@ -1821,7 +1978,7 @@
       <w:pPr>
         <w:pStyle w:val="Heading2"/>
       </w:pPr>
-      <w:bookmarkStart w:name="X81ed8af4eea4c719acfe6454a0404ae0dd5d93f" w:id="29"/>
+      <w:bookmarkStart w:id="29" w:name="数据模型"/>
       <w:r>
         <w:t xml:space="preserve">6. 数据模型</w:t>
       </w:r>
@@ -1839,7 +1996,7 @@
       <w:pPr>
         <w:pStyle w:val="Heading3"/>
       </w:pPr>
-      <w:bookmarkStart w:name="Xcb1a7e14683d35c70504b8e354563abbed9dfaf" w:id="30"/>
+      <w:bookmarkStart w:id="30" w:name="assetdefinition"/>
       <w:r>
         <w:t xml:space="preserve">6.1 AssetDefinition</w:t>
       </w:r>
@@ -1969,12 +2126,14 @@
     <w:tbl>
       <w:tblPr>
         <w:tblStyle w:val="Table"/>
-        <w:tblW w:w="5000" w:type="pct"/>
-        <w:tblLook w:val="04A0"/>
+        <w:tblW w:type="pct" w:w="0.0"/>
+        <w:tblLook w:firstRow="1"/>
       </w:tblPr>
       <w:tblGrid/>
       <w:tr>
-        <w:trPr/>
+        <w:trPr>
+          <w:cnfStyle w:firstRow="1"/>
+        </w:trPr>
         <w:tc>
           <w:tcPr>
             <w:tcBorders>
@@ -2154,7 +2313,10 @@
         <w:pStyle w:val="BodyText"/>
       </w:pPr>
       <w:r>
-        <w:t xml:space="preserve">不得在本阶段创建 </w:t>
+        <w:t xml:space="preserve">不得在本阶段创建</w:t>
+      </w:r>
+      <w:r>
+        <w:t xml:space="preserve"> </w:t>
       </w:r>
       <w:r>
         <w:rPr>
@@ -2163,14 +2325,17 @@
         <w:t xml:space="preserve">USDT</w:t>
       </w:r>
       <w:r>
-        <w:t xml:space="preserve"> 伪法币资产。USD 可以由通用 schema 支持，但不得创建或激活首期生产 USD 价值政策。</w:t>
+        <w:t xml:space="preserve"> </w:t>
+      </w:r>
+      <w:r>
+        <w:t xml:space="preserve">伪法币资产。USD 可以由通用 schema 支持，但不得创建或激活首期生产 USD 价值政策。</w:t>
       </w:r>
     </w:p>
     <w:p>
       <w:pPr>
         <w:pStyle w:val="Heading3"/>
       </w:pPr>
-      <w:bookmarkStart w:name="Xa1bb72b0bfbb1b7b9a957c1d3964324afd2363d" w:id="31"/>
+      <w:bookmarkStart w:id="31" w:name="valuepolicy"/>
       <w:r>
         <w:t xml:space="preserve">6.2 ValuePolicy</w:t>
       </w:r>
@@ -2440,14 +2605,17 @@
     </w:p>
     <w:p>
       <w:pPr>
-        <w:pStyle w:val="Compact"/>
         <w:numPr>
           <w:ilvl w:val="0"/>
           <w:numId w:val="1004"/>
         </w:numPr>
-      </w:pPr>
-      <w:r>
-        <w:t xml:space="preserve">分子和分母均 </w:t>
+        <w:pStyle w:val="Compact"/>
+      </w:pPr>
+      <w:r>
+        <w:t xml:space="preserve">分子和分母均</w:t>
+      </w:r>
+      <w:r>
+        <w:t xml:space="preserve"> </w:t>
       </w:r>
       <w:r>
         <w:rPr>
@@ -2461,11 +2629,11 @@
     </w:p>
     <w:p>
       <w:pPr>
-        <w:pStyle w:val="Compact"/>
         <w:numPr>
           <w:ilvl w:val="0"/>
           <w:numId w:val="1004"/>
         </w:numPr>
+        <w:pStyle w:val="Compact"/>
       </w:pPr>
       <w:r>
         <w:rPr>
@@ -2474,7 +2642,13 @@
         <w:t xml:space="preserve">pointAssetCode</w:t>
       </w:r>
       <w:r>
-        <w:t xml:space="preserve"> 必须指向 </w:t>
+        <w:t xml:space="preserve"> </w:t>
+      </w:r>
+      <w:r>
+        <w:t xml:space="preserve">必须指向</w:t>
+      </w:r>
+      <w:r>
+        <w:t xml:space="preserve"> </w:t>
       </w:r>
       <w:r>
         <w:rPr>
@@ -2492,7 +2666,13 @@
         <w:t xml:space="preserve">referenceAssetCode</w:t>
       </w:r>
       <w:r>
-        <w:t xml:space="preserve"> 必须指向 </w:t>
+        <w:t xml:space="preserve"> </w:t>
+      </w:r>
+      <w:r>
+        <w:t xml:space="preserve">必须指向</w:t>
+      </w:r>
+      <w:r>
+        <w:t xml:space="preserve"> </w:t>
       </w:r>
       <w:r>
         <w:rPr>
@@ -2506,14 +2686,17 @@
     </w:p>
     <w:p>
       <w:pPr>
-        <w:pStyle w:val="Compact"/>
         <w:numPr>
           <w:ilvl w:val="0"/>
           <w:numId w:val="1004"/>
         </w:numPr>
-      </w:pPr>
-      <w:r>
-        <w:t xml:space="preserve">同一平台、同一积分资产最多一个 </w:t>
+        <w:pStyle w:val="Compact"/>
+      </w:pPr>
+      <w:r>
+        <w:t xml:space="preserve">同一平台、同一积分资产最多一个</w:t>
+      </w:r>
+      <w:r>
+        <w:t xml:space="preserve"> </w:t>
       </w:r>
       <w:r>
         <w:rPr>
@@ -2522,19 +2705,25 @@
         <w:t xml:space="preserve">active</w:t>
       </w:r>
       <w:r>
-        <w:t xml:space="preserve"> policy，使用 PostgreSQL partial unique index；</w:t>
-      </w:r>
-    </w:p>
-    <w:p>
-      <w:pPr>
-        <w:pStyle w:val="Compact"/>
+        <w:t xml:space="preserve"> </w:t>
+      </w:r>
+      <w:r>
+        <w:t xml:space="preserve">policy，使用 PostgreSQL partial unique index；</w:t>
+      </w:r>
+    </w:p>
+    <w:p>
+      <w:pPr>
         <w:numPr>
           <w:ilvl w:val="0"/>
           <w:numId w:val="1004"/>
         </w:numPr>
-      </w:pPr>
-      <w:r>
-        <w:t xml:space="preserve">active policy 的 </w:t>
+        <w:pStyle w:val="Compact"/>
+      </w:pPr>
+      <w:r>
+        <w:t xml:space="preserve">active policy 的</w:t>
+      </w:r>
+      <w:r>
+        <w:t xml:space="preserve"> </w:t>
       </w:r>
       <w:r>
         <w:rPr>
@@ -2543,7 +2732,13 @@
         <w:t xml:space="preserve">referenceAssetCode</w:t>
       </w:r>
       <w:r>
-        <w:t xml:space="preserve"> 在首期运行配置中必须是 </w:t>
+        <w:t xml:space="preserve"> </w:t>
+      </w:r>
+      <w:r>
+        <w:t xml:space="preserve">在首期运行配置中必须是</w:t>
+      </w:r>
+      <w:r>
+        <w:t xml:space="preserve"> </w:t>
       </w:r>
       <w:r>
         <w:rPr>
@@ -2557,11 +2752,11 @@
     </w:p>
     <w:p>
       <w:pPr>
-        <w:pStyle w:val="Compact"/>
         <w:numPr>
           <w:ilvl w:val="0"/>
           <w:numId w:val="1004"/>
         </w:numPr>
+        <w:pStyle w:val="Compact"/>
       </w:pPr>
       <w:r>
         <w:rPr>
@@ -2570,16 +2765,19 @@
         <w:t xml:space="preserve">active/retired</w:t>
       </w:r>
       <w:r>
-        <w:t xml:space="preserve"> policy 的经济字段禁止更新；允许的状态与时间戳变化必须受控；</w:t>
-      </w:r>
-    </w:p>
-    <w:p>
-      <w:pPr>
-        <w:pStyle w:val="Compact"/>
+        <w:t xml:space="preserve"> </w:t>
+      </w:r>
+      <w:r>
+        <w:t xml:space="preserve">policy 的经济字段禁止更新；允许的状态与时间戳变化必须受控；</w:t>
+      </w:r>
+    </w:p>
+    <w:p>
+      <w:pPr>
         <w:numPr>
           <w:ilvl w:val="0"/>
           <w:numId w:val="1004"/>
         </w:numPr>
+        <w:pStyle w:val="Compact"/>
       </w:pPr>
       <w:r>
         <w:t xml:space="preserve">生产应用角色不得直接把 draft policy 更新为 active；激活入口不属于本阶段公开 API。</w:t>
@@ -2590,7 +2788,10 @@
         <w:pStyle w:val="FirstParagraph"/>
       </w:pPr>
       <w:r>
-        <w:t xml:space="preserve">候选 </w:t>
+        <w:t xml:space="preserve">候选</w:t>
+      </w:r>
+      <w:r>
+        <w:t xml:space="preserve"> </w:t>
       </w:r>
       <w:r>
         <w:rPr>
@@ -2599,7 +2800,10 @@
         <w:t xml:space="preserve">100 PTS = 1 CNY</w:t>
       </w:r>
       <w:r>
-        <w:t xml:space="preserve"> 的规范化表达是：</w:t>
+        <w:t xml:space="preserve"> </w:t>
+      </w:r>
+      <w:r>
+        <w:t xml:space="preserve">的规范化表达是：</w:t>
       </w:r>
     </w:p>
     <w:p>
@@ -2627,14 +2831,26 @@
         <w:pStyle w:val="FirstParagraph"/>
       </w:pPr>
       <w:r>
-        <w:t xml:space="preserve">因为 CNY scale 为 2，所以一个积分对应一个“分”。这只是测试夹具，D-02 批准前不得作为生产 active policy seed。</w:t>
+        <w:t xml:space="preserve">因为 CNY scale 为 2，所以一个积分对应一个</w:t>
+      </w:r>
+      <w:r>
+        <w:t xml:space="preserve">“</w:t>
+      </w:r>
+      <w:r>
+        <w:t xml:space="preserve">分</w:t>
+      </w:r>
+      <w:r>
+        <w:t xml:space="preserve">”</w:t>
+      </w:r>
+      <w:r>
+        <w:t xml:space="preserve">。这只是测试夹具，D-02 批准前不得作为生产 active policy seed。</w:t>
       </w:r>
     </w:p>
     <w:p>
       <w:pPr>
         <w:pStyle w:val="Heading3"/>
       </w:pPr>
-      <w:bookmarkStart w:name="X3321c6e0ccdede8e107cce394c63bddb83dbacd" w:id="32"/>
+      <w:bookmarkStart w:id="32" w:name="orderpricingsnapshot"/>
       <w:r>
         <w:t xml:space="preserve">6.3 OrderPricingSnapshot</w:t>
       </w:r>
@@ -2763,11 +2979,11 @@
     </w:p>
     <w:p>
       <w:pPr>
-        <w:pStyle w:val="Compact"/>
         <w:numPr>
           <w:ilvl w:val="0"/>
           <w:numId w:val="1005"/>
         </w:numPr>
+        <w:pStyle w:val="Compact"/>
       </w:pPr>
       <w:r>
         <w:t xml:space="preserve">每个启用新政策后创建的订单恰好一个 snapshot；</w:t>
@@ -2775,11 +2991,11 @@
     </w:p>
     <w:p>
       <w:pPr>
-        <w:pStyle w:val="Compact"/>
         <w:numPr>
           <w:ilvl w:val="0"/>
           <w:numId w:val="1005"/>
         </w:numPr>
+        <w:pStyle w:val="Compact"/>
       </w:pPr>
       <w:r>
         <w:t xml:space="preserve">snapshot 与 Order 必须在同一数据库事务提交；</w:t>
@@ -2787,11 +3003,11 @@
     </w:p>
     <w:p>
       <w:pPr>
-        <w:pStyle w:val="Compact"/>
         <w:numPr>
           <w:ilvl w:val="0"/>
           <w:numId w:val="1005"/>
         </w:numPr>
+        <w:pStyle w:val="Compact"/>
       </w:pPr>
       <w:r>
         <w:t xml:space="preserve">snapshot 创建后禁止 UPDATE/DELETE；</w:t>
@@ -2799,11 +3015,11 @@
     </w:p>
     <w:p>
       <w:pPr>
-        <w:pStyle w:val="Compact"/>
         <w:numPr>
           <w:ilvl w:val="0"/>
           <w:numId w:val="1005"/>
         </w:numPr>
+        <w:pStyle w:val="Compact"/>
       </w:pPr>
       <w:r>
         <w:rPr>
@@ -2812,7 +3028,13 @@
         <w:t xml:space="preserve">pointsAmountAtomic</w:t>
       </w:r>
       <w:r>
-        <w:t xml:space="preserve"> 必须等于确认时的 </w:t>
+        <w:t xml:space="preserve"> </w:t>
+      </w:r>
+      <w:r>
+        <w:t xml:space="preserve">必须等于确认时的</w:t>
+      </w:r>
+      <w:r>
+        <w:t xml:space="preserve"> </w:t>
       </w:r>
       <w:r>
         <w:rPr>
@@ -2826,11 +3048,11 @@
     </w:p>
     <w:p>
       <w:pPr>
-        <w:pStyle w:val="Compact"/>
         <w:numPr>
           <w:ilvl w:val="0"/>
           <w:numId w:val="1005"/>
         </w:numPr>
+        <w:pStyle w:val="Compact"/>
       </w:pPr>
       <w:r>
         <w:rPr>
@@ -2839,16 +3061,19 @@
         <w:t xml:space="preserve">referenceAssetCode</w:t>
       </w:r>
       <w:r>
-        <w:t xml:space="preserve"> 必须等于政策的 reference asset；</w:t>
-      </w:r>
-    </w:p>
-    <w:p>
-      <w:pPr>
-        <w:pStyle w:val="Compact"/>
+        <w:t xml:space="preserve"> </w:t>
+      </w:r>
+      <w:r>
+        <w:t xml:space="preserve">必须等于政策的 reference asset；</w:t>
+      </w:r>
+    </w:p>
+    <w:p>
+      <w:pPr>
         <w:numPr>
           <w:ilvl w:val="0"/>
           <w:numId w:val="1005"/>
         </w:numPr>
+        <w:pStyle w:val="Compact"/>
       </w:pPr>
       <w:r>
         <w:t xml:space="preserve">历史订单暂不回填虚构参考价值；M3 迁移另立任务。</w:t>
@@ -2858,7 +3083,7 @@
       <w:pPr>
         <w:pStyle w:val="Heading2"/>
       </w:pPr>
-      <w:bookmarkStart w:name="Xb49b878abb4517edb5a122157a79e9d38139d67" w:id="33"/>
+      <w:bookmarkStart w:id="33" w:name="精确换算契约"/>
       <w:r>
         <w:t xml:space="preserve">7. 精确换算契约</w:t>
       </w:r>
@@ -3138,11 +3363,11 @@
     </w:p>
     <w:p>
       <w:pPr>
-        <w:pStyle w:val="Compact"/>
         <w:numPr>
           <w:ilvl w:val="0"/>
           <w:numId w:val="1006"/>
         </w:numPr>
+        <w:pStyle w:val="Compact"/>
       </w:pPr>
       <w:r>
         <w:t xml:space="preserve">输入积分、分子和分母必须非负/正值并显式校验；</w:t>
@@ -3150,14 +3375,17 @@
     </w:p>
     <w:p>
       <w:pPr>
-        <w:pStyle w:val="Compact"/>
         <w:numPr>
           <w:ilvl w:val="0"/>
           <w:numId w:val="1006"/>
         </w:numPr>
-      </w:pPr>
-      <w:r>
-        <w:t xml:space="preserve">禁止使用 JavaScript </w:t>
+        <w:pStyle w:val="Compact"/>
+      </w:pPr>
+      <w:r>
+        <w:t xml:space="preserve">禁止使用 JavaScript</w:t>
+      </w:r>
+      <w:r>
+        <w:t xml:space="preserve"> </w:t>
       </w:r>
       <w:r>
         <w:rPr>
@@ -3171,11 +3399,11 @@
     </w:p>
     <w:p>
       <w:pPr>
-        <w:pStyle w:val="Compact"/>
         <w:numPr>
           <w:ilvl w:val="0"/>
           <w:numId w:val="1006"/>
         </w:numPr>
+        <w:pStyle w:val="Compact"/>
       </w:pPr>
       <w:r>
         <w:t xml:space="preserve">中间计算全部使用 BigInt；</w:t>
@@ -3183,14 +3411,17 @@
     </w:p>
     <w:p>
       <w:pPr>
-        <w:pStyle w:val="Compact"/>
         <w:numPr>
           <w:ilvl w:val="0"/>
           <w:numId w:val="1006"/>
         </w:numPr>
-      </w:pPr>
-      <w:r>
-        <w:t xml:space="preserve">非整除时只允许 </w:t>
+        <w:pStyle w:val="Compact"/>
+      </w:pPr>
+      <w:r>
+        <w:t xml:space="preserve">非整除时只允许</w:t>
+      </w:r>
+      <w:r>
+        <w:t xml:space="preserve"> </w:t>
       </w:r>
       <w:r>
         <w:rPr>
@@ -3204,11 +3435,11 @@
     </w:p>
     <w:p>
       <w:pPr>
-        <w:pStyle w:val="Compact"/>
         <w:numPr>
           <w:ilvl w:val="0"/>
           <w:numId w:val="1006"/>
         </w:numPr>
+        <w:pStyle w:val="Compact"/>
       </w:pPr>
       <w:r>
         <w:t xml:space="preserve">输出不得为负；</w:t>
@@ -3216,11 +3447,11 @@
     </w:p>
     <w:p>
       <w:pPr>
-        <w:pStyle w:val="Compact"/>
         <w:numPr>
           <w:ilvl w:val="0"/>
           <w:numId w:val="1006"/>
         </w:numPr>
+        <w:pStyle w:val="Compact"/>
       </w:pPr>
       <w:r>
         <w:t xml:space="preserve">API 序列化必须使用十进制字符串；</w:t>
@@ -3228,11 +3459,11 @@
     </w:p>
     <w:p>
       <w:pPr>
-        <w:pStyle w:val="Compact"/>
         <w:numPr>
           <w:ilvl w:val="0"/>
           <w:numId w:val="1006"/>
         </w:numPr>
+        <w:pStyle w:val="Compact"/>
       </w:pPr>
       <w:r>
         <w:t xml:space="preserve">不得在调用方复制换算公式。</w:t>
@@ -3270,7 +3501,7 @@
       <w:pPr>
         <w:pStyle w:val="Heading2"/>
       </w:pPr>
-      <w:bookmarkStart w:name="X9306588b500df9432f44aea0c16d6c781d602e7" w:id="34"/>
+      <w:bookmarkStart w:id="34" w:name="api-契约"/>
       <w:r>
         <w:t xml:space="preserve">8. API 契约</w:t>
       </w:r>
@@ -3280,7 +3511,7 @@
       <w:pPr>
         <w:pStyle w:val="Heading3"/>
       </w:pPr>
-      <w:bookmarkStart w:name="X0b3365d43729c5295f8096b09f201a21407b296" w:id="35"/>
+      <w:bookmarkStart w:id="35" w:name="当前价值政策"/>
       <w:r>
         <w:t xml:space="preserve">8.1 当前价值政策</w:t>
       </w:r>
@@ -3316,7 +3547,10 @@
         <w:t xml:space="preserve">shadow/enforce</w:t>
       </w:r>
       <w:r>
-        <w:t xml:space="preserve"> 成功响应：</w:t>
+        <w:t xml:space="preserve"> </w:t>
+      </w:r>
+      <w:r>
+        <w:t xml:space="preserve">成功响应：</w:t>
       </w:r>
     </w:p>
     <w:p>
@@ -3884,7 +4118,13 @@
         <w:t xml:space="preserve">off</w:t>
       </w:r>
       <w:r>
-        <w:t xml:space="preserve"> 模式返回 </w:t>
+        <w:t xml:space="preserve"> </w:t>
+      </w:r>
+      <w:r>
+        <w:t xml:space="preserve">模式返回</w:t>
+      </w:r>
+      <w:r>
+        <w:t xml:space="preserve"> </w:t>
       </w:r>
       <w:r>
         <w:rPr>
@@ -3900,7 +4140,7 @@
       <w:pPr>
         <w:pStyle w:val="Heading3"/>
       </w:pPr>
-      <w:bookmarkStart w:name="X2410748e844ca7fc6bf0897b94503733c2654a0" w:id="36"/>
+      <w:bookmarkStart w:id="36" w:name="checkout-preview"/>
       <w:r>
         <w:t xml:space="preserve">8.2 Checkout preview</w:t>
       </w:r>
@@ -4359,14 +4599,17 @@
         <w:t xml:space="preserve">price</w:t>
       </w:r>
       <w:r>
-        <w:t xml:space="preserve"> 继续作为兼容字段。本阶段不得把它直接改为对象，以免破坏现有前端和客户端。</w:t>
+        <w:t xml:space="preserve"> </w:t>
+      </w:r>
+      <w:r>
+        <w:t xml:space="preserve">继续作为兼容字段。本阶段不得把它直接改为对象，以免破坏现有前端和客户端。</w:t>
       </w:r>
     </w:p>
     <w:p>
       <w:pPr>
         <w:pStyle w:val="Heading3"/>
       </w:pPr>
-      <w:bookmarkStart w:name="X35e37ac4a3e610405f05840fde6f56f26181ac6" w:id="37"/>
+      <w:bookmarkStart w:id="37" w:name="创建订单"/>
       <w:r>
         <w:t xml:space="preserve">8.3 创建订单</w:t>
       </w:r>
@@ -4443,26 +4686,29 @@
     </w:p>
     <w:p>
       <w:pPr>
-        <w:pStyle w:val="Compact"/>
         <w:numPr>
           <w:ilvl w:val="0"/>
           <w:numId w:val="1007"/>
         </w:numPr>
-      </w:pPr>
-      <w:r>
-        <w:rPr>
-          <w:rStyle w:val="VerbatimChar"/>
-        </w:rPr>
-        <w:t xml:space="preserve">off：容忍并忽略格式合法的可选新字段，不写 snapshot，以便客户端可提前发布；</w:t>
-      </w:r>
-    </w:p>
-    <w:p>
-      <w:pPr>
-        <w:pStyle w:val="Compact"/>
+        <w:pStyle w:val="Compact"/>
+      </w:pPr>
+      <w:r>
+        <w:rPr>
+          <w:rStyle w:val="VerbatimChar"/>
+        </w:rPr>
+        <w:t xml:space="preserve">off</w:t>
+      </w:r>
+      <w:r>
+        <w:t xml:space="preserve">：容忍并忽略格式合法的可选新字段，不写 snapshot，以便客户端可提前发布；</w:t>
+      </w:r>
+    </w:p>
+    <w:p>
+      <w:pPr>
         <w:numPr>
           <w:ilvl w:val="0"/>
           <w:numId w:val="1007"/>
         </w:numPr>
+        <w:pStyle w:val="Compact"/>
       </w:pPr>
       <w:r>
         <w:rPr>
@@ -4476,11 +4722,11 @@
     </w:p>
     <w:p>
       <w:pPr>
-        <w:pStyle w:val="Compact"/>
         <w:numPr>
           <w:ilvl w:val="0"/>
           <w:numId w:val="1007"/>
         </w:numPr>
+        <w:pStyle w:val="Compact"/>
       </w:pPr>
       <w:r>
         <w:rPr>
@@ -4489,7 +4735,10 @@
         <w:t xml:space="preserve">enforce</w:t>
       </w:r>
       <w:r>
-        <w:t xml:space="preserve">：字段必填；缺失返回 </w:t>
+        <w:t xml:space="preserve">：字段必填；缺失返回</w:t>
+      </w:r>
+      <w:r>
+        <w:t xml:space="preserve"> </w:t>
       </w:r>
       <w:r>
         <w:rPr>
@@ -4503,14 +4752,17 @@
     </w:p>
     <w:p>
       <w:pPr>
-        <w:pStyle w:val="Compact"/>
         <w:numPr>
           <w:ilvl w:val="0"/>
           <w:numId w:val="1007"/>
         </w:numPr>
-      </w:pPr>
-      <w:r>
-        <w:t xml:space="preserve">ID 不一致、政策已 retired、尚未生效或基准币不是 CNY：返回 </w:t>
+        <w:pStyle w:val="Compact"/>
+      </w:pPr>
+      <w:r>
+        <w:t xml:space="preserve">ID 不一致、政策已 retired、尚未生效或基准币不是 CNY：返回</w:t>
+      </w:r>
+      <w:r>
+        <w:t xml:space="preserve"> </w:t>
       </w:r>
       <w:r>
         <w:rPr>
@@ -4524,11 +4776,11 @@
     </w:p>
     <w:p>
       <w:pPr>
-        <w:pStyle w:val="Compact"/>
         <w:numPr>
           <w:ilvl w:val="0"/>
           <w:numId w:val="1007"/>
         </w:numPr>
+        <w:pStyle w:val="Compact"/>
       </w:pPr>
       <w:r>
         <w:t xml:space="preserve">所有拒绝路径不得创建 Order、PointLog、Settlement、InventoryLog 或 snapshot，也不得改变余额/库存。</w:t>
@@ -4536,10 +4788,268 @@
     </w:p>
     <w:p>
       <w:pPr>
+        <w:pStyle w:val="Heading3"/>
+      </w:pPr>
+      <w:bookmarkStart w:id="38" w:name="X66f44ae43a31ba89d5e52284fbc8a1270b3f474"/>
+      <w:r>
+        <w:t xml:space="preserve">8.4 Implementation clarification（错误码优先级，2026-08-18 冻结）</w:t>
+      </w:r>
+      <w:bookmarkEnd w:id="38"/>
+    </w:p>
+    <w:p>
+      <w:pPr>
         <w:pStyle w:val="FirstParagraph"/>
       </w:pPr>
       <w:r>
-        <w:t xml:space="preserve">订单成功响应和订单详情新增 </w:t>
+        <w:t xml:space="preserve">第 5 节</w:t>
+      </w:r>
+      <w:r>
+        <w:t xml:space="preserve">“</w:t>
+      </w:r>
+      <w:r>
+        <w:t xml:space="preserve">无 active 返回 503</w:t>
+      </w:r>
+      <w:r>
+        <w:t xml:space="preserve">”</w:t>
+      </w:r>
+      <w:r>
+        <w:t xml:space="preserve">与第 8.3 节</w:t>
+      </w:r>
+      <w:r>
+        <w:t xml:space="preserve">“</w:t>
+      </w:r>
+      <w:r>
+        <w:t xml:space="preserve">retired/future expected ID 返回 409</w:t>
+      </w:r>
+      <w:r>
+        <w:t xml:space="preserve">”</w:t>
+      </w:r>
+      <w:r>
+        <w:t xml:space="preserve"> </w:t>
+      </w:r>
+      <w:r>
+        <w:t xml:space="preserve">同时成立时，按以下冻结解释执行，不得静默改契约：</w:t>
+      </w:r>
+    </w:p>
+    <w:p>
+      <w:pPr>
+        <w:numPr>
+          <w:ilvl w:val="0"/>
+          <w:numId w:val="1008"/>
+        </w:numPr>
+        <w:pStyle w:val="Compact"/>
+      </w:pPr>
+      <w:r>
+        <w:t xml:space="preserve">客户端提交了具体但失效的政策确认（unknown / draft / approved /</w:t>
+      </w:r>
+      <w:r>
+        <w:t xml:space="preserve"> </w:t>
+      </w:r>
+      <w:r>
+        <w:t xml:space="preserve">scheduled / retired / future / 非 CNY / 与当前唯一 active CNY policy</w:t>
+      </w:r>
+      <w:r>
+        <w:t xml:space="preserve"> </w:t>
+      </w:r>
+      <w:r>
+        <w:t xml:space="preserve">不一致）→</w:t>
+      </w:r>
+      <w:r>
+        <w:t xml:space="preserve"> </w:t>
+      </w:r>
+      <w:r>
+        <w:rPr>
+          <w:rStyle w:val="VerbatimChar"/>
+        </w:rPr>
+        <w:t xml:space="preserve">409 VALUE_POLICY_CHANGED</w:t>
+      </w:r>
+      <w:r>
+        <w:t xml:space="preserve">。即使系统当前没有可用替换政策，</w:t>
+      </w:r>
+      <w:r>
+        <w:t xml:space="preserve"> </w:t>
+      </w:r>
+      <w:r>
+        <w:t xml:space="preserve">也优先 409。</w:t>
+      </w:r>
+    </w:p>
+    <w:p>
+      <w:pPr>
+        <w:numPr>
+          <w:ilvl w:val="0"/>
+          <w:numId w:val="1008"/>
+        </w:numPr>
+        <w:pStyle w:val="Compact"/>
+      </w:pPr>
+      <w:r>
+        <w:t xml:space="preserve">shadow 客户端没有提交政策 ID，且系统没有唯一可用 active CNY policy →</w:t>
+      </w:r>
+      <w:r>
+        <w:t xml:space="preserve"> </w:t>
+      </w:r>
+      <w:r>
+        <w:rPr>
+          <w:rStyle w:val="VerbatimChar"/>
+        </w:rPr>
+        <w:t xml:space="preserve">503 VALUE_POLICY_UNAVAILABLE</w:t>
+      </w:r>
+      <w:r>
+        <w:t xml:space="preserve">。</w:t>
+      </w:r>
+    </w:p>
+    <w:p>
+      <w:pPr>
+        <w:numPr>
+          <w:ilvl w:val="0"/>
+          <w:numId w:val="1008"/>
+        </w:numPr>
+        <w:pStyle w:val="Compact"/>
+      </w:pPr>
+      <w:r>
+        <w:t xml:space="preserve">enforce 缺少</w:t>
+      </w:r>
+      <w:r>
+        <w:t xml:space="preserve"> </w:t>
+      </w:r>
+      <w:r>
+        <w:rPr>
+          <w:rStyle w:val="VerbatimChar"/>
+        </w:rPr>
+        <w:t xml:space="preserve">expectedValuePolicyId</w:t>
+      </w:r>
+      <w:r>
+        <w:t xml:space="preserve"> </w:t>
+      </w:r>
+      <w:r>
+        <w:t xml:space="preserve">→</w:t>
+      </w:r>
+      <w:r>
+        <w:t xml:space="preserve"> </w:t>
+      </w:r>
+      <w:r>
+        <w:rPr>
+          <w:rStyle w:val="VerbatimChar"/>
+        </w:rPr>
+        <w:t xml:space="preserve">400 VALUE_POLICY_REQUIRED</w:t>
+      </w:r>
+      <w:r>
+        <w:t xml:space="preserve">，</w:t>
+      </w:r>
+      <w:r>
+        <w:t xml:space="preserve"> </w:t>
+      </w:r>
+      <w:r>
+        <w:t xml:space="preserve">且必须发生在任何余额、库存、订单、PointLog、Settlement、InventoryLog、</w:t>
+      </w:r>
+      <w:r>
+        <w:t xml:space="preserve"> </w:t>
+      </w:r>
+      <w:r>
+        <w:t xml:space="preserve">outbox、snapshot 副作用之前。</w:t>
+      </w:r>
+    </w:p>
+    <w:p>
+      <w:pPr>
+        <w:numPr>
+          <w:ilvl w:val="0"/>
+          <w:numId w:val="1008"/>
+        </w:numPr>
+        <w:pStyle w:val="Compact"/>
+      </w:pPr>
+      <w:r>
+        <w:t xml:space="preserve">数据库存在 active CNY policy，但其比例、kind、scale、enabled、</w:t>
+      </w:r>
+      <w:r>
+        <w:t xml:space="preserve"> </w:t>
+      </w:r>
+      <w:r>
+        <w:t xml:space="preserve">retiredAt、rounding 等内部数据违反不变量 →</w:t>
+      </w:r>
+      <w:r>
+        <w:t xml:space="preserve"> </w:t>
+      </w:r>
+      <w:r>
+        <w:rPr>
+          <w:rStyle w:val="VerbatimChar"/>
+        </w:rPr>
+        <w:t xml:space="preserve">500 VALUE_POLICY_DATA_INVALID</w:t>
+      </w:r>
+      <w:r>
+        <w:t xml:space="preserve">。</w:t>
+      </w:r>
+      <w:r>
+        <w:t xml:space="preserve"> </w:t>
+      </w:r>
+      <w:r>
+        <w:t xml:space="preserve">无论客户端是否携带</w:t>
+      </w:r>
+      <w:r>
+        <w:t xml:space="preserve"> </w:t>
+      </w:r>
+      <w:r>
+        <w:rPr>
+          <w:rStyle w:val="VerbatimChar"/>
+        </w:rPr>
+        <w:t xml:space="preserve">expectedValuePolicyId</w:t>
+      </w:r>
+      <w:r>
+        <w:t xml:space="preserve">、ID 是否与损坏行一致，</w:t>
+      </w:r>
+      <w:r>
+        <w:t xml:space="preserve"> </w:t>
+      </w:r>
+      <w:r>
+        <w:t xml:space="preserve">一律 500；不得降级为 409，不得回退到历史比例或猜测值。</w:t>
+      </w:r>
+    </w:p>
+    <w:p>
+      <w:pPr>
+        <w:numPr>
+          <w:ilvl w:val="0"/>
+          <w:numId w:val="1008"/>
+        </w:numPr>
+        <w:pStyle w:val="Compact"/>
+      </w:pPr>
+      <w:r>
+        <w:rPr>
+          <w:rStyle w:val="VerbatimChar"/>
+        </w:rPr>
+        <w:t xml:space="preserve">off</w:t>
+      </w:r>
+      <w:r>
+        <w:t xml:space="preserve"> </w:t>
+      </w:r>
+      <w:r>
+        <w:t xml:space="preserve">忽略格式合法的</w:t>
+      </w:r>
+      <w:r>
+        <w:t xml:space="preserve"> </w:t>
+      </w:r>
+      <w:r>
+        <w:rPr>
+          <w:rStyle w:val="VerbatimChar"/>
+        </w:rPr>
+        <w:t xml:space="preserve">expectedValuePolicyId</w:t>
+      </w:r>
+      <w:r>
+        <w:t xml:space="preserve">，不查询 policy，不返回</w:t>
+      </w:r>
+      <w:r>
+        <w:t xml:space="preserve"> </w:t>
+      </w:r>
+      <w:r>
+        <w:t xml:space="preserve">pricing，不写 snapshot。</w:t>
+      </w:r>
+    </w:p>
+    <w:p>
+      <w:pPr>
+        <w:pStyle w:val="FirstParagraph"/>
+      </w:pPr>
+      <w:r>
+        <w:t xml:space="preserve">订单成功响应和订单详情新增</w:t>
+      </w:r>
+      <w:r>
+        <w:t xml:space="preserve"> </w:t>
       </w:r>
       <w:r>
         <w:rPr>
@@ -4548,7 +5058,10 @@
         <w:t xml:space="preserve">pricing</w:t>
       </w:r>
       <w:r>
-        <w:t xml:space="preserve">，其内容必须来自 </w:t>
+        <w:t xml:space="preserve">，其内容必须来自</w:t>
+      </w:r>
+      <w:r>
+        <w:t xml:space="preserve"> </w:t>
       </w:r>
       <w:r>
         <w:rPr>
@@ -4564,21 +5077,23 @@
       <w:pPr>
         <w:pStyle w:val="Heading2"/>
       </w:pPr>
-      <w:bookmarkStart w:name="X769448bef891a10d383a847be14bf16f087e9ab" w:id="38"/>
+      <w:bookmarkStart w:id="39" w:name="错误码"/>
       <w:r>
         <w:t xml:space="preserve">9. 错误码</w:t>
       </w:r>
-      <w:bookmarkEnd w:id="38"/>
+      <w:bookmarkEnd w:id="39"/>
     </w:p>
     <w:tbl>
       <w:tblPr>
         <w:tblStyle w:val="Table"/>
-        <w:tblW w:w="5000" w:type="pct"/>
-        <w:tblLook w:val="04A0"/>
+        <w:tblW w:type="pct" w:w="0.0"/>
+        <w:tblLook w:firstRow="1"/>
       </w:tblPr>
       <w:tblGrid/>
       <w:tr>
-        <w:trPr/>
+        <w:trPr>
+          <w:cnfStyle w:firstRow="1"/>
+        </w:trPr>
         <w:tc>
           <w:tcPr>
             <w:tcBorders>
@@ -4827,7 +5342,10 @@
         <w:pStyle w:val="BodyText"/>
       </w:pPr>
       <w:r>
-        <w:t xml:space="preserve">错误必须沿用项目现有 </w:t>
+        <w:t xml:space="preserve">错误必须沿用项目现有</w:t>
+      </w:r>
+      <w:r>
+        <w:t xml:space="preserve"> </w:t>
       </w:r>
       <w:r>
         <w:rPr>
@@ -4836,26 +5354,29 @@
         <w:t xml:space="preserve">HttpError</w:t>
       </w:r>
       <w:r>
-        <w:t xml:space="preserve"> 与错误序列化约定。</w:t>
+        <w:t xml:space="preserve"> </w:t>
+      </w:r>
+      <w:r>
+        <w:t xml:space="preserve">与错误序列化约定。</w:t>
       </w:r>
     </w:p>
     <w:p>
       <w:pPr>
         <w:pStyle w:val="Heading2"/>
       </w:pPr>
-      <w:bookmarkStart w:name="X5a4c770fccb8b1c92b2f681a076d9dda1769342" w:id="39"/>
+      <w:bookmarkStart w:id="40" w:name="原子性与并发"/>
       <w:r>
         <w:t xml:space="preserve">10. 原子性与并发</w:t>
       </w:r>
-      <w:bookmarkEnd w:id="39"/>
-    </w:p>
-    <w:p>
-      <w:pPr>
-        <w:pStyle w:val="Compact"/>
-        <w:numPr>
-          <w:ilvl w:val="0"/>
-          <w:numId w:val="1008"/>
-        </w:numPr>
+      <w:bookmarkEnd w:id="40"/>
+    </w:p>
+    <w:p>
+      <w:pPr>
+        <w:numPr>
+          <w:ilvl w:val="0"/>
+          <w:numId w:val="1009"/>
+        </w:numPr>
+        <w:pStyle w:val="Compact"/>
       </w:pPr>
       <w:r>
         <w:t xml:space="preserve">创建订单时，政策解析、价格校验、订单创建和 snapshot 创建必须位于现有订单事务内；</w:t>
@@ -4863,11 +5384,11 @@
     </w:p>
     <w:p>
       <w:pPr>
-        <w:pStyle w:val="Compact"/>
-        <w:numPr>
-          <w:ilvl w:val="0"/>
-          <w:numId w:val="1008"/>
-        </w:numPr>
+        <w:numPr>
+          <w:ilvl w:val="0"/>
+          <w:numId w:val="1009"/>
+        </w:numPr>
+        <w:pStyle w:val="Compact"/>
       </w:pPr>
       <w:r>
         <w:t xml:space="preserve">政策从 preview 到 confirm 发生变化时必须 409，不得静默接受；</w:t>
@@ -4875,14 +5396,17 @@
     </w:p>
     <w:p>
       <w:pPr>
-        <w:pStyle w:val="Compact"/>
-        <w:numPr>
-          <w:ilvl w:val="0"/>
-          <w:numId w:val="1008"/>
-        </w:numPr>
-      </w:pPr>
-      <w:r>
-        <w:t xml:space="preserve">相同 </w:t>
+        <w:numPr>
+          <w:ilvl w:val="0"/>
+          <w:numId w:val="1009"/>
+        </w:numPr>
+        <w:pStyle w:val="Compact"/>
+      </w:pPr>
+      <w:r>
+        <w:t xml:space="preserve">相同</w:t>
+      </w:r>
+      <w:r>
+        <w:t xml:space="preserve"> </w:t>
       </w:r>
       <w:r>
         <w:rPr>
@@ -4891,16 +5415,19 @@
         <w:t xml:space="preserve">Idempotency-Key</w:t>
       </w:r>
       <w:r>
-        <w:t xml:space="preserve"> 重放返回同一订单与同一 snapshot；</w:t>
-      </w:r>
-    </w:p>
-    <w:p>
-      <w:pPr>
-        <w:pStyle w:val="Compact"/>
-        <w:numPr>
-          <w:ilvl w:val="0"/>
-          <w:numId w:val="1008"/>
-        </w:numPr>
+        <w:t xml:space="preserve"> </w:t>
+      </w:r>
+      <w:r>
+        <w:t xml:space="preserve">重放返回同一订单与同一 snapshot；</w:t>
+      </w:r>
+    </w:p>
+    <w:p>
+      <w:pPr>
+        <w:numPr>
+          <w:ilvl w:val="0"/>
+          <w:numId w:val="1009"/>
+        </w:numPr>
+        <w:pStyle w:val="Compact"/>
       </w:pPr>
       <w:r>
         <w:t xml:space="preserve">不得在事务外创建 snapshot 或异步补写；</w:t>
@@ -4908,11 +5435,11 @@
     </w:p>
     <w:p>
       <w:pPr>
-        <w:pStyle w:val="Compact"/>
-        <w:numPr>
-          <w:ilvl w:val="0"/>
-          <w:numId w:val="1008"/>
-        </w:numPr>
+        <w:numPr>
+          <w:ilvl w:val="0"/>
+          <w:numId w:val="1009"/>
+        </w:numPr>
+        <w:pStyle w:val="Compact"/>
       </w:pPr>
       <w:r>
         <w:t xml:space="preserve">激活/退役政策必须串行化，确保不会短暂出现两个 active policy；</w:t>
@@ -4920,14 +5447,17 @@
     </w:p>
     <w:p>
       <w:pPr>
-        <w:pStyle w:val="Compact"/>
-        <w:numPr>
-          <w:ilvl w:val="0"/>
-          <w:numId w:val="1008"/>
-        </w:numPr>
-      </w:pPr>
-      <w:r>
-        <w:t xml:space="preserve">snapshot 的外键使用 </w:t>
+        <w:numPr>
+          <w:ilvl w:val="0"/>
+          <w:numId w:val="1009"/>
+        </w:numPr>
+        <w:pStyle w:val="Compact"/>
+      </w:pPr>
+      <w:r>
+        <w:t xml:space="preserve">snapshot 的外键使用</w:t>
+      </w:r>
+      <w:r>
+        <w:t xml:space="preserve"> </w:t>
       </w:r>
       <w:r>
         <w:rPr>
@@ -4943,11 +5473,11 @@
       <w:pPr>
         <w:pStyle w:val="Heading2"/>
       </w:pPr>
-      <w:bookmarkStart w:name="Xcaad7908127e06f782f39f2d47e9749328849a0" w:id="40"/>
+      <w:bookmarkStart w:id="41" w:name="迁移与-seed"/>
       <w:r>
         <w:t xml:space="preserve">11. 迁移与 seed</w:t>
       </w:r>
-      <w:bookmarkEnd w:id="40"/>
+      <w:bookmarkEnd w:id="41"/>
     </w:p>
     <w:p>
       <w:pPr>
@@ -4959,11 +5489,11 @@
     </w:p>
     <w:p>
       <w:pPr>
-        <w:pStyle w:val="Compact"/>
-        <w:numPr>
-          <w:ilvl w:val="0"/>
-          <w:numId w:val="1009"/>
-        </w:numPr>
+        <w:numPr>
+          <w:ilvl w:val="0"/>
+          <w:numId w:val="1010"/>
+        </w:numPr>
+        <w:pStyle w:val="Compact"/>
       </w:pPr>
       <w:r>
         <w:t xml:space="preserve">新增 enum、表、FK、CHECK、partial unique index 和必要的不可变保护；</w:t>
@@ -4971,14 +5501,17 @@
     </w:p>
     <w:p>
       <w:pPr>
-        <w:pStyle w:val="Compact"/>
-        <w:numPr>
-          <w:ilvl w:val="0"/>
-          <w:numId w:val="1009"/>
-        </w:numPr>
-      </w:pPr>
-      <w:r>
-        <w:t xml:space="preserve">不修改或回填现有 </w:t>
+        <w:numPr>
+          <w:ilvl w:val="0"/>
+          <w:numId w:val="1010"/>
+        </w:numPr>
+        <w:pStyle w:val="Compact"/>
+      </w:pPr>
+      <w:r>
+        <w:t xml:space="preserve">不修改或回填现有</w:t>
+      </w:r>
+      <w:r>
+        <w:t xml:space="preserve"> </w:t>
       </w:r>
       <w:r>
         <w:rPr>
@@ -5010,14 +5543,17 @@
     </w:p>
     <w:p>
       <w:pPr>
-        <w:pStyle w:val="Compact"/>
-        <w:numPr>
-          <w:ilvl w:val="0"/>
-          <w:numId w:val="1009"/>
-        </w:numPr>
-      </w:pPr>
-      <w:r>
-        <w:t xml:space="preserve">可插入 </w:t>
+        <w:numPr>
+          <w:ilvl w:val="0"/>
+          <w:numId w:val="1010"/>
+        </w:numPr>
+        <w:pStyle w:val="Compact"/>
+      </w:pPr>
+      <w:r>
+        <w:t xml:space="preserve">可插入</w:t>
+      </w:r>
+      <w:r>
+        <w:t xml:space="preserve"> </w:t>
       </w:r>
       <w:r>
         <w:rPr>
@@ -5026,7 +5562,13 @@
         <w:t xml:space="preserve">RP</w:t>
       </w:r>
       <w:r>
-        <w:t xml:space="preserve"> 与 </w:t>
+        <w:t xml:space="preserve"> </w:t>
+      </w:r>
+      <w:r>
+        <w:t xml:space="preserve">与</w:t>
+      </w:r>
+      <w:r>
+        <w:t xml:space="preserve"> </w:t>
       </w:r>
       <w:r>
         <w:rPr>
@@ -5035,16 +5577,19 @@
         <w:t xml:space="preserve">CNY</w:t>
       </w:r>
       <w:r>
-        <w:t xml:space="preserve"> 资产定义；</w:t>
-      </w:r>
-    </w:p>
-    <w:p>
-      <w:pPr>
-        <w:pStyle w:val="Compact"/>
-        <w:numPr>
-          <w:ilvl w:val="0"/>
-          <w:numId w:val="1009"/>
-        </w:numPr>
+        <w:t xml:space="preserve"> </w:t>
+      </w:r>
+      <w:r>
+        <w:t xml:space="preserve">资产定义；</w:t>
+      </w:r>
+    </w:p>
+    <w:p>
+      <w:pPr>
+        <w:numPr>
+          <w:ilvl w:val="0"/>
+          <w:numId w:val="1010"/>
+        </w:numPr>
+        <w:pStyle w:val="Compact"/>
       </w:pPr>
       <w:r>
         <w:t xml:space="preserve">不得插入生产 active ValuePolicy；</w:t>
@@ -5052,14 +5597,17 @@
     </w:p>
     <w:p>
       <w:pPr>
-        <w:pStyle w:val="Compact"/>
-        <w:numPr>
-          <w:ilvl w:val="0"/>
-          <w:numId w:val="1009"/>
-        </w:numPr>
-      </w:pPr>
-      <w:r>
-        <w:t xml:space="preserve">测试数据库可创建 </w:t>
+        <w:numPr>
+          <w:ilvl w:val="0"/>
+          <w:numId w:val="1010"/>
+        </w:numPr>
+        <w:pStyle w:val="Compact"/>
+      </w:pPr>
+      <w:r>
+        <w:t xml:space="preserve">测试数据库可创建</w:t>
+      </w:r>
+      <w:r>
+        <w:t xml:space="preserve"> </w:t>
       </w:r>
       <w:r>
         <w:rPr>
@@ -5068,16 +5616,19 @@
         <w:t xml:space="preserve">100 PTS = 1 CNY</w:t>
       </w:r>
       <w:r>
-        <w:t xml:space="preserve"> 的 active fixture；</w:t>
-      </w:r>
-    </w:p>
-    <w:p>
-      <w:pPr>
-        <w:pStyle w:val="Compact"/>
-        <w:numPr>
-          <w:ilvl w:val="0"/>
-          <w:numId w:val="1009"/>
-        </w:numPr>
+        <w:t xml:space="preserve"> </w:t>
+      </w:r>
+      <w:r>
+        <w:t xml:space="preserve">的 active fixture；</w:t>
+      </w:r>
+    </w:p>
+    <w:p>
+      <w:pPr>
+        <w:numPr>
+          <w:ilvl w:val="0"/>
+          <w:numId w:val="1010"/>
+        </w:numPr>
+        <w:pStyle w:val="Compact"/>
       </w:pPr>
       <w:r>
         <w:t xml:space="preserve">migration 必须同时通过全新数据库重放和已有数据库升级测试；</w:t>
@@ -5085,14 +5636,17 @@
     </w:p>
     <w:p>
       <w:pPr>
-        <w:pStyle w:val="Compact"/>
-        <w:numPr>
-          <w:ilvl w:val="0"/>
-          <w:numId w:val="1009"/>
-        </w:numPr>
-      </w:pPr>
-      <w:r>
-        <w:t xml:space="preserve">禁止使用 </w:t>
+        <w:numPr>
+          <w:ilvl w:val="0"/>
+          <w:numId w:val="1010"/>
+        </w:numPr>
+        <w:pStyle w:val="Compact"/>
+      </w:pPr>
+      <w:r>
+        <w:t xml:space="preserve">禁止使用</w:t>
+      </w:r>
+      <w:r>
+        <w:t xml:space="preserve"> </w:t>
       </w:r>
       <w:r>
         <w:rPr>
@@ -5101,36 +5655,39 @@
         <w:t xml:space="preserve">prisma db push</w:t>
       </w:r>
       <w:r>
-        <w:t xml:space="preserve"> 代替 migration。</w:t>
+        <w:t xml:space="preserve"> </w:t>
+      </w:r>
+      <w:r>
+        <w:t xml:space="preserve">代替 migration。</w:t>
       </w:r>
     </w:p>
     <w:p>
       <w:pPr>
         <w:pStyle w:val="Heading2"/>
       </w:pPr>
-      <w:bookmarkStart w:name="X65a7420d406df9a5d3de94b5cb1619482dfd122" w:id="41"/>
+      <w:bookmarkStart w:id="42" w:name="测试要求"/>
       <w:r>
         <w:t xml:space="preserve">12. 测试要求</w:t>
       </w:r>
-      <w:bookmarkEnd w:id="41"/>
+      <w:bookmarkEnd w:id="42"/>
     </w:p>
     <w:p>
       <w:pPr>
         <w:pStyle w:val="Heading3"/>
       </w:pPr>
-      <w:bookmarkStart w:name="Xa0a4a085f25f6435f8bef31b0ebeb338fe9c849" w:id="42"/>
+      <w:bookmarkStart w:id="43" w:name="纯函数"/>
       <w:r>
         <w:t xml:space="preserve">12.1 纯函数</w:t>
       </w:r>
-      <w:bookmarkEnd w:id="42"/>
-    </w:p>
-    <w:p>
-      <w:pPr>
-        <w:pStyle w:val="Compact"/>
-        <w:numPr>
-          <w:ilvl w:val="0"/>
-          <w:numId w:val="1010"/>
-        </w:numPr>
+      <w:bookmarkEnd w:id="43"/>
+    </w:p>
+    <w:p>
+      <w:pPr>
+        <w:numPr>
+          <w:ilvl w:val="0"/>
+          <w:numId w:val="1011"/>
+        </w:numPr>
+        <w:pStyle w:val="Compact"/>
       </w:pPr>
       <w:r>
         <w:rPr>
@@ -5144,11 +5701,11 @@
     </w:p>
     <w:p>
       <w:pPr>
-        <w:pStyle w:val="Compact"/>
-        <w:numPr>
-          <w:ilvl w:val="0"/>
-          <w:numId w:val="1010"/>
-        </w:numPr>
+        <w:numPr>
+          <w:ilvl w:val="0"/>
+          <w:numId w:val="1011"/>
+        </w:numPr>
+        <w:pStyle w:val="Compact"/>
       </w:pPr>
       <w:r>
         <w:t xml:space="preserve">零积分；</w:t>
@@ -5156,14 +5713,17 @@
     </w:p>
     <w:p>
       <w:pPr>
-        <w:pStyle w:val="Compact"/>
-        <w:numPr>
-          <w:ilvl w:val="0"/>
-          <w:numId w:val="1010"/>
-        </w:numPr>
-      </w:pPr>
-      <w:r>
-        <w:t xml:space="preserve">大于 </w:t>
+        <w:numPr>
+          <w:ilvl w:val="0"/>
+          <w:numId w:val="1011"/>
+        </w:numPr>
+        <w:pStyle w:val="Compact"/>
+      </w:pPr>
+      <w:r>
+        <w:t xml:space="preserve">大于</w:t>
+      </w:r>
+      <w:r>
+        <w:t xml:space="preserve"> </w:t>
       </w:r>
       <w:r>
         <w:rPr>
@@ -5172,16 +5732,19 @@
         <w:t xml:space="preserve">Number.MAX_SAFE_INTEGER</w:t>
       </w:r>
       <w:r>
-        <w:t xml:space="preserve"> 的积分仍精确；</w:t>
-      </w:r>
-    </w:p>
-    <w:p>
-      <w:pPr>
-        <w:pStyle w:val="Compact"/>
-        <w:numPr>
-          <w:ilvl w:val="0"/>
-          <w:numId w:val="1010"/>
-        </w:numPr>
+        <w:t xml:space="preserve"> </w:t>
+      </w:r>
+      <w:r>
+        <w:t xml:space="preserve">的积分仍精确；</w:t>
+      </w:r>
+    </w:p>
+    <w:p>
+      <w:pPr>
+        <w:numPr>
+          <w:ilvl w:val="0"/>
+          <w:numId w:val="1011"/>
+        </w:numPr>
+        <w:pStyle w:val="Compact"/>
       </w:pPr>
       <w:r>
         <w:t xml:space="preserve">可整除与不可整除比例；</w:t>
@@ -5189,11 +5752,11 @@
     </w:p>
     <w:p>
       <w:pPr>
-        <w:pStyle w:val="Compact"/>
-        <w:numPr>
-          <w:ilvl w:val="0"/>
-          <w:numId w:val="1010"/>
-        </w:numPr>
+        <w:numPr>
+          <w:ilvl w:val="0"/>
+          <w:numId w:val="1011"/>
+        </w:numPr>
+        <w:pStyle w:val="Compact"/>
       </w:pPr>
       <w:r>
         <w:t xml:space="preserve">HALF_EVEN 的偶数/奇数 tie；</w:t>
@@ -5201,11 +5764,11 @@
     </w:p>
     <w:p>
       <w:pPr>
-        <w:pStyle w:val="Compact"/>
-        <w:numPr>
-          <w:ilvl w:val="0"/>
-          <w:numId w:val="1010"/>
-        </w:numPr>
+        <w:numPr>
+          <w:ilvl w:val="0"/>
+          <w:numId w:val="1011"/>
+        </w:numPr>
+        <w:pStyle w:val="Compact"/>
       </w:pPr>
       <w:r>
         <w:t xml:space="preserve">零分母、负数和非法策略被拒绝；</w:t>
@@ -5213,11 +5776,11 @@
     </w:p>
     <w:p>
       <w:pPr>
-        <w:pStyle w:val="Compact"/>
-        <w:numPr>
-          <w:ilvl w:val="0"/>
-          <w:numId w:val="1010"/>
-        </w:numPr>
+        <w:numPr>
+          <w:ilvl w:val="0"/>
+          <w:numId w:val="1011"/>
+        </w:numPr>
+        <w:pStyle w:val="Compact"/>
       </w:pPr>
       <w:r>
         <w:t xml:space="preserve">输入对象不发生突变。</w:t>
@@ -5227,19 +5790,19 @@
       <w:pPr>
         <w:pStyle w:val="Heading3"/>
       </w:pPr>
-      <w:bookmarkStart w:name="X0cef64716066235975c141923e5cb96a13d95d2" w:id="43"/>
+      <w:bookmarkStart w:id="44" w:name="数据库约束"/>
       <w:r>
         <w:t xml:space="preserve">12.2 数据库约束</w:t>
       </w:r>
-      <w:bookmarkEnd w:id="43"/>
-    </w:p>
-    <w:p>
-      <w:pPr>
-        <w:pStyle w:val="Compact"/>
-        <w:numPr>
-          <w:ilvl w:val="0"/>
-          <w:numId w:val="1011"/>
-        </w:numPr>
+      <w:bookmarkEnd w:id="44"/>
+    </w:p>
+    <w:p>
+      <w:pPr>
+        <w:numPr>
+          <w:ilvl w:val="0"/>
+          <w:numId w:val="1012"/>
+        </w:numPr>
+        <w:pStyle w:val="Compact"/>
       </w:pPr>
       <w:r>
         <w:t xml:space="preserve">分子/分母不能为零或负数；</w:t>
@@ -5247,11 +5810,11 @@
     </w:p>
     <w:p>
       <w:pPr>
-        <w:pStyle w:val="Compact"/>
-        <w:numPr>
-          <w:ilvl w:val="0"/>
-          <w:numId w:val="1011"/>
-        </w:numPr>
+        <w:numPr>
+          <w:ilvl w:val="0"/>
+          <w:numId w:val="1012"/>
+        </w:numPr>
+        <w:pStyle w:val="Compact"/>
       </w:pPr>
       <w:r>
         <w:t xml:space="preserve">同一积分资产不能有两个 active policy；</w:t>
@@ -5259,11 +5822,11 @@
     </w:p>
     <w:p>
       <w:pPr>
-        <w:pStyle w:val="Compact"/>
-        <w:numPr>
-          <w:ilvl w:val="0"/>
-          <w:numId w:val="1011"/>
-        </w:numPr>
+        <w:numPr>
+          <w:ilvl w:val="0"/>
+          <w:numId w:val="1012"/>
+        </w:numPr>
+        <w:pStyle w:val="Compact"/>
       </w:pPr>
       <w:r>
         <w:t xml:space="preserve">active policy 经济字段不可修改；</w:t>
@@ -5271,11 +5834,11 @@
     </w:p>
     <w:p>
       <w:pPr>
-        <w:pStyle w:val="Compact"/>
-        <w:numPr>
-          <w:ilvl w:val="0"/>
-          <w:numId w:val="1011"/>
-        </w:numPr>
+        <w:numPr>
+          <w:ilvl w:val="0"/>
+          <w:numId w:val="1012"/>
+        </w:numPr>
+        <w:pStyle w:val="Compact"/>
       </w:pPr>
       <w:r>
         <w:t xml:space="preserve">snapshot 不可更新或删除；</w:t>
@@ -5283,11 +5846,11 @@
     </w:p>
     <w:p>
       <w:pPr>
-        <w:pStyle w:val="Compact"/>
-        <w:numPr>
-          <w:ilvl w:val="0"/>
-          <w:numId w:val="1011"/>
-        </w:numPr>
+        <w:numPr>
+          <w:ilvl w:val="0"/>
+          <w:numId w:val="1012"/>
+        </w:numPr>
+        <w:pStyle w:val="Compact"/>
       </w:pPr>
       <w:r>
         <w:t xml:space="preserve">snapshot 必须关联存在的 Order 和 ValuePolicy；</w:t>
@@ -5295,11 +5858,11 @@
     </w:p>
     <w:p>
       <w:pPr>
-        <w:pStyle w:val="Compact"/>
-        <w:numPr>
-          <w:ilvl w:val="0"/>
-          <w:numId w:val="1011"/>
-        </w:numPr>
+        <w:numPr>
+          <w:ilvl w:val="0"/>
+          <w:numId w:val="1012"/>
+        </w:numPr>
+        <w:pStyle w:val="Compact"/>
       </w:pPr>
       <w:r>
         <w:t xml:space="preserve">生产保护拒绝 active USD/USDT 本位政策。</w:t>
@@ -5309,19 +5872,19 @@
       <w:pPr>
         <w:pStyle w:val="Heading3"/>
       </w:pPr>
-      <w:bookmarkStart w:name="X4991729fd8817c8b03d179417f048e0f6a45a1b" w:id="44"/>
+      <w:bookmarkStart w:id="45" w:name="api-与事务"/>
       <w:r>
         <w:t xml:space="preserve">12.3 API 与事务</w:t>
       </w:r>
-      <w:bookmarkEnd w:id="44"/>
-    </w:p>
-    <w:p>
-      <w:pPr>
-        <w:pStyle w:val="Compact"/>
-        <w:numPr>
-          <w:ilvl w:val="0"/>
-          <w:numId w:val="1012"/>
-        </w:numPr>
+      <w:bookmarkEnd w:id="45"/>
+    </w:p>
+    <w:p>
+      <w:pPr>
+        <w:numPr>
+          <w:ilvl w:val="0"/>
+          <w:numId w:val="1013"/>
+        </w:numPr>
+        <w:pStyle w:val="Compact"/>
       </w:pPr>
       <w:r>
         <w:rPr>
@@ -5330,16 +5893,19 @@
         <w:t xml:space="preserve">off</w:t>
       </w:r>
       <w:r>
-        <w:t xml:space="preserve"> 模式下现有 checkout/order 测试完全不变；</w:t>
-      </w:r>
-    </w:p>
-    <w:p>
-      <w:pPr>
-        <w:pStyle w:val="Compact"/>
-        <w:numPr>
-          <w:ilvl w:val="0"/>
-          <w:numId w:val="1012"/>
-        </w:numPr>
+        <w:t xml:space="preserve"> </w:t>
+      </w:r>
+      <w:r>
+        <w:t xml:space="preserve">模式下现有 checkout/order 测试完全不变；</w:t>
+      </w:r>
+    </w:p>
+    <w:p>
+      <w:pPr>
+        <w:numPr>
+          <w:ilvl w:val="0"/>
+          <w:numId w:val="1013"/>
+        </w:numPr>
+        <w:pStyle w:val="Compact"/>
       </w:pPr>
       <w:r>
         <w:t xml:space="preserve">preview 的积分、CNY 原子金额和 policy ID 正确；</w:t>
@@ -5347,11 +5913,11 @@
     </w:p>
     <w:p>
       <w:pPr>
-        <w:pStyle w:val="Compact"/>
-        <w:numPr>
-          <w:ilvl w:val="0"/>
-          <w:numId w:val="1012"/>
-        </w:numPr>
+        <w:numPr>
+          <w:ilvl w:val="0"/>
+          <w:numId w:val="1013"/>
+        </w:numPr>
+        <w:pStyle w:val="Compact"/>
       </w:pPr>
       <w:r>
         <w:t xml:space="preserve">shadow 模式兼容未发送 policy ID 的旧客户端；</w:t>
@@ -5359,11 +5925,11 @@
     </w:p>
     <w:p>
       <w:pPr>
-        <w:pStyle w:val="Compact"/>
-        <w:numPr>
-          <w:ilvl w:val="0"/>
-          <w:numId w:val="1012"/>
-        </w:numPr>
+        <w:numPr>
+          <w:ilvl w:val="0"/>
+          <w:numId w:val="1013"/>
+        </w:numPr>
+        <w:pStyle w:val="Compact"/>
       </w:pPr>
       <w:r>
         <w:t xml:space="preserve">enforce 模式缺少 policy ID 返回 400；</w:t>
@@ -5371,11 +5937,11 @@
     </w:p>
     <w:p>
       <w:pPr>
-        <w:pStyle w:val="Compact"/>
-        <w:numPr>
-          <w:ilvl w:val="0"/>
-          <w:numId w:val="1012"/>
-        </w:numPr>
+        <w:numPr>
+          <w:ilvl w:val="0"/>
+          <w:numId w:val="1013"/>
+        </w:numPr>
+        <w:pStyle w:val="Compact"/>
       </w:pPr>
       <w:r>
         <w:t xml:space="preserve">stale policy 返回 409 且余额、库存、订单、流水、Settlement 均无变化；</w:t>
@@ -5383,11 +5949,11 @@
     </w:p>
     <w:p>
       <w:pPr>
-        <w:pStyle w:val="Compact"/>
-        <w:numPr>
-          <w:ilvl w:val="0"/>
-          <w:numId w:val="1012"/>
-        </w:numPr>
+        <w:numPr>
+          <w:ilvl w:val="0"/>
+          <w:numId w:val="1013"/>
+        </w:numPr>
+        <w:pStyle w:val="Compact"/>
       </w:pPr>
       <w:r>
         <w:t xml:space="preserve">成功订单只有一个 immutable snapshot；</w:t>
@@ -5395,11 +5961,11 @@
     </w:p>
     <w:p>
       <w:pPr>
-        <w:pStyle w:val="Compact"/>
-        <w:numPr>
-          <w:ilvl w:val="0"/>
-          <w:numId w:val="1012"/>
-        </w:numPr>
+        <w:numPr>
+          <w:ilvl w:val="0"/>
+          <w:numId w:val="1013"/>
+        </w:numPr>
+        <w:pStyle w:val="Compact"/>
       </w:pPr>
       <w:r>
         <w:t xml:space="preserve">policy 后续 retired/替换后，订单详情仍返回原 snapshot；</w:t>
@@ -5407,11 +5973,11 @@
     </w:p>
     <w:p>
       <w:pPr>
-        <w:pStyle w:val="Compact"/>
-        <w:numPr>
-          <w:ilvl w:val="0"/>
-          <w:numId w:val="1012"/>
-        </w:numPr>
+        <w:numPr>
+          <w:ilvl w:val="0"/>
+          <w:numId w:val="1013"/>
+        </w:numPr>
+        <w:pStyle w:val="Compact"/>
       </w:pPr>
       <w:r>
         <w:t xml:space="preserve">同一幂等键并发重试不产生重复 snapshot；</w:t>
@@ -5419,11 +5985,11 @@
     </w:p>
     <w:p>
       <w:pPr>
-        <w:pStyle w:val="Compact"/>
-        <w:numPr>
-          <w:ilvl w:val="0"/>
-          <w:numId w:val="1012"/>
-        </w:numPr>
+        <w:numPr>
+          <w:ilvl w:val="0"/>
+          <w:numId w:val="1013"/>
+        </w:numPr>
+        <w:pStyle w:val="Compact"/>
       </w:pPr>
       <w:r>
         <w:t xml:space="preserve">BigInt API 字段为字符串，不触发 JSON 序列化异常。</w:t>
@@ -5479,11 +6045,11 @@
       <w:pPr>
         <w:pStyle w:val="Heading2"/>
       </w:pPr>
-      <w:bookmarkStart w:name="X1fb6806147a33ab8d1e8cf79f6ec6da283bb5c5" w:id="45"/>
+      <w:bookmarkStart w:id="46" w:name="可观测性"/>
       <w:r>
         <w:t xml:space="preserve">13. 可观测性</w:t>
       </w:r>
-      <w:bookmarkEnd w:id="45"/>
+      <w:bookmarkEnd w:id="46"/>
     </w:p>
     <w:p>
       <w:pPr>
@@ -5541,11 +6107,11 @@
     </w:p>
     <w:p>
       <w:pPr>
-        <w:pStyle w:val="Compact"/>
-        <w:numPr>
-          <w:ilvl w:val="0"/>
-          <w:numId w:val="1013"/>
-        </w:numPr>
+        <w:numPr>
+          <w:ilvl w:val="0"/>
+          <w:numId w:val="1014"/>
+        </w:numPr>
+        <w:pStyle w:val="Compact"/>
       </w:pPr>
       <w:r>
         <w:t xml:space="preserve">shadow/enforce 模式不存在 active CNY policy；</w:t>
@@ -5553,11 +6119,11 @@
     </w:p>
     <w:p>
       <w:pPr>
-        <w:pStyle w:val="Compact"/>
-        <w:numPr>
-          <w:ilvl w:val="0"/>
-          <w:numId w:val="1013"/>
-        </w:numPr>
+        <w:numPr>
+          <w:ilvl w:val="0"/>
+          <w:numId w:val="1014"/>
+        </w:numPr>
+        <w:pStyle w:val="Compact"/>
       </w:pPr>
       <w:r>
         <w:t xml:space="preserve">检测到多个 active policy；</w:t>
@@ -5565,11 +6131,11 @@
     </w:p>
     <w:p>
       <w:pPr>
-        <w:pStyle w:val="Compact"/>
-        <w:numPr>
-          <w:ilvl w:val="0"/>
-          <w:numId w:val="1013"/>
-        </w:numPr>
+        <w:numPr>
+          <w:ilvl w:val="0"/>
+          <w:numId w:val="1014"/>
+        </w:numPr>
+        <w:pStyle w:val="Compact"/>
       </w:pPr>
       <w:r>
         <w:t xml:space="preserve">policy asset kind/scale 不合法；</w:t>
@@ -5577,11 +6143,11 @@
     </w:p>
     <w:p>
       <w:pPr>
-        <w:pStyle w:val="Compact"/>
-        <w:numPr>
-          <w:ilvl w:val="0"/>
-          <w:numId w:val="1013"/>
-        </w:numPr>
+        <w:numPr>
+          <w:ilvl w:val="0"/>
+          <w:numId w:val="1014"/>
+        </w:numPr>
+        <w:pStyle w:val="Compact"/>
       </w:pPr>
       <w:r>
         <w:t xml:space="preserve">成功订单缺少应有 snapshot；</w:t>
@@ -5589,11 +6155,11 @@
     </w:p>
     <w:p>
       <w:pPr>
-        <w:pStyle w:val="Compact"/>
-        <w:numPr>
-          <w:ilvl w:val="0"/>
-          <w:numId w:val="1013"/>
-        </w:numPr>
+        <w:numPr>
+          <w:ilvl w:val="0"/>
+          <w:numId w:val="1014"/>
+        </w:numPr>
+        <w:pStyle w:val="Compact"/>
       </w:pPr>
       <w:r>
         <w:t xml:space="preserve">snapshot 与 Order.price 不一致。</w:t>
@@ -5611,11 +6177,11 @@
       <w:pPr>
         <w:pStyle w:val="Heading2"/>
       </w:pPr>
-      <w:bookmarkStart w:name="X1d10e020b7dc36f4e76d78533249413e1c32023" w:id="46"/>
+      <w:bookmarkStart w:id="47" w:name="建议修改文件"/>
       <w:r>
         <w:t xml:space="preserve">14. 建议修改文件</w:t>
       </w:r>
-      <w:bookmarkEnd w:id="46"/>
+      <w:bookmarkEnd w:id="47"/>
     </w:p>
     <w:p>
       <w:pPr>
@@ -5765,11 +6331,11 @@
       <w:pPr>
         <w:pStyle w:val="Heading2"/>
       </w:pPr>
-      <w:bookmarkStart w:name="X7902864186f4bcae11f9638cad0d5f8d35e7fde" w:id="47"/>
+      <w:bookmarkStart w:id="48" w:name="验证命令"/>
       <w:r>
         <w:t xml:space="preserve">15. 验证命令</w:t>
       </w:r>
-      <w:bookmarkEnd w:id="47"/>
+      <w:bookmarkEnd w:id="48"/>
     </w:p>
     <w:p>
       <w:pPr>
@@ -5861,28 +6427,42 @@
         <w:pStyle w:val="FirstParagraph"/>
       </w:pPr>
       <w:r>
-        <w:t xml:space="preserve">若完整测试受环境依赖阻塞，必须记录具体命令、错误和已完成的替代验证；不得只写“测试通过”而不提供结果。</w:t>
+        <w:t xml:space="preserve">若完整测试受环境依赖阻塞，必须记录具体命令、错误和已完成的替代验证；不得只写</w:t>
+      </w:r>
+      <w:r>
+        <w:t xml:space="preserve">“</w:t>
+      </w:r>
+      <w:r>
+        <w:t xml:space="preserve">测试通过</w:t>
+      </w:r>
+      <w:r>
+        <w:t xml:space="preserve">”</w:t>
+      </w:r>
+      <w:r>
+        <w:t xml:space="preserve">而不提供结果。</w:t>
       </w:r>
     </w:p>
     <w:p>
       <w:pPr>
         <w:pStyle w:val="Heading2"/>
       </w:pPr>
-      <w:bookmarkStart w:name="X66244f44ca523909964ccfdcfd83c188534c638" w:id="48"/>
+      <w:bookmarkStart w:id="49" w:name="分阶段上线"/>
       <w:r>
         <w:t xml:space="preserve">16. 分阶段上线</w:t>
       </w:r>
-      <w:bookmarkEnd w:id="48"/>
+      <w:bookmarkEnd w:id="49"/>
     </w:p>
     <w:tbl>
       <w:tblPr>
         <w:tblStyle w:val="Table"/>
-        <w:tblW w:w="5000" w:type="pct"/>
-        <w:tblLook w:val="04A0"/>
+        <w:tblW w:type="pct" w:w="0.0"/>
+        <w:tblLook w:firstRow="1"/>
       </w:tblPr>
       <w:tblGrid/>
       <w:tr>
-        <w:trPr/>
+        <w:trPr>
+          <w:cnfStyle w:firstRow="1"/>
+        </w:trPr>
         <w:tc>
           <w:tcPr>
             <w:tcBorders>
@@ -6244,11 +6824,11 @@
       <w:pPr>
         <w:pStyle w:val="Heading2"/>
       </w:pPr>
-      <w:bookmarkStart w:name="X03e62838b3dddce82d3dc4d86696f6d66a27fdb" w:id="49"/>
+      <w:bookmarkStart w:id="50" w:name="完成定义"/>
       <w:r>
         <w:t xml:space="preserve">17. 完成定义</w:t>
       </w:r>
-      <w:bookmarkEnd w:id="49"/>
+      <w:bookmarkEnd w:id="50"/>
     </w:p>
     <w:p>
       <w:pPr>
@@ -6260,11 +6840,11 @@
     </w:p>
     <w:p>
       <w:pPr>
-        <w:pStyle w:val="Compact"/>
-        <w:numPr>
-          <w:ilvl w:val="0"/>
-          <w:numId w:val="1014"/>
-        </w:numPr>
+        <w:numPr>
+          <w:ilvl w:val="0"/>
+          <w:numId w:val="1015"/>
+        </w:numPr>
+        <w:pStyle w:val="Compact"/>
       </w:pPr>
       <w:r>
         <w:t xml:space="preserve">migration 可在空库与现有库重放；</w:t>
@@ -6272,11 +6852,11 @@
     </w:p>
     <w:p>
       <w:pPr>
-        <w:pStyle w:val="Compact"/>
-        <w:numPr>
-          <w:ilvl w:val="0"/>
-          <w:numId w:val="1014"/>
-        </w:numPr>
+        <w:numPr>
+          <w:ilvl w:val="0"/>
+          <w:numId w:val="1015"/>
+        </w:numPr>
+        <w:pStyle w:val="Compact"/>
       </w:pPr>
       <w:r>
         <w:rPr>
@@ -6285,16 +6865,19 @@
         <w:t xml:space="preserve">off</w:t>
       </w:r>
       <w:r>
-        <w:t xml:space="preserve"> 模式不改变任何当前用户行为或 API 兼容字段；</w:t>
-      </w:r>
-    </w:p>
-    <w:p>
-      <w:pPr>
-        <w:pStyle w:val="Compact"/>
-        <w:numPr>
-          <w:ilvl w:val="0"/>
-          <w:numId w:val="1014"/>
-        </w:numPr>
+        <w:t xml:space="preserve"> </w:t>
+      </w:r>
+      <w:r>
+        <w:t xml:space="preserve">模式不改变任何当前用户行为或 API 兼容字段；</w:t>
+      </w:r>
+    </w:p>
+    <w:p>
+      <w:pPr>
+        <w:numPr>
+          <w:ilvl w:val="0"/>
+          <w:numId w:val="1015"/>
+        </w:numPr>
+        <w:pStyle w:val="Compact"/>
       </w:pPr>
       <w:r>
         <w:t xml:space="preserve">CNY policy 能精确计算并返回字符串原子金额；</w:t>
@@ -6302,11 +6885,11 @@
     </w:p>
     <w:p>
       <w:pPr>
-        <w:pStyle w:val="Compact"/>
-        <w:numPr>
-          <w:ilvl w:val="0"/>
-          <w:numId w:val="1014"/>
-        </w:numPr>
+        <w:numPr>
+          <w:ilvl w:val="0"/>
+          <w:numId w:val="1015"/>
+        </w:numPr>
+        <w:pStyle w:val="Compact"/>
       </w:pPr>
       <w:r>
         <w:t xml:space="preserve">stale policy 在任何资金/库存副作用前被拒绝；</w:t>
@@ -6314,11 +6897,11 @@
     </w:p>
     <w:p>
       <w:pPr>
-        <w:pStyle w:val="Compact"/>
-        <w:numPr>
-          <w:ilvl w:val="0"/>
-          <w:numId w:val="1014"/>
-        </w:numPr>
+        <w:numPr>
+          <w:ilvl w:val="0"/>
+          <w:numId w:val="1015"/>
+        </w:numPr>
+        <w:pStyle w:val="Compact"/>
       </w:pPr>
       <w:r>
         <w:t xml:space="preserve">新订单 policy/snapshot 在同一事务完成；</w:t>
@@ -6326,11 +6909,11 @@
     </w:p>
     <w:p>
       <w:pPr>
-        <w:pStyle w:val="Compact"/>
-        <w:numPr>
-          <w:ilvl w:val="0"/>
-          <w:numId w:val="1014"/>
-        </w:numPr>
+        <w:numPr>
+          <w:ilvl w:val="0"/>
+          <w:numId w:val="1015"/>
+        </w:numPr>
+        <w:pStyle w:val="Compact"/>
       </w:pPr>
       <w:r>
         <w:t xml:space="preserve">历史订单不被回填或重估；</w:t>
@@ -6338,11 +6921,11 @@
     </w:p>
     <w:p>
       <w:pPr>
-        <w:pStyle w:val="Compact"/>
-        <w:numPr>
-          <w:ilvl w:val="0"/>
-          <w:numId w:val="1014"/>
-        </w:numPr>
+        <w:numPr>
+          <w:ilvl w:val="0"/>
+          <w:numId w:val="1015"/>
+        </w:numPr>
+        <w:pStyle w:val="Compact"/>
       </w:pPr>
       <w:r>
         <w:t xml:space="preserve">相关 build、测试和快速验证通过；</w:t>
@@ -6350,11 +6933,11 @@
     </w:p>
     <w:p>
       <w:pPr>
-        <w:pStyle w:val="Compact"/>
-        <w:numPr>
-          <w:ilvl w:val="0"/>
-          <w:numId w:val="1014"/>
-        </w:numPr>
+        <w:numPr>
+          <w:ilvl w:val="0"/>
+          <w:numId w:val="1015"/>
+        </w:numPr>
+        <w:pStyle w:val="Compact"/>
       </w:pPr>
       <w:r>
         <w:t xml:space="preserve">git diff 不包含真实支付、USDT、会员或无关重构；</w:t>
@@ -6362,11 +6945,11 @@
     </w:p>
     <w:p>
       <w:pPr>
-        <w:pStyle w:val="Compact"/>
-        <w:numPr>
-          <w:ilvl w:val="0"/>
-          <w:numId w:val="1014"/>
-        </w:numPr>
+        <w:numPr>
+          <w:ilvl w:val="0"/>
+          <w:numId w:val="1015"/>
+        </w:numPr>
+        <w:pStyle w:val="Compact"/>
       </w:pPr>
       <w:r>
         <w:t xml:space="preserve">Agent 输出修改文件、迁移、测试结果、风险和未决事项；</w:t>
@@ -6374,11 +6957,11 @@
     </w:p>
     <w:p>
       <w:pPr>
-        <w:pStyle w:val="Compact"/>
-        <w:numPr>
-          <w:ilvl w:val="0"/>
-          <w:numId w:val="1014"/>
-        </w:numPr>
+        <w:numPr>
+          <w:ilvl w:val="0"/>
+          <w:numId w:val="1015"/>
+        </w:numPr>
+        <w:pStyle w:val="Compact"/>
       </w:pPr>
       <w:r>
         <w:t xml:space="preserve">Agent 不自行 push、合并、创建 PR 或激活生产 policy。</w:t>
@@ -6388,11 +6971,11 @@
       <w:pPr>
         <w:pStyle w:val="Heading2"/>
       </w:pPr>
-      <w:bookmarkStart w:name="X4a40f1ca37817a456c5cf70ee9546d4af14f44c" w:id="50"/>
+      <w:bookmarkStart w:id="51" w:name="agent-执行指令"/>
       <w:r>
         <w:t xml:space="preserve">18. Agent 执行指令</w:t>
       </w:r>
-      <w:bookmarkEnd w:id="50"/>
+      <w:bookmarkEnd w:id="51"/>
     </w:p>
     <w:p>
       <w:pPr>
@@ -6404,11 +6987,11 @@
     </w:p>
     <w:p>
       <w:pPr>
-        <w:pStyle w:val="Compact"/>
-        <w:numPr>
-          <w:ilvl w:val="0"/>
-          <w:numId w:val="1015"/>
-        </w:numPr>
+        <w:numPr>
+          <w:ilvl w:val="0"/>
+          <w:numId w:val="1016"/>
+        </w:numPr>
+        <w:pStyle w:val="Compact"/>
       </w:pPr>
       <w:r>
         <w:t xml:space="preserve">完整阅读本 Spec 与上位 Spec；</w:t>
@@ -6416,11 +6999,11 @@
     </w:p>
     <w:p>
       <w:pPr>
-        <w:pStyle w:val="Compact"/>
-        <w:numPr>
-          <w:ilvl w:val="0"/>
-          <w:numId w:val="1015"/>
-        </w:numPr>
+        <w:numPr>
+          <w:ilvl w:val="0"/>
+          <w:numId w:val="1016"/>
+        </w:numPr>
+        <w:pStyle w:val="Compact"/>
       </w:pPr>
       <w:r>
         <w:t xml:space="preserve">先检查代码与测试，输出拟修改文件清单；</w:t>
@@ -6428,11 +7011,11 @@
     </w:p>
     <w:p>
       <w:pPr>
-        <w:pStyle w:val="Compact"/>
-        <w:numPr>
-          <w:ilvl w:val="0"/>
-          <w:numId w:val="1015"/>
-        </w:numPr>
+        <w:numPr>
+          <w:ilvl w:val="0"/>
+          <w:numId w:val="1016"/>
+        </w:numPr>
+        <w:pStyle w:val="Compact"/>
       </w:pPr>
       <w:r>
         <w:t xml:space="preserve">严格在本文范围内实现，不自行扩大到 ledger/VC/支付；</w:t>
@@ -6440,11 +7023,11 @@
     </w:p>
     <w:p>
       <w:pPr>
-        <w:pStyle w:val="Compact"/>
-        <w:numPr>
-          <w:ilvl w:val="0"/>
-          <w:numId w:val="1015"/>
-        </w:numPr>
+        <w:numPr>
+          <w:ilvl w:val="0"/>
+          <w:numId w:val="1016"/>
+        </w:numPr>
+        <w:pStyle w:val="Compact"/>
       </w:pPr>
       <w:r>
         <w:t xml:space="preserve">遇到 D-02、生产 seed 或业务语义不明确时停止相关部分并报告，不擅自决定；</w:t>
@@ -6452,11 +7035,11 @@
     </w:p>
     <w:p>
       <w:pPr>
-        <w:pStyle w:val="Compact"/>
-        <w:numPr>
-          <w:ilvl w:val="0"/>
-          <w:numId w:val="1015"/>
-        </w:numPr>
+        <w:numPr>
+          <w:ilvl w:val="0"/>
+          <w:numId w:val="1016"/>
+        </w:numPr>
+        <w:pStyle w:val="Compact"/>
       </w:pPr>
       <w:r>
         <w:t xml:space="preserve">保留当前工作区中不属于自己的改动；</w:t>
@@ -6464,14 +7047,946 @@
     </w:p>
     <w:p>
       <w:pPr>
-        <w:pStyle w:val="Compact"/>
-        <w:numPr>
-          <w:ilvl w:val="0"/>
-          <w:numId w:val="1015"/>
-        </w:numPr>
+        <w:numPr>
+          <w:ilvl w:val="0"/>
+          <w:numId w:val="1016"/>
+        </w:numPr>
+        <w:pStyle w:val="Compact"/>
       </w:pPr>
       <w:r>
         <w:t xml:space="preserve">实施后运行验证、检查 diff，并按完成定义逐项报告。</w:t>
+      </w:r>
+    </w:p>
+    <w:p>
+      <w:pPr>
+        <w:pStyle w:val="Heading2"/>
+      </w:pPr>
+      <w:bookmarkStart w:id="52" w:name="implementation-status2026-08-18-closure"/>
+      <w:r>
+        <w:t xml:space="preserve">19. Implementation status（2026-08-18 closure）</w:t>
+      </w:r>
+      <w:bookmarkEnd w:id="52"/>
+    </w:p>
+    <w:p>
+      <w:pPr>
+        <w:pStyle w:val="FirstParagraph"/>
+      </w:pPr>
+      <w:r>
+        <w:t xml:space="preserve">状态：</w:t>
+      </w:r>
+      <w:r>
+        <w:rPr>
+          <w:b/>
+        </w:rPr>
+        <w:t xml:space="preserve">Implemented — Production Activation Blocked by D-02/D-03</w:t>
+      </w:r>
+    </w:p>
+    <w:p>
+      <w:pPr>
+        <w:pStyle w:val="Heading3"/>
+      </w:pPr>
+      <w:bookmarkStart w:id="53" w:name="实现证据"/>
+      <w:r>
+        <w:t xml:space="preserve">19.1 实现证据</w:t>
+      </w:r>
+      <w:bookmarkEnd w:id="53"/>
+    </w:p>
+    <w:tbl>
+      <w:tblPr>
+        <w:tblStyle w:val="Table"/>
+        <w:tblW w:type="pct" w:w="5000.0"/>
+        <w:tblLook w:firstRow="1"/>
+      </w:tblPr>
+      <w:tblGrid>
+        <w:gridCol w:w="3960"/>
+        <w:gridCol w:w="3960"/>
+      </w:tblGrid>
+      <w:tr>
+        <w:trPr>
+          <w:cnfStyle w:firstRow="1"/>
+        </w:trPr>
+        <w:tc>
+          <w:tcPr>
+            <w:tcBorders>
+              <w:bottom w:val="single"/>
+            </w:tcBorders>
+            <w:vAlign w:val="bottom"/>
+          </w:tcPr>
+          <w:p>
+            <w:pPr>
+              <w:pStyle w:val="Compact"/>
+              <w:jc w:val="left"/>
+            </w:pPr>
+            <w:r>
+              <w:t xml:space="preserve">项</w:t>
+            </w:r>
+          </w:p>
+        </w:tc>
+        <w:tc>
+          <w:tcPr>
+            <w:tcBorders>
+              <w:bottom w:val="single"/>
+            </w:tcBorders>
+            <w:vAlign w:val="bottom"/>
+          </w:tcPr>
+          <w:p>
+            <w:pPr>
+              <w:pStyle w:val="Compact"/>
+              <w:jc w:val="left"/>
+            </w:pPr>
+            <w:r>
+              <w:t xml:space="preserve">证据</w:t>
+            </w:r>
+          </w:p>
+        </w:tc>
+      </w:tr>
+      <w:tr>
+        <w:tc>
+          <w:p>
+            <w:pPr>
+              <w:pStyle w:val="Compact"/>
+              <w:jc w:val="left"/>
+            </w:pPr>
+            <w:r>
+              <w:t xml:space="preserve">PR #144 已合并</w:t>
+            </w:r>
+          </w:p>
+        </w:tc>
+        <w:tc>
+          <w:p>
+            <w:pPr>
+              <w:pStyle w:val="Compact"/>
+              <w:jc w:val="left"/>
+            </w:pPr>
+            <w:r>
+              <w:rPr>
+                <w:rStyle w:val="VerbatimChar"/>
+              </w:rPr>
+              <w:t xml:space="preserve">origin/develop@c6d21bb</w:t>
+            </w:r>
+            <w:r>
+              <w:t xml:space="preserve"> </w:t>
+            </w:r>
+            <w:r>
+              <w:rPr>
+                <w:rStyle w:val="VerbatimChar"/>
+              </w:rPr>
+              <w:t xml:space="preserve">feat(value-policy): add CNY value policy phase 1 foundation (#144)</w:t>
+            </w:r>
+          </w:p>
+        </w:tc>
+      </w:tr>
+      <w:tr>
+        <w:tc>
+          <w:p>
+            <w:pPr>
+              <w:pStyle w:val="Compact"/>
+              <w:jc w:val="left"/>
+            </w:pPr>
+            <w:r>
+              <w:t xml:space="preserve">合并前功能提交</w:t>
+            </w:r>
+          </w:p>
+        </w:tc>
+        <w:tc>
+          <w:p>
+            <w:pPr>
+              <w:pStyle w:val="Compact"/>
+              <w:jc w:val="left"/>
+            </w:pPr>
+            <w:r>
+              <w:rPr>
+                <w:rStyle w:val="VerbatimChar"/>
+              </w:rPr>
+              <w:t xml:space="preserve">b71abc0</w:t>
+            </w:r>
+            <w:r>
+              <w:t xml:space="preserve">、</w:t>
+            </w:r>
+            <w:r>
+              <w:rPr>
+                <w:rStyle w:val="VerbatimChar"/>
+              </w:rPr>
+              <w:t xml:space="preserve">915dc41</w:t>
+            </w:r>
+          </w:p>
+        </w:tc>
+      </w:tr>
+      <w:tr>
+        <w:tc>
+          <w:p>
+            <w:pPr>
+              <w:pStyle w:val="Compact"/>
+              <w:jc w:val="left"/>
+            </w:pPr>
+            <w:r>
+              <w:t xml:space="preserve">Closure 分支</w:t>
+            </w:r>
+          </w:p>
+        </w:tc>
+        <w:tc>
+          <w:p>
+            <w:pPr>
+              <w:pStyle w:val="Compact"/>
+              <w:jc w:val="left"/>
+            </w:pPr>
+            <w:r>
+              <w:rPr>
+                <w:rStyle w:val="VerbatimChar"/>
+              </w:rPr>
+              <w:t xml:space="preserve">feat/cny-value-policy-phase-1-closure</w:t>
+            </w:r>
+          </w:p>
+        </w:tc>
+      </w:tr>
+      <w:tr>
+        <w:tc>
+          <w:p>
+            <w:pPr>
+              <w:pStyle w:val="Compact"/>
+              <w:jc w:val="left"/>
+            </w:pPr>
+            <w:r>
+              <w:t xml:space="preserve">Foundation migration</w:t>
+            </w:r>
+          </w:p>
+        </w:tc>
+        <w:tc>
+          <w:p>
+            <w:pPr>
+              <w:pStyle w:val="Compact"/>
+              <w:jc w:val="left"/>
+            </w:pPr>
+            <w:r>
+              <w:rPr>
+                <w:rStyle w:val="VerbatimChar"/>
+              </w:rPr>
+              <w:t xml:space="preserve">server/prisma/migrations/20260817180000_add_value_policy_foundation/</w:t>
+            </w:r>
+            <w:r>
+              <w:t xml:space="preserve">（已合并，禁止原地修改）</w:t>
+            </w:r>
+          </w:p>
+        </w:tc>
+      </w:tr>
+      <w:tr>
+        <w:tc>
+          <w:p>
+            <w:pPr>
+              <w:pStyle w:val="Compact"/>
+              <w:jc w:val="left"/>
+            </w:pPr>
+            <w:r>
+              <w:t xml:space="preserve">Closure migration</w:t>
+            </w:r>
+          </w:p>
+        </w:tc>
+        <w:tc>
+          <w:p>
+            <w:pPr>
+              <w:pStyle w:val="Compact"/>
+              <w:jc w:val="left"/>
+            </w:pPr>
+            <w:r>
+              <w:rPr>
+                <w:rStyle w:val="VerbatimChar"/>
+              </w:rPr>
+              <w:t xml:space="preserve">server/prisma/migrations/20260818120000_value_policy_phase1_closure/</w:t>
+            </w:r>
+          </w:p>
+        </w:tc>
+      </w:tr>
+      <w:tr>
+        <w:tc>
+          <w:p>
+            <w:pPr>
+              <w:pStyle w:val="Compact"/>
+              <w:jc w:val="left"/>
+            </w:pPr>
+            <w:r>
+              <w:t xml:space="preserve">内部状态推进</w:t>
+            </w:r>
+          </w:p>
+        </w:tc>
+        <w:tc>
+          <w:p>
+            <w:pPr>
+              <w:pStyle w:val="Compact"/>
+              <w:jc w:val="left"/>
+            </w:pPr>
+            <w:r>
+              <w:rPr>
+                <w:rStyle w:val="VerbatimChar"/>
+              </w:rPr>
+              <w:t xml:space="preserve">server/src/modules/valuePolicy/governance.ts</w:t>
+            </w:r>
+            <w:r>
+              <w:t xml:space="preserve">（无公开 HTTP 激活 API）</w:t>
+            </w:r>
+          </w:p>
+        </w:tc>
+      </w:tr>
+      <w:tr>
+        <w:tc>
+          <w:p>
+            <w:pPr>
+              <w:pStyle w:val="Compact"/>
+              <w:jc w:val="left"/>
+            </w:pPr>
+            <w:r>
+              <w:t xml:space="preserve">只读审计</w:t>
+            </w:r>
+          </w:p>
+        </w:tc>
+        <w:tc>
+          <w:p>
+            <w:pPr>
+              <w:pStyle w:val="Compact"/>
+              <w:jc w:val="left"/>
+            </w:pPr>
+            <w:r>
+              <w:rPr>
+                <w:rStyle w:val="VerbatimChar"/>
+              </w:rPr>
+              <w:t xml:space="preserve">npm --prefix server run value-policy:audit</w:t>
+            </w:r>
+          </w:p>
+        </w:tc>
+      </w:tr>
+      <w:tr>
+        <w:tc>
+          <w:p>
+            <w:pPr>
+              <w:pStyle w:val="Compact"/>
+              <w:jc w:val="left"/>
+            </w:pPr>
+            <w:r>
+              <w:t xml:space="preserve">告警契约</w:t>
+            </w:r>
+          </w:p>
+        </w:tc>
+        <w:tc>
+          <w:p>
+            <w:pPr>
+              <w:pStyle w:val="Compact"/>
+              <w:jc w:val="left"/>
+            </w:pPr>
+            <w:r>
+              <w:rPr>
+                <w:rStyle w:val="VerbatimChar"/>
+              </w:rPr>
+              <w:t xml:space="preserve">docs/operations/value-policy-alerts.md</w:t>
+            </w:r>
+            <w:r>
+              <w:t xml:space="preserve"> </w:t>
+            </w:r>
+            <w:r>
+              <w:t xml:space="preserve">+</w:t>
+            </w:r>
+            <w:r>
+              <w:t xml:space="preserve"> </w:t>
+            </w:r>
+            <w:r>
+              <w:rPr>
+                <w:rStyle w:val="VerbatimChar"/>
+              </w:rPr>
+              <w:t xml:space="preserve">server/src/modules/valuePolicy/alertContract.ts</w:t>
+            </w:r>
+          </w:p>
+        </w:tc>
+      </w:tr>
+      <w:tr>
+        <w:tc>
+          <w:p>
+            <w:pPr>
+              <w:pStyle w:val="Compact"/>
+              <w:jc w:val="left"/>
+            </w:pPr>
+            <w:r>
+              <w:t xml:space="preserve">运行手册</w:t>
+            </w:r>
+          </w:p>
+        </w:tc>
+        <w:tc>
+          <w:p>
+            <w:pPr>
+              <w:pStyle w:val="Compact"/>
+              <w:jc w:val="left"/>
+            </w:pPr>
+            <w:r>
+              <w:rPr>
+                <w:rStyle w:val="VerbatimChar"/>
+              </w:rPr>
+              <w:t xml:space="preserve">docs/operations/value-policy-runbook.md</w:t>
+            </w:r>
+          </w:p>
+        </w:tc>
+      </w:tr>
+    </w:tbl>
+    <w:p>
+      <w:pPr>
+        <w:pStyle w:val="Heading3"/>
+      </w:pPr>
+      <w:bookmarkStart w:id="54" w:name="已完成"/>
+      <w:r>
+        <w:t xml:space="preserve">19.2 已完成</w:t>
+      </w:r>
+      <w:bookmarkEnd w:id="54"/>
+    </w:p>
+    <w:p>
+      <w:pPr>
+        <w:numPr>
+          <w:ilvl w:val="0"/>
+          <w:numId w:val="1017"/>
+        </w:numPr>
+        <w:pStyle w:val="Compact"/>
+      </w:pPr>
+      <w:r>
+        <w:rPr>
+          <w:rStyle w:val="VerbatimChar"/>
+        </w:rPr>
+        <w:t xml:space="preserve">off</w:t>
+      </w:r>
+      <w:r>
+        <w:t xml:space="preserve"> </w:t>
+      </w:r>
+      <w:r>
+        <w:t xml:space="preserve">/</w:t>
+      </w:r>
+      <w:r>
+        <w:t xml:space="preserve"> </w:t>
+      </w:r>
+      <w:r>
+        <w:rPr>
+          <w:rStyle w:val="VerbatimChar"/>
+        </w:rPr>
+        <w:t xml:space="preserve">shadow</w:t>
+      </w:r>
+      <w:r>
+        <w:t xml:space="preserve"> </w:t>
+      </w:r>
+      <w:r>
+        <w:t xml:space="preserve">/</w:t>
+      </w:r>
+      <w:r>
+        <w:t xml:space="preserve"> </w:t>
+      </w:r>
+      <w:r>
+        <w:rPr>
+          <w:rStyle w:val="VerbatimChar"/>
+        </w:rPr>
+        <w:t xml:space="preserve">enforce</w:t>
+      </w:r>
+      <w:r>
+        <w:t xml:space="preserve"> </w:t>
+      </w:r>
+      <w:r>
+        <w:t xml:space="preserve">模式与错误码矩阵</w:t>
+      </w:r>
+    </w:p>
+    <w:p>
+      <w:pPr>
+        <w:numPr>
+          <w:ilvl w:val="0"/>
+          <w:numId w:val="1017"/>
+        </w:numPr>
+        <w:pStyle w:val="Compact"/>
+      </w:pPr>
+      <w:r>
+        <w:t xml:space="preserve">CNY</w:t>
+      </w:r>
+      <w:r>
+        <w:t xml:space="preserve"> </w:t>
+      </w:r>
+      <w:r>
+        <w:rPr>
+          <w:rStyle w:val="VerbatimChar"/>
+        </w:rPr>
+        <w:t xml:space="preserve">ValuePolicy</w:t>
+      </w:r>
+      <w:r>
+        <w:t xml:space="preserve"> </w:t>
+      </w:r>
+      <w:r>
+        <w:t xml:space="preserve">+</w:t>
+      </w:r>
+      <w:r>
+        <w:t xml:space="preserve"> </w:t>
+      </w:r>
+      <w:r>
+        <w:rPr>
+          <w:rStyle w:val="VerbatimChar"/>
+        </w:rPr>
+        <w:t xml:space="preserve">OrderPricingSnapshot</w:t>
+      </w:r>
+      <w:r>
+        <w:t xml:space="preserve"> </w:t>
+      </w:r>
+      <w:r>
+        <w:t xml:space="preserve">同事务落库</w:t>
+      </w:r>
+    </w:p>
+    <w:p>
+      <w:pPr>
+        <w:numPr>
+          <w:ilvl w:val="0"/>
+          <w:numId w:val="1017"/>
+        </w:numPr>
+        <w:pStyle w:val="Compact"/>
+      </w:pPr>
+      <w:r>
+        <w:t xml:space="preserve">状态机与时间戳由数据库 CHECK/trigger 保护</w:t>
+      </w:r>
+    </w:p>
+    <w:p>
+      <w:pPr>
+        <w:numPr>
+          <w:ilvl w:val="0"/>
+          <w:numId w:val="1017"/>
+        </w:numPr>
+        <w:pStyle w:val="Compact"/>
+      </w:pPr>
+      <w:r>
+        <w:t xml:space="preserve">Asset/policy 典型并发按同一 advisory lock 消除 40P01</w:t>
+      </w:r>
+    </w:p>
+    <w:p>
+      <w:pPr>
+        <w:numPr>
+          <w:ilvl w:val="0"/>
+          <w:numId w:val="1017"/>
+        </w:numPr>
+        <w:pStyle w:val="Compact"/>
+      </w:pPr>
+      <w:r>
+        <w:t xml:space="preserve">指标语义与事务提交一致</w:t>
+      </w:r>
+    </w:p>
+    <w:p>
+      <w:pPr>
+        <w:numPr>
+          <w:ilvl w:val="0"/>
+          <w:numId w:val="1017"/>
+        </w:numPr>
+        <w:pStyle w:val="Compact"/>
+      </w:pPr>
+      <w:r>
+        <w:t xml:space="preserve">只读审计命令</w:t>
+      </w:r>
+    </w:p>
+    <w:p>
+      <w:pPr>
+        <w:numPr>
+          <w:ilvl w:val="0"/>
+          <w:numId w:val="1017"/>
+        </w:numPr>
+        <w:pStyle w:val="Compact"/>
+      </w:pPr>
+      <w:r>
+        <w:t xml:space="preserve">生产配置守卫：</w:t>
+      </w:r>
+      <w:r>
+        <w:rPr>
+          <w:rStyle w:val="VerbatimChar"/>
+        </w:rPr>
+        <w:t xml:space="preserve">MONEXUS_DEPLOY_ENV=production</w:t>
+      </w:r>
+      <w:r>
+        <w:t xml:space="preserve"> </w:t>
+      </w:r>
+      <w:r>
+        <w:t xml:space="preserve">时强制</w:t>
+      </w:r>
+      <w:r>
+        <w:t xml:space="preserve"> </w:t>
+      </w:r>
+      <w:r>
+        <w:rPr>
+          <w:rStyle w:val="VerbatimChar"/>
+        </w:rPr>
+        <w:t xml:space="preserve">off</w:t>
+      </w:r>
+    </w:p>
+    <w:p>
+      <w:pPr>
+        <w:pStyle w:val="Heading3"/>
+      </w:pPr>
+      <w:bookmarkStart w:id="55" w:name="生产激活-gates未完成且不得由工程自行决定"/>
+      <w:r>
+        <w:t xml:space="preserve">19.3 生产激活 gates（未完成，且不得由工程自行决定）</w:t>
+      </w:r>
+      <w:bookmarkEnd w:id="55"/>
+    </w:p>
+    <w:p>
+      <w:pPr>
+        <w:numPr>
+          <w:ilvl w:val="0"/>
+          <w:numId w:val="1018"/>
+        </w:numPr>
+        <w:pStyle w:val="Compact"/>
+      </w:pPr>
+      <w:r>
+        <w:t xml:space="preserve">D-02 生产积分面值未批准</w:t>
+      </w:r>
+    </w:p>
+    <w:p>
+      <w:pPr>
+        <w:numPr>
+          <w:ilvl w:val="0"/>
+          <w:numId w:val="1018"/>
+        </w:numPr>
+        <w:pStyle w:val="Compact"/>
+      </w:pPr>
+      <w:r>
+        <w:t xml:space="preserve">D-03 生产披露文案未批准</w:t>
+      </w:r>
+    </w:p>
+    <w:p>
+      <w:pPr>
+        <w:numPr>
+          <w:ilvl w:val="0"/>
+          <w:numId w:val="1018"/>
+        </w:numPr>
+        <w:pStyle w:val="Compact"/>
+      </w:pPr>
+      <w:r>
+        <w:t xml:space="preserve">双人审批后台入口（创建人 ≠ 审批人）未开放；当前 schema 无 actor 字段</w:t>
+      </w:r>
+    </w:p>
+    <w:p>
+      <w:pPr>
+        <w:numPr>
+          <w:ilvl w:val="0"/>
+          <w:numId w:val="1018"/>
+        </w:numPr>
+        <w:pStyle w:val="Compact"/>
+      </w:pPr>
+      <w:r>
+        <w:t xml:space="preserve">未创建生产 active ValuePolicy</w:t>
+      </w:r>
+    </w:p>
+    <w:p>
+      <w:pPr>
+        <w:numPr>
+          <w:ilvl w:val="0"/>
+          <w:numId w:val="1018"/>
+        </w:numPr>
+        <w:pStyle w:val="Compact"/>
+      </w:pPr>
+      <w:r>
+        <w:t xml:space="preserve">生产</w:t>
+      </w:r>
+      <w:r>
+        <w:t xml:space="preserve"> </w:t>
+      </w:r>
+      <w:r>
+        <w:rPr>
+          <w:rStyle w:val="VerbatimChar"/>
+        </w:rPr>
+        <w:t xml:space="preserve">POINT_VALUE_POLICY_MODE</w:t>
+      </w:r>
+      <w:r>
+        <w:t xml:space="preserve"> </w:t>
+      </w:r>
+      <w:r>
+        <w:t xml:space="preserve">必须保持</w:t>
+      </w:r>
+      <w:r>
+        <w:t xml:space="preserve"> </w:t>
+      </w:r>
+      <w:r>
+        <w:rPr>
+          <w:rStyle w:val="VerbatimChar"/>
+        </w:rPr>
+        <w:t xml:space="preserve">off</w:t>
+      </w:r>
+    </w:p>
+    <w:p>
+      <w:pPr>
+        <w:pStyle w:val="Heading3"/>
+      </w:pPr>
+      <w:bookmarkStart w:id="56" w:name="明确不属于本-phase-1-的后续范围"/>
+      <w:r>
+        <w:t xml:space="preserve">19.4 明确不属于本 Phase 1 的后续范围</w:t>
+      </w:r>
+      <w:bookmarkEnd w:id="56"/>
+    </w:p>
+    <w:p>
+      <w:pPr>
+        <w:pStyle w:val="FirstParagraph"/>
+      </w:pPr>
+      <w:r>
+        <w:t xml:space="preserve">以下属于</w:t>
+      </w:r>
+      <w:r>
+        <w:t xml:space="preserve"> </w:t>
+      </w:r>
+      <w:r>
+        <w:rPr>
+          <w:rStyle w:val="VerbatimChar"/>
+        </w:rPr>
+        <w:t xml:space="preserve">SPEC-VALUE-LEDGER-001</w:t>
+      </w:r>
+      <w:r>
+        <w:t xml:space="preserve"> </w:t>
+      </w:r>
+      <w:r>
+        <w:t xml:space="preserve">后续阶段，不是本次 closure 的未完成代码：</w:t>
+      </w:r>
+    </w:p>
+    <w:p>
+      <w:pPr>
+        <w:numPr>
+          <w:ilvl w:val="0"/>
+          <w:numId w:val="1019"/>
+        </w:numPr>
+        <w:pStyle w:val="Compact"/>
+      </w:pPr>
+      <w:r>
+        <w:t xml:space="preserve">LedgerAccount / LedgerTransaction / LedgerEntry</w:t>
+      </w:r>
+    </w:p>
+    <w:p>
+      <w:pPr>
+        <w:numPr>
+          <w:ilvl w:val="0"/>
+          <w:numId w:val="1019"/>
+        </w:numPr>
+        <w:pStyle w:val="Compact"/>
+      </w:pPr>
+      <w:r>
+        <w:t xml:space="preserve">EntitlementLot / ConsumptionAllocation</w:t>
+      </w:r>
+    </w:p>
+    <w:p>
+      <w:pPr>
+        <w:numPr>
+          <w:ilvl w:val="0"/>
+          <w:numId w:val="1019"/>
+        </w:numPr>
+        <w:pStyle w:val="Compact"/>
+      </w:pPr>
+      <w:r>
+        <w:t xml:space="preserve">RP/VC/XP 拆分</w:t>
+      </w:r>
+    </w:p>
+    <w:p>
+      <w:pPr>
+        <w:numPr>
+          <w:ilvl w:val="0"/>
+          <w:numId w:val="1019"/>
+        </w:numPr>
+        <w:pStyle w:val="Compact"/>
+      </w:pPr>
+      <w:r>
+        <w:t xml:space="preserve">FxQuote</w:t>
+      </w:r>
+    </w:p>
+    <w:p>
+      <w:pPr>
+        <w:numPr>
+          <w:ilvl w:val="0"/>
+          <w:numId w:val="1019"/>
+        </w:numPr>
+        <w:pStyle w:val="Compact"/>
+      </w:pPr>
+      <w:r>
+        <w:t xml:space="preserve">真实 CNY/USD/USDT 支付</w:t>
+      </w:r>
+    </w:p>
+    <w:p>
+      <w:pPr>
+        <w:numPr>
+          <w:ilvl w:val="0"/>
+          <w:numId w:val="1019"/>
+        </w:numPr>
+        <w:pStyle w:val="Compact"/>
+      </w:pPr>
+      <w:r>
+        <w:t xml:space="preserve">用户充值、转账、提现或现金赎回</w:t>
+      </w:r>
+    </w:p>
+    <w:p>
+      <w:pPr>
+        <w:numPr>
+          <w:ilvl w:val="0"/>
+          <w:numId w:val="1019"/>
+        </w:numPr>
+        <w:pStyle w:val="Compact"/>
+      </w:pPr>
+      <w:r>
+        <w:t xml:space="preserve">商家真实货币出款</w:t>
+      </w:r>
+    </w:p>
+    <w:p>
+      <w:pPr>
+        <w:numPr>
+          <w:ilvl w:val="0"/>
+          <w:numId w:val="1019"/>
+        </w:numPr>
+        <w:pStyle w:val="Compact"/>
+      </w:pPr>
+      <w:r>
+        <w:t xml:space="preserve">SettlementV2 / Payout / Reconciliation</w:t>
+      </w:r>
+    </w:p>
+    <w:p>
+      <w:pPr>
+        <w:numPr>
+          <w:ilvl w:val="0"/>
+          <w:numId w:val="1019"/>
+        </w:numPr>
+        <w:pStyle w:val="Compact"/>
+      </w:pPr>
+      <w:r>
+        <w:t xml:space="preserve">前端生产参考价值展示</w:t>
+      </w:r>
+    </w:p>
+    <w:p>
+      <w:pPr>
+        <w:numPr>
+          <w:ilvl w:val="0"/>
+          <w:numId w:val="1019"/>
+        </w:numPr>
+        <w:pStyle w:val="Compact"/>
+      </w:pPr>
+      <w:r>
+        <w:t xml:space="preserve">多租户</w:t>
+      </w:r>
+    </w:p>
+    <w:p>
+      <w:pPr>
+        <w:numPr>
+          <w:ilvl w:val="0"/>
+          <w:numId w:val="1019"/>
+        </w:numPr>
+        <w:pStyle w:val="Compact"/>
+      </w:pPr>
+      <w:r>
+        <w:t xml:space="preserve">生产 active policy</w:t>
+      </w:r>
+    </w:p>
+    <w:p>
+      <w:pPr>
+        <w:numPr>
+          <w:ilvl w:val="0"/>
+          <w:numId w:val="1019"/>
+        </w:numPr>
+        <w:pStyle w:val="Compact"/>
+      </w:pPr>
+      <w:r>
+        <w:t xml:space="preserve">自行决定</w:t>
+      </w:r>
+      <w:r>
+        <w:t xml:space="preserve"> </w:t>
+      </w:r>
+      <w:r>
+        <w:rPr>
+          <w:rStyle w:val="VerbatimChar"/>
+        </w:rPr>
+        <w:t xml:space="preserve">100 PTS = 1 CNY</w:t>
+      </w:r>
+    </w:p>
+    <w:p>
+      <w:pPr>
+        <w:pStyle w:val="Heading3"/>
+      </w:pPr>
+      <w:bookmarkStart w:id="57" w:name="migration-政策"/>
+      <w:r>
+        <w:t xml:space="preserve">19.5 Migration 政策</w:t>
+      </w:r>
+      <w:bookmarkEnd w:id="57"/>
+    </w:p>
+    <w:p>
+      <w:pPr>
+        <w:pStyle w:val="FirstParagraph"/>
+      </w:pPr>
+      <w:r>
+        <w:t xml:space="preserve">已合并的</w:t>
+      </w:r>
+      <w:r>
+        <w:t xml:space="preserve"> </w:t>
+      </w:r>
+      <w:r>
+        <w:rPr>
+          <w:rStyle w:val="VerbatimChar"/>
+        </w:rPr>
+        <w:t xml:space="preserve">20260817180000_add_value_policy_foundation</w:t>
+      </w:r>
+      <w:r>
+        <w:t xml:space="preserve"> </w:t>
+      </w:r>
+      <w:r>
+        <w:t xml:space="preserve">不得原地修改。</w:t>
+      </w:r>
+      <w:r>
+        <w:t xml:space="preserve"> </w:t>
+      </w:r>
+      <w:r>
+        <w:t xml:space="preserve">部署后只允许 forward-fix。禁止</w:t>
+      </w:r>
+      <w:r>
+        <w:t xml:space="preserve"> </w:t>
+      </w:r>
+      <w:r>
+        <w:rPr>
+          <w:rStyle w:val="VerbatimChar"/>
+        </w:rPr>
+        <w:t xml:space="preserve">prisma db push</w:t>
+      </w:r>
+      <w:r>
+        <w:t xml:space="preserve">。禁止回滚历史 migration。</w:t>
+      </w:r>
+    </w:p>
+    <w:p>
+      <w:pPr>
+        <w:pStyle w:val="Heading3"/>
+      </w:pPr>
+      <w:bookmarkStart w:id="58" w:name="docx-同步"/>
+      <w:r>
+        <w:t xml:space="preserve">19.6 DOCX 同步</w:t>
+      </w:r>
+      <w:bookmarkEnd w:id="58"/>
+    </w:p>
+    <w:p>
+      <w:pPr>
+        <w:pStyle w:val="FirstParagraph"/>
+      </w:pPr>
+      <w:r>
+        <w:t xml:space="preserve">两个正式 Spec 的权威正文是 Markdown。DOCX 由</w:t>
+      </w:r>
+      <w:r>
+        <w:t xml:space="preserve"> </w:t>
+      </w:r>
+      <w:r>
+        <w:rPr>
+          <w:rStyle w:val="VerbatimChar"/>
+        </w:rPr>
+        <w:t xml:space="preserve">scripts/sync-value-policy-specs-docx.sh</w:t>
+      </w:r>
+      <w:r>
+        <w:t xml:space="preserve">（pandoc）从 Markdown 重新生成，</w:t>
+      </w:r>
+      <w:r>
+        <w:t xml:space="preserve"> </w:t>
+      </w:r>
+      <w:r>
+        <w:t xml:space="preserve">并用反向</w:t>
+      </w:r>
+      <w:r>
+        <w:t xml:space="preserve"> </w:t>
+      </w:r>
+      <w:r>
+        <w:rPr>
+          <w:rStyle w:val="VerbatimChar"/>
+        </w:rPr>
+        <w:t xml:space="preserve">pandoc -t plain</w:t>
+      </w:r>
+      <w:r>
+        <w:t xml:space="preserve"> </w:t>
+      </w:r>
+      <w:r>
+        <w:t xml:space="preserve">校验关键状态句。禁止手工改 DOCX。</w:t>
       </w:r>
     </w:p>
     <w:sectPr/>
@@ -6607,7 +8122,7 @@
       </w:pPr>
     </w:lvl>
   </w:abstractNum>
-  <w:abstractNum w:abstractNumId="99211">
+  <w:abstractNum w:abstractNumId="99411">
     <w:nsid w:val="ea454b4c"/>
     <w:multiLevelType w:val="multilevel"/>
     <w:lvl w:ilvl="0">
@@ -6624,7 +8139,7 @@
     </w:lvl>
     <w:lvl w:ilvl="1">
       <w:start w:val="1"/>
-      <w:numFmt w:val="lowerLetter"/>
+      <w:numFmt w:val="decimal"/>
       <w:lvlText w:val="%2."/>
       <w:lvlJc w:val="left"/>
       <w:pPr>
@@ -6636,7 +8151,7 @@
     </w:lvl>
     <w:lvl w:ilvl="2">
       <w:start w:val="1"/>
-      <w:numFmt w:val="lowerRoman"/>
+      <w:numFmt w:val="decimal"/>
       <w:lvlText w:val="%3."/>
       <w:lvlJc w:val="left"/>
       <w:pPr>
@@ -6660,7 +8175,7 @@
     </w:lvl>
     <w:lvl w:ilvl="4">
       <w:start w:val="1"/>
-      <w:numFmt w:val="lowerLetter"/>
+      <w:numFmt w:val="decimal"/>
       <w:lvlText w:val="%5."/>
       <w:lvlJc w:val="left"/>
       <w:pPr>
@@ -6672,7 +8187,7 @@
     </w:lvl>
     <w:lvl w:ilvl="5">
       <w:start w:val="1"/>
-      <w:numFmt w:val="lowerRoman"/>
+      <w:numFmt w:val="decimal"/>
       <w:lvlText w:val="%6."/>
       <w:lvlJc w:val="left"/>
       <w:pPr>
@@ -6696,7 +8211,7 @@
     </w:lvl>
     <w:lvl w:ilvl="7">
       <w:start w:val="1"/>
-      <w:numFmt w:val="lowerLetter"/>
+      <w:numFmt w:val="decimal"/>
       <w:lvlText w:val="%8."/>
       <w:lvlJc w:val="left"/>
       <w:pPr>
@@ -6708,7 +8223,7 @@
     </w:lvl>
     <w:lvl w:ilvl="8">
       <w:start w:val="1"/>
-      <w:numFmt w:val="lowerRoman"/>
+      <w:numFmt w:val="decimal"/>
       <w:lvlText w:val="%9."/>
       <w:lvlJc w:val="left"/>
       <w:pPr>
@@ -6826,7 +8341,7 @@
     <w:abstractNumId w:val="990"/>
   </w:num>
   <w:num w:numId="1001">
-    <w:abstractNumId w:val="99211"/>
+    <w:abstractNumId w:val="99411"/>
     <w:lvlOverride w:ilvl="0">
       <w:startOverride w:val="1"/>
     </w:lvlOverride>
@@ -6862,7 +8377,7 @@
     <w:abstractNumId w:val="991"/>
   </w:num>
   <w:num w:numId="1004">
-    <w:abstractNumId w:val="99211"/>
+    <w:abstractNumId w:val="99411"/>
     <w:lvlOverride w:ilvl="0">
       <w:startOverride w:val="1"/>
     </w:lvlOverride>
@@ -6901,7 +8416,7 @@
     <w:abstractNumId w:val="991"/>
   </w:num>
   <w:num w:numId="1008">
-    <w:abstractNumId w:val="99211"/>
+    <w:abstractNumId w:val="99411"/>
     <w:lvlOverride w:ilvl="0">
       <w:startOverride w:val="1"/>
     </w:lvlOverride>
@@ -6931,7 +8446,7 @@
     </w:lvlOverride>
   </w:num>
   <w:num w:numId="1009">
-    <w:abstractNumId w:val="99211"/>
+    <w:abstractNumId w:val="99411"/>
     <w:lvlOverride w:ilvl="0">
       <w:startOverride w:val="1"/>
     </w:lvlOverride>
@@ -6961,19 +8476,7 @@
     </w:lvlOverride>
   </w:num>
   <w:num w:numId="1010">
-    <w:abstractNumId w:val="991"/>
-  </w:num>
-  <w:num w:numId="1011">
-    <w:abstractNumId w:val="991"/>
-  </w:num>
-  <w:num w:numId="1012">
-    <w:abstractNumId w:val="991"/>
-  </w:num>
-  <w:num w:numId="1013">
-    <w:abstractNumId w:val="991"/>
-  </w:num>
-  <w:num w:numId="1014">
-    <w:abstractNumId w:val="99211"/>
+    <w:abstractNumId w:val="99411"/>
     <w:lvlOverride w:ilvl="0">
       <w:startOverride w:val="1"/>
     </w:lvlOverride>
@@ -7002,8 +8505,20 @@
       <w:startOverride w:val="1"/>
     </w:lvlOverride>
   </w:num>
+  <w:num w:numId="1011">
+    <w:abstractNumId w:val="991"/>
+  </w:num>
+  <w:num w:numId="1012">
+    <w:abstractNumId w:val="991"/>
+  </w:num>
+  <w:num w:numId="1013">
+    <w:abstractNumId w:val="991"/>
+  </w:num>
+  <w:num w:numId="1014">
+    <w:abstractNumId w:val="991"/>
+  </w:num>
   <w:num w:numId="1015">
-    <w:abstractNumId w:val="99211"/>
+    <w:abstractNumId w:val="99411"/>
     <w:lvlOverride w:ilvl="0">
       <w:startOverride w:val="1"/>
     </w:lvlOverride>
@@ -7032,6 +8547,45 @@
       <w:startOverride w:val="1"/>
     </w:lvlOverride>
   </w:num>
+  <w:num w:numId="1016">
+    <w:abstractNumId w:val="99411"/>
+    <w:lvlOverride w:ilvl="0">
+      <w:startOverride w:val="1"/>
+    </w:lvlOverride>
+    <w:lvlOverride w:ilvl="1">
+      <w:startOverride w:val="1"/>
+    </w:lvlOverride>
+    <w:lvlOverride w:ilvl="2">
+      <w:startOverride w:val="1"/>
+    </w:lvlOverride>
+    <w:lvlOverride w:ilvl="3">
+      <w:startOverride w:val="1"/>
+    </w:lvlOverride>
+    <w:lvlOverride w:ilvl="4">
+      <w:startOverride w:val="1"/>
+    </w:lvlOverride>
+    <w:lvlOverride w:ilvl="5">
+      <w:startOverride w:val="1"/>
+    </w:lvlOverride>
+    <w:lvlOverride w:ilvl="6">
+      <w:startOverride w:val="1"/>
+    </w:lvlOverride>
+    <w:lvlOverride w:ilvl="7">
+      <w:startOverride w:val="1"/>
+    </w:lvlOverride>
+    <w:lvlOverride w:ilvl="8">
+      <w:startOverride w:val="1"/>
+    </w:lvlOverride>
+  </w:num>
+  <w:num w:numId="1017">
+    <w:abstractNumId w:val="991"/>
+  </w:num>
+  <w:num w:numId="1018">
+    <w:abstractNumId w:val="991"/>
+  </w:num>
+  <w:num w:numId="1019">
+    <w:abstractNumId w:val="991"/>
+  </w:num>
 </w:numbering>
 </file>
 
@@ -7040,7 +8594,7 @@
   <w:docDefaults>
     <w:rPrDefault>
       <w:rPr>
-        <w:rFonts w:asciiTheme="minorHAnsi" w:hAnsiTheme="minorHAnsi" w:eastAsiaTheme="minorHAnsi" w:cstheme="minorBidi"/>
+        <w:rFonts w:asciiTheme="minorHAnsi" w:eastAsiaTheme="minorHAnsi" w:hAnsiTheme="minorHAnsi" w:cstheme="minorBidi"/>
         <w:sz w:val="24"/>
         <w:szCs w:val="24"/>
         <w:lang w:val="en-US" w:eastAsia="en-US" w:bidi="ar-SA"/>
@@ -7053,7 +8607,7 @@
     </w:pPrDefault>
   </w:docDefaults>
   <w:latentStyles w:defLockedState="0" w:defUIPriority="0" w:defSemiHidden="0" w:defUnhideWhenUsed="0" w:defQFormat="0" w:count="276"/>
-  <w:style w:type="paragraph" w:styleId="Normal" w:default="1">
+  <w:style w:type="paragraph" w:default="1" w:styleId="Normal">
     <w:name w:val="Normal"/>
     <w:qFormat/>
   </w:style>
@@ -7061,18 +8615,18 @@
     <w:name w:val="Body Text"/>
     <w:basedOn w:val="Normal"/>
     <w:link w:val="BodyTextChar"/>
-    <w:qFormat/>
     <w:pPr>
       <w:spacing w:before="180" w:after="180"/>
     </w:pPr>
+    <w:qFormat/>
   </w:style>
-  <w:style w:type="paragraph" w:styleId="FirstParagraph" w:customStyle="1">
+  <w:style w:type="paragraph" w:customStyle="1" w:styleId="FirstParagraph">
     <w:name w:val="First Paragraph"/>
     <w:basedOn w:val="BodyText"/>
     <w:next w:val="BodyText"/>
     <w:qFormat/>
   </w:style>
-  <w:style w:type="paragraph" w:styleId="Compact" w:customStyle="1">
+  <w:style w:type="paragraph" w:customStyle="1" w:styleId="Compact">
     <w:name w:val="Compact"/>
     <w:basedOn w:val="BodyText"/>
     <w:qFormat/>
@@ -7092,7 +8646,7 @@
       <w:jc w:val="center"/>
     </w:pPr>
     <w:rPr>
-      <w:rFonts w:asciiTheme="majorHAnsi" w:hAnsiTheme="majorHAnsi" w:eastAsiaTheme="majorEastAsia" w:cstheme="majorBidi"/>
+      <w:rFonts w:asciiTheme="majorHAnsi" w:eastAsiaTheme="majorEastAsia" w:hAnsiTheme="majorHAnsi" w:cstheme="majorBidi"/>
       <w:b/>
       <w:bCs/>
       <w:color w:val="345A8A" w:themeColor="accent1" w:themeShade="B5"/>
@@ -7116,7 +8670,7 @@
       <w:szCs w:val="30"/>
     </w:rPr>
   </w:style>
-  <w:style w:type="paragraph" w:styleId="Author" w:customStyle="1">
+  <w:style w:type="paragraph" w:customStyle="1" w:styleId="Author">
     <w:name w:val="Author"/>
     <w:next w:val="BodyText"/>
     <w:qFormat/>
@@ -7136,7 +8690,7 @@
       <w:jc w:val="center"/>
     </w:pPr>
   </w:style>
-  <w:style w:type="paragraph" w:styleId="Abstract" w:customStyle="1">
+  <w:style w:type="paragraph" w:customStyle="1" w:styleId="Abstract">
     <w:name w:val="Abstract"/>
     <w:basedOn w:val="Normal"/>
     <w:next w:val="BodyText"/>
@@ -7172,7 +8726,7 @@
       <w:outlineLvl w:val="0"/>
     </w:pPr>
     <w:rPr>
-      <w:rFonts w:asciiTheme="majorHAnsi" w:hAnsiTheme="majorHAnsi" w:eastAsiaTheme="majorEastAsia" w:cstheme="majorBidi"/>
+      <w:rFonts w:asciiTheme="majorHAnsi" w:eastAsiaTheme="majorEastAsia" w:hAnsiTheme="majorHAnsi" w:cstheme="majorBidi"/>
       <w:b/>
       <w:bCs/>
       <w:color w:val="4F81BD" w:themeColor="accent1"/>
@@ -7194,7 +8748,7 @@
       <w:outlineLvl w:val="1"/>
     </w:pPr>
     <w:rPr>
-      <w:rFonts w:asciiTheme="majorHAnsi" w:hAnsiTheme="majorHAnsi" w:eastAsiaTheme="majorEastAsia" w:cstheme="majorBidi"/>
+      <w:rFonts w:asciiTheme="majorHAnsi" w:eastAsiaTheme="majorEastAsia" w:hAnsiTheme="majorHAnsi" w:cstheme="majorBidi"/>
       <w:b/>
       <w:bCs/>
       <w:color w:val="4F81BD" w:themeColor="accent1"/>
@@ -7216,7 +8770,7 @@
       <w:outlineLvl w:val="2"/>
     </w:pPr>
     <w:rPr>
-      <w:rFonts w:asciiTheme="majorHAnsi" w:hAnsiTheme="majorHAnsi" w:eastAsiaTheme="majorEastAsia" w:cstheme="majorBidi"/>
+      <w:rFonts w:asciiTheme="majorHAnsi" w:eastAsiaTheme="majorEastAsia" w:hAnsiTheme="majorHAnsi" w:cstheme="majorBidi"/>
       <w:b/>
       <w:bCs/>
       <w:color w:val="4F81BD" w:themeColor="accent1"/>
@@ -7238,9 +8792,9 @@
       <w:outlineLvl w:val="3"/>
     </w:pPr>
     <w:rPr>
-      <w:rFonts w:asciiTheme="majorHAnsi" w:hAnsiTheme="majorHAnsi" w:eastAsiaTheme="majorEastAsia" w:cstheme="majorBidi"/>
+      <w:rFonts w:asciiTheme="majorHAnsi" w:eastAsiaTheme="majorEastAsia" w:hAnsiTheme="majorHAnsi" w:cstheme="majorBidi"/>
+      <w:i/>
       <w:bCs/>
-      <w:i/>
       <w:color w:val="4F81BD" w:themeColor="accent1"/>
       <w:sz w:val="24"/>
       <w:szCs w:val="24"/>
@@ -7260,7 +8814,7 @@
       <w:outlineLvl w:val="4"/>
     </w:pPr>
     <w:rPr>
-      <w:rFonts w:asciiTheme="majorHAnsi" w:hAnsiTheme="majorHAnsi" w:eastAsiaTheme="majorEastAsia" w:cstheme="majorBidi"/>
+      <w:rFonts w:asciiTheme="majorHAnsi" w:eastAsiaTheme="majorEastAsia" w:hAnsiTheme="majorHAnsi" w:cstheme="majorBidi"/>
       <w:iCs/>
       <w:color w:val="4F81BD" w:themeColor="accent1"/>
       <w:sz w:val="24"/>
@@ -7281,7 +8835,7 @@
       <w:outlineLvl w:val="5"/>
     </w:pPr>
     <w:rPr>
-      <w:rFonts w:asciiTheme="majorHAnsi" w:hAnsiTheme="majorHAnsi" w:eastAsiaTheme="majorEastAsia" w:cstheme="majorBidi"/>
+      <w:rFonts w:asciiTheme="majorHAnsi" w:eastAsiaTheme="majorEastAsia" w:hAnsiTheme="majorHAnsi" w:cstheme="majorBidi"/>
       <w:color w:val="4F81BD" w:themeColor="accent1"/>
       <w:sz w:val="24"/>
       <w:szCs w:val="24"/>
@@ -7301,7 +8855,7 @@
       <w:outlineLvl w:val="6"/>
     </w:pPr>
     <w:rPr>
-      <w:rFonts w:asciiTheme="majorHAnsi" w:hAnsiTheme="majorHAnsi" w:eastAsiaTheme="majorEastAsia" w:cstheme="majorBidi"/>
+      <w:rFonts w:asciiTheme="majorHAnsi" w:eastAsiaTheme="majorEastAsia" w:hAnsiTheme="majorHAnsi" w:cstheme="majorBidi"/>
       <w:color w:val="4F81BD" w:themeColor="accent1"/>
       <w:sz w:val="24"/>
       <w:szCs w:val="24"/>
@@ -7321,7 +8875,7 @@
       <w:outlineLvl w:val="7"/>
     </w:pPr>
     <w:rPr>
-      <w:rFonts w:asciiTheme="majorHAnsi" w:hAnsiTheme="majorHAnsi" w:eastAsiaTheme="majorEastAsia" w:cstheme="majorBidi"/>
+      <w:rFonts w:asciiTheme="majorHAnsi" w:eastAsiaTheme="majorEastAsia" w:hAnsiTheme="majorHAnsi" w:cstheme="majorBidi"/>
       <w:color w:val="4F81BD" w:themeColor="accent1"/>
       <w:sz w:val="24"/>
       <w:szCs w:val="24"/>
@@ -7341,7 +8895,7 @@
       <w:outlineLvl w:val="8"/>
     </w:pPr>
     <w:rPr>
-      <w:rFonts w:asciiTheme="majorHAnsi" w:hAnsiTheme="majorHAnsi" w:eastAsiaTheme="majorEastAsia" w:cstheme="majorBidi"/>
+      <w:rFonts w:asciiTheme="majorHAnsi" w:eastAsiaTheme="majorEastAsia" w:hAnsiTheme="majorHAnsi" w:cstheme="majorBidi"/>
       <w:color w:val="4F81BD" w:themeColor="accent1"/>
       <w:sz w:val="24"/>
       <w:szCs w:val="24"/>
@@ -7356,7 +8910,7 @@
     <w:qFormat/>
     <w:pPr>
       <w:spacing w:before="100" w:after="100"/>
-      <w:ind w:left="480" w:right="480" w:firstLine="0"/>
+      <w:ind w:firstLine="0" w:left="480" w:right="480"/>
     </w:pPr>
   </w:style>
   <w:style w:type="paragraph" w:styleId="FootnoteText">
@@ -7367,12 +8921,12 @@
     <w:unhideWhenUsed/>
     <w:qFormat/>
   </w:style>
-  <w:style w:type="character" w:styleId="DefaultParagraphFont" w:default="1">
+  <w:style w:type="character" w:default="1" w:styleId="DefaultParagraphFont">
     <w:name w:val="Default Paragraph Font"/>
     <w:semiHidden/>
     <w:unhideWhenUsed/>
   </w:style>
-  <w:style w:type="table" w:styleId="Table" w:default="1">
+  <w:style w:type="table" w:default="1" w:styleId="Table">
     <w:name w:val="Table"/>
     <w:basedOn w:val="TableNormal"/>
     <w:semiHidden/>
@@ -7388,7 +8942,7 @@
       </w:tblCellMar>
     </w:tblPr>
   </w:style>
-  <w:style w:type="paragraph" w:styleId="DefinitionTerm" w:customStyle="1">
+  <w:style w:type="paragraph" w:customStyle="1" w:styleId="DefinitionTerm">
     <w:name w:val="Definition Term"/>
     <w:basedOn w:val="Normal"/>
     <w:next w:val="Definition"/>
@@ -7401,7 +8955,7 @@
       <w:b/>
     </w:rPr>
   </w:style>
-  <w:style w:type="paragraph" w:styleId="Definition" w:customStyle="1">
+  <w:style w:type="paragraph" w:customStyle="1" w:styleId="Definition">
     <w:name w:val="Definition"/>
     <w:basedOn w:val="Normal"/>
   </w:style>
@@ -7416,34 +8970,34 @@
       <w:i/>
     </w:rPr>
   </w:style>
-  <w:style w:type="paragraph" w:styleId="TableCaption" w:customStyle="1">
+  <w:style w:type="paragraph" w:customStyle="1" w:styleId="TableCaption">
     <w:name w:val="Table Caption"/>
     <w:basedOn w:val="Caption"/>
     <w:pPr>
       <w:keepNext/>
     </w:pPr>
   </w:style>
-  <w:style w:type="paragraph" w:styleId="ImageCaption" w:customStyle="1">
+  <w:style w:type="paragraph" w:customStyle="1" w:styleId="ImageCaption">
     <w:name w:val="Image Caption"/>
     <w:basedOn w:val="Caption"/>
   </w:style>
-  <w:style w:type="paragraph" w:styleId="Figure" w:customStyle="1">
+  <w:style w:type="paragraph" w:customStyle="1" w:styleId="Figure">
     <w:name w:val="Figure"/>
     <w:basedOn w:val="Normal"/>
   </w:style>
-  <w:style w:type="paragraph" w:styleId="CaptionedFigure" w:customStyle="1">
+  <w:style w:type="paragraph" w:customStyle="1" w:styleId="CaptionedFigure">
     <w:name w:val="Captioned Figure"/>
     <w:basedOn w:val="Figure"/>
     <w:pPr>
       <w:keepNext/>
     </w:pPr>
   </w:style>
-  <w:style w:type="character" w:styleId="BodyTextChar" w:customStyle="1">
+  <w:style w:type="character" w:customStyle="1" w:styleId="BodyTextChar">
     <w:name w:val="Body Text Char"/>
     <w:basedOn w:val="DefaultParagraphFont"/>
     <w:link w:val="BodyText"/>
   </w:style>
-  <w:style w:type="character" w:styleId="VerbatimChar" w:customStyle="1">
+  <w:style w:type="character" w:customStyle="1" w:styleId="VerbatimChar">
     <w:name w:val="Verbatim Char"/>
     <w:basedOn w:val="BodyTextChar"/>
     <w:rPr>
@@ -7477,13 +9031,13 @@
       <w:outlineLvl w:val="9"/>
     </w:pPr>
     <w:rPr>
-      <w:rFonts w:asciiTheme="majorHAnsi" w:hAnsiTheme="majorHAnsi" w:eastAsiaTheme="majorEastAsia" w:cstheme="majorBidi"/>
+      <w:rFonts w:asciiTheme="majorHAnsi" w:eastAsiaTheme="majorEastAsia" w:hAnsiTheme="majorHAnsi" w:cstheme="majorBidi"/>
       <w:b w:val="0"/>
       <w:bCs w:val="0"/>
       <w:color w:val="365F91" w:themeColor="accent1" w:themeShade="BF"/>
     </w:rPr>
   </w:style>
-  <w:style w:type="paragraph" w:styleId="SourceCode" w:customStyle="1">
+  <w:style w:type="paragraph" w:customStyle="1" w:styleId="SourceCode">
     <w:name w:val="Source Code"/>
     <w:basedOn w:val="Normal"/>
     <w:link w:val="VerbatimChar"/>
@@ -7491,223 +9045,223 @@
       <w:wordWrap w:val="off"/>
     </w:pPr>
   </w:style>
-  <w:style w:type="character" w:styleId="KeywordTok" w:customStyle="1">
+  <w:style w:type="character" w:customStyle="1" w:styleId="KeywordTok">
     <w:name w:val="KeywordTok"/>
     <w:basedOn w:val="VerbatimChar"/>
     <w:rPr>
+      <w:color w:val="007020"/>
       <w:b/>
-      <w:color w:val="007020"/>
     </w:rPr>
   </w:style>
-  <w:style w:type="character" w:styleId="DataTypeTok" w:customStyle="1">
+  <w:style w:type="character" w:customStyle="1" w:styleId="DataTypeTok">
     <w:name w:val="DataTypeTok"/>
     <w:basedOn w:val="VerbatimChar"/>
     <w:rPr>
       <w:color w:val="902000"/>
     </w:rPr>
   </w:style>
-  <w:style w:type="character" w:styleId="DecValTok" w:customStyle="1">
+  <w:style w:type="character" w:customStyle="1" w:styleId="DecValTok">
     <w:name w:val="DecValTok"/>
     <w:basedOn w:val="VerbatimChar"/>
     <w:rPr>
       <w:color w:val="40a070"/>
     </w:rPr>
   </w:style>
-  <w:style w:type="character" w:styleId="BaseNTok" w:customStyle="1">
+  <w:style w:type="character" w:customStyle="1" w:styleId="BaseNTok">
     <w:name w:val="BaseNTok"/>
     <w:basedOn w:val="VerbatimChar"/>
     <w:rPr>
       <w:color w:val="40a070"/>
     </w:rPr>
   </w:style>
-  <w:style w:type="character" w:styleId="FloatTok" w:customStyle="1">
+  <w:style w:type="character" w:customStyle="1" w:styleId="FloatTok">
     <w:name w:val="FloatTok"/>
     <w:basedOn w:val="VerbatimChar"/>
     <w:rPr>
       <w:color w:val="40a070"/>
     </w:rPr>
   </w:style>
-  <w:style w:type="character" w:styleId="ConstantTok" w:customStyle="1">
+  <w:style w:type="character" w:customStyle="1" w:styleId="ConstantTok">
     <w:name w:val="ConstantTok"/>
     <w:basedOn w:val="VerbatimChar"/>
     <w:rPr>
       <w:color w:val="880000"/>
     </w:rPr>
   </w:style>
-  <w:style w:type="character" w:styleId="CharTok" w:customStyle="1">
+  <w:style w:type="character" w:customStyle="1" w:styleId="CharTok">
     <w:name w:val="CharTok"/>
     <w:basedOn w:val="VerbatimChar"/>
     <w:rPr>
       <w:color w:val="4070a0"/>
     </w:rPr>
   </w:style>
-  <w:style w:type="character" w:styleId="SpecialCharTok" w:customStyle="1">
+  <w:style w:type="character" w:customStyle="1" w:styleId="SpecialCharTok">
     <w:name w:val="SpecialCharTok"/>
     <w:basedOn w:val="VerbatimChar"/>
     <w:rPr>
       <w:color w:val="4070a0"/>
     </w:rPr>
   </w:style>
-  <w:style w:type="character" w:styleId="StringTok" w:customStyle="1">
+  <w:style w:type="character" w:customStyle="1" w:styleId="StringTok">
     <w:name w:val="StringTok"/>
     <w:basedOn w:val="VerbatimChar"/>
     <w:rPr>
       <w:color w:val="4070a0"/>
     </w:rPr>
   </w:style>
-  <w:style w:type="character" w:styleId="VerbatimStringTok" w:customStyle="1">
+  <w:style w:type="character" w:customStyle="1" w:styleId="VerbatimStringTok">
     <w:name w:val="VerbatimStringTok"/>
     <w:basedOn w:val="VerbatimChar"/>
     <w:rPr>
       <w:color w:val="4070a0"/>
     </w:rPr>
   </w:style>
-  <w:style w:type="character" w:styleId="SpecialStringTok" w:customStyle="1">
+  <w:style w:type="character" w:customStyle="1" w:styleId="SpecialStringTok">
     <w:name w:val="SpecialStringTok"/>
     <w:basedOn w:val="VerbatimChar"/>
     <w:rPr>
       <w:color w:val="bb6688"/>
     </w:rPr>
   </w:style>
-  <w:style w:type="character" w:styleId="ImportTok" w:customStyle="1">
+  <w:style w:type="character" w:customStyle="1" w:styleId="ImportTok">
     <w:name w:val="ImportTok"/>
     <w:basedOn w:val="VerbatimChar"/>
     <w:rPr/>
   </w:style>
-  <w:style w:type="character" w:styleId="CommentTok" w:customStyle="1">
+  <w:style w:type="character" w:customStyle="1" w:styleId="CommentTok">
     <w:name w:val="CommentTok"/>
     <w:basedOn w:val="VerbatimChar"/>
     <w:rPr>
+      <w:color w:val="60a0b0"/>
       <w:i/>
-      <w:color w:val="60a0b0"/>
     </w:rPr>
   </w:style>
-  <w:style w:type="character" w:styleId="DocumentationTok" w:customStyle="1">
+  <w:style w:type="character" w:customStyle="1" w:styleId="DocumentationTok">
     <w:name w:val="DocumentationTok"/>
     <w:basedOn w:val="VerbatimChar"/>
     <w:rPr>
+      <w:color w:val="ba2121"/>
       <w:i/>
-      <w:color w:val="ba2121"/>
     </w:rPr>
   </w:style>
-  <w:style w:type="character" w:styleId="AnnotationTok" w:customStyle="1">
+  <w:style w:type="character" w:customStyle="1" w:styleId="AnnotationTok">
     <w:name w:val="AnnotationTok"/>
     <w:basedOn w:val="VerbatimChar"/>
     <w:rPr>
+      <w:color w:val="60a0b0"/>
       <w:b/>
       <w:i/>
-      <w:color w:val="60a0b0"/>
     </w:rPr>
   </w:style>
-  <w:style w:type="character" w:styleId="CommentVarTok" w:customStyle="1">
+  <w:style w:type="character" w:customStyle="1" w:styleId="CommentVarTok">
     <w:name w:val="CommentVarTok"/>
     <w:basedOn w:val="VerbatimChar"/>
     <w:rPr>
+      <w:color w:val="60a0b0"/>
       <w:b/>
       <w:i/>
-      <w:color w:val="60a0b0"/>
     </w:rPr>
   </w:style>
-  <w:style w:type="character" w:styleId="OtherTok" w:customStyle="1">
+  <w:style w:type="character" w:customStyle="1" w:styleId="OtherTok">
     <w:name w:val="OtherTok"/>
     <w:basedOn w:val="VerbatimChar"/>
     <w:rPr>
       <w:color w:val="007020"/>
     </w:rPr>
   </w:style>
-  <w:style w:type="character" w:styleId="FunctionTok" w:customStyle="1">
+  <w:style w:type="character" w:customStyle="1" w:styleId="FunctionTok">
     <w:name w:val="FunctionTok"/>
     <w:basedOn w:val="VerbatimChar"/>
     <w:rPr>
       <w:color w:val="06287e"/>
     </w:rPr>
   </w:style>
-  <w:style w:type="character" w:styleId="VariableTok" w:customStyle="1">
+  <w:style w:type="character" w:customStyle="1" w:styleId="VariableTok">
     <w:name w:val="VariableTok"/>
     <w:basedOn w:val="VerbatimChar"/>
     <w:rPr>
       <w:color w:val="19177c"/>
     </w:rPr>
   </w:style>
-  <w:style w:type="character" w:styleId="ControlFlowTok" w:customStyle="1">
+  <w:style w:type="character" w:customStyle="1" w:styleId="ControlFlowTok">
     <w:name w:val="ControlFlowTok"/>
     <w:basedOn w:val="VerbatimChar"/>
     <w:rPr>
+      <w:color w:val="007020"/>
       <w:b/>
-      <w:color w:val="007020"/>
     </w:rPr>
   </w:style>
-  <w:style w:type="character" w:styleId="OperatorTok" w:customStyle="1">
+  <w:style w:type="character" w:customStyle="1" w:styleId="OperatorTok">
     <w:name w:val="OperatorTok"/>
     <w:basedOn w:val="VerbatimChar"/>
     <w:rPr>
       <w:color w:val="666666"/>
     </w:rPr>
   </w:style>
-  <w:style w:type="character" w:styleId="BuiltInTok" w:customStyle="1">
+  <w:style w:type="character" w:customStyle="1" w:styleId="BuiltInTok">
     <w:name w:val="BuiltInTok"/>
     <w:basedOn w:val="VerbatimChar"/>
     <w:rPr/>
   </w:style>
-  <w:style w:type="character" w:styleId="ExtensionTok" w:customStyle="1">
+  <w:style w:type="character" w:customStyle="1" w:styleId="ExtensionTok">
     <w:name w:val="ExtensionTok"/>
     <w:basedOn w:val="VerbatimChar"/>
     <w:rPr/>
   </w:style>
-  <w:style w:type="character" w:styleId="PreprocessorTok" w:customStyle="1">
+  <w:style w:type="character" w:customStyle="1" w:styleId="PreprocessorTok">
     <w:name w:val="PreprocessorTok"/>
     <w:basedOn w:val="VerbatimChar"/>
     <w:rPr>
       <w:color w:val="bc7a00"/>
     </w:rPr>
   </w:style>
-  <w:style w:type="character" w:styleId="AttributeTok" w:customStyle="1">
+  <w:style w:type="character" w:customStyle="1" w:styleId="AttributeTok">
     <w:name w:val="AttributeTok"/>
     <w:basedOn w:val="VerbatimChar"/>
     <w:rPr>
       <w:color w:val="7d9029"/>
     </w:rPr>
   </w:style>
-  <w:style w:type="character" w:styleId="RegionMarkerTok" w:customStyle="1">
+  <w:style w:type="character" w:customStyle="1" w:styleId="RegionMarkerTok">
     <w:name w:val="RegionMarkerTok"/>
     <w:basedOn w:val="VerbatimChar"/>
     <w:rPr/>
   </w:style>
-  <w:style w:type="character" w:styleId="InformationTok" w:customStyle="1">
+  <w:style w:type="character" w:customStyle="1" w:styleId="InformationTok">
     <w:name w:val="InformationTok"/>
     <w:basedOn w:val="VerbatimChar"/>
     <w:rPr>
+      <w:color w:val="60a0b0"/>
       <w:b/>
       <w:i/>
-      <w:color w:val="60a0b0"/>
     </w:rPr>
   </w:style>
-  <w:style w:type="character" w:styleId="WarningTok" w:customStyle="1">
+  <w:style w:type="character" w:customStyle="1" w:styleId="WarningTok">
     <w:name w:val="WarningTok"/>
     <w:basedOn w:val="VerbatimChar"/>
     <w:rPr>
+      <w:color w:val="60a0b0"/>
       <w:b/>
       <w:i/>
-      <w:color w:val="60a0b0"/>
     </w:rPr>
   </w:style>
-  <w:style w:type="character" w:styleId="AlertTok" w:customStyle="1">
+  <w:style w:type="character" w:customStyle="1" w:styleId="AlertTok">
     <w:name w:val="AlertTok"/>
     <w:basedOn w:val="VerbatimChar"/>
     <w:rPr>
+      <w:color w:val="ff0000"/>
       <w:b/>
-      <w:color w:val="ff0000"/>
     </w:rPr>
   </w:style>
-  <w:style w:type="character" w:styleId="ErrorTok" w:customStyle="1">
+  <w:style w:type="character" w:customStyle="1" w:styleId="ErrorTok">
     <w:name w:val="ErrorTok"/>
     <w:basedOn w:val="VerbatimChar"/>
     <w:rPr>
+      <w:color w:val="ff0000"/>
       <w:b/>
-      <w:color w:val="ff0000"/>
     </w:rPr>
   </w:style>
-  <w:style w:type="character" w:styleId="NormalTok" w:customStyle="1">
+  <w:style w:type="character" w:customStyle="1" w:styleId="NormalTok">
     <w:name w:val="NormalTok"/>
     <w:basedOn w:val="VerbatimChar"/>
     <w:rPr/>

</xml_diff>

<commit_message>
release: promote ValuePolicy closure to production (2026-08-18)
Source develop: baccbaaaf499a9b6b7d1983a7cd9e4a07eb1bafe
</commit_message>
<xml_diff>
--- a/docs/specs/points-value-policy-phase-1.docx
+++ b/docs/specs/points-value-policy-phase-1.docx
@@ -6,7 +6,7 @@
       <w:pPr>
         <w:pStyle w:val="Heading1"/>
       </w:pPr>
-      <w:bookmarkStart w:name="speccny-价值政策与订单定价快照phase-1" w:id="20"/>
+      <w:bookmarkStart w:id="20" w:name="speccny-价值政策与订单定价快照phase-1"/>
       <w:r>
         <w:t xml:space="preserve">Spec：CNY 价值政策与订单定价快照（Phase 1）</w:t>
       </w:r>
@@ -15,12 +15,14 @@
     <w:tbl>
       <w:tblPr>
         <w:tblStyle w:val="Table"/>
-        <w:tblW w:w="5000" w:type="pct"/>
-        <w:tblLook w:val="04A0"/>
+        <w:tblW w:type="pct" w:w="0.0"/>
+        <w:tblLook w:firstRow="1"/>
       </w:tblPr>
       <w:tblGrid/>
       <w:tr>
-        <w:trPr/>
+        <w:trPr>
+          <w:cnfStyle w:firstRow="1"/>
+        </w:trPr>
         <w:tc>
           <w:tcPr>
             <w:tcBorders>
@@ -123,7 +125,7 @@
               <w:jc w:val="left"/>
             </w:pPr>
             <w:r>
-              <w:t xml:space="preserve">2026-08-17</w:t>
+              <w:t xml:space="preserve">2026-08-18</w:t>
             </w:r>
           </w:p>
         </w:tc>
@@ -147,7 +149,7 @@
               <w:jc w:val="left"/>
             </w:pPr>
             <w:r>
-              <w:t xml:space="preserve">Ready for Implementation — Production Activation Blocked by D-02</w:t>
+              <w:t xml:space="preserve">Implemented — Production Activation Blocked by D-02/D-03</w:t>
             </w:r>
           </w:p>
         </w:tc>
@@ -201,7 +203,37 @@
               <w:rPr>
                 <w:rStyle w:val="VerbatimChar"/>
               </w:rPr>
-              <w:t xml:space="preserve">origin/develop@46253bc</w:t>
+              <w:t xml:space="preserve">origin/develop@c6d21bb</w:t>
+            </w:r>
+            <w:r>
+              <w:t xml:space="preserve">（PR #144 squash merge）</w:t>
+            </w:r>
+          </w:p>
+        </w:tc>
+      </w:tr>
+      <w:tr>
+        <w:tc>
+          <w:p>
+            <w:pPr>
+              <w:pStyle w:val="Compact"/>
+              <w:jc w:val="left"/>
+            </w:pPr>
+            <w:r>
+              <w:t xml:space="preserve">Closure 分支</w:t>
+            </w:r>
+          </w:p>
+        </w:tc>
+        <w:tc>
+          <w:p>
+            <w:pPr>
+              <w:pStyle w:val="Compact"/>
+              <w:jc w:val="left"/>
+            </w:pPr>
+            <w:r>
+              <w:rPr>
+                <w:rStyle w:val="VerbatimChar"/>
+              </w:rPr>
+              <w:t xml:space="preserve">feat/cny-value-policy-phase-1-closure</w:t>
             </w:r>
           </w:p>
         </w:tc>
@@ -297,7 +329,7 @@
       <w:pPr>
         <w:pStyle w:val="Heading2"/>
       </w:pPr>
-      <w:bookmarkStart w:name="X8bdf336b6fd2404de374dec908efa455727feeb" w:id="21"/>
+      <w:bookmarkStart w:id="21" w:name="已冻结决策"/>
       <w:r>
         <w:t xml:space="preserve">0. 已冻结决策</w:t>
       </w:r>
@@ -307,7 +339,7 @@
       <w:pPr>
         <w:pStyle w:val="Heading3"/>
       </w:pPr>
-      <w:bookmarkStart w:name="X7a330a5b93fcbde18d4249b3e5dc37092f744e6" w:id="22"/>
+      <w:bookmarkStart w:id="22" w:name="已批准"/>
       <w:r>
         <w:t xml:space="preserve">0.1 已批准</w:t>
       </w:r>
@@ -316,12 +348,14 @@
     <w:tbl>
       <w:tblPr>
         <w:tblStyle w:val="Table"/>
-        <w:tblW w:w="5000" w:type="pct"/>
-        <w:tblLook w:val="04A0"/>
+        <w:tblW w:type="pct" w:w="0.0"/>
+        <w:tblLook w:firstRow="1"/>
       </w:tblPr>
       <w:tblGrid/>
       <w:tr>
-        <w:trPr/>
+        <w:trPr>
+          <w:cnfStyle w:firstRow="1"/>
+        </w:trPr>
         <w:tc>
           <w:tcPr>
             <w:tcBorders>
@@ -550,7 +584,10 @@
               <w:jc w:val="left"/>
             </w:pPr>
             <w:r>
-              <w:t xml:space="preserve">保留现有 </w:t>
+              <w:t xml:space="preserve">保留现有</w:t>
+            </w:r>
+            <w:r>
+              <w:t xml:space="preserve"> </w:t>
             </w:r>
             <w:r>
               <w:rPr>
@@ -559,7 +596,10 @@
               <w:t xml:space="preserve">price: number</w:t>
             </w:r>
             <w:r>
-              <w:t xml:space="preserve"> 与旧积分扣减链路；新增字段采用加法式兼容</w:t>
+              <w:t xml:space="preserve"> </w:t>
+            </w:r>
+            <w:r>
+              <w:t xml:space="preserve">与旧积分扣减链路；新增字段采用加法式兼容</w:t>
             </w:r>
           </w:p>
         </w:tc>
@@ -569,7 +609,7 @@
       <w:pPr>
         <w:pStyle w:val="Heading3"/>
       </w:pPr>
-      <w:bookmarkStart w:name="X03d4bd81c6817597a516fea90e71d3155c93d46" w:id="23"/>
+      <w:bookmarkStart w:id="23" w:name="仍待批准"/>
       <w:r>
         <w:t xml:space="preserve">0.2 仍待批准</w:t>
       </w:r>
@@ -578,12 +618,14 @@
     <w:tbl>
       <w:tblPr>
         <w:tblStyle w:val="Table"/>
-        <w:tblW w:w="5000" w:type="pct"/>
-        <w:tblLook w:val="04A0"/>
+        <w:tblW w:type="pct" w:w="0.0"/>
+        <w:tblLook w:firstRow="1"/>
       </w:tblPr>
       <w:tblGrid/>
       <w:tr>
-        <w:trPr/>
+        <w:trPr>
+          <w:cnfStyle w:firstRow="1"/>
+        </w:trPr>
         <w:tc>
           <w:tcPr>
             <w:tcBorders>
@@ -732,7 +774,13 @@
               <w:jc w:val="left"/>
             </w:pPr>
             <w:r>
-              <w:t xml:space="preserve">“参考价值，不代表现金赎回承诺”</w:t>
+              <w:t xml:space="preserve">“</w:t>
+            </w:r>
+            <w:r>
+              <w:t xml:space="preserve">参考价值，不代表现金赎回承诺</w:t>
+            </w:r>
+            <w:r>
+              <w:t xml:space="preserve">”</w:t>
             </w:r>
           </w:p>
         </w:tc>
@@ -754,14 +802,37 @@
         <w:pStyle w:val="BodyText"/>
       </w:pPr>
       <w:r>
-        <w:t xml:space="preserve">代码实现可以开始，但生产激活必须等待 D-02。任何 Agent 都不得把候选比例写成代码常量、默认配置或不可撤销的生产 seed。</w:t>
+        <w:t xml:space="preserve">Phase 1 工程实现已完成，但生产激活必须等待 D-02 与 D-03。任何 Agent 都不得把候选比例写成代码常量、默认配置或不可撤销的生产 seed。</w:t>
+      </w:r>
+    </w:p>
+    <w:p>
+      <w:pPr>
+        <w:pStyle w:val="BodyText"/>
+      </w:pPr>
+      <w:r>
+        <w:t xml:space="preserve">这不是</w:t>
+      </w:r>
+      <w:r>
+        <w:t xml:space="preserve"> </w:t>
+      </w:r>
+      <w:r>
+        <w:rPr>
+          <w:rStyle w:val="VerbatimChar"/>
+        </w:rPr>
+        <w:t xml:space="preserve">SPEC-VALUE-LEDGER-001</w:t>
+      </w:r>
+      <w:r>
+        <w:t xml:space="preserve"> </w:t>
+      </w:r>
+      <w:r>
+        <w:t xml:space="preserve">的大 Phase 1（ledger / lot / 双写）。账本规格后续阶段仍未实施。</w:t>
       </w:r>
     </w:p>
     <w:p>
       <w:pPr>
         <w:pStyle w:val="Heading2"/>
       </w:pPr>
-      <w:bookmarkStart w:name="X662d4400b9c2123b441e8dde308a9af7e4d9bca" w:id="24"/>
+      <w:bookmarkStart w:id="24" w:name="目标"/>
       <w:r>
         <w:t xml:space="preserve">1. 目标</w:t>
       </w:r>
@@ -777,14 +848,17 @@
     </w:p>
     <w:p>
       <w:pPr>
-        <w:pStyle w:val="Compact"/>
         <w:numPr>
           <w:ilvl w:val="0"/>
           <w:numId w:val="1001"/>
         </w:numPr>
-      </w:pPr>
-      <w:r>
-        <w:t xml:space="preserve">用不可变、版本化的 </w:t>
+        <w:pStyle w:val="Compact"/>
+      </w:pPr>
+      <w:r>
+        <w:t xml:space="preserve">用不可变、版本化的</w:t>
+      </w:r>
+      <w:r>
+        <w:t xml:space="preserve"> </w:t>
       </w:r>
       <w:r>
         <w:rPr>
@@ -793,16 +867,19 @@
         <w:t xml:space="preserve">ValuePolicy</w:t>
       </w:r>
       <w:r>
-        <w:t xml:space="preserve"> 表达积分和 CNY 的固定关系；</w:t>
-      </w:r>
-    </w:p>
-    <w:p>
-      <w:pPr>
-        <w:pStyle w:val="Compact"/>
+        <w:t xml:space="preserve"> </w:t>
+      </w:r>
+      <w:r>
+        <w:t xml:space="preserve">表达积分和 CNY 的固定关系；</w:t>
+      </w:r>
+    </w:p>
+    <w:p>
+      <w:pPr>
         <w:numPr>
           <w:ilvl w:val="0"/>
           <w:numId w:val="1001"/>
         </w:numPr>
+        <w:pStyle w:val="Compact"/>
       </w:pPr>
       <w:r>
         <w:t xml:space="preserve">使用 BigInt 有理数完成积分到 CNY 原子单位的确定性换算；</w:t>
@@ -810,11 +887,11 @@
     </w:p>
     <w:p>
       <w:pPr>
-        <w:pStyle w:val="Compact"/>
         <w:numPr>
           <w:ilvl w:val="0"/>
           <w:numId w:val="1001"/>
         </w:numPr>
+        <w:pStyle w:val="Compact"/>
       </w:pPr>
       <w:r>
         <w:t xml:space="preserve">在 checkout preview 返回积分价格、CNY 参考价值和政策 ID；</w:t>
@@ -822,11 +899,11 @@
     </w:p>
     <w:p>
       <w:pPr>
-        <w:pStyle w:val="Compact"/>
         <w:numPr>
           <w:ilvl w:val="0"/>
           <w:numId w:val="1001"/>
         </w:numPr>
+        <w:pStyle w:val="Compact"/>
       </w:pPr>
       <w:r>
         <w:t xml:space="preserve">在订单确认事务内重新解析政策、校验客户端政策 ID，并保存定价快照；</w:t>
@@ -834,11 +911,11 @@
     </w:p>
     <w:p>
       <w:pPr>
-        <w:pStyle w:val="Compact"/>
         <w:numPr>
           <w:ilvl w:val="0"/>
           <w:numId w:val="1001"/>
         </w:numPr>
+        <w:pStyle w:val="Compact"/>
       </w:pPr>
       <w:r>
         <w:t xml:space="preserve">保证后续政策变化不会改变既有订单的参考价值；</w:t>
@@ -846,11 +923,11 @@
     </w:p>
     <w:p>
       <w:pPr>
-        <w:pStyle w:val="Compact"/>
         <w:numPr>
           <w:ilvl w:val="0"/>
           <w:numId w:val="1001"/>
         </w:numPr>
+        <w:pStyle w:val="Compact"/>
       </w:pPr>
       <w:r>
         <w:t xml:space="preserve">在功能关闭时保持当前积分、订单、Settlement 和前端契约不变。</w:t>
@@ -860,7 +937,7 @@
       <w:pPr>
         <w:pStyle w:val="Heading2"/>
       </w:pPr>
-      <w:bookmarkStart w:name="X1ea5d00b406c768a32e5d2c1db73f1fb0f6105c" w:id="25"/>
+      <w:bookmarkStart w:id="25" w:name="非目标"/>
       <w:r>
         <w:t xml:space="preserve">2. 非目标</w:t>
       </w:r>
@@ -876,11 +953,11 @@
     </w:p>
     <w:p>
       <w:pPr>
-        <w:pStyle w:val="Compact"/>
         <w:numPr>
           <w:ilvl w:val="0"/>
           <w:numId w:val="1002"/>
         </w:numPr>
+        <w:pStyle w:val="Compact"/>
       </w:pPr>
       <w:r>
         <w:t xml:space="preserve">新双重记账 ledger、lot、RP/VC/XP 拆分；</w:t>
@@ -888,11 +965,11 @@
     </w:p>
     <w:p>
       <w:pPr>
-        <w:pStyle w:val="Compact"/>
         <w:numPr>
           <w:ilvl w:val="0"/>
           <w:numId w:val="1002"/>
         </w:numPr>
+        <w:pStyle w:val="Compact"/>
       </w:pPr>
       <w:r>
         <w:t xml:space="preserve">CNY、USD 或 USDT 充值与真实付款；</w:t>
@@ -900,14 +977,17 @@
     </w:p>
     <w:p>
       <w:pPr>
-        <w:pStyle w:val="Compact"/>
         <w:numPr>
           <w:ilvl w:val="0"/>
           <w:numId w:val="1002"/>
         </w:numPr>
-      </w:pPr>
-      <w:r>
-        <w:t xml:space="preserve">实时 FX 服务或 </w:t>
+        <w:pStyle w:val="Compact"/>
+      </w:pPr>
+      <w:r>
+        <w:t xml:space="preserve">实时 FX 服务或</w:t>
+      </w:r>
+      <w:r>
+        <w:t xml:space="preserve"> </w:t>
       </w:r>
       <w:r>
         <w:rPr>
@@ -916,16 +996,19 @@
         <w:t xml:space="preserve">FxQuote</w:t>
       </w:r>
       <w:r>
-        <w:t xml:space="preserve"> 数据表；</w:t>
-      </w:r>
-    </w:p>
-    <w:p>
-      <w:pPr>
-        <w:pStyle w:val="Compact"/>
+        <w:t xml:space="preserve"> </w:t>
+      </w:r>
+      <w:r>
+        <w:t xml:space="preserve">数据表；</w:t>
+      </w:r>
+    </w:p>
+    <w:p>
+      <w:pPr>
         <w:numPr>
           <w:ilvl w:val="0"/>
           <w:numId w:val="1002"/>
         </w:numPr>
+        <w:pStyle w:val="Compact"/>
       </w:pPr>
       <w:r>
         <w:t xml:space="preserve">用户转账、提现、现金赎回；</w:t>
@@ -933,11 +1016,11 @@
     </w:p>
     <w:p>
       <w:pPr>
-        <w:pStyle w:val="Compact"/>
         <w:numPr>
           <w:ilvl w:val="0"/>
           <w:numId w:val="1002"/>
         </w:numPr>
+        <w:pStyle w:val="Compact"/>
       </w:pPr>
       <w:r>
         <w:t xml:space="preserve">商家法币或稳定币出款；</w:t>
@@ -945,14 +1028,17 @@
     </w:p>
     <w:p>
       <w:pPr>
-        <w:pStyle w:val="Compact"/>
         <w:numPr>
           <w:ilvl w:val="0"/>
           <w:numId w:val="1002"/>
         </w:numPr>
-      </w:pPr>
-      <w:r>
-        <w:t xml:space="preserve">修改当前 </w:t>
+        <w:pStyle w:val="Compact"/>
+      </w:pPr>
+      <w:r>
+        <w:t xml:space="preserve">修改当前</w:t>
+      </w:r>
+      <w:r>
+        <w:t xml:space="preserve"> </w:t>
       </w:r>
       <w:r>
         <w:rPr>
@@ -970,16 +1056,19 @@
         <w:t xml:space="preserve">PointLog</w:t>
       </w:r>
       <w:r>
-        <w:t xml:space="preserve"> 的权威写入语义；</w:t>
-      </w:r>
-    </w:p>
-    <w:p>
-      <w:pPr>
-        <w:pStyle w:val="Compact"/>
+        <w:t xml:space="preserve"> </w:t>
+      </w:r>
+      <w:r>
+        <w:t xml:space="preserve">的权威写入语义；</w:t>
+      </w:r>
+    </w:p>
+    <w:p>
+      <w:pPr>
         <w:numPr>
           <w:ilvl w:val="0"/>
           <w:numId w:val="1002"/>
         </w:numPr>
+        <w:pStyle w:val="Compact"/>
       </w:pPr>
       <w:r>
         <w:t xml:space="preserve">修改会员成长、排行榜或商家 Settlement 计算；</w:t>
@@ -987,11 +1076,11 @@
     </w:p>
     <w:p>
       <w:pPr>
-        <w:pStyle w:val="Compact"/>
         <w:numPr>
           <w:ilvl w:val="0"/>
           <w:numId w:val="1002"/>
         </w:numPr>
+        <w:pStyle w:val="Compact"/>
       </w:pPr>
       <w:r>
         <w:t xml:space="preserve">多租户模型。README 已明确 multi-tenant white-label SaaS 不在当前产品边界内；本阶段按单一平台作用域实现。</w:t>
@@ -1001,7 +1090,7 @@
       <w:pPr>
         <w:pStyle w:val="Heading2"/>
       </w:pPr>
-      <w:bookmarkStart w:name="X44e37b3a9c9545750fe7ae417192f8508c7a844" w:id="26"/>
+      <w:bookmarkStart w:id="26" w:name="当前代码事实与修改边界"/>
       <w:r>
         <w:t xml:space="preserve">3. 当前代码事实与修改边界</w:t>
       </w:r>
@@ -1010,12 +1099,18 @@
     <w:tbl>
       <w:tblPr>
         <w:tblStyle w:val="Table"/>
-        <w:tblW w:w="5000" w:type="pct"/>
-        <w:tblLook w:val="04A0"/>
+        <w:tblW w:type="pct" w:w="5000.0"/>
+        <w:tblLook w:firstRow="1"/>
       </w:tblPr>
-      <w:tblGrid/>
+      <w:tblGrid>
+        <w:gridCol w:w="2640"/>
+        <w:gridCol w:w="2640"/>
+        <w:gridCol w:w="2640"/>
+      </w:tblGrid>
       <w:tr>
-        <w:trPr/>
+        <w:trPr>
+          <w:cnfStyle w:firstRow="1"/>
+        </w:trPr>
         <w:tc>
           <w:tcPr>
             <w:tcBorders>
@@ -1076,7 +1171,10 @@
               <w:jc w:val="left"/>
             </w:pPr>
             <w:r>
-              <w:t xml:space="preserve">可用/冻结积分为 </w:t>
+              <w:t xml:space="preserve">可用/冻结积分为</w:t>
+            </w:r>
+            <w:r>
+              <w:t xml:space="preserve"> </w:t>
             </w:r>
             <w:r>
               <w:rPr>
@@ -1120,7 +1218,10 @@
               <w:jc w:val="left"/>
             </w:pPr>
             <w:r>
-              <w:t xml:space="preserve">SKU 价格为 </w:t>
+              <w:t xml:space="preserve">SKU 价格为</w:t>
+            </w:r>
+            <w:r>
+              <w:t xml:space="preserve"> </w:t>
             </w:r>
             <w:r>
               <w:rPr>
@@ -1164,7 +1265,10 @@
               <w:jc w:val="left"/>
             </w:pPr>
             <w:r>
-              <w:t xml:space="preserve">checkout preview 返回 </w:t>
+              <w:t xml:space="preserve">checkout preview 返回</w:t>
+            </w:r>
+            <w:r>
+              <w:t xml:space="preserve"> </w:t>
             </w:r>
             <w:r>
               <w:rPr>
@@ -1195,7 +1299,10 @@
               <w:jc w:val="left"/>
             </w:pPr>
             <w:r>
-              <w:t xml:space="preserve">保留并新增 </w:t>
+              <w:t xml:space="preserve">保留并新增</w:t>
+            </w:r>
+            <w:r>
+              <w:t xml:space="preserve"> </w:t>
             </w:r>
             <w:r>
               <w:rPr>
@@ -1204,7 +1311,10 @@
               <w:t xml:space="preserve">pricing</w:t>
             </w:r>
             <w:r>
-              <w:t xml:space="preserve"> 对象</w:t>
+              <w:t xml:space="preserve"> </w:t>
+            </w:r>
+            <w:r>
+              <w:t xml:space="preserve">对象</w:t>
             </w:r>
           </w:p>
         </w:tc>
@@ -1217,7 +1327,10 @@
               <w:jc w:val="left"/>
             </w:pPr>
             <w:r>
-              <w:t xml:space="preserve">创建订单校验 </w:t>
+              <w:t xml:space="preserve">创建订单校验</w:t>
+            </w:r>
+            <w:r>
+              <w:t xml:space="preserve"> </w:t>
             </w:r>
             <w:r>
               <w:rPr>
@@ -1257,7 +1370,10 @@
               <w:jc w:val="left"/>
             </w:pPr>
             <w:r>
-              <w:t xml:space="preserve">新增 </w:t>
+              <w:t xml:space="preserve">新增</w:t>
+            </w:r>
+            <w:r>
+              <w:t xml:space="preserve"> </w:t>
             </w:r>
             <w:r>
               <w:rPr>
@@ -1266,7 +1382,10 @@
               <w:t xml:space="preserve">expectedValuePolicyId</w:t>
             </w:r>
             <w:r>
-              <w:t xml:space="preserve"> 校验</w:t>
+              <w:t xml:space="preserve"> </w:t>
+            </w:r>
+            <w:r>
+              <w:t xml:space="preserve">校验</w:t>
             </w:r>
           </w:p>
         </w:tc>
@@ -1304,7 +1423,10 @@
               <w:jc w:val="left"/>
             </w:pPr>
             <w:r>
-              <w:t xml:space="preserve">新增一对一 </w:t>
+              <w:t xml:space="preserve">新增一对一</w:t>
+            </w:r>
+            <w:r>
+              <w:t xml:space="preserve"> </w:t>
             </w:r>
             <w:r>
               <w:rPr>
@@ -1323,7 +1445,10 @@
               <w:jc w:val="left"/>
             </w:pPr>
             <w:r>
-              <w:t xml:space="preserve">当前佣金使用 </w:t>
+              <w:t xml:space="preserve">当前佣金使用</w:t>
+            </w:r>
+            <w:r>
+              <w:t xml:space="preserve"> </w:t>
             </w:r>
             <w:r>
               <w:rPr>
@@ -1410,7 +1535,7 @@
       <w:pPr>
         <w:pStyle w:val="Heading2"/>
       </w:pPr>
-      <w:bookmarkStart w:name="X9a50f3333a7832096da45188296290e8265d359" w:id="27"/>
+      <w:bookmarkStart w:id="27" w:name="总体流程"/>
       <w:r>
         <w:t xml:space="preserve">4. 总体流程</w:t>
       </w:r>
@@ -1550,7 +1675,7 @@
       <w:pPr>
         <w:pStyle w:val="Heading2"/>
       </w:pPr>
-      <w:bookmarkStart w:name="X604a67222ed80749c6faa92ee1683f37ba079d7" w:id="28"/>
+      <w:bookmarkStart w:id="28" w:name="功能模式与上线安全"/>
       <w:r>
         <w:t xml:space="preserve">5. 功能模式与上线安全</w:t>
       </w:r>
@@ -1578,12 +1703,17 @@
     <w:tbl>
       <w:tblPr>
         <w:tblStyle w:val="Table"/>
-        <w:tblW w:w="5000" w:type="pct"/>
-        <w:tblLook w:val="04A0"/>
+        <w:tblW w:type="pct" w:w="5000.0"/>
+        <w:tblLook w:firstRow="1"/>
       </w:tblPr>
-      <w:tblGrid/>
+      <w:tblGrid>
+        <w:gridCol w:w="3960"/>
+        <w:gridCol w:w="3960"/>
+      </w:tblGrid>
       <w:tr>
-        <w:trPr/>
+        <w:trPr>
+          <w:cnfStyle w:firstRow="1"/>
+        </w:trPr>
         <w:tc>
           <w:tcPr>
             <w:tcBorders>
@@ -1668,7 +1798,10 @@
               <w:jc w:val="left"/>
             </w:pPr>
             <w:r>
-              <w:t xml:space="preserve">要求 active CNY policy；返回并保存新定价数据，但 </w:t>
+              <w:t xml:space="preserve">要求 active CNY policy；返回并保存新定价数据，但</w:t>
+            </w:r>
+            <w:r>
+              <w:t xml:space="preserve"> </w:t>
             </w:r>
             <w:r>
               <w:rPr>
@@ -1677,7 +1810,10 @@
               <w:t xml:space="preserve">expectedValuePolicyId</w:t>
             </w:r>
             <w:r>
-              <w:t xml:space="preserve"> 暂为可选。若客户端传入则必须校验。</w:t>
+              <w:t xml:space="preserve"> </w:t>
+            </w:r>
+            <w:r>
+              <w:t xml:space="preserve">暂为可选。若客户端传入则必须校验。</w:t>
             </w:r>
           </w:p>
         </w:tc>
@@ -1704,7 +1840,10 @@
               <w:jc w:val="left"/>
             </w:pPr>
             <w:r>
-              <w:t xml:space="preserve">要求 active CNY policy；创建订单必须携带 </w:t>
+              <w:t xml:space="preserve">要求 active CNY policy；创建订单必须携带</w:t>
+            </w:r>
+            <w:r>
+              <w:t xml:space="preserve"> </w:t>
             </w:r>
             <w:r>
               <w:rPr>
@@ -1729,14 +1868,17 @@
     </w:p>
     <w:p>
       <w:pPr>
-        <w:pStyle w:val="Compact"/>
         <w:numPr>
           <w:ilvl w:val="0"/>
           <w:numId w:val="1003"/>
         </w:numPr>
-      </w:pPr>
-      <w:r>
-        <w:t xml:space="preserve">生产默认必须是 </w:t>
+        <w:pStyle w:val="Compact"/>
+      </w:pPr>
+      <w:r>
+        <w:t xml:space="preserve">生产默认必须是</w:t>
+      </w:r>
+      <w:r>
+        <w:t xml:space="preserve"> </w:t>
       </w:r>
       <w:r>
         <w:rPr>
@@ -1745,7 +1887,10 @@
         <w:t xml:space="preserve">off</w:t>
       </w:r>
       <w:r>
-        <w:t xml:space="preserve">；D-02 批准前不得切到 </w:t>
+        <w:t xml:space="preserve">；D-02 批准前不得切到</w:t>
+      </w:r>
+      <w:r>
+        <w:t xml:space="preserve"> </w:t>
       </w:r>
       <w:r>
         <w:rPr>
@@ -1754,7 +1899,13 @@
         <w:t xml:space="preserve">shadow</w:t>
       </w:r>
       <w:r>
-        <w:t xml:space="preserve"> 或 </w:t>
+        <w:t xml:space="preserve"> </w:t>
+      </w:r>
+      <w:r>
+        <w:t xml:space="preserve">或</w:t>
+      </w:r>
+      <w:r>
+        <w:t xml:space="preserve"> </w:t>
       </w:r>
       <w:r>
         <w:rPr>
@@ -1768,11 +1919,11 @@
     </w:p>
     <w:p>
       <w:pPr>
-        <w:pStyle w:val="Compact"/>
         <w:numPr>
           <w:ilvl w:val="0"/>
           <w:numId w:val="1003"/>
         </w:numPr>
+        <w:pStyle w:val="Compact"/>
       </w:pPr>
       <w:r>
         <w:t xml:space="preserve">配置值必须在进程启动时验证；非法值启动失败。</w:t>
@@ -1780,11 +1931,11 @@
     </w:p>
     <w:p>
       <w:pPr>
-        <w:pStyle w:val="Compact"/>
         <w:numPr>
           <w:ilvl w:val="0"/>
           <w:numId w:val="1003"/>
         </w:numPr>
+        <w:pStyle w:val="Compact"/>
       </w:pPr>
       <w:r>
         <w:rPr>
@@ -1793,7 +1944,13 @@
         <w:t xml:space="preserve">shadow/enforce</w:t>
       </w:r>
       <w:r>
-        <w:t xml:space="preserve"> 下无唯一 active CNY policy 时 fail closed，返回 </w:t>
+        <w:t xml:space="preserve"> </w:t>
+      </w:r>
+      <w:r>
+        <w:t xml:space="preserve">下无唯一 active CNY policy 时 fail closed，返回</w:t>
+      </w:r>
+      <w:r>
+        <w:t xml:space="preserve"> </w:t>
       </w:r>
       <w:r>
         <w:rPr>
@@ -1807,11 +1964,11 @@
     </w:p>
     <w:p>
       <w:pPr>
-        <w:pStyle w:val="Compact"/>
         <w:numPr>
           <w:ilvl w:val="0"/>
           <w:numId w:val="1003"/>
         </w:numPr>
+        <w:pStyle w:val="Compact"/>
       </w:pPr>
       <w:r>
         <w:t xml:space="preserve">不得在请求失败时回退到猜测比例或最新历史政策。</w:t>
@@ -1821,7 +1978,7 @@
       <w:pPr>
         <w:pStyle w:val="Heading2"/>
       </w:pPr>
-      <w:bookmarkStart w:name="X81ed8af4eea4c719acfe6454a0404ae0dd5d93f" w:id="29"/>
+      <w:bookmarkStart w:id="29" w:name="数据模型"/>
       <w:r>
         <w:t xml:space="preserve">6. 数据模型</w:t>
       </w:r>
@@ -1839,7 +1996,7 @@
       <w:pPr>
         <w:pStyle w:val="Heading3"/>
       </w:pPr>
-      <w:bookmarkStart w:name="Xcb1a7e14683d35c70504b8e354563abbed9dfaf" w:id="30"/>
+      <w:bookmarkStart w:id="30" w:name="assetdefinition"/>
       <w:r>
         <w:t xml:space="preserve">6.1 AssetDefinition</w:t>
       </w:r>
@@ -1969,12 +2126,14 @@
     <w:tbl>
       <w:tblPr>
         <w:tblStyle w:val="Table"/>
-        <w:tblW w:w="5000" w:type="pct"/>
-        <w:tblLook w:val="04A0"/>
+        <w:tblW w:type="pct" w:w="0.0"/>
+        <w:tblLook w:firstRow="1"/>
       </w:tblPr>
       <w:tblGrid/>
       <w:tr>
-        <w:trPr/>
+        <w:trPr>
+          <w:cnfStyle w:firstRow="1"/>
+        </w:trPr>
         <w:tc>
           <w:tcPr>
             <w:tcBorders>
@@ -2154,7 +2313,10 @@
         <w:pStyle w:val="BodyText"/>
       </w:pPr>
       <w:r>
-        <w:t xml:space="preserve">不得在本阶段创建 </w:t>
+        <w:t xml:space="preserve">不得在本阶段创建</w:t>
+      </w:r>
+      <w:r>
+        <w:t xml:space="preserve"> </w:t>
       </w:r>
       <w:r>
         <w:rPr>
@@ -2163,14 +2325,17 @@
         <w:t xml:space="preserve">USDT</w:t>
       </w:r>
       <w:r>
-        <w:t xml:space="preserve"> 伪法币资产。USD 可以由通用 schema 支持，但不得创建或激活首期生产 USD 价值政策。</w:t>
+        <w:t xml:space="preserve"> </w:t>
+      </w:r>
+      <w:r>
+        <w:t xml:space="preserve">伪法币资产。USD 可以由通用 schema 支持，但不得创建或激活首期生产 USD 价值政策。</w:t>
       </w:r>
     </w:p>
     <w:p>
       <w:pPr>
         <w:pStyle w:val="Heading3"/>
       </w:pPr>
-      <w:bookmarkStart w:name="Xa1bb72b0bfbb1b7b9a957c1d3964324afd2363d" w:id="31"/>
+      <w:bookmarkStart w:id="31" w:name="valuepolicy"/>
       <w:r>
         <w:t xml:space="preserve">6.2 ValuePolicy</w:t>
       </w:r>
@@ -2440,14 +2605,17 @@
     </w:p>
     <w:p>
       <w:pPr>
-        <w:pStyle w:val="Compact"/>
         <w:numPr>
           <w:ilvl w:val="0"/>
           <w:numId w:val="1004"/>
         </w:numPr>
-      </w:pPr>
-      <w:r>
-        <w:t xml:space="preserve">分子和分母均 </w:t>
+        <w:pStyle w:val="Compact"/>
+      </w:pPr>
+      <w:r>
+        <w:t xml:space="preserve">分子和分母均</w:t>
+      </w:r>
+      <w:r>
+        <w:t xml:space="preserve"> </w:t>
       </w:r>
       <w:r>
         <w:rPr>
@@ -2461,11 +2629,11 @@
     </w:p>
     <w:p>
       <w:pPr>
-        <w:pStyle w:val="Compact"/>
         <w:numPr>
           <w:ilvl w:val="0"/>
           <w:numId w:val="1004"/>
         </w:numPr>
+        <w:pStyle w:val="Compact"/>
       </w:pPr>
       <w:r>
         <w:rPr>
@@ -2474,7 +2642,13 @@
         <w:t xml:space="preserve">pointAssetCode</w:t>
       </w:r>
       <w:r>
-        <w:t xml:space="preserve"> 必须指向 </w:t>
+        <w:t xml:space="preserve"> </w:t>
+      </w:r>
+      <w:r>
+        <w:t xml:space="preserve">必须指向</w:t>
+      </w:r>
+      <w:r>
+        <w:t xml:space="preserve"> </w:t>
       </w:r>
       <w:r>
         <w:rPr>
@@ -2492,7 +2666,13 @@
         <w:t xml:space="preserve">referenceAssetCode</w:t>
       </w:r>
       <w:r>
-        <w:t xml:space="preserve"> 必须指向 </w:t>
+        <w:t xml:space="preserve"> </w:t>
+      </w:r>
+      <w:r>
+        <w:t xml:space="preserve">必须指向</w:t>
+      </w:r>
+      <w:r>
+        <w:t xml:space="preserve"> </w:t>
       </w:r>
       <w:r>
         <w:rPr>
@@ -2506,14 +2686,17 @@
     </w:p>
     <w:p>
       <w:pPr>
-        <w:pStyle w:val="Compact"/>
         <w:numPr>
           <w:ilvl w:val="0"/>
           <w:numId w:val="1004"/>
         </w:numPr>
-      </w:pPr>
-      <w:r>
-        <w:t xml:space="preserve">同一平台、同一积分资产最多一个 </w:t>
+        <w:pStyle w:val="Compact"/>
+      </w:pPr>
+      <w:r>
+        <w:t xml:space="preserve">同一平台、同一积分资产最多一个</w:t>
+      </w:r>
+      <w:r>
+        <w:t xml:space="preserve"> </w:t>
       </w:r>
       <w:r>
         <w:rPr>
@@ -2522,19 +2705,25 @@
         <w:t xml:space="preserve">active</w:t>
       </w:r>
       <w:r>
-        <w:t xml:space="preserve"> policy，使用 PostgreSQL partial unique index；</w:t>
-      </w:r>
-    </w:p>
-    <w:p>
-      <w:pPr>
-        <w:pStyle w:val="Compact"/>
+        <w:t xml:space="preserve"> </w:t>
+      </w:r>
+      <w:r>
+        <w:t xml:space="preserve">policy，使用 PostgreSQL partial unique index；</w:t>
+      </w:r>
+    </w:p>
+    <w:p>
+      <w:pPr>
         <w:numPr>
           <w:ilvl w:val="0"/>
           <w:numId w:val="1004"/>
         </w:numPr>
-      </w:pPr>
-      <w:r>
-        <w:t xml:space="preserve">active policy 的 </w:t>
+        <w:pStyle w:val="Compact"/>
+      </w:pPr>
+      <w:r>
+        <w:t xml:space="preserve">active policy 的</w:t>
+      </w:r>
+      <w:r>
+        <w:t xml:space="preserve"> </w:t>
       </w:r>
       <w:r>
         <w:rPr>
@@ -2543,7 +2732,13 @@
         <w:t xml:space="preserve">referenceAssetCode</w:t>
       </w:r>
       <w:r>
-        <w:t xml:space="preserve"> 在首期运行配置中必须是 </w:t>
+        <w:t xml:space="preserve"> </w:t>
+      </w:r>
+      <w:r>
+        <w:t xml:space="preserve">在首期运行配置中必须是</w:t>
+      </w:r>
+      <w:r>
+        <w:t xml:space="preserve"> </w:t>
       </w:r>
       <w:r>
         <w:rPr>
@@ -2557,11 +2752,11 @@
     </w:p>
     <w:p>
       <w:pPr>
-        <w:pStyle w:val="Compact"/>
         <w:numPr>
           <w:ilvl w:val="0"/>
           <w:numId w:val="1004"/>
         </w:numPr>
+        <w:pStyle w:val="Compact"/>
       </w:pPr>
       <w:r>
         <w:rPr>
@@ -2570,16 +2765,19 @@
         <w:t xml:space="preserve">active/retired</w:t>
       </w:r>
       <w:r>
-        <w:t xml:space="preserve"> policy 的经济字段禁止更新；允许的状态与时间戳变化必须受控；</w:t>
-      </w:r>
-    </w:p>
-    <w:p>
-      <w:pPr>
-        <w:pStyle w:val="Compact"/>
+        <w:t xml:space="preserve"> </w:t>
+      </w:r>
+      <w:r>
+        <w:t xml:space="preserve">policy 的经济字段禁止更新；允许的状态与时间戳变化必须受控；</w:t>
+      </w:r>
+    </w:p>
+    <w:p>
+      <w:pPr>
         <w:numPr>
           <w:ilvl w:val="0"/>
           <w:numId w:val="1004"/>
         </w:numPr>
+        <w:pStyle w:val="Compact"/>
       </w:pPr>
       <w:r>
         <w:t xml:space="preserve">生产应用角色不得直接把 draft policy 更新为 active；激活入口不属于本阶段公开 API。</w:t>
@@ -2590,7 +2788,10 @@
         <w:pStyle w:val="FirstParagraph"/>
       </w:pPr>
       <w:r>
-        <w:t xml:space="preserve">候选 </w:t>
+        <w:t xml:space="preserve">候选</w:t>
+      </w:r>
+      <w:r>
+        <w:t xml:space="preserve"> </w:t>
       </w:r>
       <w:r>
         <w:rPr>
@@ -2599,7 +2800,10 @@
         <w:t xml:space="preserve">100 PTS = 1 CNY</w:t>
       </w:r>
       <w:r>
-        <w:t xml:space="preserve"> 的规范化表达是：</w:t>
+        <w:t xml:space="preserve"> </w:t>
+      </w:r>
+      <w:r>
+        <w:t xml:space="preserve">的规范化表达是：</w:t>
       </w:r>
     </w:p>
     <w:p>
@@ -2627,14 +2831,26 @@
         <w:pStyle w:val="FirstParagraph"/>
       </w:pPr>
       <w:r>
-        <w:t xml:space="preserve">因为 CNY scale 为 2，所以一个积分对应一个“分”。这只是测试夹具，D-02 批准前不得作为生产 active policy seed。</w:t>
+        <w:t xml:space="preserve">因为 CNY scale 为 2，所以一个积分对应一个</w:t>
+      </w:r>
+      <w:r>
+        <w:t xml:space="preserve">“</w:t>
+      </w:r>
+      <w:r>
+        <w:t xml:space="preserve">分</w:t>
+      </w:r>
+      <w:r>
+        <w:t xml:space="preserve">”</w:t>
+      </w:r>
+      <w:r>
+        <w:t xml:space="preserve">。这只是测试夹具，D-02 批准前不得作为生产 active policy seed。</w:t>
       </w:r>
     </w:p>
     <w:p>
       <w:pPr>
         <w:pStyle w:val="Heading3"/>
       </w:pPr>
-      <w:bookmarkStart w:name="X3321c6e0ccdede8e107cce394c63bddb83dbacd" w:id="32"/>
+      <w:bookmarkStart w:id="32" w:name="orderpricingsnapshot"/>
       <w:r>
         <w:t xml:space="preserve">6.3 OrderPricingSnapshot</w:t>
       </w:r>
@@ -2763,11 +2979,11 @@
     </w:p>
     <w:p>
       <w:pPr>
-        <w:pStyle w:val="Compact"/>
         <w:numPr>
           <w:ilvl w:val="0"/>
           <w:numId w:val="1005"/>
         </w:numPr>
+        <w:pStyle w:val="Compact"/>
       </w:pPr>
       <w:r>
         <w:t xml:space="preserve">每个启用新政策后创建的订单恰好一个 snapshot；</w:t>
@@ -2775,11 +2991,11 @@
     </w:p>
     <w:p>
       <w:pPr>
-        <w:pStyle w:val="Compact"/>
         <w:numPr>
           <w:ilvl w:val="0"/>
           <w:numId w:val="1005"/>
         </w:numPr>
+        <w:pStyle w:val="Compact"/>
       </w:pPr>
       <w:r>
         <w:t xml:space="preserve">snapshot 与 Order 必须在同一数据库事务提交；</w:t>
@@ -2787,11 +3003,11 @@
     </w:p>
     <w:p>
       <w:pPr>
-        <w:pStyle w:val="Compact"/>
         <w:numPr>
           <w:ilvl w:val="0"/>
           <w:numId w:val="1005"/>
         </w:numPr>
+        <w:pStyle w:val="Compact"/>
       </w:pPr>
       <w:r>
         <w:t xml:space="preserve">snapshot 创建后禁止 UPDATE/DELETE；</w:t>
@@ -2799,11 +3015,11 @@
     </w:p>
     <w:p>
       <w:pPr>
-        <w:pStyle w:val="Compact"/>
         <w:numPr>
           <w:ilvl w:val="0"/>
           <w:numId w:val="1005"/>
         </w:numPr>
+        <w:pStyle w:val="Compact"/>
       </w:pPr>
       <w:r>
         <w:rPr>
@@ -2812,7 +3028,13 @@
         <w:t xml:space="preserve">pointsAmountAtomic</w:t>
       </w:r>
       <w:r>
-        <w:t xml:space="preserve"> 必须等于确认时的 </w:t>
+        <w:t xml:space="preserve"> </w:t>
+      </w:r>
+      <w:r>
+        <w:t xml:space="preserve">必须等于确认时的</w:t>
+      </w:r>
+      <w:r>
+        <w:t xml:space="preserve"> </w:t>
       </w:r>
       <w:r>
         <w:rPr>
@@ -2826,11 +3048,11 @@
     </w:p>
     <w:p>
       <w:pPr>
-        <w:pStyle w:val="Compact"/>
         <w:numPr>
           <w:ilvl w:val="0"/>
           <w:numId w:val="1005"/>
         </w:numPr>
+        <w:pStyle w:val="Compact"/>
       </w:pPr>
       <w:r>
         <w:rPr>
@@ -2839,16 +3061,19 @@
         <w:t xml:space="preserve">referenceAssetCode</w:t>
       </w:r>
       <w:r>
-        <w:t xml:space="preserve"> 必须等于政策的 reference asset；</w:t>
-      </w:r>
-    </w:p>
-    <w:p>
-      <w:pPr>
-        <w:pStyle w:val="Compact"/>
+        <w:t xml:space="preserve"> </w:t>
+      </w:r>
+      <w:r>
+        <w:t xml:space="preserve">必须等于政策的 reference asset；</w:t>
+      </w:r>
+    </w:p>
+    <w:p>
+      <w:pPr>
         <w:numPr>
           <w:ilvl w:val="0"/>
           <w:numId w:val="1005"/>
         </w:numPr>
+        <w:pStyle w:val="Compact"/>
       </w:pPr>
       <w:r>
         <w:t xml:space="preserve">历史订单暂不回填虚构参考价值；M3 迁移另立任务。</w:t>
@@ -2858,7 +3083,7 @@
       <w:pPr>
         <w:pStyle w:val="Heading2"/>
       </w:pPr>
-      <w:bookmarkStart w:name="Xb49b878abb4517edb5a122157a79e9d38139d67" w:id="33"/>
+      <w:bookmarkStart w:id="33" w:name="精确换算契约"/>
       <w:r>
         <w:t xml:space="preserve">7. 精确换算契约</w:t>
       </w:r>
@@ -3138,11 +3363,11 @@
     </w:p>
     <w:p>
       <w:pPr>
-        <w:pStyle w:val="Compact"/>
         <w:numPr>
           <w:ilvl w:val="0"/>
           <w:numId w:val="1006"/>
         </w:numPr>
+        <w:pStyle w:val="Compact"/>
       </w:pPr>
       <w:r>
         <w:t xml:space="preserve">输入积分、分子和分母必须非负/正值并显式校验；</w:t>
@@ -3150,14 +3375,17 @@
     </w:p>
     <w:p>
       <w:pPr>
-        <w:pStyle w:val="Compact"/>
         <w:numPr>
           <w:ilvl w:val="0"/>
           <w:numId w:val="1006"/>
         </w:numPr>
-      </w:pPr>
-      <w:r>
-        <w:t xml:space="preserve">禁止使用 JavaScript </w:t>
+        <w:pStyle w:val="Compact"/>
+      </w:pPr>
+      <w:r>
+        <w:t xml:space="preserve">禁止使用 JavaScript</w:t>
+      </w:r>
+      <w:r>
+        <w:t xml:space="preserve"> </w:t>
       </w:r>
       <w:r>
         <w:rPr>
@@ -3171,11 +3399,11 @@
     </w:p>
     <w:p>
       <w:pPr>
-        <w:pStyle w:val="Compact"/>
         <w:numPr>
           <w:ilvl w:val="0"/>
           <w:numId w:val="1006"/>
         </w:numPr>
+        <w:pStyle w:val="Compact"/>
       </w:pPr>
       <w:r>
         <w:t xml:space="preserve">中间计算全部使用 BigInt；</w:t>
@@ -3183,14 +3411,17 @@
     </w:p>
     <w:p>
       <w:pPr>
-        <w:pStyle w:val="Compact"/>
         <w:numPr>
           <w:ilvl w:val="0"/>
           <w:numId w:val="1006"/>
         </w:numPr>
-      </w:pPr>
-      <w:r>
-        <w:t xml:space="preserve">非整除时只允许 </w:t>
+        <w:pStyle w:val="Compact"/>
+      </w:pPr>
+      <w:r>
+        <w:t xml:space="preserve">非整除时只允许</w:t>
+      </w:r>
+      <w:r>
+        <w:t xml:space="preserve"> </w:t>
       </w:r>
       <w:r>
         <w:rPr>
@@ -3204,11 +3435,11 @@
     </w:p>
     <w:p>
       <w:pPr>
-        <w:pStyle w:val="Compact"/>
         <w:numPr>
           <w:ilvl w:val="0"/>
           <w:numId w:val="1006"/>
         </w:numPr>
+        <w:pStyle w:val="Compact"/>
       </w:pPr>
       <w:r>
         <w:t xml:space="preserve">输出不得为负；</w:t>
@@ -3216,11 +3447,11 @@
     </w:p>
     <w:p>
       <w:pPr>
-        <w:pStyle w:val="Compact"/>
         <w:numPr>
           <w:ilvl w:val="0"/>
           <w:numId w:val="1006"/>
         </w:numPr>
+        <w:pStyle w:val="Compact"/>
       </w:pPr>
       <w:r>
         <w:t xml:space="preserve">API 序列化必须使用十进制字符串；</w:t>
@@ -3228,11 +3459,11 @@
     </w:p>
     <w:p>
       <w:pPr>
-        <w:pStyle w:val="Compact"/>
         <w:numPr>
           <w:ilvl w:val="0"/>
           <w:numId w:val="1006"/>
         </w:numPr>
+        <w:pStyle w:val="Compact"/>
       </w:pPr>
       <w:r>
         <w:t xml:space="preserve">不得在调用方复制换算公式。</w:t>
@@ -3270,7 +3501,7 @@
       <w:pPr>
         <w:pStyle w:val="Heading2"/>
       </w:pPr>
-      <w:bookmarkStart w:name="X9306588b500df9432f44aea0c16d6c781d602e7" w:id="34"/>
+      <w:bookmarkStart w:id="34" w:name="api-契约"/>
       <w:r>
         <w:t xml:space="preserve">8. API 契约</w:t>
       </w:r>
@@ -3280,7 +3511,7 @@
       <w:pPr>
         <w:pStyle w:val="Heading3"/>
       </w:pPr>
-      <w:bookmarkStart w:name="X0b3365d43729c5295f8096b09f201a21407b296" w:id="35"/>
+      <w:bookmarkStart w:id="35" w:name="当前价值政策"/>
       <w:r>
         <w:t xml:space="preserve">8.1 当前价值政策</w:t>
       </w:r>
@@ -3316,7 +3547,10 @@
         <w:t xml:space="preserve">shadow/enforce</w:t>
       </w:r>
       <w:r>
-        <w:t xml:space="preserve"> 成功响应：</w:t>
+        <w:t xml:space="preserve"> </w:t>
+      </w:r>
+      <w:r>
+        <w:t xml:space="preserve">成功响应：</w:t>
       </w:r>
     </w:p>
     <w:p>
@@ -3884,7 +4118,13 @@
         <w:t xml:space="preserve">off</w:t>
       </w:r>
       <w:r>
-        <w:t xml:space="preserve"> 模式返回 </w:t>
+        <w:t xml:space="preserve"> </w:t>
+      </w:r>
+      <w:r>
+        <w:t xml:space="preserve">模式返回</w:t>
+      </w:r>
+      <w:r>
+        <w:t xml:space="preserve"> </w:t>
       </w:r>
       <w:r>
         <w:rPr>
@@ -3900,7 +4140,7 @@
       <w:pPr>
         <w:pStyle w:val="Heading3"/>
       </w:pPr>
-      <w:bookmarkStart w:name="X2410748e844ca7fc6bf0897b94503733c2654a0" w:id="36"/>
+      <w:bookmarkStart w:id="36" w:name="checkout-preview"/>
       <w:r>
         <w:t xml:space="preserve">8.2 Checkout preview</w:t>
       </w:r>
@@ -4359,14 +4599,17 @@
         <w:t xml:space="preserve">price</w:t>
       </w:r>
       <w:r>
-        <w:t xml:space="preserve"> 继续作为兼容字段。本阶段不得把它直接改为对象，以免破坏现有前端和客户端。</w:t>
+        <w:t xml:space="preserve"> </w:t>
+      </w:r>
+      <w:r>
+        <w:t xml:space="preserve">继续作为兼容字段。本阶段不得把它直接改为对象，以免破坏现有前端和客户端。</w:t>
       </w:r>
     </w:p>
     <w:p>
       <w:pPr>
         <w:pStyle w:val="Heading3"/>
       </w:pPr>
-      <w:bookmarkStart w:name="X35e37ac4a3e610405f05840fde6f56f26181ac6" w:id="37"/>
+      <w:bookmarkStart w:id="37" w:name="创建订单"/>
       <w:r>
         <w:t xml:space="preserve">8.3 创建订单</w:t>
       </w:r>
@@ -4443,26 +4686,29 @@
     </w:p>
     <w:p>
       <w:pPr>
-        <w:pStyle w:val="Compact"/>
         <w:numPr>
           <w:ilvl w:val="0"/>
           <w:numId w:val="1007"/>
         </w:numPr>
-      </w:pPr>
-      <w:r>
-        <w:rPr>
-          <w:rStyle w:val="VerbatimChar"/>
-        </w:rPr>
-        <w:t xml:space="preserve">off：容忍并忽略格式合法的可选新字段，不写 snapshot，以便客户端可提前发布；</w:t>
-      </w:r>
-    </w:p>
-    <w:p>
-      <w:pPr>
-        <w:pStyle w:val="Compact"/>
+        <w:pStyle w:val="Compact"/>
+      </w:pPr>
+      <w:r>
+        <w:rPr>
+          <w:rStyle w:val="VerbatimChar"/>
+        </w:rPr>
+        <w:t xml:space="preserve">off</w:t>
+      </w:r>
+      <w:r>
+        <w:t xml:space="preserve">：容忍并忽略格式合法的可选新字段，不写 snapshot，以便客户端可提前发布；</w:t>
+      </w:r>
+    </w:p>
+    <w:p>
+      <w:pPr>
         <w:numPr>
           <w:ilvl w:val="0"/>
           <w:numId w:val="1007"/>
         </w:numPr>
+        <w:pStyle w:val="Compact"/>
       </w:pPr>
       <w:r>
         <w:rPr>
@@ -4476,11 +4722,11 @@
     </w:p>
     <w:p>
       <w:pPr>
-        <w:pStyle w:val="Compact"/>
         <w:numPr>
           <w:ilvl w:val="0"/>
           <w:numId w:val="1007"/>
         </w:numPr>
+        <w:pStyle w:val="Compact"/>
       </w:pPr>
       <w:r>
         <w:rPr>
@@ -4489,7 +4735,10 @@
         <w:t xml:space="preserve">enforce</w:t>
       </w:r>
       <w:r>
-        <w:t xml:space="preserve">：字段必填；缺失返回 </w:t>
+        <w:t xml:space="preserve">：字段必填；缺失返回</w:t>
+      </w:r>
+      <w:r>
+        <w:t xml:space="preserve"> </w:t>
       </w:r>
       <w:r>
         <w:rPr>
@@ -4503,14 +4752,17 @@
     </w:p>
     <w:p>
       <w:pPr>
-        <w:pStyle w:val="Compact"/>
         <w:numPr>
           <w:ilvl w:val="0"/>
           <w:numId w:val="1007"/>
         </w:numPr>
-      </w:pPr>
-      <w:r>
-        <w:t xml:space="preserve">ID 不一致、政策已 retired、尚未生效或基准币不是 CNY：返回 </w:t>
+        <w:pStyle w:val="Compact"/>
+      </w:pPr>
+      <w:r>
+        <w:t xml:space="preserve">ID 不一致、政策已 retired、尚未生效或基准币不是 CNY：返回</w:t>
+      </w:r>
+      <w:r>
+        <w:t xml:space="preserve"> </w:t>
       </w:r>
       <w:r>
         <w:rPr>
@@ -4524,11 +4776,11 @@
     </w:p>
     <w:p>
       <w:pPr>
-        <w:pStyle w:val="Compact"/>
         <w:numPr>
           <w:ilvl w:val="0"/>
           <w:numId w:val="1007"/>
         </w:numPr>
+        <w:pStyle w:val="Compact"/>
       </w:pPr>
       <w:r>
         <w:t xml:space="preserve">所有拒绝路径不得创建 Order、PointLog、Settlement、InventoryLog 或 snapshot，也不得改变余额/库存。</w:t>
@@ -4536,10 +4788,268 @@
     </w:p>
     <w:p>
       <w:pPr>
+        <w:pStyle w:val="Heading3"/>
+      </w:pPr>
+      <w:bookmarkStart w:id="38" w:name="X66f44ae43a31ba89d5e52284fbc8a1270b3f474"/>
+      <w:r>
+        <w:t xml:space="preserve">8.4 Implementation clarification（错误码优先级，2026-08-18 冻结）</w:t>
+      </w:r>
+      <w:bookmarkEnd w:id="38"/>
+    </w:p>
+    <w:p>
+      <w:pPr>
         <w:pStyle w:val="FirstParagraph"/>
       </w:pPr>
       <w:r>
-        <w:t xml:space="preserve">订单成功响应和订单详情新增 </w:t>
+        <w:t xml:space="preserve">第 5 节</w:t>
+      </w:r>
+      <w:r>
+        <w:t xml:space="preserve">“</w:t>
+      </w:r>
+      <w:r>
+        <w:t xml:space="preserve">无 active 返回 503</w:t>
+      </w:r>
+      <w:r>
+        <w:t xml:space="preserve">”</w:t>
+      </w:r>
+      <w:r>
+        <w:t xml:space="preserve">与第 8.3 节</w:t>
+      </w:r>
+      <w:r>
+        <w:t xml:space="preserve">“</w:t>
+      </w:r>
+      <w:r>
+        <w:t xml:space="preserve">retired/future expected ID 返回 409</w:t>
+      </w:r>
+      <w:r>
+        <w:t xml:space="preserve">”</w:t>
+      </w:r>
+      <w:r>
+        <w:t xml:space="preserve"> </w:t>
+      </w:r>
+      <w:r>
+        <w:t xml:space="preserve">同时成立时，按以下冻结解释执行，不得静默改契约：</w:t>
+      </w:r>
+    </w:p>
+    <w:p>
+      <w:pPr>
+        <w:numPr>
+          <w:ilvl w:val="0"/>
+          <w:numId w:val="1008"/>
+        </w:numPr>
+        <w:pStyle w:val="Compact"/>
+      </w:pPr>
+      <w:r>
+        <w:t xml:space="preserve">客户端提交了具体但失效的政策确认（unknown / draft / approved /</w:t>
+      </w:r>
+      <w:r>
+        <w:t xml:space="preserve"> </w:t>
+      </w:r>
+      <w:r>
+        <w:t xml:space="preserve">scheduled / retired / future / 非 CNY / 与当前唯一 active CNY policy</w:t>
+      </w:r>
+      <w:r>
+        <w:t xml:space="preserve"> </w:t>
+      </w:r>
+      <w:r>
+        <w:t xml:space="preserve">不一致）→</w:t>
+      </w:r>
+      <w:r>
+        <w:t xml:space="preserve"> </w:t>
+      </w:r>
+      <w:r>
+        <w:rPr>
+          <w:rStyle w:val="VerbatimChar"/>
+        </w:rPr>
+        <w:t xml:space="preserve">409 VALUE_POLICY_CHANGED</w:t>
+      </w:r>
+      <w:r>
+        <w:t xml:space="preserve">。即使系统当前没有可用替换政策，</w:t>
+      </w:r>
+      <w:r>
+        <w:t xml:space="preserve"> </w:t>
+      </w:r>
+      <w:r>
+        <w:t xml:space="preserve">也优先 409。</w:t>
+      </w:r>
+    </w:p>
+    <w:p>
+      <w:pPr>
+        <w:numPr>
+          <w:ilvl w:val="0"/>
+          <w:numId w:val="1008"/>
+        </w:numPr>
+        <w:pStyle w:val="Compact"/>
+      </w:pPr>
+      <w:r>
+        <w:t xml:space="preserve">shadow 客户端没有提交政策 ID，且系统没有唯一可用 active CNY policy →</w:t>
+      </w:r>
+      <w:r>
+        <w:t xml:space="preserve"> </w:t>
+      </w:r>
+      <w:r>
+        <w:rPr>
+          <w:rStyle w:val="VerbatimChar"/>
+        </w:rPr>
+        <w:t xml:space="preserve">503 VALUE_POLICY_UNAVAILABLE</w:t>
+      </w:r>
+      <w:r>
+        <w:t xml:space="preserve">。</w:t>
+      </w:r>
+    </w:p>
+    <w:p>
+      <w:pPr>
+        <w:numPr>
+          <w:ilvl w:val="0"/>
+          <w:numId w:val="1008"/>
+        </w:numPr>
+        <w:pStyle w:val="Compact"/>
+      </w:pPr>
+      <w:r>
+        <w:t xml:space="preserve">enforce 缺少</w:t>
+      </w:r>
+      <w:r>
+        <w:t xml:space="preserve"> </w:t>
+      </w:r>
+      <w:r>
+        <w:rPr>
+          <w:rStyle w:val="VerbatimChar"/>
+        </w:rPr>
+        <w:t xml:space="preserve">expectedValuePolicyId</w:t>
+      </w:r>
+      <w:r>
+        <w:t xml:space="preserve"> </w:t>
+      </w:r>
+      <w:r>
+        <w:t xml:space="preserve">→</w:t>
+      </w:r>
+      <w:r>
+        <w:t xml:space="preserve"> </w:t>
+      </w:r>
+      <w:r>
+        <w:rPr>
+          <w:rStyle w:val="VerbatimChar"/>
+        </w:rPr>
+        <w:t xml:space="preserve">400 VALUE_POLICY_REQUIRED</w:t>
+      </w:r>
+      <w:r>
+        <w:t xml:space="preserve">，</w:t>
+      </w:r>
+      <w:r>
+        <w:t xml:space="preserve"> </w:t>
+      </w:r>
+      <w:r>
+        <w:t xml:space="preserve">且必须发生在任何余额、库存、订单、PointLog、Settlement、InventoryLog、</w:t>
+      </w:r>
+      <w:r>
+        <w:t xml:space="preserve"> </w:t>
+      </w:r>
+      <w:r>
+        <w:t xml:space="preserve">outbox、snapshot 副作用之前。</w:t>
+      </w:r>
+    </w:p>
+    <w:p>
+      <w:pPr>
+        <w:numPr>
+          <w:ilvl w:val="0"/>
+          <w:numId w:val="1008"/>
+        </w:numPr>
+        <w:pStyle w:val="Compact"/>
+      </w:pPr>
+      <w:r>
+        <w:t xml:space="preserve">数据库存在 active CNY policy，但其比例、kind、scale、enabled、</w:t>
+      </w:r>
+      <w:r>
+        <w:t xml:space="preserve"> </w:t>
+      </w:r>
+      <w:r>
+        <w:t xml:space="preserve">retiredAt、rounding 等内部数据违反不变量 →</w:t>
+      </w:r>
+      <w:r>
+        <w:t xml:space="preserve"> </w:t>
+      </w:r>
+      <w:r>
+        <w:rPr>
+          <w:rStyle w:val="VerbatimChar"/>
+        </w:rPr>
+        <w:t xml:space="preserve">500 VALUE_POLICY_DATA_INVALID</w:t>
+      </w:r>
+      <w:r>
+        <w:t xml:space="preserve">。</w:t>
+      </w:r>
+      <w:r>
+        <w:t xml:space="preserve"> </w:t>
+      </w:r>
+      <w:r>
+        <w:t xml:space="preserve">无论客户端是否携带</w:t>
+      </w:r>
+      <w:r>
+        <w:t xml:space="preserve"> </w:t>
+      </w:r>
+      <w:r>
+        <w:rPr>
+          <w:rStyle w:val="VerbatimChar"/>
+        </w:rPr>
+        <w:t xml:space="preserve">expectedValuePolicyId</w:t>
+      </w:r>
+      <w:r>
+        <w:t xml:space="preserve">、ID 是否与损坏行一致，</w:t>
+      </w:r>
+      <w:r>
+        <w:t xml:space="preserve"> </w:t>
+      </w:r>
+      <w:r>
+        <w:t xml:space="preserve">一律 500；不得降级为 409，不得回退到历史比例或猜测值。</w:t>
+      </w:r>
+    </w:p>
+    <w:p>
+      <w:pPr>
+        <w:numPr>
+          <w:ilvl w:val="0"/>
+          <w:numId w:val="1008"/>
+        </w:numPr>
+        <w:pStyle w:val="Compact"/>
+      </w:pPr>
+      <w:r>
+        <w:rPr>
+          <w:rStyle w:val="VerbatimChar"/>
+        </w:rPr>
+        <w:t xml:space="preserve">off</w:t>
+      </w:r>
+      <w:r>
+        <w:t xml:space="preserve"> </w:t>
+      </w:r>
+      <w:r>
+        <w:t xml:space="preserve">忽略格式合法的</w:t>
+      </w:r>
+      <w:r>
+        <w:t xml:space="preserve"> </w:t>
+      </w:r>
+      <w:r>
+        <w:rPr>
+          <w:rStyle w:val="VerbatimChar"/>
+        </w:rPr>
+        <w:t xml:space="preserve">expectedValuePolicyId</w:t>
+      </w:r>
+      <w:r>
+        <w:t xml:space="preserve">，不查询 policy，不返回</w:t>
+      </w:r>
+      <w:r>
+        <w:t xml:space="preserve"> </w:t>
+      </w:r>
+      <w:r>
+        <w:t xml:space="preserve">pricing，不写 snapshot。</w:t>
+      </w:r>
+    </w:p>
+    <w:p>
+      <w:pPr>
+        <w:pStyle w:val="FirstParagraph"/>
+      </w:pPr>
+      <w:r>
+        <w:t xml:space="preserve">订单成功响应和订单详情新增</w:t>
+      </w:r>
+      <w:r>
+        <w:t xml:space="preserve"> </w:t>
       </w:r>
       <w:r>
         <w:rPr>
@@ -4548,7 +5058,10 @@
         <w:t xml:space="preserve">pricing</w:t>
       </w:r>
       <w:r>
-        <w:t xml:space="preserve">，其内容必须来自 </w:t>
+        <w:t xml:space="preserve">，其内容必须来自</w:t>
+      </w:r>
+      <w:r>
+        <w:t xml:space="preserve"> </w:t>
       </w:r>
       <w:r>
         <w:rPr>
@@ -4564,21 +5077,23 @@
       <w:pPr>
         <w:pStyle w:val="Heading2"/>
       </w:pPr>
-      <w:bookmarkStart w:name="X769448bef891a10d383a847be14bf16f087e9ab" w:id="38"/>
+      <w:bookmarkStart w:id="39" w:name="错误码"/>
       <w:r>
         <w:t xml:space="preserve">9. 错误码</w:t>
       </w:r>
-      <w:bookmarkEnd w:id="38"/>
+      <w:bookmarkEnd w:id="39"/>
     </w:p>
     <w:tbl>
       <w:tblPr>
         <w:tblStyle w:val="Table"/>
-        <w:tblW w:w="5000" w:type="pct"/>
-        <w:tblLook w:val="04A0"/>
+        <w:tblW w:type="pct" w:w="0.0"/>
+        <w:tblLook w:firstRow="1"/>
       </w:tblPr>
       <w:tblGrid/>
       <w:tr>
-        <w:trPr/>
+        <w:trPr>
+          <w:cnfStyle w:firstRow="1"/>
+        </w:trPr>
         <w:tc>
           <w:tcPr>
             <w:tcBorders>
@@ -4827,7 +5342,10 @@
         <w:pStyle w:val="BodyText"/>
       </w:pPr>
       <w:r>
-        <w:t xml:space="preserve">错误必须沿用项目现有 </w:t>
+        <w:t xml:space="preserve">错误必须沿用项目现有</w:t>
+      </w:r>
+      <w:r>
+        <w:t xml:space="preserve"> </w:t>
       </w:r>
       <w:r>
         <w:rPr>
@@ -4836,26 +5354,29 @@
         <w:t xml:space="preserve">HttpError</w:t>
       </w:r>
       <w:r>
-        <w:t xml:space="preserve"> 与错误序列化约定。</w:t>
+        <w:t xml:space="preserve"> </w:t>
+      </w:r>
+      <w:r>
+        <w:t xml:space="preserve">与错误序列化约定。</w:t>
       </w:r>
     </w:p>
     <w:p>
       <w:pPr>
         <w:pStyle w:val="Heading2"/>
       </w:pPr>
-      <w:bookmarkStart w:name="X5a4c770fccb8b1c92b2f681a076d9dda1769342" w:id="39"/>
+      <w:bookmarkStart w:id="40" w:name="原子性与并发"/>
       <w:r>
         <w:t xml:space="preserve">10. 原子性与并发</w:t>
       </w:r>
-      <w:bookmarkEnd w:id="39"/>
-    </w:p>
-    <w:p>
-      <w:pPr>
-        <w:pStyle w:val="Compact"/>
-        <w:numPr>
-          <w:ilvl w:val="0"/>
-          <w:numId w:val="1008"/>
-        </w:numPr>
+      <w:bookmarkEnd w:id="40"/>
+    </w:p>
+    <w:p>
+      <w:pPr>
+        <w:numPr>
+          <w:ilvl w:val="0"/>
+          <w:numId w:val="1009"/>
+        </w:numPr>
+        <w:pStyle w:val="Compact"/>
       </w:pPr>
       <w:r>
         <w:t xml:space="preserve">创建订单时，政策解析、价格校验、订单创建和 snapshot 创建必须位于现有订单事务内；</w:t>
@@ -4863,11 +5384,11 @@
     </w:p>
     <w:p>
       <w:pPr>
-        <w:pStyle w:val="Compact"/>
-        <w:numPr>
-          <w:ilvl w:val="0"/>
-          <w:numId w:val="1008"/>
-        </w:numPr>
+        <w:numPr>
+          <w:ilvl w:val="0"/>
+          <w:numId w:val="1009"/>
+        </w:numPr>
+        <w:pStyle w:val="Compact"/>
       </w:pPr>
       <w:r>
         <w:t xml:space="preserve">政策从 preview 到 confirm 发生变化时必须 409，不得静默接受；</w:t>
@@ -4875,14 +5396,17 @@
     </w:p>
     <w:p>
       <w:pPr>
-        <w:pStyle w:val="Compact"/>
-        <w:numPr>
-          <w:ilvl w:val="0"/>
-          <w:numId w:val="1008"/>
-        </w:numPr>
-      </w:pPr>
-      <w:r>
-        <w:t xml:space="preserve">相同 </w:t>
+        <w:numPr>
+          <w:ilvl w:val="0"/>
+          <w:numId w:val="1009"/>
+        </w:numPr>
+        <w:pStyle w:val="Compact"/>
+      </w:pPr>
+      <w:r>
+        <w:t xml:space="preserve">相同</w:t>
+      </w:r>
+      <w:r>
+        <w:t xml:space="preserve"> </w:t>
       </w:r>
       <w:r>
         <w:rPr>
@@ -4891,16 +5415,19 @@
         <w:t xml:space="preserve">Idempotency-Key</w:t>
       </w:r>
       <w:r>
-        <w:t xml:space="preserve"> 重放返回同一订单与同一 snapshot；</w:t>
-      </w:r>
-    </w:p>
-    <w:p>
-      <w:pPr>
-        <w:pStyle w:val="Compact"/>
-        <w:numPr>
-          <w:ilvl w:val="0"/>
-          <w:numId w:val="1008"/>
-        </w:numPr>
+        <w:t xml:space="preserve"> </w:t>
+      </w:r>
+      <w:r>
+        <w:t xml:space="preserve">重放返回同一订单与同一 snapshot；</w:t>
+      </w:r>
+    </w:p>
+    <w:p>
+      <w:pPr>
+        <w:numPr>
+          <w:ilvl w:val="0"/>
+          <w:numId w:val="1009"/>
+        </w:numPr>
+        <w:pStyle w:val="Compact"/>
       </w:pPr>
       <w:r>
         <w:t xml:space="preserve">不得在事务外创建 snapshot 或异步补写；</w:t>
@@ -4908,11 +5435,11 @@
     </w:p>
     <w:p>
       <w:pPr>
-        <w:pStyle w:val="Compact"/>
-        <w:numPr>
-          <w:ilvl w:val="0"/>
-          <w:numId w:val="1008"/>
-        </w:numPr>
+        <w:numPr>
+          <w:ilvl w:val="0"/>
+          <w:numId w:val="1009"/>
+        </w:numPr>
+        <w:pStyle w:val="Compact"/>
       </w:pPr>
       <w:r>
         <w:t xml:space="preserve">激活/退役政策必须串行化，确保不会短暂出现两个 active policy；</w:t>
@@ -4920,14 +5447,17 @@
     </w:p>
     <w:p>
       <w:pPr>
-        <w:pStyle w:val="Compact"/>
-        <w:numPr>
-          <w:ilvl w:val="0"/>
-          <w:numId w:val="1008"/>
-        </w:numPr>
-      </w:pPr>
-      <w:r>
-        <w:t xml:space="preserve">snapshot 的外键使用 </w:t>
+        <w:numPr>
+          <w:ilvl w:val="0"/>
+          <w:numId w:val="1009"/>
+        </w:numPr>
+        <w:pStyle w:val="Compact"/>
+      </w:pPr>
+      <w:r>
+        <w:t xml:space="preserve">snapshot 的外键使用</w:t>
+      </w:r>
+      <w:r>
+        <w:t xml:space="preserve"> </w:t>
       </w:r>
       <w:r>
         <w:rPr>
@@ -4943,11 +5473,11 @@
       <w:pPr>
         <w:pStyle w:val="Heading2"/>
       </w:pPr>
-      <w:bookmarkStart w:name="Xcaad7908127e06f782f39f2d47e9749328849a0" w:id="40"/>
+      <w:bookmarkStart w:id="41" w:name="迁移与-seed"/>
       <w:r>
         <w:t xml:space="preserve">11. 迁移与 seed</w:t>
       </w:r>
-      <w:bookmarkEnd w:id="40"/>
+      <w:bookmarkEnd w:id="41"/>
     </w:p>
     <w:p>
       <w:pPr>
@@ -4959,11 +5489,11 @@
     </w:p>
     <w:p>
       <w:pPr>
-        <w:pStyle w:val="Compact"/>
-        <w:numPr>
-          <w:ilvl w:val="0"/>
-          <w:numId w:val="1009"/>
-        </w:numPr>
+        <w:numPr>
+          <w:ilvl w:val="0"/>
+          <w:numId w:val="1010"/>
+        </w:numPr>
+        <w:pStyle w:val="Compact"/>
       </w:pPr>
       <w:r>
         <w:t xml:space="preserve">新增 enum、表、FK、CHECK、partial unique index 和必要的不可变保护；</w:t>
@@ -4971,14 +5501,17 @@
     </w:p>
     <w:p>
       <w:pPr>
-        <w:pStyle w:val="Compact"/>
-        <w:numPr>
-          <w:ilvl w:val="0"/>
-          <w:numId w:val="1009"/>
-        </w:numPr>
-      </w:pPr>
-      <w:r>
-        <w:t xml:space="preserve">不修改或回填现有 </w:t>
+        <w:numPr>
+          <w:ilvl w:val="0"/>
+          <w:numId w:val="1010"/>
+        </w:numPr>
+        <w:pStyle w:val="Compact"/>
+      </w:pPr>
+      <w:r>
+        <w:t xml:space="preserve">不修改或回填现有</w:t>
+      </w:r>
+      <w:r>
+        <w:t xml:space="preserve"> </w:t>
       </w:r>
       <w:r>
         <w:rPr>
@@ -5010,14 +5543,17 @@
     </w:p>
     <w:p>
       <w:pPr>
-        <w:pStyle w:val="Compact"/>
-        <w:numPr>
-          <w:ilvl w:val="0"/>
-          <w:numId w:val="1009"/>
-        </w:numPr>
-      </w:pPr>
-      <w:r>
-        <w:t xml:space="preserve">可插入 </w:t>
+        <w:numPr>
+          <w:ilvl w:val="0"/>
+          <w:numId w:val="1010"/>
+        </w:numPr>
+        <w:pStyle w:val="Compact"/>
+      </w:pPr>
+      <w:r>
+        <w:t xml:space="preserve">可插入</w:t>
+      </w:r>
+      <w:r>
+        <w:t xml:space="preserve"> </w:t>
       </w:r>
       <w:r>
         <w:rPr>
@@ -5026,7 +5562,13 @@
         <w:t xml:space="preserve">RP</w:t>
       </w:r>
       <w:r>
-        <w:t xml:space="preserve"> 与 </w:t>
+        <w:t xml:space="preserve"> </w:t>
+      </w:r>
+      <w:r>
+        <w:t xml:space="preserve">与</w:t>
+      </w:r>
+      <w:r>
+        <w:t xml:space="preserve"> </w:t>
       </w:r>
       <w:r>
         <w:rPr>
@@ -5035,16 +5577,19 @@
         <w:t xml:space="preserve">CNY</w:t>
       </w:r>
       <w:r>
-        <w:t xml:space="preserve"> 资产定义；</w:t>
-      </w:r>
-    </w:p>
-    <w:p>
-      <w:pPr>
-        <w:pStyle w:val="Compact"/>
-        <w:numPr>
-          <w:ilvl w:val="0"/>
-          <w:numId w:val="1009"/>
-        </w:numPr>
+        <w:t xml:space="preserve"> </w:t>
+      </w:r>
+      <w:r>
+        <w:t xml:space="preserve">资产定义；</w:t>
+      </w:r>
+    </w:p>
+    <w:p>
+      <w:pPr>
+        <w:numPr>
+          <w:ilvl w:val="0"/>
+          <w:numId w:val="1010"/>
+        </w:numPr>
+        <w:pStyle w:val="Compact"/>
       </w:pPr>
       <w:r>
         <w:t xml:space="preserve">不得插入生产 active ValuePolicy；</w:t>
@@ -5052,14 +5597,17 @@
     </w:p>
     <w:p>
       <w:pPr>
-        <w:pStyle w:val="Compact"/>
-        <w:numPr>
-          <w:ilvl w:val="0"/>
-          <w:numId w:val="1009"/>
-        </w:numPr>
-      </w:pPr>
-      <w:r>
-        <w:t xml:space="preserve">测试数据库可创建 </w:t>
+        <w:numPr>
+          <w:ilvl w:val="0"/>
+          <w:numId w:val="1010"/>
+        </w:numPr>
+        <w:pStyle w:val="Compact"/>
+      </w:pPr>
+      <w:r>
+        <w:t xml:space="preserve">测试数据库可创建</w:t>
+      </w:r>
+      <w:r>
+        <w:t xml:space="preserve"> </w:t>
       </w:r>
       <w:r>
         <w:rPr>
@@ -5068,16 +5616,19 @@
         <w:t xml:space="preserve">100 PTS = 1 CNY</w:t>
       </w:r>
       <w:r>
-        <w:t xml:space="preserve"> 的 active fixture；</w:t>
-      </w:r>
-    </w:p>
-    <w:p>
-      <w:pPr>
-        <w:pStyle w:val="Compact"/>
-        <w:numPr>
-          <w:ilvl w:val="0"/>
-          <w:numId w:val="1009"/>
-        </w:numPr>
+        <w:t xml:space="preserve"> </w:t>
+      </w:r>
+      <w:r>
+        <w:t xml:space="preserve">的 active fixture；</w:t>
+      </w:r>
+    </w:p>
+    <w:p>
+      <w:pPr>
+        <w:numPr>
+          <w:ilvl w:val="0"/>
+          <w:numId w:val="1010"/>
+        </w:numPr>
+        <w:pStyle w:val="Compact"/>
       </w:pPr>
       <w:r>
         <w:t xml:space="preserve">migration 必须同时通过全新数据库重放和已有数据库升级测试；</w:t>
@@ -5085,14 +5636,17 @@
     </w:p>
     <w:p>
       <w:pPr>
-        <w:pStyle w:val="Compact"/>
-        <w:numPr>
-          <w:ilvl w:val="0"/>
-          <w:numId w:val="1009"/>
-        </w:numPr>
-      </w:pPr>
-      <w:r>
-        <w:t xml:space="preserve">禁止使用 </w:t>
+        <w:numPr>
+          <w:ilvl w:val="0"/>
+          <w:numId w:val="1010"/>
+        </w:numPr>
+        <w:pStyle w:val="Compact"/>
+      </w:pPr>
+      <w:r>
+        <w:t xml:space="preserve">禁止使用</w:t>
+      </w:r>
+      <w:r>
+        <w:t xml:space="preserve"> </w:t>
       </w:r>
       <w:r>
         <w:rPr>
@@ -5101,36 +5655,39 @@
         <w:t xml:space="preserve">prisma db push</w:t>
       </w:r>
       <w:r>
-        <w:t xml:space="preserve"> 代替 migration。</w:t>
+        <w:t xml:space="preserve"> </w:t>
+      </w:r>
+      <w:r>
+        <w:t xml:space="preserve">代替 migration。</w:t>
       </w:r>
     </w:p>
     <w:p>
       <w:pPr>
         <w:pStyle w:val="Heading2"/>
       </w:pPr>
-      <w:bookmarkStart w:name="X65a7420d406df9a5d3de94b5cb1619482dfd122" w:id="41"/>
+      <w:bookmarkStart w:id="42" w:name="测试要求"/>
       <w:r>
         <w:t xml:space="preserve">12. 测试要求</w:t>
       </w:r>
-      <w:bookmarkEnd w:id="41"/>
+      <w:bookmarkEnd w:id="42"/>
     </w:p>
     <w:p>
       <w:pPr>
         <w:pStyle w:val="Heading3"/>
       </w:pPr>
-      <w:bookmarkStart w:name="Xa0a4a085f25f6435f8bef31b0ebeb338fe9c849" w:id="42"/>
+      <w:bookmarkStart w:id="43" w:name="纯函数"/>
       <w:r>
         <w:t xml:space="preserve">12.1 纯函数</w:t>
       </w:r>
-      <w:bookmarkEnd w:id="42"/>
-    </w:p>
-    <w:p>
-      <w:pPr>
-        <w:pStyle w:val="Compact"/>
-        <w:numPr>
-          <w:ilvl w:val="0"/>
-          <w:numId w:val="1010"/>
-        </w:numPr>
+      <w:bookmarkEnd w:id="43"/>
+    </w:p>
+    <w:p>
+      <w:pPr>
+        <w:numPr>
+          <w:ilvl w:val="0"/>
+          <w:numId w:val="1011"/>
+        </w:numPr>
+        <w:pStyle w:val="Compact"/>
       </w:pPr>
       <w:r>
         <w:rPr>
@@ -5144,11 +5701,11 @@
     </w:p>
     <w:p>
       <w:pPr>
-        <w:pStyle w:val="Compact"/>
-        <w:numPr>
-          <w:ilvl w:val="0"/>
-          <w:numId w:val="1010"/>
-        </w:numPr>
+        <w:numPr>
+          <w:ilvl w:val="0"/>
+          <w:numId w:val="1011"/>
+        </w:numPr>
+        <w:pStyle w:val="Compact"/>
       </w:pPr>
       <w:r>
         <w:t xml:space="preserve">零积分；</w:t>
@@ -5156,14 +5713,17 @@
     </w:p>
     <w:p>
       <w:pPr>
-        <w:pStyle w:val="Compact"/>
-        <w:numPr>
-          <w:ilvl w:val="0"/>
-          <w:numId w:val="1010"/>
-        </w:numPr>
-      </w:pPr>
-      <w:r>
-        <w:t xml:space="preserve">大于 </w:t>
+        <w:numPr>
+          <w:ilvl w:val="0"/>
+          <w:numId w:val="1011"/>
+        </w:numPr>
+        <w:pStyle w:val="Compact"/>
+      </w:pPr>
+      <w:r>
+        <w:t xml:space="preserve">大于</w:t>
+      </w:r>
+      <w:r>
+        <w:t xml:space="preserve"> </w:t>
       </w:r>
       <w:r>
         <w:rPr>
@@ -5172,16 +5732,19 @@
         <w:t xml:space="preserve">Number.MAX_SAFE_INTEGER</w:t>
       </w:r>
       <w:r>
-        <w:t xml:space="preserve"> 的积分仍精确；</w:t>
-      </w:r>
-    </w:p>
-    <w:p>
-      <w:pPr>
-        <w:pStyle w:val="Compact"/>
-        <w:numPr>
-          <w:ilvl w:val="0"/>
-          <w:numId w:val="1010"/>
-        </w:numPr>
+        <w:t xml:space="preserve"> </w:t>
+      </w:r>
+      <w:r>
+        <w:t xml:space="preserve">的积分仍精确；</w:t>
+      </w:r>
+    </w:p>
+    <w:p>
+      <w:pPr>
+        <w:numPr>
+          <w:ilvl w:val="0"/>
+          <w:numId w:val="1011"/>
+        </w:numPr>
+        <w:pStyle w:val="Compact"/>
       </w:pPr>
       <w:r>
         <w:t xml:space="preserve">可整除与不可整除比例；</w:t>
@@ -5189,11 +5752,11 @@
     </w:p>
     <w:p>
       <w:pPr>
-        <w:pStyle w:val="Compact"/>
-        <w:numPr>
-          <w:ilvl w:val="0"/>
-          <w:numId w:val="1010"/>
-        </w:numPr>
+        <w:numPr>
+          <w:ilvl w:val="0"/>
+          <w:numId w:val="1011"/>
+        </w:numPr>
+        <w:pStyle w:val="Compact"/>
       </w:pPr>
       <w:r>
         <w:t xml:space="preserve">HALF_EVEN 的偶数/奇数 tie；</w:t>
@@ -5201,11 +5764,11 @@
     </w:p>
     <w:p>
       <w:pPr>
-        <w:pStyle w:val="Compact"/>
-        <w:numPr>
-          <w:ilvl w:val="0"/>
-          <w:numId w:val="1010"/>
-        </w:numPr>
+        <w:numPr>
+          <w:ilvl w:val="0"/>
+          <w:numId w:val="1011"/>
+        </w:numPr>
+        <w:pStyle w:val="Compact"/>
       </w:pPr>
       <w:r>
         <w:t xml:space="preserve">零分母、负数和非法策略被拒绝；</w:t>
@@ -5213,11 +5776,11 @@
     </w:p>
     <w:p>
       <w:pPr>
-        <w:pStyle w:val="Compact"/>
-        <w:numPr>
-          <w:ilvl w:val="0"/>
-          <w:numId w:val="1010"/>
-        </w:numPr>
+        <w:numPr>
+          <w:ilvl w:val="0"/>
+          <w:numId w:val="1011"/>
+        </w:numPr>
+        <w:pStyle w:val="Compact"/>
       </w:pPr>
       <w:r>
         <w:t xml:space="preserve">输入对象不发生突变。</w:t>
@@ -5227,19 +5790,19 @@
       <w:pPr>
         <w:pStyle w:val="Heading3"/>
       </w:pPr>
-      <w:bookmarkStart w:name="X0cef64716066235975c141923e5cb96a13d95d2" w:id="43"/>
+      <w:bookmarkStart w:id="44" w:name="数据库约束"/>
       <w:r>
         <w:t xml:space="preserve">12.2 数据库约束</w:t>
       </w:r>
-      <w:bookmarkEnd w:id="43"/>
-    </w:p>
-    <w:p>
-      <w:pPr>
-        <w:pStyle w:val="Compact"/>
-        <w:numPr>
-          <w:ilvl w:val="0"/>
-          <w:numId w:val="1011"/>
-        </w:numPr>
+      <w:bookmarkEnd w:id="44"/>
+    </w:p>
+    <w:p>
+      <w:pPr>
+        <w:numPr>
+          <w:ilvl w:val="0"/>
+          <w:numId w:val="1012"/>
+        </w:numPr>
+        <w:pStyle w:val="Compact"/>
       </w:pPr>
       <w:r>
         <w:t xml:space="preserve">分子/分母不能为零或负数；</w:t>
@@ -5247,11 +5810,11 @@
     </w:p>
     <w:p>
       <w:pPr>
-        <w:pStyle w:val="Compact"/>
-        <w:numPr>
-          <w:ilvl w:val="0"/>
-          <w:numId w:val="1011"/>
-        </w:numPr>
+        <w:numPr>
+          <w:ilvl w:val="0"/>
+          <w:numId w:val="1012"/>
+        </w:numPr>
+        <w:pStyle w:val="Compact"/>
       </w:pPr>
       <w:r>
         <w:t xml:space="preserve">同一积分资产不能有两个 active policy；</w:t>
@@ -5259,11 +5822,11 @@
     </w:p>
     <w:p>
       <w:pPr>
-        <w:pStyle w:val="Compact"/>
-        <w:numPr>
-          <w:ilvl w:val="0"/>
-          <w:numId w:val="1011"/>
-        </w:numPr>
+        <w:numPr>
+          <w:ilvl w:val="0"/>
+          <w:numId w:val="1012"/>
+        </w:numPr>
+        <w:pStyle w:val="Compact"/>
       </w:pPr>
       <w:r>
         <w:t xml:space="preserve">active policy 经济字段不可修改；</w:t>
@@ -5271,11 +5834,11 @@
     </w:p>
     <w:p>
       <w:pPr>
-        <w:pStyle w:val="Compact"/>
-        <w:numPr>
-          <w:ilvl w:val="0"/>
-          <w:numId w:val="1011"/>
-        </w:numPr>
+        <w:numPr>
+          <w:ilvl w:val="0"/>
+          <w:numId w:val="1012"/>
+        </w:numPr>
+        <w:pStyle w:val="Compact"/>
       </w:pPr>
       <w:r>
         <w:t xml:space="preserve">snapshot 不可更新或删除；</w:t>
@@ -5283,11 +5846,11 @@
     </w:p>
     <w:p>
       <w:pPr>
-        <w:pStyle w:val="Compact"/>
-        <w:numPr>
-          <w:ilvl w:val="0"/>
-          <w:numId w:val="1011"/>
-        </w:numPr>
+        <w:numPr>
+          <w:ilvl w:val="0"/>
+          <w:numId w:val="1012"/>
+        </w:numPr>
+        <w:pStyle w:val="Compact"/>
       </w:pPr>
       <w:r>
         <w:t xml:space="preserve">snapshot 必须关联存在的 Order 和 ValuePolicy；</w:t>
@@ -5295,11 +5858,11 @@
     </w:p>
     <w:p>
       <w:pPr>
-        <w:pStyle w:val="Compact"/>
-        <w:numPr>
-          <w:ilvl w:val="0"/>
-          <w:numId w:val="1011"/>
-        </w:numPr>
+        <w:numPr>
+          <w:ilvl w:val="0"/>
+          <w:numId w:val="1012"/>
+        </w:numPr>
+        <w:pStyle w:val="Compact"/>
       </w:pPr>
       <w:r>
         <w:t xml:space="preserve">生产保护拒绝 active USD/USDT 本位政策。</w:t>
@@ -5309,19 +5872,19 @@
       <w:pPr>
         <w:pStyle w:val="Heading3"/>
       </w:pPr>
-      <w:bookmarkStart w:name="X4991729fd8817c8b03d179417f048e0f6a45a1b" w:id="44"/>
+      <w:bookmarkStart w:id="45" w:name="api-与事务"/>
       <w:r>
         <w:t xml:space="preserve">12.3 API 与事务</w:t>
       </w:r>
-      <w:bookmarkEnd w:id="44"/>
-    </w:p>
-    <w:p>
-      <w:pPr>
-        <w:pStyle w:val="Compact"/>
-        <w:numPr>
-          <w:ilvl w:val="0"/>
-          <w:numId w:val="1012"/>
-        </w:numPr>
+      <w:bookmarkEnd w:id="45"/>
+    </w:p>
+    <w:p>
+      <w:pPr>
+        <w:numPr>
+          <w:ilvl w:val="0"/>
+          <w:numId w:val="1013"/>
+        </w:numPr>
+        <w:pStyle w:val="Compact"/>
       </w:pPr>
       <w:r>
         <w:rPr>
@@ -5330,16 +5893,19 @@
         <w:t xml:space="preserve">off</w:t>
       </w:r>
       <w:r>
-        <w:t xml:space="preserve"> 模式下现有 checkout/order 测试完全不变；</w:t>
-      </w:r>
-    </w:p>
-    <w:p>
-      <w:pPr>
-        <w:pStyle w:val="Compact"/>
-        <w:numPr>
-          <w:ilvl w:val="0"/>
-          <w:numId w:val="1012"/>
-        </w:numPr>
+        <w:t xml:space="preserve"> </w:t>
+      </w:r>
+      <w:r>
+        <w:t xml:space="preserve">模式下现有 checkout/order 测试完全不变；</w:t>
+      </w:r>
+    </w:p>
+    <w:p>
+      <w:pPr>
+        <w:numPr>
+          <w:ilvl w:val="0"/>
+          <w:numId w:val="1013"/>
+        </w:numPr>
+        <w:pStyle w:val="Compact"/>
       </w:pPr>
       <w:r>
         <w:t xml:space="preserve">preview 的积分、CNY 原子金额和 policy ID 正确；</w:t>
@@ -5347,11 +5913,11 @@
     </w:p>
     <w:p>
       <w:pPr>
-        <w:pStyle w:val="Compact"/>
-        <w:numPr>
-          <w:ilvl w:val="0"/>
-          <w:numId w:val="1012"/>
-        </w:numPr>
+        <w:numPr>
+          <w:ilvl w:val="0"/>
+          <w:numId w:val="1013"/>
+        </w:numPr>
+        <w:pStyle w:val="Compact"/>
       </w:pPr>
       <w:r>
         <w:t xml:space="preserve">shadow 模式兼容未发送 policy ID 的旧客户端；</w:t>
@@ -5359,11 +5925,11 @@
     </w:p>
     <w:p>
       <w:pPr>
-        <w:pStyle w:val="Compact"/>
-        <w:numPr>
-          <w:ilvl w:val="0"/>
-          <w:numId w:val="1012"/>
-        </w:numPr>
+        <w:numPr>
+          <w:ilvl w:val="0"/>
+          <w:numId w:val="1013"/>
+        </w:numPr>
+        <w:pStyle w:val="Compact"/>
       </w:pPr>
       <w:r>
         <w:t xml:space="preserve">enforce 模式缺少 policy ID 返回 400；</w:t>
@@ -5371,11 +5937,11 @@
     </w:p>
     <w:p>
       <w:pPr>
-        <w:pStyle w:val="Compact"/>
-        <w:numPr>
-          <w:ilvl w:val="0"/>
-          <w:numId w:val="1012"/>
-        </w:numPr>
+        <w:numPr>
+          <w:ilvl w:val="0"/>
+          <w:numId w:val="1013"/>
+        </w:numPr>
+        <w:pStyle w:val="Compact"/>
       </w:pPr>
       <w:r>
         <w:t xml:space="preserve">stale policy 返回 409 且余额、库存、订单、流水、Settlement 均无变化；</w:t>
@@ -5383,11 +5949,11 @@
     </w:p>
     <w:p>
       <w:pPr>
-        <w:pStyle w:val="Compact"/>
-        <w:numPr>
-          <w:ilvl w:val="0"/>
-          <w:numId w:val="1012"/>
-        </w:numPr>
+        <w:numPr>
+          <w:ilvl w:val="0"/>
+          <w:numId w:val="1013"/>
+        </w:numPr>
+        <w:pStyle w:val="Compact"/>
       </w:pPr>
       <w:r>
         <w:t xml:space="preserve">成功订单只有一个 immutable snapshot；</w:t>
@@ -5395,11 +5961,11 @@
     </w:p>
     <w:p>
       <w:pPr>
-        <w:pStyle w:val="Compact"/>
-        <w:numPr>
-          <w:ilvl w:val="0"/>
-          <w:numId w:val="1012"/>
-        </w:numPr>
+        <w:numPr>
+          <w:ilvl w:val="0"/>
+          <w:numId w:val="1013"/>
+        </w:numPr>
+        <w:pStyle w:val="Compact"/>
       </w:pPr>
       <w:r>
         <w:t xml:space="preserve">policy 后续 retired/替换后，订单详情仍返回原 snapshot；</w:t>
@@ -5407,11 +5973,11 @@
     </w:p>
     <w:p>
       <w:pPr>
-        <w:pStyle w:val="Compact"/>
-        <w:numPr>
-          <w:ilvl w:val="0"/>
-          <w:numId w:val="1012"/>
-        </w:numPr>
+        <w:numPr>
+          <w:ilvl w:val="0"/>
+          <w:numId w:val="1013"/>
+        </w:numPr>
+        <w:pStyle w:val="Compact"/>
       </w:pPr>
       <w:r>
         <w:t xml:space="preserve">同一幂等键并发重试不产生重复 snapshot；</w:t>
@@ -5419,11 +5985,11 @@
     </w:p>
     <w:p>
       <w:pPr>
-        <w:pStyle w:val="Compact"/>
-        <w:numPr>
-          <w:ilvl w:val="0"/>
-          <w:numId w:val="1012"/>
-        </w:numPr>
+        <w:numPr>
+          <w:ilvl w:val="0"/>
+          <w:numId w:val="1013"/>
+        </w:numPr>
+        <w:pStyle w:val="Compact"/>
       </w:pPr>
       <w:r>
         <w:t xml:space="preserve">BigInt API 字段为字符串，不触发 JSON 序列化异常。</w:t>
@@ -5479,11 +6045,11 @@
       <w:pPr>
         <w:pStyle w:val="Heading2"/>
       </w:pPr>
-      <w:bookmarkStart w:name="X1fb6806147a33ab8d1e8cf79f6ec6da283bb5c5" w:id="45"/>
+      <w:bookmarkStart w:id="46" w:name="可观测性"/>
       <w:r>
         <w:t xml:space="preserve">13. 可观测性</w:t>
       </w:r>
-      <w:bookmarkEnd w:id="45"/>
+      <w:bookmarkEnd w:id="46"/>
     </w:p>
     <w:p>
       <w:pPr>
@@ -5541,11 +6107,11 @@
     </w:p>
     <w:p>
       <w:pPr>
-        <w:pStyle w:val="Compact"/>
-        <w:numPr>
-          <w:ilvl w:val="0"/>
-          <w:numId w:val="1013"/>
-        </w:numPr>
+        <w:numPr>
+          <w:ilvl w:val="0"/>
+          <w:numId w:val="1014"/>
+        </w:numPr>
+        <w:pStyle w:val="Compact"/>
       </w:pPr>
       <w:r>
         <w:t xml:space="preserve">shadow/enforce 模式不存在 active CNY policy；</w:t>
@@ -5553,11 +6119,11 @@
     </w:p>
     <w:p>
       <w:pPr>
-        <w:pStyle w:val="Compact"/>
-        <w:numPr>
-          <w:ilvl w:val="0"/>
-          <w:numId w:val="1013"/>
-        </w:numPr>
+        <w:numPr>
+          <w:ilvl w:val="0"/>
+          <w:numId w:val="1014"/>
+        </w:numPr>
+        <w:pStyle w:val="Compact"/>
       </w:pPr>
       <w:r>
         <w:t xml:space="preserve">检测到多个 active policy；</w:t>
@@ -5565,11 +6131,11 @@
     </w:p>
     <w:p>
       <w:pPr>
-        <w:pStyle w:val="Compact"/>
-        <w:numPr>
-          <w:ilvl w:val="0"/>
-          <w:numId w:val="1013"/>
-        </w:numPr>
+        <w:numPr>
+          <w:ilvl w:val="0"/>
+          <w:numId w:val="1014"/>
+        </w:numPr>
+        <w:pStyle w:val="Compact"/>
       </w:pPr>
       <w:r>
         <w:t xml:space="preserve">policy asset kind/scale 不合法；</w:t>
@@ -5577,11 +6143,11 @@
     </w:p>
     <w:p>
       <w:pPr>
-        <w:pStyle w:val="Compact"/>
-        <w:numPr>
-          <w:ilvl w:val="0"/>
-          <w:numId w:val="1013"/>
-        </w:numPr>
+        <w:numPr>
+          <w:ilvl w:val="0"/>
+          <w:numId w:val="1014"/>
+        </w:numPr>
+        <w:pStyle w:val="Compact"/>
       </w:pPr>
       <w:r>
         <w:t xml:space="preserve">成功订单缺少应有 snapshot；</w:t>
@@ -5589,11 +6155,11 @@
     </w:p>
     <w:p>
       <w:pPr>
-        <w:pStyle w:val="Compact"/>
-        <w:numPr>
-          <w:ilvl w:val="0"/>
-          <w:numId w:val="1013"/>
-        </w:numPr>
+        <w:numPr>
+          <w:ilvl w:val="0"/>
+          <w:numId w:val="1014"/>
+        </w:numPr>
+        <w:pStyle w:val="Compact"/>
       </w:pPr>
       <w:r>
         <w:t xml:space="preserve">snapshot 与 Order.price 不一致。</w:t>
@@ -5611,11 +6177,11 @@
       <w:pPr>
         <w:pStyle w:val="Heading2"/>
       </w:pPr>
-      <w:bookmarkStart w:name="X1d10e020b7dc36f4e76d78533249413e1c32023" w:id="46"/>
+      <w:bookmarkStart w:id="47" w:name="建议修改文件"/>
       <w:r>
         <w:t xml:space="preserve">14. 建议修改文件</w:t>
       </w:r>
-      <w:bookmarkEnd w:id="46"/>
+      <w:bookmarkEnd w:id="47"/>
     </w:p>
     <w:p>
       <w:pPr>
@@ -5765,11 +6331,11 @@
       <w:pPr>
         <w:pStyle w:val="Heading2"/>
       </w:pPr>
-      <w:bookmarkStart w:name="X7902864186f4bcae11f9638cad0d5f8d35e7fde" w:id="47"/>
+      <w:bookmarkStart w:id="48" w:name="验证命令"/>
       <w:r>
         <w:t xml:space="preserve">15. 验证命令</w:t>
       </w:r>
-      <w:bookmarkEnd w:id="47"/>
+      <w:bookmarkEnd w:id="48"/>
     </w:p>
     <w:p>
       <w:pPr>
@@ -5861,28 +6427,42 @@
         <w:pStyle w:val="FirstParagraph"/>
       </w:pPr>
       <w:r>
-        <w:t xml:space="preserve">若完整测试受环境依赖阻塞，必须记录具体命令、错误和已完成的替代验证；不得只写“测试通过”而不提供结果。</w:t>
+        <w:t xml:space="preserve">若完整测试受环境依赖阻塞，必须记录具体命令、错误和已完成的替代验证；不得只写</w:t>
+      </w:r>
+      <w:r>
+        <w:t xml:space="preserve">“</w:t>
+      </w:r>
+      <w:r>
+        <w:t xml:space="preserve">测试通过</w:t>
+      </w:r>
+      <w:r>
+        <w:t xml:space="preserve">”</w:t>
+      </w:r>
+      <w:r>
+        <w:t xml:space="preserve">而不提供结果。</w:t>
       </w:r>
     </w:p>
     <w:p>
       <w:pPr>
         <w:pStyle w:val="Heading2"/>
       </w:pPr>
-      <w:bookmarkStart w:name="X66244f44ca523909964ccfdcfd83c188534c638" w:id="48"/>
+      <w:bookmarkStart w:id="49" w:name="分阶段上线"/>
       <w:r>
         <w:t xml:space="preserve">16. 分阶段上线</w:t>
       </w:r>
-      <w:bookmarkEnd w:id="48"/>
+      <w:bookmarkEnd w:id="49"/>
     </w:p>
     <w:tbl>
       <w:tblPr>
         <w:tblStyle w:val="Table"/>
-        <w:tblW w:w="5000" w:type="pct"/>
-        <w:tblLook w:val="04A0"/>
+        <w:tblW w:type="pct" w:w="0.0"/>
+        <w:tblLook w:firstRow="1"/>
       </w:tblPr>
       <w:tblGrid/>
       <w:tr>
-        <w:trPr/>
+        <w:trPr>
+          <w:cnfStyle w:firstRow="1"/>
+        </w:trPr>
         <w:tc>
           <w:tcPr>
             <w:tcBorders>
@@ -6244,11 +6824,11 @@
       <w:pPr>
         <w:pStyle w:val="Heading2"/>
       </w:pPr>
-      <w:bookmarkStart w:name="X03e62838b3dddce82d3dc4d86696f6d66a27fdb" w:id="49"/>
+      <w:bookmarkStart w:id="50" w:name="完成定义"/>
       <w:r>
         <w:t xml:space="preserve">17. 完成定义</w:t>
       </w:r>
-      <w:bookmarkEnd w:id="49"/>
+      <w:bookmarkEnd w:id="50"/>
     </w:p>
     <w:p>
       <w:pPr>
@@ -6260,11 +6840,11 @@
     </w:p>
     <w:p>
       <w:pPr>
-        <w:pStyle w:val="Compact"/>
-        <w:numPr>
-          <w:ilvl w:val="0"/>
-          <w:numId w:val="1014"/>
-        </w:numPr>
+        <w:numPr>
+          <w:ilvl w:val="0"/>
+          <w:numId w:val="1015"/>
+        </w:numPr>
+        <w:pStyle w:val="Compact"/>
       </w:pPr>
       <w:r>
         <w:t xml:space="preserve">migration 可在空库与现有库重放；</w:t>
@@ -6272,11 +6852,11 @@
     </w:p>
     <w:p>
       <w:pPr>
-        <w:pStyle w:val="Compact"/>
-        <w:numPr>
-          <w:ilvl w:val="0"/>
-          <w:numId w:val="1014"/>
-        </w:numPr>
+        <w:numPr>
+          <w:ilvl w:val="0"/>
+          <w:numId w:val="1015"/>
+        </w:numPr>
+        <w:pStyle w:val="Compact"/>
       </w:pPr>
       <w:r>
         <w:rPr>
@@ -6285,16 +6865,19 @@
         <w:t xml:space="preserve">off</w:t>
       </w:r>
       <w:r>
-        <w:t xml:space="preserve"> 模式不改变任何当前用户行为或 API 兼容字段；</w:t>
-      </w:r>
-    </w:p>
-    <w:p>
-      <w:pPr>
-        <w:pStyle w:val="Compact"/>
-        <w:numPr>
-          <w:ilvl w:val="0"/>
-          <w:numId w:val="1014"/>
-        </w:numPr>
+        <w:t xml:space="preserve"> </w:t>
+      </w:r>
+      <w:r>
+        <w:t xml:space="preserve">模式不改变任何当前用户行为或 API 兼容字段；</w:t>
+      </w:r>
+    </w:p>
+    <w:p>
+      <w:pPr>
+        <w:numPr>
+          <w:ilvl w:val="0"/>
+          <w:numId w:val="1015"/>
+        </w:numPr>
+        <w:pStyle w:val="Compact"/>
       </w:pPr>
       <w:r>
         <w:t xml:space="preserve">CNY policy 能精确计算并返回字符串原子金额；</w:t>
@@ -6302,11 +6885,11 @@
     </w:p>
     <w:p>
       <w:pPr>
-        <w:pStyle w:val="Compact"/>
-        <w:numPr>
-          <w:ilvl w:val="0"/>
-          <w:numId w:val="1014"/>
-        </w:numPr>
+        <w:numPr>
+          <w:ilvl w:val="0"/>
+          <w:numId w:val="1015"/>
+        </w:numPr>
+        <w:pStyle w:val="Compact"/>
       </w:pPr>
       <w:r>
         <w:t xml:space="preserve">stale policy 在任何资金/库存副作用前被拒绝；</w:t>
@@ -6314,11 +6897,11 @@
     </w:p>
     <w:p>
       <w:pPr>
-        <w:pStyle w:val="Compact"/>
-        <w:numPr>
-          <w:ilvl w:val="0"/>
-          <w:numId w:val="1014"/>
-        </w:numPr>
+        <w:numPr>
+          <w:ilvl w:val="0"/>
+          <w:numId w:val="1015"/>
+        </w:numPr>
+        <w:pStyle w:val="Compact"/>
       </w:pPr>
       <w:r>
         <w:t xml:space="preserve">新订单 policy/snapshot 在同一事务完成；</w:t>
@@ -6326,11 +6909,11 @@
     </w:p>
     <w:p>
       <w:pPr>
-        <w:pStyle w:val="Compact"/>
-        <w:numPr>
-          <w:ilvl w:val="0"/>
-          <w:numId w:val="1014"/>
-        </w:numPr>
+        <w:numPr>
+          <w:ilvl w:val="0"/>
+          <w:numId w:val="1015"/>
+        </w:numPr>
+        <w:pStyle w:val="Compact"/>
       </w:pPr>
       <w:r>
         <w:t xml:space="preserve">历史订单不被回填或重估；</w:t>
@@ -6338,11 +6921,11 @@
     </w:p>
     <w:p>
       <w:pPr>
-        <w:pStyle w:val="Compact"/>
-        <w:numPr>
-          <w:ilvl w:val="0"/>
-          <w:numId w:val="1014"/>
-        </w:numPr>
+        <w:numPr>
+          <w:ilvl w:val="0"/>
+          <w:numId w:val="1015"/>
+        </w:numPr>
+        <w:pStyle w:val="Compact"/>
       </w:pPr>
       <w:r>
         <w:t xml:space="preserve">相关 build、测试和快速验证通过；</w:t>
@@ -6350,11 +6933,11 @@
     </w:p>
     <w:p>
       <w:pPr>
-        <w:pStyle w:val="Compact"/>
-        <w:numPr>
-          <w:ilvl w:val="0"/>
-          <w:numId w:val="1014"/>
-        </w:numPr>
+        <w:numPr>
+          <w:ilvl w:val="0"/>
+          <w:numId w:val="1015"/>
+        </w:numPr>
+        <w:pStyle w:val="Compact"/>
       </w:pPr>
       <w:r>
         <w:t xml:space="preserve">git diff 不包含真实支付、USDT、会员或无关重构；</w:t>
@@ -6362,11 +6945,11 @@
     </w:p>
     <w:p>
       <w:pPr>
-        <w:pStyle w:val="Compact"/>
-        <w:numPr>
-          <w:ilvl w:val="0"/>
-          <w:numId w:val="1014"/>
-        </w:numPr>
+        <w:numPr>
+          <w:ilvl w:val="0"/>
+          <w:numId w:val="1015"/>
+        </w:numPr>
+        <w:pStyle w:val="Compact"/>
       </w:pPr>
       <w:r>
         <w:t xml:space="preserve">Agent 输出修改文件、迁移、测试结果、风险和未决事项；</w:t>
@@ -6374,11 +6957,11 @@
     </w:p>
     <w:p>
       <w:pPr>
-        <w:pStyle w:val="Compact"/>
-        <w:numPr>
-          <w:ilvl w:val="0"/>
-          <w:numId w:val="1014"/>
-        </w:numPr>
+        <w:numPr>
+          <w:ilvl w:val="0"/>
+          <w:numId w:val="1015"/>
+        </w:numPr>
+        <w:pStyle w:val="Compact"/>
       </w:pPr>
       <w:r>
         <w:t xml:space="preserve">Agent 不自行 push、合并、创建 PR 或激活生产 policy。</w:t>
@@ -6388,11 +6971,11 @@
       <w:pPr>
         <w:pStyle w:val="Heading2"/>
       </w:pPr>
-      <w:bookmarkStart w:name="X4a40f1ca37817a456c5cf70ee9546d4af14f44c" w:id="50"/>
+      <w:bookmarkStart w:id="51" w:name="agent-执行指令"/>
       <w:r>
         <w:t xml:space="preserve">18. Agent 执行指令</w:t>
       </w:r>
-      <w:bookmarkEnd w:id="50"/>
+      <w:bookmarkEnd w:id="51"/>
     </w:p>
     <w:p>
       <w:pPr>
@@ -6404,11 +6987,11 @@
     </w:p>
     <w:p>
       <w:pPr>
-        <w:pStyle w:val="Compact"/>
-        <w:numPr>
-          <w:ilvl w:val="0"/>
-          <w:numId w:val="1015"/>
-        </w:numPr>
+        <w:numPr>
+          <w:ilvl w:val="0"/>
+          <w:numId w:val="1016"/>
+        </w:numPr>
+        <w:pStyle w:val="Compact"/>
       </w:pPr>
       <w:r>
         <w:t xml:space="preserve">完整阅读本 Spec 与上位 Spec；</w:t>
@@ -6416,11 +6999,11 @@
     </w:p>
     <w:p>
       <w:pPr>
-        <w:pStyle w:val="Compact"/>
-        <w:numPr>
-          <w:ilvl w:val="0"/>
-          <w:numId w:val="1015"/>
-        </w:numPr>
+        <w:numPr>
+          <w:ilvl w:val="0"/>
+          <w:numId w:val="1016"/>
+        </w:numPr>
+        <w:pStyle w:val="Compact"/>
       </w:pPr>
       <w:r>
         <w:t xml:space="preserve">先检查代码与测试，输出拟修改文件清单；</w:t>
@@ -6428,11 +7011,11 @@
     </w:p>
     <w:p>
       <w:pPr>
-        <w:pStyle w:val="Compact"/>
-        <w:numPr>
-          <w:ilvl w:val="0"/>
-          <w:numId w:val="1015"/>
-        </w:numPr>
+        <w:numPr>
+          <w:ilvl w:val="0"/>
+          <w:numId w:val="1016"/>
+        </w:numPr>
+        <w:pStyle w:val="Compact"/>
       </w:pPr>
       <w:r>
         <w:t xml:space="preserve">严格在本文范围内实现，不自行扩大到 ledger/VC/支付；</w:t>
@@ -6440,11 +7023,11 @@
     </w:p>
     <w:p>
       <w:pPr>
-        <w:pStyle w:val="Compact"/>
-        <w:numPr>
-          <w:ilvl w:val="0"/>
-          <w:numId w:val="1015"/>
-        </w:numPr>
+        <w:numPr>
+          <w:ilvl w:val="0"/>
+          <w:numId w:val="1016"/>
+        </w:numPr>
+        <w:pStyle w:val="Compact"/>
       </w:pPr>
       <w:r>
         <w:t xml:space="preserve">遇到 D-02、生产 seed 或业务语义不明确时停止相关部分并报告，不擅自决定；</w:t>
@@ -6452,11 +7035,11 @@
     </w:p>
     <w:p>
       <w:pPr>
-        <w:pStyle w:val="Compact"/>
-        <w:numPr>
-          <w:ilvl w:val="0"/>
-          <w:numId w:val="1015"/>
-        </w:numPr>
+        <w:numPr>
+          <w:ilvl w:val="0"/>
+          <w:numId w:val="1016"/>
+        </w:numPr>
+        <w:pStyle w:val="Compact"/>
       </w:pPr>
       <w:r>
         <w:t xml:space="preserve">保留当前工作区中不属于自己的改动；</w:t>
@@ -6464,14 +7047,946 @@
     </w:p>
     <w:p>
       <w:pPr>
-        <w:pStyle w:val="Compact"/>
-        <w:numPr>
-          <w:ilvl w:val="0"/>
-          <w:numId w:val="1015"/>
-        </w:numPr>
+        <w:numPr>
+          <w:ilvl w:val="0"/>
+          <w:numId w:val="1016"/>
+        </w:numPr>
+        <w:pStyle w:val="Compact"/>
       </w:pPr>
       <w:r>
         <w:t xml:space="preserve">实施后运行验证、检查 diff，并按完成定义逐项报告。</w:t>
+      </w:r>
+    </w:p>
+    <w:p>
+      <w:pPr>
+        <w:pStyle w:val="Heading2"/>
+      </w:pPr>
+      <w:bookmarkStart w:id="52" w:name="implementation-status2026-08-18-closure"/>
+      <w:r>
+        <w:t xml:space="preserve">19. Implementation status（2026-08-18 closure）</w:t>
+      </w:r>
+      <w:bookmarkEnd w:id="52"/>
+    </w:p>
+    <w:p>
+      <w:pPr>
+        <w:pStyle w:val="FirstParagraph"/>
+      </w:pPr>
+      <w:r>
+        <w:t xml:space="preserve">状态：</w:t>
+      </w:r>
+      <w:r>
+        <w:rPr>
+          <w:b/>
+        </w:rPr>
+        <w:t xml:space="preserve">Implemented — Production Activation Blocked by D-02/D-03</w:t>
+      </w:r>
+    </w:p>
+    <w:p>
+      <w:pPr>
+        <w:pStyle w:val="Heading3"/>
+      </w:pPr>
+      <w:bookmarkStart w:id="53" w:name="实现证据"/>
+      <w:r>
+        <w:t xml:space="preserve">19.1 实现证据</w:t>
+      </w:r>
+      <w:bookmarkEnd w:id="53"/>
+    </w:p>
+    <w:tbl>
+      <w:tblPr>
+        <w:tblStyle w:val="Table"/>
+        <w:tblW w:type="pct" w:w="5000.0"/>
+        <w:tblLook w:firstRow="1"/>
+      </w:tblPr>
+      <w:tblGrid>
+        <w:gridCol w:w="3960"/>
+        <w:gridCol w:w="3960"/>
+      </w:tblGrid>
+      <w:tr>
+        <w:trPr>
+          <w:cnfStyle w:firstRow="1"/>
+        </w:trPr>
+        <w:tc>
+          <w:tcPr>
+            <w:tcBorders>
+              <w:bottom w:val="single"/>
+            </w:tcBorders>
+            <w:vAlign w:val="bottom"/>
+          </w:tcPr>
+          <w:p>
+            <w:pPr>
+              <w:pStyle w:val="Compact"/>
+              <w:jc w:val="left"/>
+            </w:pPr>
+            <w:r>
+              <w:t xml:space="preserve">项</w:t>
+            </w:r>
+          </w:p>
+        </w:tc>
+        <w:tc>
+          <w:tcPr>
+            <w:tcBorders>
+              <w:bottom w:val="single"/>
+            </w:tcBorders>
+            <w:vAlign w:val="bottom"/>
+          </w:tcPr>
+          <w:p>
+            <w:pPr>
+              <w:pStyle w:val="Compact"/>
+              <w:jc w:val="left"/>
+            </w:pPr>
+            <w:r>
+              <w:t xml:space="preserve">证据</w:t>
+            </w:r>
+          </w:p>
+        </w:tc>
+      </w:tr>
+      <w:tr>
+        <w:tc>
+          <w:p>
+            <w:pPr>
+              <w:pStyle w:val="Compact"/>
+              <w:jc w:val="left"/>
+            </w:pPr>
+            <w:r>
+              <w:t xml:space="preserve">PR #144 已合并</w:t>
+            </w:r>
+          </w:p>
+        </w:tc>
+        <w:tc>
+          <w:p>
+            <w:pPr>
+              <w:pStyle w:val="Compact"/>
+              <w:jc w:val="left"/>
+            </w:pPr>
+            <w:r>
+              <w:rPr>
+                <w:rStyle w:val="VerbatimChar"/>
+              </w:rPr>
+              <w:t xml:space="preserve">origin/develop@c6d21bb</w:t>
+            </w:r>
+            <w:r>
+              <w:t xml:space="preserve"> </w:t>
+            </w:r>
+            <w:r>
+              <w:rPr>
+                <w:rStyle w:val="VerbatimChar"/>
+              </w:rPr>
+              <w:t xml:space="preserve">feat(value-policy): add CNY value policy phase 1 foundation (#144)</w:t>
+            </w:r>
+          </w:p>
+        </w:tc>
+      </w:tr>
+      <w:tr>
+        <w:tc>
+          <w:p>
+            <w:pPr>
+              <w:pStyle w:val="Compact"/>
+              <w:jc w:val="left"/>
+            </w:pPr>
+            <w:r>
+              <w:t xml:space="preserve">合并前功能提交</w:t>
+            </w:r>
+          </w:p>
+        </w:tc>
+        <w:tc>
+          <w:p>
+            <w:pPr>
+              <w:pStyle w:val="Compact"/>
+              <w:jc w:val="left"/>
+            </w:pPr>
+            <w:r>
+              <w:rPr>
+                <w:rStyle w:val="VerbatimChar"/>
+              </w:rPr>
+              <w:t xml:space="preserve">b71abc0</w:t>
+            </w:r>
+            <w:r>
+              <w:t xml:space="preserve">、</w:t>
+            </w:r>
+            <w:r>
+              <w:rPr>
+                <w:rStyle w:val="VerbatimChar"/>
+              </w:rPr>
+              <w:t xml:space="preserve">915dc41</w:t>
+            </w:r>
+          </w:p>
+        </w:tc>
+      </w:tr>
+      <w:tr>
+        <w:tc>
+          <w:p>
+            <w:pPr>
+              <w:pStyle w:val="Compact"/>
+              <w:jc w:val="left"/>
+            </w:pPr>
+            <w:r>
+              <w:t xml:space="preserve">Closure 分支</w:t>
+            </w:r>
+          </w:p>
+        </w:tc>
+        <w:tc>
+          <w:p>
+            <w:pPr>
+              <w:pStyle w:val="Compact"/>
+              <w:jc w:val="left"/>
+            </w:pPr>
+            <w:r>
+              <w:rPr>
+                <w:rStyle w:val="VerbatimChar"/>
+              </w:rPr>
+              <w:t xml:space="preserve">feat/cny-value-policy-phase-1-closure</w:t>
+            </w:r>
+          </w:p>
+        </w:tc>
+      </w:tr>
+      <w:tr>
+        <w:tc>
+          <w:p>
+            <w:pPr>
+              <w:pStyle w:val="Compact"/>
+              <w:jc w:val="left"/>
+            </w:pPr>
+            <w:r>
+              <w:t xml:space="preserve">Foundation migration</w:t>
+            </w:r>
+          </w:p>
+        </w:tc>
+        <w:tc>
+          <w:p>
+            <w:pPr>
+              <w:pStyle w:val="Compact"/>
+              <w:jc w:val="left"/>
+            </w:pPr>
+            <w:r>
+              <w:rPr>
+                <w:rStyle w:val="VerbatimChar"/>
+              </w:rPr>
+              <w:t xml:space="preserve">server/prisma/migrations/20260817180000_add_value_policy_foundation/</w:t>
+            </w:r>
+            <w:r>
+              <w:t xml:space="preserve">（已合并，禁止原地修改）</w:t>
+            </w:r>
+          </w:p>
+        </w:tc>
+      </w:tr>
+      <w:tr>
+        <w:tc>
+          <w:p>
+            <w:pPr>
+              <w:pStyle w:val="Compact"/>
+              <w:jc w:val="left"/>
+            </w:pPr>
+            <w:r>
+              <w:t xml:space="preserve">Closure migration</w:t>
+            </w:r>
+          </w:p>
+        </w:tc>
+        <w:tc>
+          <w:p>
+            <w:pPr>
+              <w:pStyle w:val="Compact"/>
+              <w:jc w:val="left"/>
+            </w:pPr>
+            <w:r>
+              <w:rPr>
+                <w:rStyle w:val="VerbatimChar"/>
+              </w:rPr>
+              <w:t xml:space="preserve">server/prisma/migrations/20260818120000_value_policy_phase1_closure/</w:t>
+            </w:r>
+          </w:p>
+        </w:tc>
+      </w:tr>
+      <w:tr>
+        <w:tc>
+          <w:p>
+            <w:pPr>
+              <w:pStyle w:val="Compact"/>
+              <w:jc w:val="left"/>
+            </w:pPr>
+            <w:r>
+              <w:t xml:space="preserve">内部状态推进</w:t>
+            </w:r>
+          </w:p>
+        </w:tc>
+        <w:tc>
+          <w:p>
+            <w:pPr>
+              <w:pStyle w:val="Compact"/>
+              <w:jc w:val="left"/>
+            </w:pPr>
+            <w:r>
+              <w:rPr>
+                <w:rStyle w:val="VerbatimChar"/>
+              </w:rPr>
+              <w:t xml:space="preserve">server/src/modules/valuePolicy/governance.ts</w:t>
+            </w:r>
+            <w:r>
+              <w:t xml:space="preserve">（无公开 HTTP 激活 API）</w:t>
+            </w:r>
+          </w:p>
+        </w:tc>
+      </w:tr>
+      <w:tr>
+        <w:tc>
+          <w:p>
+            <w:pPr>
+              <w:pStyle w:val="Compact"/>
+              <w:jc w:val="left"/>
+            </w:pPr>
+            <w:r>
+              <w:t xml:space="preserve">只读审计</w:t>
+            </w:r>
+          </w:p>
+        </w:tc>
+        <w:tc>
+          <w:p>
+            <w:pPr>
+              <w:pStyle w:val="Compact"/>
+              <w:jc w:val="left"/>
+            </w:pPr>
+            <w:r>
+              <w:rPr>
+                <w:rStyle w:val="VerbatimChar"/>
+              </w:rPr>
+              <w:t xml:space="preserve">npm --prefix server run value-policy:audit</w:t>
+            </w:r>
+          </w:p>
+        </w:tc>
+      </w:tr>
+      <w:tr>
+        <w:tc>
+          <w:p>
+            <w:pPr>
+              <w:pStyle w:val="Compact"/>
+              <w:jc w:val="left"/>
+            </w:pPr>
+            <w:r>
+              <w:t xml:space="preserve">告警契约</w:t>
+            </w:r>
+          </w:p>
+        </w:tc>
+        <w:tc>
+          <w:p>
+            <w:pPr>
+              <w:pStyle w:val="Compact"/>
+              <w:jc w:val="left"/>
+            </w:pPr>
+            <w:r>
+              <w:rPr>
+                <w:rStyle w:val="VerbatimChar"/>
+              </w:rPr>
+              <w:t xml:space="preserve">docs/operations/value-policy-alerts.md</w:t>
+            </w:r>
+            <w:r>
+              <w:t xml:space="preserve"> </w:t>
+            </w:r>
+            <w:r>
+              <w:t xml:space="preserve">+</w:t>
+            </w:r>
+            <w:r>
+              <w:t xml:space="preserve"> </w:t>
+            </w:r>
+            <w:r>
+              <w:rPr>
+                <w:rStyle w:val="VerbatimChar"/>
+              </w:rPr>
+              <w:t xml:space="preserve">server/src/modules/valuePolicy/alertContract.ts</w:t>
+            </w:r>
+          </w:p>
+        </w:tc>
+      </w:tr>
+      <w:tr>
+        <w:tc>
+          <w:p>
+            <w:pPr>
+              <w:pStyle w:val="Compact"/>
+              <w:jc w:val="left"/>
+            </w:pPr>
+            <w:r>
+              <w:t xml:space="preserve">运行手册</w:t>
+            </w:r>
+          </w:p>
+        </w:tc>
+        <w:tc>
+          <w:p>
+            <w:pPr>
+              <w:pStyle w:val="Compact"/>
+              <w:jc w:val="left"/>
+            </w:pPr>
+            <w:r>
+              <w:rPr>
+                <w:rStyle w:val="VerbatimChar"/>
+              </w:rPr>
+              <w:t xml:space="preserve">docs/operations/value-policy-runbook.md</w:t>
+            </w:r>
+          </w:p>
+        </w:tc>
+      </w:tr>
+    </w:tbl>
+    <w:p>
+      <w:pPr>
+        <w:pStyle w:val="Heading3"/>
+      </w:pPr>
+      <w:bookmarkStart w:id="54" w:name="已完成"/>
+      <w:r>
+        <w:t xml:space="preserve">19.2 已完成</w:t>
+      </w:r>
+      <w:bookmarkEnd w:id="54"/>
+    </w:p>
+    <w:p>
+      <w:pPr>
+        <w:numPr>
+          <w:ilvl w:val="0"/>
+          <w:numId w:val="1017"/>
+        </w:numPr>
+        <w:pStyle w:val="Compact"/>
+      </w:pPr>
+      <w:r>
+        <w:rPr>
+          <w:rStyle w:val="VerbatimChar"/>
+        </w:rPr>
+        <w:t xml:space="preserve">off</w:t>
+      </w:r>
+      <w:r>
+        <w:t xml:space="preserve"> </w:t>
+      </w:r>
+      <w:r>
+        <w:t xml:space="preserve">/</w:t>
+      </w:r>
+      <w:r>
+        <w:t xml:space="preserve"> </w:t>
+      </w:r>
+      <w:r>
+        <w:rPr>
+          <w:rStyle w:val="VerbatimChar"/>
+        </w:rPr>
+        <w:t xml:space="preserve">shadow</w:t>
+      </w:r>
+      <w:r>
+        <w:t xml:space="preserve"> </w:t>
+      </w:r>
+      <w:r>
+        <w:t xml:space="preserve">/</w:t>
+      </w:r>
+      <w:r>
+        <w:t xml:space="preserve"> </w:t>
+      </w:r>
+      <w:r>
+        <w:rPr>
+          <w:rStyle w:val="VerbatimChar"/>
+        </w:rPr>
+        <w:t xml:space="preserve">enforce</w:t>
+      </w:r>
+      <w:r>
+        <w:t xml:space="preserve"> </w:t>
+      </w:r>
+      <w:r>
+        <w:t xml:space="preserve">模式与错误码矩阵</w:t>
+      </w:r>
+    </w:p>
+    <w:p>
+      <w:pPr>
+        <w:numPr>
+          <w:ilvl w:val="0"/>
+          <w:numId w:val="1017"/>
+        </w:numPr>
+        <w:pStyle w:val="Compact"/>
+      </w:pPr>
+      <w:r>
+        <w:t xml:space="preserve">CNY</w:t>
+      </w:r>
+      <w:r>
+        <w:t xml:space="preserve"> </w:t>
+      </w:r>
+      <w:r>
+        <w:rPr>
+          <w:rStyle w:val="VerbatimChar"/>
+        </w:rPr>
+        <w:t xml:space="preserve">ValuePolicy</w:t>
+      </w:r>
+      <w:r>
+        <w:t xml:space="preserve"> </w:t>
+      </w:r>
+      <w:r>
+        <w:t xml:space="preserve">+</w:t>
+      </w:r>
+      <w:r>
+        <w:t xml:space="preserve"> </w:t>
+      </w:r>
+      <w:r>
+        <w:rPr>
+          <w:rStyle w:val="VerbatimChar"/>
+        </w:rPr>
+        <w:t xml:space="preserve">OrderPricingSnapshot</w:t>
+      </w:r>
+      <w:r>
+        <w:t xml:space="preserve"> </w:t>
+      </w:r>
+      <w:r>
+        <w:t xml:space="preserve">同事务落库</w:t>
+      </w:r>
+    </w:p>
+    <w:p>
+      <w:pPr>
+        <w:numPr>
+          <w:ilvl w:val="0"/>
+          <w:numId w:val="1017"/>
+        </w:numPr>
+        <w:pStyle w:val="Compact"/>
+      </w:pPr>
+      <w:r>
+        <w:t xml:space="preserve">状态机与时间戳由数据库 CHECK/trigger 保护</w:t>
+      </w:r>
+    </w:p>
+    <w:p>
+      <w:pPr>
+        <w:numPr>
+          <w:ilvl w:val="0"/>
+          <w:numId w:val="1017"/>
+        </w:numPr>
+        <w:pStyle w:val="Compact"/>
+      </w:pPr>
+      <w:r>
+        <w:t xml:space="preserve">Asset/policy 典型并发按同一 advisory lock 消除 40P01</w:t>
+      </w:r>
+    </w:p>
+    <w:p>
+      <w:pPr>
+        <w:numPr>
+          <w:ilvl w:val="0"/>
+          <w:numId w:val="1017"/>
+        </w:numPr>
+        <w:pStyle w:val="Compact"/>
+      </w:pPr>
+      <w:r>
+        <w:t xml:space="preserve">指标语义与事务提交一致</w:t>
+      </w:r>
+    </w:p>
+    <w:p>
+      <w:pPr>
+        <w:numPr>
+          <w:ilvl w:val="0"/>
+          <w:numId w:val="1017"/>
+        </w:numPr>
+        <w:pStyle w:val="Compact"/>
+      </w:pPr>
+      <w:r>
+        <w:t xml:space="preserve">只读审计命令</w:t>
+      </w:r>
+    </w:p>
+    <w:p>
+      <w:pPr>
+        <w:numPr>
+          <w:ilvl w:val="0"/>
+          <w:numId w:val="1017"/>
+        </w:numPr>
+        <w:pStyle w:val="Compact"/>
+      </w:pPr>
+      <w:r>
+        <w:t xml:space="preserve">生产配置守卫：</w:t>
+      </w:r>
+      <w:r>
+        <w:rPr>
+          <w:rStyle w:val="VerbatimChar"/>
+        </w:rPr>
+        <w:t xml:space="preserve">MONEXUS_DEPLOY_ENV=production</w:t>
+      </w:r>
+      <w:r>
+        <w:t xml:space="preserve"> </w:t>
+      </w:r>
+      <w:r>
+        <w:t xml:space="preserve">时强制</w:t>
+      </w:r>
+      <w:r>
+        <w:t xml:space="preserve"> </w:t>
+      </w:r>
+      <w:r>
+        <w:rPr>
+          <w:rStyle w:val="VerbatimChar"/>
+        </w:rPr>
+        <w:t xml:space="preserve">off</w:t>
+      </w:r>
+    </w:p>
+    <w:p>
+      <w:pPr>
+        <w:pStyle w:val="Heading3"/>
+      </w:pPr>
+      <w:bookmarkStart w:id="55" w:name="生产激活-gates未完成且不得由工程自行决定"/>
+      <w:r>
+        <w:t xml:space="preserve">19.3 生产激活 gates（未完成，且不得由工程自行决定）</w:t>
+      </w:r>
+      <w:bookmarkEnd w:id="55"/>
+    </w:p>
+    <w:p>
+      <w:pPr>
+        <w:numPr>
+          <w:ilvl w:val="0"/>
+          <w:numId w:val="1018"/>
+        </w:numPr>
+        <w:pStyle w:val="Compact"/>
+      </w:pPr>
+      <w:r>
+        <w:t xml:space="preserve">D-02 生产积分面值未批准</w:t>
+      </w:r>
+    </w:p>
+    <w:p>
+      <w:pPr>
+        <w:numPr>
+          <w:ilvl w:val="0"/>
+          <w:numId w:val="1018"/>
+        </w:numPr>
+        <w:pStyle w:val="Compact"/>
+      </w:pPr>
+      <w:r>
+        <w:t xml:space="preserve">D-03 生产披露文案未批准</w:t>
+      </w:r>
+    </w:p>
+    <w:p>
+      <w:pPr>
+        <w:numPr>
+          <w:ilvl w:val="0"/>
+          <w:numId w:val="1018"/>
+        </w:numPr>
+        <w:pStyle w:val="Compact"/>
+      </w:pPr>
+      <w:r>
+        <w:t xml:space="preserve">双人审批后台入口（创建人 ≠ 审批人）未开放；当前 schema 无 actor 字段</w:t>
+      </w:r>
+    </w:p>
+    <w:p>
+      <w:pPr>
+        <w:numPr>
+          <w:ilvl w:val="0"/>
+          <w:numId w:val="1018"/>
+        </w:numPr>
+        <w:pStyle w:val="Compact"/>
+      </w:pPr>
+      <w:r>
+        <w:t xml:space="preserve">未创建生产 active ValuePolicy</w:t>
+      </w:r>
+    </w:p>
+    <w:p>
+      <w:pPr>
+        <w:numPr>
+          <w:ilvl w:val="0"/>
+          <w:numId w:val="1018"/>
+        </w:numPr>
+        <w:pStyle w:val="Compact"/>
+      </w:pPr>
+      <w:r>
+        <w:t xml:space="preserve">生产</w:t>
+      </w:r>
+      <w:r>
+        <w:t xml:space="preserve"> </w:t>
+      </w:r>
+      <w:r>
+        <w:rPr>
+          <w:rStyle w:val="VerbatimChar"/>
+        </w:rPr>
+        <w:t xml:space="preserve">POINT_VALUE_POLICY_MODE</w:t>
+      </w:r>
+      <w:r>
+        <w:t xml:space="preserve"> </w:t>
+      </w:r>
+      <w:r>
+        <w:t xml:space="preserve">必须保持</w:t>
+      </w:r>
+      <w:r>
+        <w:t xml:space="preserve"> </w:t>
+      </w:r>
+      <w:r>
+        <w:rPr>
+          <w:rStyle w:val="VerbatimChar"/>
+        </w:rPr>
+        <w:t xml:space="preserve">off</w:t>
+      </w:r>
+    </w:p>
+    <w:p>
+      <w:pPr>
+        <w:pStyle w:val="Heading3"/>
+      </w:pPr>
+      <w:bookmarkStart w:id="56" w:name="明确不属于本-phase-1-的后续范围"/>
+      <w:r>
+        <w:t xml:space="preserve">19.4 明确不属于本 Phase 1 的后续范围</w:t>
+      </w:r>
+      <w:bookmarkEnd w:id="56"/>
+    </w:p>
+    <w:p>
+      <w:pPr>
+        <w:pStyle w:val="FirstParagraph"/>
+      </w:pPr>
+      <w:r>
+        <w:t xml:space="preserve">以下属于</w:t>
+      </w:r>
+      <w:r>
+        <w:t xml:space="preserve"> </w:t>
+      </w:r>
+      <w:r>
+        <w:rPr>
+          <w:rStyle w:val="VerbatimChar"/>
+        </w:rPr>
+        <w:t xml:space="preserve">SPEC-VALUE-LEDGER-001</w:t>
+      </w:r>
+      <w:r>
+        <w:t xml:space="preserve"> </w:t>
+      </w:r>
+      <w:r>
+        <w:t xml:space="preserve">后续阶段，不是本次 closure 的未完成代码：</w:t>
+      </w:r>
+    </w:p>
+    <w:p>
+      <w:pPr>
+        <w:numPr>
+          <w:ilvl w:val="0"/>
+          <w:numId w:val="1019"/>
+        </w:numPr>
+        <w:pStyle w:val="Compact"/>
+      </w:pPr>
+      <w:r>
+        <w:t xml:space="preserve">LedgerAccount / LedgerTransaction / LedgerEntry</w:t>
+      </w:r>
+    </w:p>
+    <w:p>
+      <w:pPr>
+        <w:numPr>
+          <w:ilvl w:val="0"/>
+          <w:numId w:val="1019"/>
+        </w:numPr>
+        <w:pStyle w:val="Compact"/>
+      </w:pPr>
+      <w:r>
+        <w:t xml:space="preserve">EntitlementLot / ConsumptionAllocation</w:t>
+      </w:r>
+    </w:p>
+    <w:p>
+      <w:pPr>
+        <w:numPr>
+          <w:ilvl w:val="0"/>
+          <w:numId w:val="1019"/>
+        </w:numPr>
+        <w:pStyle w:val="Compact"/>
+      </w:pPr>
+      <w:r>
+        <w:t xml:space="preserve">RP/VC/XP 拆分</w:t>
+      </w:r>
+    </w:p>
+    <w:p>
+      <w:pPr>
+        <w:numPr>
+          <w:ilvl w:val="0"/>
+          <w:numId w:val="1019"/>
+        </w:numPr>
+        <w:pStyle w:val="Compact"/>
+      </w:pPr>
+      <w:r>
+        <w:t xml:space="preserve">FxQuote</w:t>
+      </w:r>
+    </w:p>
+    <w:p>
+      <w:pPr>
+        <w:numPr>
+          <w:ilvl w:val="0"/>
+          <w:numId w:val="1019"/>
+        </w:numPr>
+        <w:pStyle w:val="Compact"/>
+      </w:pPr>
+      <w:r>
+        <w:t xml:space="preserve">真实 CNY/USD/USDT 支付</w:t>
+      </w:r>
+    </w:p>
+    <w:p>
+      <w:pPr>
+        <w:numPr>
+          <w:ilvl w:val="0"/>
+          <w:numId w:val="1019"/>
+        </w:numPr>
+        <w:pStyle w:val="Compact"/>
+      </w:pPr>
+      <w:r>
+        <w:t xml:space="preserve">用户充值、转账、提现或现金赎回</w:t>
+      </w:r>
+    </w:p>
+    <w:p>
+      <w:pPr>
+        <w:numPr>
+          <w:ilvl w:val="0"/>
+          <w:numId w:val="1019"/>
+        </w:numPr>
+        <w:pStyle w:val="Compact"/>
+      </w:pPr>
+      <w:r>
+        <w:t xml:space="preserve">商家真实货币出款</w:t>
+      </w:r>
+    </w:p>
+    <w:p>
+      <w:pPr>
+        <w:numPr>
+          <w:ilvl w:val="0"/>
+          <w:numId w:val="1019"/>
+        </w:numPr>
+        <w:pStyle w:val="Compact"/>
+      </w:pPr>
+      <w:r>
+        <w:t xml:space="preserve">SettlementV2 / Payout / Reconciliation</w:t>
+      </w:r>
+    </w:p>
+    <w:p>
+      <w:pPr>
+        <w:numPr>
+          <w:ilvl w:val="0"/>
+          <w:numId w:val="1019"/>
+        </w:numPr>
+        <w:pStyle w:val="Compact"/>
+      </w:pPr>
+      <w:r>
+        <w:t xml:space="preserve">前端生产参考价值展示</w:t>
+      </w:r>
+    </w:p>
+    <w:p>
+      <w:pPr>
+        <w:numPr>
+          <w:ilvl w:val="0"/>
+          <w:numId w:val="1019"/>
+        </w:numPr>
+        <w:pStyle w:val="Compact"/>
+      </w:pPr>
+      <w:r>
+        <w:t xml:space="preserve">多租户</w:t>
+      </w:r>
+    </w:p>
+    <w:p>
+      <w:pPr>
+        <w:numPr>
+          <w:ilvl w:val="0"/>
+          <w:numId w:val="1019"/>
+        </w:numPr>
+        <w:pStyle w:val="Compact"/>
+      </w:pPr>
+      <w:r>
+        <w:t xml:space="preserve">生产 active policy</w:t>
+      </w:r>
+    </w:p>
+    <w:p>
+      <w:pPr>
+        <w:numPr>
+          <w:ilvl w:val="0"/>
+          <w:numId w:val="1019"/>
+        </w:numPr>
+        <w:pStyle w:val="Compact"/>
+      </w:pPr>
+      <w:r>
+        <w:t xml:space="preserve">自行决定</w:t>
+      </w:r>
+      <w:r>
+        <w:t xml:space="preserve"> </w:t>
+      </w:r>
+      <w:r>
+        <w:rPr>
+          <w:rStyle w:val="VerbatimChar"/>
+        </w:rPr>
+        <w:t xml:space="preserve">100 PTS = 1 CNY</w:t>
+      </w:r>
+    </w:p>
+    <w:p>
+      <w:pPr>
+        <w:pStyle w:val="Heading3"/>
+      </w:pPr>
+      <w:bookmarkStart w:id="57" w:name="migration-政策"/>
+      <w:r>
+        <w:t xml:space="preserve">19.5 Migration 政策</w:t>
+      </w:r>
+      <w:bookmarkEnd w:id="57"/>
+    </w:p>
+    <w:p>
+      <w:pPr>
+        <w:pStyle w:val="FirstParagraph"/>
+      </w:pPr>
+      <w:r>
+        <w:t xml:space="preserve">已合并的</w:t>
+      </w:r>
+      <w:r>
+        <w:t xml:space="preserve"> </w:t>
+      </w:r>
+      <w:r>
+        <w:rPr>
+          <w:rStyle w:val="VerbatimChar"/>
+        </w:rPr>
+        <w:t xml:space="preserve">20260817180000_add_value_policy_foundation</w:t>
+      </w:r>
+      <w:r>
+        <w:t xml:space="preserve"> </w:t>
+      </w:r>
+      <w:r>
+        <w:t xml:space="preserve">不得原地修改。</w:t>
+      </w:r>
+      <w:r>
+        <w:t xml:space="preserve"> </w:t>
+      </w:r>
+      <w:r>
+        <w:t xml:space="preserve">部署后只允许 forward-fix。禁止</w:t>
+      </w:r>
+      <w:r>
+        <w:t xml:space="preserve"> </w:t>
+      </w:r>
+      <w:r>
+        <w:rPr>
+          <w:rStyle w:val="VerbatimChar"/>
+        </w:rPr>
+        <w:t xml:space="preserve">prisma db push</w:t>
+      </w:r>
+      <w:r>
+        <w:t xml:space="preserve">。禁止回滚历史 migration。</w:t>
+      </w:r>
+    </w:p>
+    <w:p>
+      <w:pPr>
+        <w:pStyle w:val="Heading3"/>
+      </w:pPr>
+      <w:bookmarkStart w:id="58" w:name="docx-同步"/>
+      <w:r>
+        <w:t xml:space="preserve">19.6 DOCX 同步</w:t>
+      </w:r>
+      <w:bookmarkEnd w:id="58"/>
+    </w:p>
+    <w:p>
+      <w:pPr>
+        <w:pStyle w:val="FirstParagraph"/>
+      </w:pPr>
+      <w:r>
+        <w:t xml:space="preserve">两个正式 Spec 的权威正文是 Markdown。DOCX 由</w:t>
+      </w:r>
+      <w:r>
+        <w:t xml:space="preserve"> </w:t>
+      </w:r>
+      <w:r>
+        <w:rPr>
+          <w:rStyle w:val="VerbatimChar"/>
+        </w:rPr>
+        <w:t xml:space="preserve">scripts/sync-value-policy-specs-docx.sh</w:t>
+      </w:r>
+      <w:r>
+        <w:t xml:space="preserve">（pandoc）从 Markdown 重新生成，</w:t>
+      </w:r>
+      <w:r>
+        <w:t xml:space="preserve"> </w:t>
+      </w:r>
+      <w:r>
+        <w:t xml:space="preserve">并用反向</w:t>
+      </w:r>
+      <w:r>
+        <w:t xml:space="preserve"> </w:t>
+      </w:r>
+      <w:r>
+        <w:rPr>
+          <w:rStyle w:val="VerbatimChar"/>
+        </w:rPr>
+        <w:t xml:space="preserve">pandoc -t plain</w:t>
+      </w:r>
+      <w:r>
+        <w:t xml:space="preserve"> </w:t>
+      </w:r>
+      <w:r>
+        <w:t xml:space="preserve">校验关键状态句。禁止手工改 DOCX。</w:t>
       </w:r>
     </w:p>
     <w:sectPr/>
@@ -6607,7 +8122,7 @@
       </w:pPr>
     </w:lvl>
   </w:abstractNum>
-  <w:abstractNum w:abstractNumId="99211">
+  <w:abstractNum w:abstractNumId="99411">
     <w:nsid w:val="ea454b4c"/>
     <w:multiLevelType w:val="multilevel"/>
     <w:lvl w:ilvl="0">
@@ -6624,7 +8139,7 @@
     </w:lvl>
     <w:lvl w:ilvl="1">
       <w:start w:val="1"/>
-      <w:numFmt w:val="lowerLetter"/>
+      <w:numFmt w:val="decimal"/>
       <w:lvlText w:val="%2."/>
       <w:lvlJc w:val="left"/>
       <w:pPr>
@@ -6636,7 +8151,7 @@
     </w:lvl>
     <w:lvl w:ilvl="2">
       <w:start w:val="1"/>
-      <w:numFmt w:val="lowerRoman"/>
+      <w:numFmt w:val="decimal"/>
       <w:lvlText w:val="%3."/>
       <w:lvlJc w:val="left"/>
       <w:pPr>
@@ -6660,7 +8175,7 @@
     </w:lvl>
     <w:lvl w:ilvl="4">
       <w:start w:val="1"/>
-      <w:numFmt w:val="lowerLetter"/>
+      <w:numFmt w:val="decimal"/>
       <w:lvlText w:val="%5."/>
       <w:lvlJc w:val="left"/>
       <w:pPr>
@@ -6672,7 +8187,7 @@
     </w:lvl>
     <w:lvl w:ilvl="5">
       <w:start w:val="1"/>
-      <w:numFmt w:val="lowerRoman"/>
+      <w:numFmt w:val="decimal"/>
       <w:lvlText w:val="%6."/>
       <w:lvlJc w:val="left"/>
       <w:pPr>
@@ -6696,7 +8211,7 @@
     </w:lvl>
     <w:lvl w:ilvl="7">
       <w:start w:val="1"/>
-      <w:numFmt w:val="lowerLetter"/>
+      <w:numFmt w:val="decimal"/>
       <w:lvlText w:val="%8."/>
       <w:lvlJc w:val="left"/>
       <w:pPr>
@@ -6708,7 +8223,7 @@
     </w:lvl>
     <w:lvl w:ilvl="8">
       <w:start w:val="1"/>
-      <w:numFmt w:val="lowerRoman"/>
+      <w:numFmt w:val="decimal"/>
       <w:lvlText w:val="%9."/>
       <w:lvlJc w:val="left"/>
       <w:pPr>
@@ -6826,7 +8341,7 @@
     <w:abstractNumId w:val="990"/>
   </w:num>
   <w:num w:numId="1001">
-    <w:abstractNumId w:val="99211"/>
+    <w:abstractNumId w:val="99411"/>
     <w:lvlOverride w:ilvl="0">
       <w:startOverride w:val="1"/>
     </w:lvlOverride>
@@ -6862,7 +8377,7 @@
     <w:abstractNumId w:val="991"/>
   </w:num>
   <w:num w:numId="1004">
-    <w:abstractNumId w:val="99211"/>
+    <w:abstractNumId w:val="99411"/>
     <w:lvlOverride w:ilvl="0">
       <w:startOverride w:val="1"/>
     </w:lvlOverride>
@@ -6901,7 +8416,7 @@
     <w:abstractNumId w:val="991"/>
   </w:num>
   <w:num w:numId="1008">
-    <w:abstractNumId w:val="99211"/>
+    <w:abstractNumId w:val="99411"/>
     <w:lvlOverride w:ilvl="0">
       <w:startOverride w:val="1"/>
     </w:lvlOverride>
@@ -6931,7 +8446,7 @@
     </w:lvlOverride>
   </w:num>
   <w:num w:numId="1009">
-    <w:abstractNumId w:val="99211"/>
+    <w:abstractNumId w:val="99411"/>
     <w:lvlOverride w:ilvl="0">
       <w:startOverride w:val="1"/>
     </w:lvlOverride>
@@ -6961,19 +8476,7 @@
     </w:lvlOverride>
   </w:num>
   <w:num w:numId="1010">
-    <w:abstractNumId w:val="991"/>
-  </w:num>
-  <w:num w:numId="1011">
-    <w:abstractNumId w:val="991"/>
-  </w:num>
-  <w:num w:numId="1012">
-    <w:abstractNumId w:val="991"/>
-  </w:num>
-  <w:num w:numId="1013">
-    <w:abstractNumId w:val="991"/>
-  </w:num>
-  <w:num w:numId="1014">
-    <w:abstractNumId w:val="99211"/>
+    <w:abstractNumId w:val="99411"/>
     <w:lvlOverride w:ilvl="0">
       <w:startOverride w:val="1"/>
     </w:lvlOverride>
@@ -7002,8 +8505,20 @@
       <w:startOverride w:val="1"/>
     </w:lvlOverride>
   </w:num>
+  <w:num w:numId="1011">
+    <w:abstractNumId w:val="991"/>
+  </w:num>
+  <w:num w:numId="1012">
+    <w:abstractNumId w:val="991"/>
+  </w:num>
+  <w:num w:numId="1013">
+    <w:abstractNumId w:val="991"/>
+  </w:num>
+  <w:num w:numId="1014">
+    <w:abstractNumId w:val="991"/>
+  </w:num>
   <w:num w:numId="1015">
-    <w:abstractNumId w:val="99211"/>
+    <w:abstractNumId w:val="99411"/>
     <w:lvlOverride w:ilvl="0">
       <w:startOverride w:val="1"/>
     </w:lvlOverride>
@@ -7032,6 +8547,45 @@
       <w:startOverride w:val="1"/>
     </w:lvlOverride>
   </w:num>
+  <w:num w:numId="1016">
+    <w:abstractNumId w:val="99411"/>
+    <w:lvlOverride w:ilvl="0">
+      <w:startOverride w:val="1"/>
+    </w:lvlOverride>
+    <w:lvlOverride w:ilvl="1">
+      <w:startOverride w:val="1"/>
+    </w:lvlOverride>
+    <w:lvlOverride w:ilvl="2">
+      <w:startOverride w:val="1"/>
+    </w:lvlOverride>
+    <w:lvlOverride w:ilvl="3">
+      <w:startOverride w:val="1"/>
+    </w:lvlOverride>
+    <w:lvlOverride w:ilvl="4">
+      <w:startOverride w:val="1"/>
+    </w:lvlOverride>
+    <w:lvlOverride w:ilvl="5">
+      <w:startOverride w:val="1"/>
+    </w:lvlOverride>
+    <w:lvlOverride w:ilvl="6">
+      <w:startOverride w:val="1"/>
+    </w:lvlOverride>
+    <w:lvlOverride w:ilvl="7">
+      <w:startOverride w:val="1"/>
+    </w:lvlOverride>
+    <w:lvlOverride w:ilvl="8">
+      <w:startOverride w:val="1"/>
+    </w:lvlOverride>
+  </w:num>
+  <w:num w:numId="1017">
+    <w:abstractNumId w:val="991"/>
+  </w:num>
+  <w:num w:numId="1018">
+    <w:abstractNumId w:val="991"/>
+  </w:num>
+  <w:num w:numId="1019">
+    <w:abstractNumId w:val="991"/>
+  </w:num>
 </w:numbering>
 </file>
 
@@ -7040,7 +8594,7 @@
   <w:docDefaults>
     <w:rPrDefault>
       <w:rPr>
-        <w:rFonts w:asciiTheme="minorHAnsi" w:hAnsiTheme="minorHAnsi" w:eastAsiaTheme="minorHAnsi" w:cstheme="minorBidi"/>
+        <w:rFonts w:asciiTheme="minorHAnsi" w:eastAsiaTheme="minorHAnsi" w:hAnsiTheme="minorHAnsi" w:cstheme="minorBidi"/>
         <w:sz w:val="24"/>
         <w:szCs w:val="24"/>
         <w:lang w:val="en-US" w:eastAsia="en-US" w:bidi="ar-SA"/>
@@ -7053,7 +8607,7 @@
     </w:pPrDefault>
   </w:docDefaults>
   <w:latentStyles w:defLockedState="0" w:defUIPriority="0" w:defSemiHidden="0" w:defUnhideWhenUsed="0" w:defQFormat="0" w:count="276"/>
-  <w:style w:type="paragraph" w:styleId="Normal" w:default="1">
+  <w:style w:type="paragraph" w:default="1" w:styleId="Normal">
     <w:name w:val="Normal"/>
     <w:qFormat/>
   </w:style>
@@ -7061,18 +8615,18 @@
     <w:name w:val="Body Text"/>
     <w:basedOn w:val="Normal"/>
     <w:link w:val="BodyTextChar"/>
-    <w:qFormat/>
     <w:pPr>
       <w:spacing w:before="180" w:after="180"/>
     </w:pPr>
+    <w:qFormat/>
   </w:style>
-  <w:style w:type="paragraph" w:styleId="FirstParagraph" w:customStyle="1">
+  <w:style w:type="paragraph" w:customStyle="1" w:styleId="FirstParagraph">
     <w:name w:val="First Paragraph"/>
     <w:basedOn w:val="BodyText"/>
     <w:next w:val="BodyText"/>
     <w:qFormat/>
   </w:style>
-  <w:style w:type="paragraph" w:styleId="Compact" w:customStyle="1">
+  <w:style w:type="paragraph" w:customStyle="1" w:styleId="Compact">
     <w:name w:val="Compact"/>
     <w:basedOn w:val="BodyText"/>
     <w:qFormat/>
@@ -7092,7 +8646,7 @@
       <w:jc w:val="center"/>
     </w:pPr>
     <w:rPr>
-      <w:rFonts w:asciiTheme="majorHAnsi" w:hAnsiTheme="majorHAnsi" w:eastAsiaTheme="majorEastAsia" w:cstheme="majorBidi"/>
+      <w:rFonts w:asciiTheme="majorHAnsi" w:eastAsiaTheme="majorEastAsia" w:hAnsiTheme="majorHAnsi" w:cstheme="majorBidi"/>
       <w:b/>
       <w:bCs/>
       <w:color w:val="345A8A" w:themeColor="accent1" w:themeShade="B5"/>
@@ -7116,7 +8670,7 @@
       <w:szCs w:val="30"/>
     </w:rPr>
   </w:style>
-  <w:style w:type="paragraph" w:styleId="Author" w:customStyle="1">
+  <w:style w:type="paragraph" w:customStyle="1" w:styleId="Author">
     <w:name w:val="Author"/>
     <w:next w:val="BodyText"/>
     <w:qFormat/>
@@ -7136,7 +8690,7 @@
       <w:jc w:val="center"/>
     </w:pPr>
   </w:style>
-  <w:style w:type="paragraph" w:styleId="Abstract" w:customStyle="1">
+  <w:style w:type="paragraph" w:customStyle="1" w:styleId="Abstract">
     <w:name w:val="Abstract"/>
     <w:basedOn w:val="Normal"/>
     <w:next w:val="BodyText"/>
@@ -7172,7 +8726,7 @@
       <w:outlineLvl w:val="0"/>
     </w:pPr>
     <w:rPr>
-      <w:rFonts w:asciiTheme="majorHAnsi" w:hAnsiTheme="majorHAnsi" w:eastAsiaTheme="majorEastAsia" w:cstheme="majorBidi"/>
+      <w:rFonts w:asciiTheme="majorHAnsi" w:eastAsiaTheme="majorEastAsia" w:hAnsiTheme="majorHAnsi" w:cstheme="majorBidi"/>
       <w:b/>
       <w:bCs/>
       <w:color w:val="4F81BD" w:themeColor="accent1"/>
@@ -7194,7 +8748,7 @@
       <w:outlineLvl w:val="1"/>
     </w:pPr>
     <w:rPr>
-      <w:rFonts w:asciiTheme="majorHAnsi" w:hAnsiTheme="majorHAnsi" w:eastAsiaTheme="majorEastAsia" w:cstheme="majorBidi"/>
+      <w:rFonts w:asciiTheme="majorHAnsi" w:eastAsiaTheme="majorEastAsia" w:hAnsiTheme="majorHAnsi" w:cstheme="majorBidi"/>
       <w:b/>
       <w:bCs/>
       <w:color w:val="4F81BD" w:themeColor="accent1"/>
@@ -7216,7 +8770,7 @@
       <w:outlineLvl w:val="2"/>
     </w:pPr>
     <w:rPr>
-      <w:rFonts w:asciiTheme="majorHAnsi" w:hAnsiTheme="majorHAnsi" w:eastAsiaTheme="majorEastAsia" w:cstheme="majorBidi"/>
+      <w:rFonts w:asciiTheme="majorHAnsi" w:eastAsiaTheme="majorEastAsia" w:hAnsiTheme="majorHAnsi" w:cstheme="majorBidi"/>
       <w:b/>
       <w:bCs/>
       <w:color w:val="4F81BD" w:themeColor="accent1"/>
@@ -7238,9 +8792,9 @@
       <w:outlineLvl w:val="3"/>
     </w:pPr>
     <w:rPr>
-      <w:rFonts w:asciiTheme="majorHAnsi" w:hAnsiTheme="majorHAnsi" w:eastAsiaTheme="majorEastAsia" w:cstheme="majorBidi"/>
+      <w:rFonts w:asciiTheme="majorHAnsi" w:eastAsiaTheme="majorEastAsia" w:hAnsiTheme="majorHAnsi" w:cstheme="majorBidi"/>
+      <w:i/>
       <w:bCs/>
-      <w:i/>
       <w:color w:val="4F81BD" w:themeColor="accent1"/>
       <w:sz w:val="24"/>
       <w:szCs w:val="24"/>
@@ -7260,7 +8814,7 @@
       <w:outlineLvl w:val="4"/>
     </w:pPr>
     <w:rPr>
-      <w:rFonts w:asciiTheme="majorHAnsi" w:hAnsiTheme="majorHAnsi" w:eastAsiaTheme="majorEastAsia" w:cstheme="majorBidi"/>
+      <w:rFonts w:asciiTheme="majorHAnsi" w:eastAsiaTheme="majorEastAsia" w:hAnsiTheme="majorHAnsi" w:cstheme="majorBidi"/>
       <w:iCs/>
       <w:color w:val="4F81BD" w:themeColor="accent1"/>
       <w:sz w:val="24"/>
@@ -7281,7 +8835,7 @@
       <w:outlineLvl w:val="5"/>
     </w:pPr>
     <w:rPr>
-      <w:rFonts w:asciiTheme="majorHAnsi" w:hAnsiTheme="majorHAnsi" w:eastAsiaTheme="majorEastAsia" w:cstheme="majorBidi"/>
+      <w:rFonts w:asciiTheme="majorHAnsi" w:eastAsiaTheme="majorEastAsia" w:hAnsiTheme="majorHAnsi" w:cstheme="majorBidi"/>
       <w:color w:val="4F81BD" w:themeColor="accent1"/>
       <w:sz w:val="24"/>
       <w:szCs w:val="24"/>
@@ -7301,7 +8855,7 @@
       <w:outlineLvl w:val="6"/>
     </w:pPr>
     <w:rPr>
-      <w:rFonts w:asciiTheme="majorHAnsi" w:hAnsiTheme="majorHAnsi" w:eastAsiaTheme="majorEastAsia" w:cstheme="majorBidi"/>
+      <w:rFonts w:asciiTheme="majorHAnsi" w:eastAsiaTheme="majorEastAsia" w:hAnsiTheme="majorHAnsi" w:cstheme="majorBidi"/>
       <w:color w:val="4F81BD" w:themeColor="accent1"/>
       <w:sz w:val="24"/>
       <w:szCs w:val="24"/>
@@ -7321,7 +8875,7 @@
       <w:outlineLvl w:val="7"/>
     </w:pPr>
     <w:rPr>
-      <w:rFonts w:asciiTheme="majorHAnsi" w:hAnsiTheme="majorHAnsi" w:eastAsiaTheme="majorEastAsia" w:cstheme="majorBidi"/>
+      <w:rFonts w:asciiTheme="majorHAnsi" w:eastAsiaTheme="majorEastAsia" w:hAnsiTheme="majorHAnsi" w:cstheme="majorBidi"/>
       <w:color w:val="4F81BD" w:themeColor="accent1"/>
       <w:sz w:val="24"/>
       <w:szCs w:val="24"/>
@@ -7341,7 +8895,7 @@
       <w:outlineLvl w:val="8"/>
     </w:pPr>
     <w:rPr>
-      <w:rFonts w:asciiTheme="majorHAnsi" w:hAnsiTheme="majorHAnsi" w:eastAsiaTheme="majorEastAsia" w:cstheme="majorBidi"/>
+      <w:rFonts w:asciiTheme="majorHAnsi" w:eastAsiaTheme="majorEastAsia" w:hAnsiTheme="majorHAnsi" w:cstheme="majorBidi"/>
       <w:color w:val="4F81BD" w:themeColor="accent1"/>
       <w:sz w:val="24"/>
       <w:szCs w:val="24"/>
@@ -7356,7 +8910,7 @@
     <w:qFormat/>
     <w:pPr>
       <w:spacing w:before="100" w:after="100"/>
-      <w:ind w:left="480" w:right="480" w:firstLine="0"/>
+      <w:ind w:firstLine="0" w:left="480" w:right="480"/>
     </w:pPr>
   </w:style>
   <w:style w:type="paragraph" w:styleId="FootnoteText">
@@ -7367,12 +8921,12 @@
     <w:unhideWhenUsed/>
     <w:qFormat/>
   </w:style>
-  <w:style w:type="character" w:styleId="DefaultParagraphFont" w:default="1">
+  <w:style w:type="character" w:default="1" w:styleId="DefaultParagraphFont">
     <w:name w:val="Default Paragraph Font"/>
     <w:semiHidden/>
     <w:unhideWhenUsed/>
   </w:style>
-  <w:style w:type="table" w:styleId="Table" w:default="1">
+  <w:style w:type="table" w:default="1" w:styleId="Table">
     <w:name w:val="Table"/>
     <w:basedOn w:val="TableNormal"/>
     <w:semiHidden/>
@@ -7388,7 +8942,7 @@
       </w:tblCellMar>
     </w:tblPr>
   </w:style>
-  <w:style w:type="paragraph" w:styleId="DefinitionTerm" w:customStyle="1">
+  <w:style w:type="paragraph" w:customStyle="1" w:styleId="DefinitionTerm">
     <w:name w:val="Definition Term"/>
     <w:basedOn w:val="Normal"/>
     <w:next w:val="Definition"/>
@@ -7401,7 +8955,7 @@
       <w:b/>
     </w:rPr>
   </w:style>
-  <w:style w:type="paragraph" w:styleId="Definition" w:customStyle="1">
+  <w:style w:type="paragraph" w:customStyle="1" w:styleId="Definition">
     <w:name w:val="Definition"/>
     <w:basedOn w:val="Normal"/>
   </w:style>
@@ -7416,34 +8970,34 @@
       <w:i/>
     </w:rPr>
   </w:style>
-  <w:style w:type="paragraph" w:styleId="TableCaption" w:customStyle="1">
+  <w:style w:type="paragraph" w:customStyle="1" w:styleId="TableCaption">
     <w:name w:val="Table Caption"/>
     <w:basedOn w:val="Caption"/>
     <w:pPr>
       <w:keepNext/>
     </w:pPr>
   </w:style>
-  <w:style w:type="paragraph" w:styleId="ImageCaption" w:customStyle="1">
+  <w:style w:type="paragraph" w:customStyle="1" w:styleId="ImageCaption">
     <w:name w:val="Image Caption"/>
     <w:basedOn w:val="Caption"/>
   </w:style>
-  <w:style w:type="paragraph" w:styleId="Figure" w:customStyle="1">
+  <w:style w:type="paragraph" w:customStyle="1" w:styleId="Figure">
     <w:name w:val="Figure"/>
     <w:basedOn w:val="Normal"/>
   </w:style>
-  <w:style w:type="paragraph" w:styleId="CaptionedFigure" w:customStyle="1">
+  <w:style w:type="paragraph" w:customStyle="1" w:styleId="CaptionedFigure">
     <w:name w:val="Captioned Figure"/>
     <w:basedOn w:val="Figure"/>
     <w:pPr>
       <w:keepNext/>
     </w:pPr>
   </w:style>
-  <w:style w:type="character" w:styleId="BodyTextChar" w:customStyle="1">
+  <w:style w:type="character" w:customStyle="1" w:styleId="BodyTextChar">
     <w:name w:val="Body Text Char"/>
     <w:basedOn w:val="DefaultParagraphFont"/>
     <w:link w:val="BodyText"/>
   </w:style>
-  <w:style w:type="character" w:styleId="VerbatimChar" w:customStyle="1">
+  <w:style w:type="character" w:customStyle="1" w:styleId="VerbatimChar">
     <w:name w:val="Verbatim Char"/>
     <w:basedOn w:val="BodyTextChar"/>
     <w:rPr>
@@ -7477,13 +9031,13 @@
       <w:outlineLvl w:val="9"/>
     </w:pPr>
     <w:rPr>
-      <w:rFonts w:asciiTheme="majorHAnsi" w:hAnsiTheme="majorHAnsi" w:eastAsiaTheme="majorEastAsia" w:cstheme="majorBidi"/>
+      <w:rFonts w:asciiTheme="majorHAnsi" w:eastAsiaTheme="majorEastAsia" w:hAnsiTheme="majorHAnsi" w:cstheme="majorBidi"/>
       <w:b w:val="0"/>
       <w:bCs w:val="0"/>
       <w:color w:val="365F91" w:themeColor="accent1" w:themeShade="BF"/>
     </w:rPr>
   </w:style>
-  <w:style w:type="paragraph" w:styleId="SourceCode" w:customStyle="1">
+  <w:style w:type="paragraph" w:customStyle="1" w:styleId="SourceCode">
     <w:name w:val="Source Code"/>
     <w:basedOn w:val="Normal"/>
     <w:link w:val="VerbatimChar"/>
@@ -7491,223 +9045,223 @@
       <w:wordWrap w:val="off"/>
     </w:pPr>
   </w:style>
-  <w:style w:type="character" w:styleId="KeywordTok" w:customStyle="1">
+  <w:style w:type="character" w:customStyle="1" w:styleId="KeywordTok">
     <w:name w:val="KeywordTok"/>
     <w:basedOn w:val="VerbatimChar"/>
     <w:rPr>
+      <w:color w:val="007020"/>
       <w:b/>
-      <w:color w:val="007020"/>
     </w:rPr>
   </w:style>
-  <w:style w:type="character" w:styleId="DataTypeTok" w:customStyle="1">
+  <w:style w:type="character" w:customStyle="1" w:styleId="DataTypeTok">
     <w:name w:val="DataTypeTok"/>
     <w:basedOn w:val="VerbatimChar"/>
     <w:rPr>
       <w:color w:val="902000"/>
     </w:rPr>
   </w:style>
-  <w:style w:type="character" w:styleId="DecValTok" w:customStyle="1">
+  <w:style w:type="character" w:customStyle="1" w:styleId="DecValTok">
     <w:name w:val="DecValTok"/>
     <w:basedOn w:val="VerbatimChar"/>
     <w:rPr>
       <w:color w:val="40a070"/>
     </w:rPr>
   </w:style>
-  <w:style w:type="character" w:styleId="BaseNTok" w:customStyle="1">
+  <w:style w:type="character" w:customStyle="1" w:styleId="BaseNTok">
     <w:name w:val="BaseNTok"/>
     <w:basedOn w:val="VerbatimChar"/>
     <w:rPr>
       <w:color w:val="40a070"/>
     </w:rPr>
   </w:style>
-  <w:style w:type="character" w:styleId="FloatTok" w:customStyle="1">
+  <w:style w:type="character" w:customStyle="1" w:styleId="FloatTok">
     <w:name w:val="FloatTok"/>
     <w:basedOn w:val="VerbatimChar"/>
     <w:rPr>
       <w:color w:val="40a070"/>
     </w:rPr>
   </w:style>
-  <w:style w:type="character" w:styleId="ConstantTok" w:customStyle="1">
+  <w:style w:type="character" w:customStyle="1" w:styleId="ConstantTok">
     <w:name w:val="ConstantTok"/>
     <w:basedOn w:val="VerbatimChar"/>
     <w:rPr>
       <w:color w:val="880000"/>
     </w:rPr>
   </w:style>
-  <w:style w:type="character" w:styleId="CharTok" w:customStyle="1">
+  <w:style w:type="character" w:customStyle="1" w:styleId="CharTok">
     <w:name w:val="CharTok"/>
     <w:basedOn w:val="VerbatimChar"/>
     <w:rPr>
       <w:color w:val="4070a0"/>
     </w:rPr>
   </w:style>
-  <w:style w:type="character" w:styleId="SpecialCharTok" w:customStyle="1">
+  <w:style w:type="character" w:customStyle="1" w:styleId="SpecialCharTok">
     <w:name w:val="SpecialCharTok"/>
     <w:basedOn w:val="VerbatimChar"/>
     <w:rPr>
       <w:color w:val="4070a0"/>
     </w:rPr>
   </w:style>
-  <w:style w:type="character" w:styleId="StringTok" w:customStyle="1">
+  <w:style w:type="character" w:customStyle="1" w:styleId="StringTok">
     <w:name w:val="StringTok"/>
     <w:basedOn w:val="VerbatimChar"/>
     <w:rPr>
       <w:color w:val="4070a0"/>
     </w:rPr>
   </w:style>
-  <w:style w:type="character" w:styleId="VerbatimStringTok" w:customStyle="1">
+  <w:style w:type="character" w:customStyle="1" w:styleId="VerbatimStringTok">
     <w:name w:val="VerbatimStringTok"/>
     <w:basedOn w:val="VerbatimChar"/>
     <w:rPr>
       <w:color w:val="4070a0"/>
     </w:rPr>
   </w:style>
-  <w:style w:type="character" w:styleId="SpecialStringTok" w:customStyle="1">
+  <w:style w:type="character" w:customStyle="1" w:styleId="SpecialStringTok">
     <w:name w:val="SpecialStringTok"/>
     <w:basedOn w:val="VerbatimChar"/>
     <w:rPr>
       <w:color w:val="bb6688"/>
     </w:rPr>
   </w:style>
-  <w:style w:type="character" w:styleId="ImportTok" w:customStyle="1">
+  <w:style w:type="character" w:customStyle="1" w:styleId="ImportTok">
     <w:name w:val="ImportTok"/>
     <w:basedOn w:val="VerbatimChar"/>
     <w:rPr/>
   </w:style>
-  <w:style w:type="character" w:styleId="CommentTok" w:customStyle="1">
+  <w:style w:type="character" w:customStyle="1" w:styleId="CommentTok">
     <w:name w:val="CommentTok"/>
     <w:basedOn w:val="VerbatimChar"/>
     <w:rPr>
+      <w:color w:val="60a0b0"/>
       <w:i/>
-      <w:color w:val="60a0b0"/>
     </w:rPr>
   </w:style>
-  <w:style w:type="character" w:styleId="DocumentationTok" w:customStyle="1">
+  <w:style w:type="character" w:customStyle="1" w:styleId="DocumentationTok">
     <w:name w:val="DocumentationTok"/>
     <w:basedOn w:val="VerbatimChar"/>
     <w:rPr>
+      <w:color w:val="ba2121"/>
       <w:i/>
-      <w:color w:val="ba2121"/>
     </w:rPr>
   </w:style>
-  <w:style w:type="character" w:styleId="AnnotationTok" w:customStyle="1">
+  <w:style w:type="character" w:customStyle="1" w:styleId="AnnotationTok">
     <w:name w:val="AnnotationTok"/>
     <w:basedOn w:val="VerbatimChar"/>
     <w:rPr>
+      <w:color w:val="60a0b0"/>
       <w:b/>
       <w:i/>
-      <w:color w:val="60a0b0"/>
     </w:rPr>
   </w:style>
-  <w:style w:type="character" w:styleId="CommentVarTok" w:customStyle="1">
+  <w:style w:type="character" w:customStyle="1" w:styleId="CommentVarTok">
     <w:name w:val="CommentVarTok"/>
     <w:basedOn w:val="VerbatimChar"/>
     <w:rPr>
+      <w:color w:val="60a0b0"/>
       <w:b/>
       <w:i/>
-      <w:color w:val="60a0b0"/>
     </w:rPr>
   </w:style>
-  <w:style w:type="character" w:styleId="OtherTok" w:customStyle="1">
+  <w:style w:type="character" w:customStyle="1" w:styleId="OtherTok">
     <w:name w:val="OtherTok"/>
     <w:basedOn w:val="VerbatimChar"/>
     <w:rPr>
       <w:color w:val="007020"/>
     </w:rPr>
   </w:style>
-  <w:style w:type="character" w:styleId="FunctionTok" w:customStyle="1">
+  <w:style w:type="character" w:customStyle="1" w:styleId="FunctionTok">
     <w:name w:val="FunctionTok"/>
     <w:basedOn w:val="VerbatimChar"/>
     <w:rPr>
       <w:color w:val="06287e"/>
     </w:rPr>
   </w:style>
-  <w:style w:type="character" w:styleId="VariableTok" w:customStyle="1">
+  <w:style w:type="character" w:customStyle="1" w:styleId="VariableTok">
     <w:name w:val="VariableTok"/>
     <w:basedOn w:val="VerbatimChar"/>
     <w:rPr>
       <w:color w:val="19177c"/>
     </w:rPr>
   </w:style>
-  <w:style w:type="character" w:styleId="ControlFlowTok" w:customStyle="1">
+  <w:style w:type="character" w:customStyle="1" w:styleId="ControlFlowTok">
     <w:name w:val="ControlFlowTok"/>
     <w:basedOn w:val="VerbatimChar"/>
     <w:rPr>
+      <w:color w:val="007020"/>
       <w:b/>
-      <w:color w:val="007020"/>
     </w:rPr>
   </w:style>
-  <w:style w:type="character" w:styleId="OperatorTok" w:customStyle="1">
+  <w:style w:type="character" w:customStyle="1" w:styleId="OperatorTok">
     <w:name w:val="OperatorTok"/>
     <w:basedOn w:val="VerbatimChar"/>
     <w:rPr>
       <w:color w:val="666666"/>
     </w:rPr>
   </w:style>
-  <w:style w:type="character" w:styleId="BuiltInTok" w:customStyle="1">
+  <w:style w:type="character" w:customStyle="1" w:styleId="BuiltInTok">
     <w:name w:val="BuiltInTok"/>
     <w:basedOn w:val="VerbatimChar"/>
     <w:rPr/>
   </w:style>
-  <w:style w:type="character" w:styleId="ExtensionTok" w:customStyle="1">
+  <w:style w:type="character" w:customStyle="1" w:styleId="ExtensionTok">
     <w:name w:val="ExtensionTok"/>
     <w:basedOn w:val="VerbatimChar"/>
     <w:rPr/>
   </w:style>
-  <w:style w:type="character" w:styleId="PreprocessorTok" w:customStyle="1">
+  <w:style w:type="character" w:customStyle="1" w:styleId="PreprocessorTok">
     <w:name w:val="PreprocessorTok"/>
     <w:basedOn w:val="VerbatimChar"/>
     <w:rPr>
       <w:color w:val="bc7a00"/>
     </w:rPr>
   </w:style>
-  <w:style w:type="character" w:styleId="AttributeTok" w:customStyle="1">
+  <w:style w:type="character" w:customStyle="1" w:styleId="AttributeTok">
     <w:name w:val="AttributeTok"/>
     <w:basedOn w:val="VerbatimChar"/>
     <w:rPr>
       <w:color w:val="7d9029"/>
     </w:rPr>
   </w:style>
-  <w:style w:type="character" w:styleId="RegionMarkerTok" w:customStyle="1">
+  <w:style w:type="character" w:customStyle="1" w:styleId="RegionMarkerTok">
     <w:name w:val="RegionMarkerTok"/>
     <w:basedOn w:val="VerbatimChar"/>
     <w:rPr/>
   </w:style>
-  <w:style w:type="character" w:styleId="InformationTok" w:customStyle="1">
+  <w:style w:type="character" w:customStyle="1" w:styleId="InformationTok">
     <w:name w:val="InformationTok"/>
     <w:basedOn w:val="VerbatimChar"/>
     <w:rPr>
+      <w:color w:val="60a0b0"/>
       <w:b/>
       <w:i/>
-      <w:color w:val="60a0b0"/>
     </w:rPr>
   </w:style>
-  <w:style w:type="character" w:styleId="WarningTok" w:customStyle="1">
+  <w:style w:type="character" w:customStyle="1" w:styleId="WarningTok">
     <w:name w:val="WarningTok"/>
     <w:basedOn w:val="VerbatimChar"/>
     <w:rPr>
+      <w:color w:val="60a0b0"/>
       <w:b/>
       <w:i/>
-      <w:color w:val="60a0b0"/>
     </w:rPr>
   </w:style>
-  <w:style w:type="character" w:styleId="AlertTok" w:customStyle="1">
+  <w:style w:type="character" w:customStyle="1" w:styleId="AlertTok">
     <w:name w:val="AlertTok"/>
     <w:basedOn w:val="VerbatimChar"/>
     <w:rPr>
+      <w:color w:val="ff0000"/>
       <w:b/>
-      <w:color w:val="ff0000"/>
     </w:rPr>
   </w:style>
-  <w:style w:type="character" w:styleId="ErrorTok" w:customStyle="1">
+  <w:style w:type="character" w:customStyle="1" w:styleId="ErrorTok">
     <w:name w:val="ErrorTok"/>
     <w:basedOn w:val="VerbatimChar"/>
     <w:rPr>
+      <w:color w:val="ff0000"/>
       <w:b/>
-      <w:color w:val="ff0000"/>
     </w:rPr>
   </w:style>
-  <w:style w:type="character" w:styleId="NormalTok" w:customStyle="1">
+  <w:style w:type="character" w:customStyle="1" w:styleId="NormalTok">
     <w:name w:val="NormalTok"/>
     <w:basedOn w:val="VerbatimChar"/>
     <w:rPr/>

</xml_diff>

<commit_message>
release: promote ValuePolicy closure to production (2026-08-18) (#152)
Source develop: baccbaaaf499a9b6b7d1983a7cd9e4a07eb1bafe
</commit_message>
<xml_diff>
--- a/docs/specs/points-value-policy-phase-1.docx
+++ b/docs/specs/points-value-policy-phase-1.docx
@@ -6,7 +6,7 @@
       <w:pPr>
         <w:pStyle w:val="Heading1"/>
       </w:pPr>
-      <w:bookmarkStart w:name="speccny-价值政策与订单定价快照phase-1" w:id="20"/>
+      <w:bookmarkStart w:id="20" w:name="speccny-价值政策与订单定价快照phase-1"/>
       <w:r>
         <w:t xml:space="preserve">Spec：CNY 价值政策与订单定价快照（Phase 1）</w:t>
       </w:r>
@@ -15,12 +15,14 @@
     <w:tbl>
       <w:tblPr>
         <w:tblStyle w:val="Table"/>
-        <w:tblW w:w="5000" w:type="pct"/>
-        <w:tblLook w:val="04A0"/>
+        <w:tblW w:type="pct" w:w="0.0"/>
+        <w:tblLook w:firstRow="1"/>
       </w:tblPr>
       <w:tblGrid/>
       <w:tr>
-        <w:trPr/>
+        <w:trPr>
+          <w:cnfStyle w:firstRow="1"/>
+        </w:trPr>
         <w:tc>
           <w:tcPr>
             <w:tcBorders>
@@ -123,7 +125,7 @@
               <w:jc w:val="left"/>
             </w:pPr>
             <w:r>
-              <w:t xml:space="preserve">2026-08-17</w:t>
+              <w:t xml:space="preserve">2026-08-18</w:t>
             </w:r>
           </w:p>
         </w:tc>
@@ -147,7 +149,7 @@
               <w:jc w:val="left"/>
             </w:pPr>
             <w:r>
-              <w:t xml:space="preserve">Ready for Implementation — Production Activation Blocked by D-02</w:t>
+              <w:t xml:space="preserve">Implemented — Production Activation Blocked by D-02/D-03</w:t>
             </w:r>
           </w:p>
         </w:tc>
@@ -201,7 +203,37 @@
               <w:rPr>
                 <w:rStyle w:val="VerbatimChar"/>
               </w:rPr>
-              <w:t xml:space="preserve">origin/develop@46253bc</w:t>
+              <w:t xml:space="preserve">origin/develop@c6d21bb</w:t>
+            </w:r>
+            <w:r>
+              <w:t xml:space="preserve">（PR #144 squash merge）</w:t>
+            </w:r>
+          </w:p>
+        </w:tc>
+      </w:tr>
+      <w:tr>
+        <w:tc>
+          <w:p>
+            <w:pPr>
+              <w:pStyle w:val="Compact"/>
+              <w:jc w:val="left"/>
+            </w:pPr>
+            <w:r>
+              <w:t xml:space="preserve">Closure 分支</w:t>
+            </w:r>
+          </w:p>
+        </w:tc>
+        <w:tc>
+          <w:p>
+            <w:pPr>
+              <w:pStyle w:val="Compact"/>
+              <w:jc w:val="left"/>
+            </w:pPr>
+            <w:r>
+              <w:rPr>
+                <w:rStyle w:val="VerbatimChar"/>
+              </w:rPr>
+              <w:t xml:space="preserve">feat/cny-value-policy-phase-1-closure</w:t>
             </w:r>
           </w:p>
         </w:tc>
@@ -297,7 +329,7 @@
       <w:pPr>
         <w:pStyle w:val="Heading2"/>
       </w:pPr>
-      <w:bookmarkStart w:name="X8bdf336b6fd2404de374dec908efa455727feeb" w:id="21"/>
+      <w:bookmarkStart w:id="21" w:name="已冻结决策"/>
       <w:r>
         <w:t xml:space="preserve">0. 已冻结决策</w:t>
       </w:r>
@@ -307,7 +339,7 @@
       <w:pPr>
         <w:pStyle w:val="Heading3"/>
       </w:pPr>
-      <w:bookmarkStart w:name="X7a330a5b93fcbde18d4249b3e5dc37092f744e6" w:id="22"/>
+      <w:bookmarkStart w:id="22" w:name="已批准"/>
       <w:r>
         <w:t xml:space="preserve">0.1 已批准</w:t>
       </w:r>
@@ -316,12 +348,14 @@
     <w:tbl>
       <w:tblPr>
         <w:tblStyle w:val="Table"/>
-        <w:tblW w:w="5000" w:type="pct"/>
-        <w:tblLook w:val="04A0"/>
+        <w:tblW w:type="pct" w:w="0.0"/>
+        <w:tblLook w:firstRow="1"/>
       </w:tblPr>
       <w:tblGrid/>
       <w:tr>
-        <w:trPr/>
+        <w:trPr>
+          <w:cnfStyle w:firstRow="1"/>
+        </w:trPr>
         <w:tc>
           <w:tcPr>
             <w:tcBorders>
@@ -550,7 +584,10 @@
               <w:jc w:val="left"/>
             </w:pPr>
             <w:r>
-              <w:t xml:space="preserve">保留现有 </w:t>
+              <w:t xml:space="preserve">保留现有</w:t>
+            </w:r>
+            <w:r>
+              <w:t xml:space="preserve"> </w:t>
             </w:r>
             <w:r>
               <w:rPr>
@@ -559,7 +596,10 @@
               <w:t xml:space="preserve">price: number</w:t>
             </w:r>
             <w:r>
-              <w:t xml:space="preserve"> 与旧积分扣减链路；新增字段采用加法式兼容</w:t>
+              <w:t xml:space="preserve"> </w:t>
+            </w:r>
+            <w:r>
+              <w:t xml:space="preserve">与旧积分扣减链路；新增字段采用加法式兼容</w:t>
             </w:r>
           </w:p>
         </w:tc>
@@ -569,7 +609,7 @@
       <w:pPr>
         <w:pStyle w:val="Heading3"/>
       </w:pPr>
-      <w:bookmarkStart w:name="X03d4bd81c6817597a516fea90e71d3155c93d46" w:id="23"/>
+      <w:bookmarkStart w:id="23" w:name="仍待批准"/>
       <w:r>
         <w:t xml:space="preserve">0.2 仍待批准</w:t>
       </w:r>
@@ -578,12 +618,14 @@
     <w:tbl>
       <w:tblPr>
         <w:tblStyle w:val="Table"/>
-        <w:tblW w:w="5000" w:type="pct"/>
-        <w:tblLook w:val="04A0"/>
+        <w:tblW w:type="pct" w:w="0.0"/>
+        <w:tblLook w:firstRow="1"/>
       </w:tblPr>
       <w:tblGrid/>
       <w:tr>
-        <w:trPr/>
+        <w:trPr>
+          <w:cnfStyle w:firstRow="1"/>
+        </w:trPr>
         <w:tc>
           <w:tcPr>
             <w:tcBorders>
@@ -732,7 +774,13 @@
               <w:jc w:val="left"/>
             </w:pPr>
             <w:r>
-              <w:t xml:space="preserve">“参考价值，不代表现金赎回承诺”</w:t>
+              <w:t xml:space="preserve">“</w:t>
+            </w:r>
+            <w:r>
+              <w:t xml:space="preserve">参考价值，不代表现金赎回承诺</w:t>
+            </w:r>
+            <w:r>
+              <w:t xml:space="preserve">”</w:t>
             </w:r>
           </w:p>
         </w:tc>
@@ -754,14 +802,37 @@
         <w:pStyle w:val="BodyText"/>
       </w:pPr>
       <w:r>
-        <w:t xml:space="preserve">代码实现可以开始，但生产激活必须等待 D-02。任何 Agent 都不得把候选比例写成代码常量、默认配置或不可撤销的生产 seed。</w:t>
+        <w:t xml:space="preserve">Phase 1 工程实现已完成，但生产激活必须等待 D-02 与 D-03。任何 Agent 都不得把候选比例写成代码常量、默认配置或不可撤销的生产 seed。</w:t>
+      </w:r>
+    </w:p>
+    <w:p>
+      <w:pPr>
+        <w:pStyle w:val="BodyText"/>
+      </w:pPr>
+      <w:r>
+        <w:t xml:space="preserve">这不是</w:t>
+      </w:r>
+      <w:r>
+        <w:t xml:space="preserve"> </w:t>
+      </w:r>
+      <w:r>
+        <w:rPr>
+          <w:rStyle w:val="VerbatimChar"/>
+        </w:rPr>
+        <w:t xml:space="preserve">SPEC-VALUE-LEDGER-001</w:t>
+      </w:r>
+      <w:r>
+        <w:t xml:space="preserve"> </w:t>
+      </w:r>
+      <w:r>
+        <w:t xml:space="preserve">的大 Phase 1（ledger / lot / 双写）。账本规格后续阶段仍未实施。</w:t>
       </w:r>
     </w:p>
     <w:p>
       <w:pPr>
         <w:pStyle w:val="Heading2"/>
       </w:pPr>
-      <w:bookmarkStart w:name="X662d4400b9c2123b441e8dde308a9af7e4d9bca" w:id="24"/>
+      <w:bookmarkStart w:id="24" w:name="目标"/>
       <w:r>
         <w:t xml:space="preserve">1. 目标</w:t>
       </w:r>
@@ -777,14 +848,17 @@
     </w:p>
     <w:p>
       <w:pPr>
-        <w:pStyle w:val="Compact"/>
         <w:numPr>
           <w:ilvl w:val="0"/>
           <w:numId w:val="1001"/>
         </w:numPr>
-      </w:pPr>
-      <w:r>
-        <w:t xml:space="preserve">用不可变、版本化的 </w:t>
+        <w:pStyle w:val="Compact"/>
+      </w:pPr>
+      <w:r>
+        <w:t xml:space="preserve">用不可变、版本化的</w:t>
+      </w:r>
+      <w:r>
+        <w:t xml:space="preserve"> </w:t>
       </w:r>
       <w:r>
         <w:rPr>
@@ -793,16 +867,19 @@
         <w:t xml:space="preserve">ValuePolicy</w:t>
       </w:r>
       <w:r>
-        <w:t xml:space="preserve"> 表达积分和 CNY 的固定关系；</w:t>
-      </w:r>
-    </w:p>
-    <w:p>
-      <w:pPr>
-        <w:pStyle w:val="Compact"/>
+        <w:t xml:space="preserve"> </w:t>
+      </w:r>
+      <w:r>
+        <w:t xml:space="preserve">表达积分和 CNY 的固定关系；</w:t>
+      </w:r>
+    </w:p>
+    <w:p>
+      <w:pPr>
         <w:numPr>
           <w:ilvl w:val="0"/>
           <w:numId w:val="1001"/>
         </w:numPr>
+        <w:pStyle w:val="Compact"/>
       </w:pPr>
       <w:r>
         <w:t xml:space="preserve">使用 BigInt 有理数完成积分到 CNY 原子单位的确定性换算；</w:t>
@@ -810,11 +887,11 @@
     </w:p>
     <w:p>
       <w:pPr>
-        <w:pStyle w:val="Compact"/>
         <w:numPr>
           <w:ilvl w:val="0"/>
           <w:numId w:val="1001"/>
         </w:numPr>
+        <w:pStyle w:val="Compact"/>
       </w:pPr>
       <w:r>
         <w:t xml:space="preserve">在 checkout preview 返回积分价格、CNY 参考价值和政策 ID；</w:t>
@@ -822,11 +899,11 @@
     </w:p>
     <w:p>
       <w:pPr>
-        <w:pStyle w:val="Compact"/>
         <w:numPr>
           <w:ilvl w:val="0"/>
           <w:numId w:val="1001"/>
         </w:numPr>
+        <w:pStyle w:val="Compact"/>
       </w:pPr>
       <w:r>
         <w:t xml:space="preserve">在订单确认事务内重新解析政策、校验客户端政策 ID，并保存定价快照；</w:t>
@@ -834,11 +911,11 @@
     </w:p>
     <w:p>
       <w:pPr>
-        <w:pStyle w:val="Compact"/>
         <w:numPr>
           <w:ilvl w:val="0"/>
           <w:numId w:val="1001"/>
         </w:numPr>
+        <w:pStyle w:val="Compact"/>
       </w:pPr>
       <w:r>
         <w:t xml:space="preserve">保证后续政策变化不会改变既有订单的参考价值；</w:t>
@@ -846,11 +923,11 @@
     </w:p>
     <w:p>
       <w:pPr>
-        <w:pStyle w:val="Compact"/>
         <w:numPr>
           <w:ilvl w:val="0"/>
           <w:numId w:val="1001"/>
         </w:numPr>
+        <w:pStyle w:val="Compact"/>
       </w:pPr>
       <w:r>
         <w:t xml:space="preserve">在功能关闭时保持当前积分、订单、Settlement 和前端契约不变。</w:t>
@@ -860,7 +937,7 @@
       <w:pPr>
         <w:pStyle w:val="Heading2"/>
       </w:pPr>
-      <w:bookmarkStart w:name="X1ea5d00b406c768a32e5d2c1db73f1fb0f6105c" w:id="25"/>
+      <w:bookmarkStart w:id="25" w:name="非目标"/>
       <w:r>
         <w:t xml:space="preserve">2. 非目标</w:t>
       </w:r>
@@ -876,11 +953,11 @@
     </w:p>
     <w:p>
       <w:pPr>
-        <w:pStyle w:val="Compact"/>
         <w:numPr>
           <w:ilvl w:val="0"/>
           <w:numId w:val="1002"/>
         </w:numPr>
+        <w:pStyle w:val="Compact"/>
       </w:pPr>
       <w:r>
         <w:t xml:space="preserve">新双重记账 ledger、lot、RP/VC/XP 拆分；</w:t>
@@ -888,11 +965,11 @@
     </w:p>
     <w:p>
       <w:pPr>
-        <w:pStyle w:val="Compact"/>
         <w:numPr>
           <w:ilvl w:val="0"/>
           <w:numId w:val="1002"/>
         </w:numPr>
+        <w:pStyle w:val="Compact"/>
       </w:pPr>
       <w:r>
         <w:t xml:space="preserve">CNY、USD 或 USDT 充值与真实付款；</w:t>
@@ -900,14 +977,17 @@
     </w:p>
     <w:p>
       <w:pPr>
-        <w:pStyle w:val="Compact"/>
         <w:numPr>
           <w:ilvl w:val="0"/>
           <w:numId w:val="1002"/>
         </w:numPr>
-      </w:pPr>
-      <w:r>
-        <w:t xml:space="preserve">实时 FX 服务或 </w:t>
+        <w:pStyle w:val="Compact"/>
+      </w:pPr>
+      <w:r>
+        <w:t xml:space="preserve">实时 FX 服务或</w:t>
+      </w:r>
+      <w:r>
+        <w:t xml:space="preserve"> </w:t>
       </w:r>
       <w:r>
         <w:rPr>
@@ -916,16 +996,19 @@
         <w:t xml:space="preserve">FxQuote</w:t>
       </w:r>
       <w:r>
-        <w:t xml:space="preserve"> 数据表；</w:t>
-      </w:r>
-    </w:p>
-    <w:p>
-      <w:pPr>
-        <w:pStyle w:val="Compact"/>
+        <w:t xml:space="preserve"> </w:t>
+      </w:r>
+      <w:r>
+        <w:t xml:space="preserve">数据表；</w:t>
+      </w:r>
+    </w:p>
+    <w:p>
+      <w:pPr>
         <w:numPr>
           <w:ilvl w:val="0"/>
           <w:numId w:val="1002"/>
         </w:numPr>
+        <w:pStyle w:val="Compact"/>
       </w:pPr>
       <w:r>
         <w:t xml:space="preserve">用户转账、提现、现金赎回；</w:t>
@@ -933,11 +1016,11 @@
     </w:p>
     <w:p>
       <w:pPr>
-        <w:pStyle w:val="Compact"/>
         <w:numPr>
           <w:ilvl w:val="0"/>
           <w:numId w:val="1002"/>
         </w:numPr>
+        <w:pStyle w:val="Compact"/>
       </w:pPr>
       <w:r>
         <w:t xml:space="preserve">商家法币或稳定币出款；</w:t>
@@ -945,14 +1028,17 @@
     </w:p>
     <w:p>
       <w:pPr>
-        <w:pStyle w:val="Compact"/>
         <w:numPr>
           <w:ilvl w:val="0"/>
           <w:numId w:val="1002"/>
         </w:numPr>
-      </w:pPr>
-      <w:r>
-        <w:t xml:space="preserve">修改当前 </w:t>
+        <w:pStyle w:val="Compact"/>
+      </w:pPr>
+      <w:r>
+        <w:t xml:space="preserve">修改当前</w:t>
+      </w:r>
+      <w:r>
+        <w:t xml:space="preserve"> </w:t>
       </w:r>
       <w:r>
         <w:rPr>
@@ -970,16 +1056,19 @@
         <w:t xml:space="preserve">PointLog</w:t>
       </w:r>
       <w:r>
-        <w:t xml:space="preserve"> 的权威写入语义；</w:t>
-      </w:r>
-    </w:p>
-    <w:p>
-      <w:pPr>
-        <w:pStyle w:val="Compact"/>
+        <w:t xml:space="preserve"> </w:t>
+      </w:r>
+      <w:r>
+        <w:t xml:space="preserve">的权威写入语义；</w:t>
+      </w:r>
+    </w:p>
+    <w:p>
+      <w:pPr>
         <w:numPr>
           <w:ilvl w:val="0"/>
           <w:numId w:val="1002"/>
         </w:numPr>
+        <w:pStyle w:val="Compact"/>
       </w:pPr>
       <w:r>
         <w:t xml:space="preserve">修改会员成长、排行榜或商家 Settlement 计算；</w:t>
@@ -987,11 +1076,11 @@
     </w:p>
     <w:p>
       <w:pPr>
-        <w:pStyle w:val="Compact"/>
         <w:numPr>
           <w:ilvl w:val="0"/>
           <w:numId w:val="1002"/>
         </w:numPr>
+        <w:pStyle w:val="Compact"/>
       </w:pPr>
       <w:r>
         <w:t xml:space="preserve">多租户模型。README 已明确 multi-tenant white-label SaaS 不在当前产品边界内；本阶段按单一平台作用域实现。</w:t>
@@ -1001,7 +1090,7 @@
       <w:pPr>
         <w:pStyle w:val="Heading2"/>
       </w:pPr>
-      <w:bookmarkStart w:name="X44e37b3a9c9545750fe7ae417192f8508c7a844" w:id="26"/>
+      <w:bookmarkStart w:id="26" w:name="当前代码事实与修改边界"/>
       <w:r>
         <w:t xml:space="preserve">3. 当前代码事实与修改边界</w:t>
       </w:r>
@@ -1010,12 +1099,18 @@
     <w:tbl>
       <w:tblPr>
         <w:tblStyle w:val="Table"/>
-        <w:tblW w:w="5000" w:type="pct"/>
-        <w:tblLook w:val="04A0"/>
+        <w:tblW w:type="pct" w:w="5000.0"/>
+        <w:tblLook w:firstRow="1"/>
       </w:tblPr>
-      <w:tblGrid/>
+      <w:tblGrid>
+        <w:gridCol w:w="2640"/>
+        <w:gridCol w:w="2640"/>
+        <w:gridCol w:w="2640"/>
+      </w:tblGrid>
       <w:tr>
-        <w:trPr/>
+        <w:trPr>
+          <w:cnfStyle w:firstRow="1"/>
+        </w:trPr>
         <w:tc>
           <w:tcPr>
             <w:tcBorders>
@@ -1076,7 +1171,10 @@
               <w:jc w:val="left"/>
             </w:pPr>
             <w:r>
-              <w:t xml:space="preserve">可用/冻结积分为 </w:t>
+              <w:t xml:space="preserve">可用/冻结积分为</w:t>
+            </w:r>
+            <w:r>
+              <w:t xml:space="preserve"> </w:t>
             </w:r>
             <w:r>
               <w:rPr>
@@ -1120,7 +1218,10 @@
               <w:jc w:val="left"/>
             </w:pPr>
             <w:r>
-              <w:t xml:space="preserve">SKU 价格为 </w:t>
+              <w:t xml:space="preserve">SKU 价格为</w:t>
+            </w:r>
+            <w:r>
+              <w:t xml:space="preserve"> </w:t>
             </w:r>
             <w:r>
               <w:rPr>
@@ -1164,7 +1265,10 @@
               <w:jc w:val="left"/>
             </w:pPr>
             <w:r>
-              <w:t xml:space="preserve">checkout preview 返回 </w:t>
+              <w:t xml:space="preserve">checkout preview 返回</w:t>
+            </w:r>
+            <w:r>
+              <w:t xml:space="preserve"> </w:t>
             </w:r>
             <w:r>
               <w:rPr>
@@ -1195,7 +1299,10 @@
               <w:jc w:val="left"/>
             </w:pPr>
             <w:r>
-              <w:t xml:space="preserve">保留并新增 </w:t>
+              <w:t xml:space="preserve">保留并新增</w:t>
+            </w:r>
+            <w:r>
+              <w:t xml:space="preserve"> </w:t>
             </w:r>
             <w:r>
               <w:rPr>
@@ -1204,7 +1311,10 @@
               <w:t xml:space="preserve">pricing</w:t>
             </w:r>
             <w:r>
-              <w:t xml:space="preserve"> 对象</w:t>
+              <w:t xml:space="preserve"> </w:t>
+            </w:r>
+            <w:r>
+              <w:t xml:space="preserve">对象</w:t>
             </w:r>
           </w:p>
         </w:tc>
@@ -1217,7 +1327,10 @@
               <w:jc w:val="left"/>
             </w:pPr>
             <w:r>
-              <w:t xml:space="preserve">创建订单校验 </w:t>
+              <w:t xml:space="preserve">创建订单校验</w:t>
+            </w:r>
+            <w:r>
+              <w:t xml:space="preserve"> </w:t>
             </w:r>
             <w:r>
               <w:rPr>
@@ -1257,7 +1370,10 @@
               <w:jc w:val="left"/>
             </w:pPr>
             <w:r>
-              <w:t xml:space="preserve">新增 </w:t>
+              <w:t xml:space="preserve">新增</w:t>
+            </w:r>
+            <w:r>
+              <w:t xml:space="preserve"> </w:t>
             </w:r>
             <w:r>
               <w:rPr>
@@ -1266,7 +1382,10 @@
               <w:t xml:space="preserve">expectedValuePolicyId</w:t>
             </w:r>
             <w:r>
-              <w:t xml:space="preserve"> 校验</w:t>
+              <w:t xml:space="preserve"> </w:t>
+            </w:r>
+            <w:r>
+              <w:t xml:space="preserve">校验</w:t>
             </w:r>
           </w:p>
         </w:tc>
@@ -1304,7 +1423,10 @@
               <w:jc w:val="left"/>
             </w:pPr>
             <w:r>
-              <w:t xml:space="preserve">新增一对一 </w:t>
+              <w:t xml:space="preserve">新增一对一</w:t>
+            </w:r>
+            <w:r>
+              <w:t xml:space="preserve"> </w:t>
             </w:r>
             <w:r>
               <w:rPr>
@@ -1323,7 +1445,10 @@
               <w:jc w:val="left"/>
             </w:pPr>
             <w:r>
-              <w:t xml:space="preserve">当前佣金使用 </w:t>
+              <w:t xml:space="preserve">当前佣金使用</w:t>
+            </w:r>
+            <w:r>
+              <w:t xml:space="preserve"> </w:t>
             </w:r>
             <w:r>
               <w:rPr>
@@ -1410,7 +1535,7 @@
       <w:pPr>
         <w:pStyle w:val="Heading2"/>
       </w:pPr>
-      <w:bookmarkStart w:name="X9a50f3333a7832096da45188296290e8265d359" w:id="27"/>
+      <w:bookmarkStart w:id="27" w:name="总体流程"/>
       <w:r>
         <w:t xml:space="preserve">4. 总体流程</w:t>
       </w:r>
@@ -1550,7 +1675,7 @@
       <w:pPr>
         <w:pStyle w:val="Heading2"/>
       </w:pPr>
-      <w:bookmarkStart w:name="X604a67222ed80749c6faa92ee1683f37ba079d7" w:id="28"/>
+      <w:bookmarkStart w:id="28" w:name="功能模式与上线安全"/>
       <w:r>
         <w:t xml:space="preserve">5. 功能模式与上线安全</w:t>
       </w:r>
@@ -1578,12 +1703,17 @@
     <w:tbl>
       <w:tblPr>
         <w:tblStyle w:val="Table"/>
-        <w:tblW w:w="5000" w:type="pct"/>
-        <w:tblLook w:val="04A0"/>
+        <w:tblW w:type="pct" w:w="5000.0"/>
+        <w:tblLook w:firstRow="1"/>
       </w:tblPr>
-      <w:tblGrid/>
+      <w:tblGrid>
+        <w:gridCol w:w="3960"/>
+        <w:gridCol w:w="3960"/>
+      </w:tblGrid>
       <w:tr>
-        <w:trPr/>
+        <w:trPr>
+          <w:cnfStyle w:firstRow="1"/>
+        </w:trPr>
         <w:tc>
           <w:tcPr>
             <w:tcBorders>
@@ -1668,7 +1798,10 @@
               <w:jc w:val="left"/>
             </w:pPr>
             <w:r>
-              <w:t xml:space="preserve">要求 active CNY policy；返回并保存新定价数据，但 </w:t>
+              <w:t xml:space="preserve">要求 active CNY policy；返回并保存新定价数据，但</w:t>
+            </w:r>
+            <w:r>
+              <w:t xml:space="preserve"> </w:t>
             </w:r>
             <w:r>
               <w:rPr>
@@ -1677,7 +1810,10 @@
               <w:t xml:space="preserve">expectedValuePolicyId</w:t>
             </w:r>
             <w:r>
-              <w:t xml:space="preserve"> 暂为可选。若客户端传入则必须校验。</w:t>
+              <w:t xml:space="preserve"> </w:t>
+            </w:r>
+            <w:r>
+              <w:t xml:space="preserve">暂为可选。若客户端传入则必须校验。</w:t>
             </w:r>
           </w:p>
         </w:tc>
@@ -1704,7 +1840,10 @@
               <w:jc w:val="left"/>
             </w:pPr>
             <w:r>
-              <w:t xml:space="preserve">要求 active CNY policy；创建订单必须携带 </w:t>
+              <w:t xml:space="preserve">要求 active CNY policy；创建订单必须携带</w:t>
+            </w:r>
+            <w:r>
+              <w:t xml:space="preserve"> </w:t>
             </w:r>
             <w:r>
               <w:rPr>
@@ -1729,14 +1868,17 @@
     </w:p>
     <w:p>
       <w:pPr>
-        <w:pStyle w:val="Compact"/>
         <w:numPr>
           <w:ilvl w:val="0"/>
           <w:numId w:val="1003"/>
         </w:numPr>
-      </w:pPr>
-      <w:r>
-        <w:t xml:space="preserve">生产默认必须是 </w:t>
+        <w:pStyle w:val="Compact"/>
+      </w:pPr>
+      <w:r>
+        <w:t xml:space="preserve">生产默认必须是</w:t>
+      </w:r>
+      <w:r>
+        <w:t xml:space="preserve"> </w:t>
       </w:r>
       <w:r>
         <w:rPr>
@@ -1745,7 +1887,10 @@
         <w:t xml:space="preserve">off</w:t>
       </w:r>
       <w:r>
-        <w:t xml:space="preserve">；D-02 批准前不得切到 </w:t>
+        <w:t xml:space="preserve">；D-02 批准前不得切到</w:t>
+      </w:r>
+      <w:r>
+        <w:t xml:space="preserve"> </w:t>
       </w:r>
       <w:r>
         <w:rPr>
@@ -1754,7 +1899,13 @@
         <w:t xml:space="preserve">shadow</w:t>
       </w:r>
       <w:r>
-        <w:t xml:space="preserve"> 或 </w:t>
+        <w:t xml:space="preserve"> </w:t>
+      </w:r>
+      <w:r>
+        <w:t xml:space="preserve">或</w:t>
+      </w:r>
+      <w:r>
+        <w:t xml:space="preserve"> </w:t>
       </w:r>
       <w:r>
         <w:rPr>
@@ -1768,11 +1919,11 @@
     </w:p>
     <w:p>
       <w:pPr>
-        <w:pStyle w:val="Compact"/>
         <w:numPr>
           <w:ilvl w:val="0"/>
           <w:numId w:val="1003"/>
         </w:numPr>
+        <w:pStyle w:val="Compact"/>
       </w:pPr>
       <w:r>
         <w:t xml:space="preserve">配置值必须在进程启动时验证；非法值启动失败。</w:t>
@@ -1780,11 +1931,11 @@
     </w:p>
     <w:p>
       <w:pPr>
-        <w:pStyle w:val="Compact"/>
         <w:numPr>
           <w:ilvl w:val="0"/>
           <w:numId w:val="1003"/>
         </w:numPr>
+        <w:pStyle w:val="Compact"/>
       </w:pPr>
       <w:r>
         <w:rPr>
@@ -1793,7 +1944,13 @@
         <w:t xml:space="preserve">shadow/enforce</w:t>
       </w:r>
       <w:r>
-        <w:t xml:space="preserve"> 下无唯一 active CNY policy 时 fail closed，返回 </w:t>
+        <w:t xml:space="preserve"> </w:t>
+      </w:r>
+      <w:r>
+        <w:t xml:space="preserve">下无唯一 active CNY policy 时 fail closed，返回</w:t>
+      </w:r>
+      <w:r>
+        <w:t xml:space="preserve"> </w:t>
       </w:r>
       <w:r>
         <w:rPr>
@@ -1807,11 +1964,11 @@
     </w:p>
     <w:p>
       <w:pPr>
-        <w:pStyle w:val="Compact"/>
         <w:numPr>
           <w:ilvl w:val="0"/>
           <w:numId w:val="1003"/>
         </w:numPr>
+        <w:pStyle w:val="Compact"/>
       </w:pPr>
       <w:r>
         <w:t xml:space="preserve">不得在请求失败时回退到猜测比例或最新历史政策。</w:t>
@@ -1821,7 +1978,7 @@
       <w:pPr>
         <w:pStyle w:val="Heading2"/>
       </w:pPr>
-      <w:bookmarkStart w:name="X81ed8af4eea4c719acfe6454a0404ae0dd5d93f" w:id="29"/>
+      <w:bookmarkStart w:id="29" w:name="数据模型"/>
       <w:r>
         <w:t xml:space="preserve">6. 数据模型</w:t>
       </w:r>
@@ -1839,7 +1996,7 @@
       <w:pPr>
         <w:pStyle w:val="Heading3"/>
       </w:pPr>
-      <w:bookmarkStart w:name="Xcb1a7e14683d35c70504b8e354563abbed9dfaf" w:id="30"/>
+      <w:bookmarkStart w:id="30" w:name="assetdefinition"/>
       <w:r>
         <w:t xml:space="preserve">6.1 AssetDefinition</w:t>
       </w:r>
@@ -1969,12 +2126,14 @@
     <w:tbl>
       <w:tblPr>
         <w:tblStyle w:val="Table"/>
-        <w:tblW w:w="5000" w:type="pct"/>
-        <w:tblLook w:val="04A0"/>
+        <w:tblW w:type="pct" w:w="0.0"/>
+        <w:tblLook w:firstRow="1"/>
       </w:tblPr>
       <w:tblGrid/>
       <w:tr>
-        <w:trPr/>
+        <w:trPr>
+          <w:cnfStyle w:firstRow="1"/>
+        </w:trPr>
         <w:tc>
           <w:tcPr>
             <w:tcBorders>
@@ -2154,7 +2313,10 @@
         <w:pStyle w:val="BodyText"/>
       </w:pPr>
       <w:r>
-        <w:t xml:space="preserve">不得在本阶段创建 </w:t>
+        <w:t xml:space="preserve">不得在本阶段创建</w:t>
+      </w:r>
+      <w:r>
+        <w:t xml:space="preserve"> </w:t>
       </w:r>
       <w:r>
         <w:rPr>
@@ -2163,14 +2325,17 @@
         <w:t xml:space="preserve">USDT</w:t>
       </w:r>
       <w:r>
-        <w:t xml:space="preserve"> 伪法币资产。USD 可以由通用 schema 支持，但不得创建或激活首期生产 USD 价值政策。</w:t>
+        <w:t xml:space="preserve"> </w:t>
+      </w:r>
+      <w:r>
+        <w:t xml:space="preserve">伪法币资产。USD 可以由通用 schema 支持，但不得创建或激活首期生产 USD 价值政策。</w:t>
       </w:r>
     </w:p>
     <w:p>
       <w:pPr>
         <w:pStyle w:val="Heading3"/>
       </w:pPr>
-      <w:bookmarkStart w:name="Xa1bb72b0bfbb1b7b9a957c1d3964324afd2363d" w:id="31"/>
+      <w:bookmarkStart w:id="31" w:name="valuepolicy"/>
       <w:r>
         <w:t xml:space="preserve">6.2 ValuePolicy</w:t>
       </w:r>
@@ -2440,14 +2605,17 @@
     </w:p>
     <w:p>
       <w:pPr>
-        <w:pStyle w:val="Compact"/>
         <w:numPr>
           <w:ilvl w:val="0"/>
           <w:numId w:val="1004"/>
         </w:numPr>
-      </w:pPr>
-      <w:r>
-        <w:t xml:space="preserve">分子和分母均 </w:t>
+        <w:pStyle w:val="Compact"/>
+      </w:pPr>
+      <w:r>
+        <w:t xml:space="preserve">分子和分母均</w:t>
+      </w:r>
+      <w:r>
+        <w:t xml:space="preserve"> </w:t>
       </w:r>
       <w:r>
         <w:rPr>
@@ -2461,11 +2629,11 @@
     </w:p>
     <w:p>
       <w:pPr>
-        <w:pStyle w:val="Compact"/>
         <w:numPr>
           <w:ilvl w:val="0"/>
           <w:numId w:val="1004"/>
         </w:numPr>
+        <w:pStyle w:val="Compact"/>
       </w:pPr>
       <w:r>
         <w:rPr>
@@ -2474,7 +2642,13 @@
         <w:t xml:space="preserve">pointAssetCode</w:t>
       </w:r>
       <w:r>
-        <w:t xml:space="preserve"> 必须指向 </w:t>
+        <w:t xml:space="preserve"> </w:t>
+      </w:r>
+      <w:r>
+        <w:t xml:space="preserve">必须指向</w:t>
+      </w:r>
+      <w:r>
+        <w:t xml:space="preserve"> </w:t>
       </w:r>
       <w:r>
         <w:rPr>
@@ -2492,7 +2666,13 @@
         <w:t xml:space="preserve">referenceAssetCode</w:t>
       </w:r>
       <w:r>
-        <w:t xml:space="preserve"> 必须指向 </w:t>
+        <w:t xml:space="preserve"> </w:t>
+      </w:r>
+      <w:r>
+        <w:t xml:space="preserve">必须指向</w:t>
+      </w:r>
+      <w:r>
+        <w:t xml:space="preserve"> </w:t>
       </w:r>
       <w:r>
         <w:rPr>
@@ -2506,14 +2686,17 @@
     </w:p>
     <w:p>
       <w:pPr>
-        <w:pStyle w:val="Compact"/>
         <w:numPr>
           <w:ilvl w:val="0"/>
           <w:numId w:val="1004"/>
         </w:numPr>
-      </w:pPr>
-      <w:r>
-        <w:t xml:space="preserve">同一平台、同一积分资产最多一个 </w:t>
+        <w:pStyle w:val="Compact"/>
+      </w:pPr>
+      <w:r>
+        <w:t xml:space="preserve">同一平台、同一积分资产最多一个</w:t>
+      </w:r>
+      <w:r>
+        <w:t xml:space="preserve"> </w:t>
       </w:r>
       <w:r>
         <w:rPr>
@@ -2522,19 +2705,25 @@
         <w:t xml:space="preserve">active</w:t>
       </w:r>
       <w:r>
-        <w:t xml:space="preserve"> policy，使用 PostgreSQL partial unique index；</w:t>
-      </w:r>
-    </w:p>
-    <w:p>
-      <w:pPr>
-        <w:pStyle w:val="Compact"/>
+        <w:t xml:space="preserve"> </w:t>
+      </w:r>
+      <w:r>
+        <w:t xml:space="preserve">policy，使用 PostgreSQL partial unique index；</w:t>
+      </w:r>
+    </w:p>
+    <w:p>
+      <w:pPr>
         <w:numPr>
           <w:ilvl w:val="0"/>
           <w:numId w:val="1004"/>
         </w:numPr>
-      </w:pPr>
-      <w:r>
-        <w:t xml:space="preserve">active policy 的 </w:t>
+        <w:pStyle w:val="Compact"/>
+      </w:pPr>
+      <w:r>
+        <w:t xml:space="preserve">active policy 的</w:t>
+      </w:r>
+      <w:r>
+        <w:t xml:space="preserve"> </w:t>
       </w:r>
       <w:r>
         <w:rPr>
@@ -2543,7 +2732,13 @@
         <w:t xml:space="preserve">referenceAssetCode</w:t>
       </w:r>
       <w:r>
-        <w:t xml:space="preserve"> 在首期运行配置中必须是 </w:t>
+        <w:t xml:space="preserve"> </w:t>
+      </w:r>
+      <w:r>
+        <w:t xml:space="preserve">在首期运行配置中必须是</w:t>
+      </w:r>
+      <w:r>
+        <w:t xml:space="preserve"> </w:t>
       </w:r>
       <w:r>
         <w:rPr>
@@ -2557,11 +2752,11 @@
     </w:p>
     <w:p>
       <w:pPr>
-        <w:pStyle w:val="Compact"/>
         <w:numPr>
           <w:ilvl w:val="0"/>
           <w:numId w:val="1004"/>
         </w:numPr>
+        <w:pStyle w:val="Compact"/>
       </w:pPr>
       <w:r>
         <w:rPr>
@@ -2570,16 +2765,19 @@
         <w:t xml:space="preserve">active/retired</w:t>
       </w:r>
       <w:r>
-        <w:t xml:space="preserve"> policy 的经济字段禁止更新；允许的状态与时间戳变化必须受控；</w:t>
-      </w:r>
-    </w:p>
-    <w:p>
-      <w:pPr>
-        <w:pStyle w:val="Compact"/>
+        <w:t xml:space="preserve"> </w:t>
+      </w:r>
+      <w:r>
+        <w:t xml:space="preserve">policy 的经济字段禁止更新；允许的状态与时间戳变化必须受控；</w:t>
+      </w:r>
+    </w:p>
+    <w:p>
+      <w:pPr>
         <w:numPr>
           <w:ilvl w:val="0"/>
           <w:numId w:val="1004"/>
         </w:numPr>
+        <w:pStyle w:val="Compact"/>
       </w:pPr>
       <w:r>
         <w:t xml:space="preserve">生产应用角色不得直接把 draft policy 更新为 active；激活入口不属于本阶段公开 API。</w:t>
@@ -2590,7 +2788,10 @@
         <w:pStyle w:val="FirstParagraph"/>
       </w:pPr>
       <w:r>
-        <w:t xml:space="preserve">候选 </w:t>
+        <w:t xml:space="preserve">候选</w:t>
+      </w:r>
+      <w:r>
+        <w:t xml:space="preserve"> </w:t>
       </w:r>
       <w:r>
         <w:rPr>
@@ -2599,7 +2800,10 @@
         <w:t xml:space="preserve">100 PTS = 1 CNY</w:t>
       </w:r>
       <w:r>
-        <w:t xml:space="preserve"> 的规范化表达是：</w:t>
+        <w:t xml:space="preserve"> </w:t>
+      </w:r>
+      <w:r>
+        <w:t xml:space="preserve">的规范化表达是：</w:t>
       </w:r>
     </w:p>
     <w:p>
@@ -2627,14 +2831,26 @@
         <w:pStyle w:val="FirstParagraph"/>
       </w:pPr>
       <w:r>
-        <w:t xml:space="preserve">因为 CNY scale 为 2，所以一个积分对应一个“分”。这只是测试夹具，D-02 批准前不得作为生产 active policy seed。</w:t>
+        <w:t xml:space="preserve">因为 CNY scale 为 2，所以一个积分对应一个</w:t>
+      </w:r>
+      <w:r>
+        <w:t xml:space="preserve">“</w:t>
+      </w:r>
+      <w:r>
+        <w:t xml:space="preserve">分</w:t>
+      </w:r>
+      <w:r>
+        <w:t xml:space="preserve">”</w:t>
+      </w:r>
+      <w:r>
+        <w:t xml:space="preserve">。这只是测试夹具，D-02 批准前不得作为生产 active policy seed。</w:t>
       </w:r>
     </w:p>
     <w:p>
       <w:pPr>
         <w:pStyle w:val="Heading3"/>
       </w:pPr>
-      <w:bookmarkStart w:name="X3321c6e0ccdede8e107cce394c63bddb83dbacd" w:id="32"/>
+      <w:bookmarkStart w:id="32" w:name="orderpricingsnapshot"/>
       <w:r>
         <w:t xml:space="preserve">6.3 OrderPricingSnapshot</w:t>
       </w:r>
@@ -2763,11 +2979,11 @@
     </w:p>
     <w:p>
       <w:pPr>
-        <w:pStyle w:val="Compact"/>
         <w:numPr>
           <w:ilvl w:val="0"/>
           <w:numId w:val="1005"/>
         </w:numPr>
+        <w:pStyle w:val="Compact"/>
       </w:pPr>
       <w:r>
         <w:t xml:space="preserve">每个启用新政策后创建的订单恰好一个 snapshot；</w:t>
@@ -2775,11 +2991,11 @@
     </w:p>
     <w:p>
       <w:pPr>
-        <w:pStyle w:val="Compact"/>
         <w:numPr>
           <w:ilvl w:val="0"/>
           <w:numId w:val="1005"/>
         </w:numPr>
+        <w:pStyle w:val="Compact"/>
       </w:pPr>
       <w:r>
         <w:t xml:space="preserve">snapshot 与 Order 必须在同一数据库事务提交；</w:t>
@@ -2787,11 +3003,11 @@
     </w:p>
     <w:p>
       <w:pPr>
-        <w:pStyle w:val="Compact"/>
         <w:numPr>
           <w:ilvl w:val="0"/>
           <w:numId w:val="1005"/>
         </w:numPr>
+        <w:pStyle w:val="Compact"/>
       </w:pPr>
       <w:r>
         <w:t xml:space="preserve">snapshot 创建后禁止 UPDATE/DELETE；</w:t>
@@ -2799,11 +3015,11 @@
     </w:p>
     <w:p>
       <w:pPr>
-        <w:pStyle w:val="Compact"/>
         <w:numPr>
           <w:ilvl w:val="0"/>
           <w:numId w:val="1005"/>
         </w:numPr>
+        <w:pStyle w:val="Compact"/>
       </w:pPr>
       <w:r>
         <w:rPr>
@@ -2812,7 +3028,13 @@
         <w:t xml:space="preserve">pointsAmountAtomic</w:t>
       </w:r>
       <w:r>
-        <w:t xml:space="preserve"> 必须等于确认时的 </w:t>
+        <w:t xml:space="preserve"> </w:t>
+      </w:r>
+      <w:r>
+        <w:t xml:space="preserve">必须等于确认时的</w:t>
+      </w:r>
+      <w:r>
+        <w:t xml:space="preserve"> </w:t>
       </w:r>
       <w:r>
         <w:rPr>
@@ -2826,11 +3048,11 @@
     </w:p>
     <w:p>
       <w:pPr>
-        <w:pStyle w:val="Compact"/>
         <w:numPr>
           <w:ilvl w:val="0"/>
           <w:numId w:val="1005"/>
         </w:numPr>
+        <w:pStyle w:val="Compact"/>
       </w:pPr>
       <w:r>
         <w:rPr>
@@ -2839,16 +3061,19 @@
         <w:t xml:space="preserve">referenceAssetCode</w:t>
       </w:r>
       <w:r>
-        <w:t xml:space="preserve"> 必须等于政策的 reference asset；</w:t>
-      </w:r>
-    </w:p>
-    <w:p>
-      <w:pPr>
-        <w:pStyle w:val="Compact"/>
+        <w:t xml:space="preserve"> </w:t>
+      </w:r>
+      <w:r>
+        <w:t xml:space="preserve">必须等于政策的 reference asset；</w:t>
+      </w:r>
+    </w:p>
+    <w:p>
+      <w:pPr>
         <w:numPr>
           <w:ilvl w:val="0"/>
           <w:numId w:val="1005"/>
         </w:numPr>
+        <w:pStyle w:val="Compact"/>
       </w:pPr>
       <w:r>
         <w:t xml:space="preserve">历史订单暂不回填虚构参考价值；M3 迁移另立任务。</w:t>
@@ -2858,7 +3083,7 @@
       <w:pPr>
         <w:pStyle w:val="Heading2"/>
       </w:pPr>
-      <w:bookmarkStart w:name="Xb49b878abb4517edb5a122157a79e9d38139d67" w:id="33"/>
+      <w:bookmarkStart w:id="33" w:name="精确换算契约"/>
       <w:r>
         <w:t xml:space="preserve">7. 精确换算契约</w:t>
       </w:r>
@@ -3138,11 +3363,11 @@
     </w:p>
     <w:p>
       <w:pPr>
-        <w:pStyle w:val="Compact"/>
         <w:numPr>
           <w:ilvl w:val="0"/>
           <w:numId w:val="1006"/>
         </w:numPr>
+        <w:pStyle w:val="Compact"/>
       </w:pPr>
       <w:r>
         <w:t xml:space="preserve">输入积分、分子和分母必须非负/正值并显式校验；</w:t>
@@ -3150,14 +3375,17 @@
     </w:p>
     <w:p>
       <w:pPr>
-        <w:pStyle w:val="Compact"/>
         <w:numPr>
           <w:ilvl w:val="0"/>
           <w:numId w:val="1006"/>
         </w:numPr>
-      </w:pPr>
-      <w:r>
-        <w:t xml:space="preserve">禁止使用 JavaScript </w:t>
+        <w:pStyle w:val="Compact"/>
+      </w:pPr>
+      <w:r>
+        <w:t xml:space="preserve">禁止使用 JavaScript</w:t>
+      </w:r>
+      <w:r>
+        <w:t xml:space="preserve"> </w:t>
       </w:r>
       <w:r>
         <w:rPr>
@@ -3171,11 +3399,11 @@
     </w:p>
     <w:p>
       <w:pPr>
-        <w:pStyle w:val="Compact"/>
         <w:numPr>
           <w:ilvl w:val="0"/>
           <w:numId w:val="1006"/>
         </w:numPr>
+        <w:pStyle w:val="Compact"/>
       </w:pPr>
       <w:r>
         <w:t xml:space="preserve">中间计算全部使用 BigInt；</w:t>
@@ -3183,14 +3411,17 @@
     </w:p>
     <w:p>
       <w:pPr>
-        <w:pStyle w:val="Compact"/>
         <w:numPr>
           <w:ilvl w:val="0"/>
           <w:numId w:val="1006"/>
         </w:numPr>
-      </w:pPr>
-      <w:r>
-        <w:t xml:space="preserve">非整除时只允许 </w:t>
+        <w:pStyle w:val="Compact"/>
+      </w:pPr>
+      <w:r>
+        <w:t xml:space="preserve">非整除时只允许</w:t>
+      </w:r>
+      <w:r>
+        <w:t xml:space="preserve"> </w:t>
       </w:r>
       <w:r>
         <w:rPr>
@@ -3204,11 +3435,11 @@
     </w:p>
     <w:p>
       <w:pPr>
-        <w:pStyle w:val="Compact"/>
         <w:numPr>
           <w:ilvl w:val="0"/>
           <w:numId w:val="1006"/>
         </w:numPr>
+        <w:pStyle w:val="Compact"/>
       </w:pPr>
       <w:r>
         <w:t xml:space="preserve">输出不得为负；</w:t>
@@ -3216,11 +3447,11 @@
     </w:p>
     <w:p>
       <w:pPr>
-        <w:pStyle w:val="Compact"/>
         <w:numPr>
           <w:ilvl w:val="0"/>
           <w:numId w:val="1006"/>
         </w:numPr>
+        <w:pStyle w:val="Compact"/>
       </w:pPr>
       <w:r>
         <w:t xml:space="preserve">API 序列化必须使用十进制字符串；</w:t>
@@ -3228,11 +3459,11 @@
     </w:p>
     <w:p>
       <w:pPr>
-        <w:pStyle w:val="Compact"/>
         <w:numPr>
           <w:ilvl w:val="0"/>
           <w:numId w:val="1006"/>
         </w:numPr>
+        <w:pStyle w:val="Compact"/>
       </w:pPr>
       <w:r>
         <w:t xml:space="preserve">不得在调用方复制换算公式。</w:t>
@@ -3270,7 +3501,7 @@
       <w:pPr>
         <w:pStyle w:val="Heading2"/>
       </w:pPr>
-      <w:bookmarkStart w:name="X9306588b500df9432f44aea0c16d6c781d602e7" w:id="34"/>
+      <w:bookmarkStart w:id="34" w:name="api-契约"/>
       <w:r>
         <w:t xml:space="preserve">8. API 契约</w:t>
       </w:r>
@@ -3280,7 +3511,7 @@
       <w:pPr>
         <w:pStyle w:val="Heading3"/>
       </w:pPr>
-      <w:bookmarkStart w:name="X0b3365d43729c5295f8096b09f201a21407b296" w:id="35"/>
+      <w:bookmarkStart w:id="35" w:name="当前价值政策"/>
       <w:r>
         <w:t xml:space="preserve">8.1 当前价值政策</w:t>
       </w:r>
@@ -3316,7 +3547,10 @@
         <w:t xml:space="preserve">shadow/enforce</w:t>
       </w:r>
       <w:r>
-        <w:t xml:space="preserve"> 成功响应：</w:t>
+        <w:t xml:space="preserve"> </w:t>
+      </w:r>
+      <w:r>
+        <w:t xml:space="preserve">成功响应：</w:t>
       </w:r>
     </w:p>
     <w:p>
@@ -3884,7 +4118,13 @@
         <w:t xml:space="preserve">off</w:t>
       </w:r>
       <w:r>
-        <w:t xml:space="preserve"> 模式返回 </w:t>
+        <w:t xml:space="preserve"> </w:t>
+      </w:r>
+      <w:r>
+        <w:t xml:space="preserve">模式返回</w:t>
+      </w:r>
+      <w:r>
+        <w:t xml:space="preserve"> </w:t>
       </w:r>
       <w:r>
         <w:rPr>
@@ -3900,7 +4140,7 @@
       <w:pPr>
         <w:pStyle w:val="Heading3"/>
       </w:pPr>
-      <w:bookmarkStart w:name="X2410748e844ca7fc6bf0897b94503733c2654a0" w:id="36"/>
+      <w:bookmarkStart w:id="36" w:name="checkout-preview"/>
       <w:r>
         <w:t xml:space="preserve">8.2 Checkout preview</w:t>
       </w:r>
@@ -4359,14 +4599,17 @@
         <w:t xml:space="preserve">price</w:t>
       </w:r>
       <w:r>
-        <w:t xml:space="preserve"> 继续作为兼容字段。本阶段不得把它直接改为对象，以免破坏现有前端和客户端。</w:t>
+        <w:t xml:space="preserve"> </w:t>
+      </w:r>
+      <w:r>
+        <w:t xml:space="preserve">继续作为兼容字段。本阶段不得把它直接改为对象，以免破坏现有前端和客户端。</w:t>
       </w:r>
     </w:p>
     <w:p>
       <w:pPr>
         <w:pStyle w:val="Heading3"/>
       </w:pPr>
-      <w:bookmarkStart w:name="X35e37ac4a3e610405f05840fde6f56f26181ac6" w:id="37"/>
+      <w:bookmarkStart w:id="37" w:name="创建订单"/>
       <w:r>
         <w:t xml:space="preserve">8.3 创建订单</w:t>
       </w:r>
@@ -4443,26 +4686,29 @@
     </w:p>
     <w:p>
       <w:pPr>
-        <w:pStyle w:val="Compact"/>
         <w:numPr>
           <w:ilvl w:val="0"/>
           <w:numId w:val="1007"/>
         </w:numPr>
-      </w:pPr>
-      <w:r>
-        <w:rPr>
-          <w:rStyle w:val="VerbatimChar"/>
-        </w:rPr>
-        <w:t xml:space="preserve">off：容忍并忽略格式合法的可选新字段，不写 snapshot，以便客户端可提前发布；</w:t>
-      </w:r>
-    </w:p>
-    <w:p>
-      <w:pPr>
-        <w:pStyle w:val="Compact"/>
+        <w:pStyle w:val="Compact"/>
+      </w:pPr>
+      <w:r>
+        <w:rPr>
+          <w:rStyle w:val="VerbatimChar"/>
+        </w:rPr>
+        <w:t xml:space="preserve">off</w:t>
+      </w:r>
+      <w:r>
+        <w:t xml:space="preserve">：容忍并忽略格式合法的可选新字段，不写 snapshot，以便客户端可提前发布；</w:t>
+      </w:r>
+    </w:p>
+    <w:p>
+      <w:pPr>
         <w:numPr>
           <w:ilvl w:val="0"/>
           <w:numId w:val="1007"/>
         </w:numPr>
+        <w:pStyle w:val="Compact"/>
       </w:pPr>
       <w:r>
         <w:rPr>
@@ -4476,11 +4722,11 @@
     </w:p>
     <w:p>
       <w:pPr>
-        <w:pStyle w:val="Compact"/>
         <w:numPr>
           <w:ilvl w:val="0"/>
           <w:numId w:val="1007"/>
         </w:numPr>
+        <w:pStyle w:val="Compact"/>
       </w:pPr>
       <w:r>
         <w:rPr>
@@ -4489,7 +4735,10 @@
         <w:t xml:space="preserve">enforce</w:t>
       </w:r>
       <w:r>
-        <w:t xml:space="preserve">：字段必填；缺失返回 </w:t>
+        <w:t xml:space="preserve">：字段必填；缺失返回</w:t>
+      </w:r>
+      <w:r>
+        <w:t xml:space="preserve"> </w:t>
       </w:r>
       <w:r>
         <w:rPr>
@@ -4503,14 +4752,17 @@
     </w:p>
     <w:p>
       <w:pPr>
-        <w:pStyle w:val="Compact"/>
         <w:numPr>
           <w:ilvl w:val="0"/>
           <w:numId w:val="1007"/>
         </w:numPr>
-      </w:pPr>
-      <w:r>
-        <w:t xml:space="preserve">ID 不一致、政策已 retired、尚未生效或基准币不是 CNY：返回 </w:t>
+        <w:pStyle w:val="Compact"/>
+      </w:pPr>
+      <w:r>
+        <w:t xml:space="preserve">ID 不一致、政策已 retired、尚未生效或基准币不是 CNY：返回</w:t>
+      </w:r>
+      <w:r>
+        <w:t xml:space="preserve"> </w:t>
       </w:r>
       <w:r>
         <w:rPr>
@@ -4524,11 +4776,11 @@
     </w:p>
     <w:p>
       <w:pPr>
-        <w:pStyle w:val="Compact"/>
         <w:numPr>
           <w:ilvl w:val="0"/>
           <w:numId w:val="1007"/>
         </w:numPr>
+        <w:pStyle w:val="Compact"/>
       </w:pPr>
       <w:r>
         <w:t xml:space="preserve">所有拒绝路径不得创建 Order、PointLog、Settlement、InventoryLog 或 snapshot，也不得改变余额/库存。</w:t>
@@ -4536,10 +4788,268 @@
     </w:p>
     <w:p>
       <w:pPr>
+        <w:pStyle w:val="Heading3"/>
+      </w:pPr>
+      <w:bookmarkStart w:id="38" w:name="X66f44ae43a31ba89d5e52284fbc8a1270b3f474"/>
+      <w:r>
+        <w:t xml:space="preserve">8.4 Implementation clarification（错误码优先级，2026-08-18 冻结）</w:t>
+      </w:r>
+      <w:bookmarkEnd w:id="38"/>
+    </w:p>
+    <w:p>
+      <w:pPr>
         <w:pStyle w:val="FirstParagraph"/>
       </w:pPr>
       <w:r>
-        <w:t xml:space="preserve">订单成功响应和订单详情新增 </w:t>
+        <w:t xml:space="preserve">第 5 节</w:t>
+      </w:r>
+      <w:r>
+        <w:t xml:space="preserve">“</w:t>
+      </w:r>
+      <w:r>
+        <w:t xml:space="preserve">无 active 返回 503</w:t>
+      </w:r>
+      <w:r>
+        <w:t xml:space="preserve">”</w:t>
+      </w:r>
+      <w:r>
+        <w:t xml:space="preserve">与第 8.3 节</w:t>
+      </w:r>
+      <w:r>
+        <w:t xml:space="preserve">“</w:t>
+      </w:r>
+      <w:r>
+        <w:t xml:space="preserve">retired/future expected ID 返回 409</w:t>
+      </w:r>
+      <w:r>
+        <w:t xml:space="preserve">”</w:t>
+      </w:r>
+      <w:r>
+        <w:t xml:space="preserve"> </w:t>
+      </w:r>
+      <w:r>
+        <w:t xml:space="preserve">同时成立时，按以下冻结解释执行，不得静默改契约：</w:t>
+      </w:r>
+    </w:p>
+    <w:p>
+      <w:pPr>
+        <w:numPr>
+          <w:ilvl w:val="0"/>
+          <w:numId w:val="1008"/>
+        </w:numPr>
+        <w:pStyle w:val="Compact"/>
+      </w:pPr>
+      <w:r>
+        <w:t xml:space="preserve">客户端提交了具体但失效的政策确认（unknown / draft / approved /</w:t>
+      </w:r>
+      <w:r>
+        <w:t xml:space="preserve"> </w:t>
+      </w:r>
+      <w:r>
+        <w:t xml:space="preserve">scheduled / retired / future / 非 CNY / 与当前唯一 active CNY policy</w:t>
+      </w:r>
+      <w:r>
+        <w:t xml:space="preserve"> </w:t>
+      </w:r>
+      <w:r>
+        <w:t xml:space="preserve">不一致）→</w:t>
+      </w:r>
+      <w:r>
+        <w:t xml:space="preserve"> </w:t>
+      </w:r>
+      <w:r>
+        <w:rPr>
+          <w:rStyle w:val="VerbatimChar"/>
+        </w:rPr>
+        <w:t xml:space="preserve">409 VALUE_POLICY_CHANGED</w:t>
+      </w:r>
+      <w:r>
+        <w:t xml:space="preserve">。即使系统当前没有可用替换政策，</w:t>
+      </w:r>
+      <w:r>
+        <w:t xml:space="preserve"> </w:t>
+      </w:r>
+      <w:r>
+        <w:t xml:space="preserve">也优先 409。</w:t>
+      </w:r>
+    </w:p>
+    <w:p>
+      <w:pPr>
+        <w:numPr>
+          <w:ilvl w:val="0"/>
+          <w:numId w:val="1008"/>
+        </w:numPr>
+        <w:pStyle w:val="Compact"/>
+      </w:pPr>
+      <w:r>
+        <w:t xml:space="preserve">shadow 客户端没有提交政策 ID，且系统没有唯一可用 active CNY policy →</w:t>
+      </w:r>
+      <w:r>
+        <w:t xml:space="preserve"> </w:t>
+      </w:r>
+      <w:r>
+        <w:rPr>
+          <w:rStyle w:val="VerbatimChar"/>
+        </w:rPr>
+        <w:t xml:space="preserve">503 VALUE_POLICY_UNAVAILABLE</w:t>
+      </w:r>
+      <w:r>
+        <w:t xml:space="preserve">。</w:t>
+      </w:r>
+    </w:p>
+    <w:p>
+      <w:pPr>
+        <w:numPr>
+          <w:ilvl w:val="0"/>
+          <w:numId w:val="1008"/>
+        </w:numPr>
+        <w:pStyle w:val="Compact"/>
+      </w:pPr>
+      <w:r>
+        <w:t xml:space="preserve">enforce 缺少</w:t>
+      </w:r>
+      <w:r>
+        <w:t xml:space="preserve"> </w:t>
+      </w:r>
+      <w:r>
+        <w:rPr>
+          <w:rStyle w:val="VerbatimChar"/>
+        </w:rPr>
+        <w:t xml:space="preserve">expectedValuePolicyId</w:t>
+      </w:r>
+      <w:r>
+        <w:t xml:space="preserve"> </w:t>
+      </w:r>
+      <w:r>
+        <w:t xml:space="preserve">→</w:t>
+      </w:r>
+      <w:r>
+        <w:t xml:space="preserve"> </w:t>
+      </w:r>
+      <w:r>
+        <w:rPr>
+          <w:rStyle w:val="VerbatimChar"/>
+        </w:rPr>
+        <w:t xml:space="preserve">400 VALUE_POLICY_REQUIRED</w:t>
+      </w:r>
+      <w:r>
+        <w:t xml:space="preserve">，</w:t>
+      </w:r>
+      <w:r>
+        <w:t xml:space="preserve"> </w:t>
+      </w:r>
+      <w:r>
+        <w:t xml:space="preserve">且必须发生在任何余额、库存、订单、PointLog、Settlement、InventoryLog、</w:t>
+      </w:r>
+      <w:r>
+        <w:t xml:space="preserve"> </w:t>
+      </w:r>
+      <w:r>
+        <w:t xml:space="preserve">outbox、snapshot 副作用之前。</w:t>
+      </w:r>
+    </w:p>
+    <w:p>
+      <w:pPr>
+        <w:numPr>
+          <w:ilvl w:val="0"/>
+          <w:numId w:val="1008"/>
+        </w:numPr>
+        <w:pStyle w:val="Compact"/>
+      </w:pPr>
+      <w:r>
+        <w:t xml:space="preserve">数据库存在 active CNY policy，但其比例、kind、scale、enabled、</w:t>
+      </w:r>
+      <w:r>
+        <w:t xml:space="preserve"> </w:t>
+      </w:r>
+      <w:r>
+        <w:t xml:space="preserve">retiredAt、rounding 等内部数据违反不变量 →</w:t>
+      </w:r>
+      <w:r>
+        <w:t xml:space="preserve"> </w:t>
+      </w:r>
+      <w:r>
+        <w:rPr>
+          <w:rStyle w:val="VerbatimChar"/>
+        </w:rPr>
+        <w:t xml:space="preserve">500 VALUE_POLICY_DATA_INVALID</w:t>
+      </w:r>
+      <w:r>
+        <w:t xml:space="preserve">。</w:t>
+      </w:r>
+      <w:r>
+        <w:t xml:space="preserve"> </w:t>
+      </w:r>
+      <w:r>
+        <w:t xml:space="preserve">无论客户端是否携带</w:t>
+      </w:r>
+      <w:r>
+        <w:t xml:space="preserve"> </w:t>
+      </w:r>
+      <w:r>
+        <w:rPr>
+          <w:rStyle w:val="VerbatimChar"/>
+        </w:rPr>
+        <w:t xml:space="preserve">expectedValuePolicyId</w:t>
+      </w:r>
+      <w:r>
+        <w:t xml:space="preserve">、ID 是否与损坏行一致，</w:t>
+      </w:r>
+      <w:r>
+        <w:t xml:space="preserve"> </w:t>
+      </w:r>
+      <w:r>
+        <w:t xml:space="preserve">一律 500；不得降级为 409，不得回退到历史比例或猜测值。</w:t>
+      </w:r>
+    </w:p>
+    <w:p>
+      <w:pPr>
+        <w:numPr>
+          <w:ilvl w:val="0"/>
+          <w:numId w:val="1008"/>
+        </w:numPr>
+        <w:pStyle w:val="Compact"/>
+      </w:pPr>
+      <w:r>
+        <w:rPr>
+          <w:rStyle w:val="VerbatimChar"/>
+        </w:rPr>
+        <w:t xml:space="preserve">off</w:t>
+      </w:r>
+      <w:r>
+        <w:t xml:space="preserve"> </w:t>
+      </w:r>
+      <w:r>
+        <w:t xml:space="preserve">忽略格式合法的</w:t>
+      </w:r>
+      <w:r>
+        <w:t xml:space="preserve"> </w:t>
+      </w:r>
+      <w:r>
+        <w:rPr>
+          <w:rStyle w:val="VerbatimChar"/>
+        </w:rPr>
+        <w:t xml:space="preserve">expectedValuePolicyId</w:t>
+      </w:r>
+      <w:r>
+        <w:t xml:space="preserve">，不查询 policy，不返回</w:t>
+      </w:r>
+      <w:r>
+        <w:t xml:space="preserve"> </w:t>
+      </w:r>
+      <w:r>
+        <w:t xml:space="preserve">pricing，不写 snapshot。</w:t>
+      </w:r>
+    </w:p>
+    <w:p>
+      <w:pPr>
+        <w:pStyle w:val="FirstParagraph"/>
+      </w:pPr>
+      <w:r>
+        <w:t xml:space="preserve">订单成功响应和订单详情新增</w:t>
+      </w:r>
+      <w:r>
+        <w:t xml:space="preserve"> </w:t>
       </w:r>
       <w:r>
         <w:rPr>
@@ -4548,7 +5058,10 @@
         <w:t xml:space="preserve">pricing</w:t>
       </w:r>
       <w:r>
-        <w:t xml:space="preserve">，其内容必须来自 </w:t>
+        <w:t xml:space="preserve">，其内容必须来自</w:t>
+      </w:r>
+      <w:r>
+        <w:t xml:space="preserve"> </w:t>
       </w:r>
       <w:r>
         <w:rPr>
@@ -4564,21 +5077,23 @@
       <w:pPr>
         <w:pStyle w:val="Heading2"/>
       </w:pPr>
-      <w:bookmarkStart w:name="X769448bef891a10d383a847be14bf16f087e9ab" w:id="38"/>
+      <w:bookmarkStart w:id="39" w:name="错误码"/>
       <w:r>
         <w:t xml:space="preserve">9. 错误码</w:t>
       </w:r>
-      <w:bookmarkEnd w:id="38"/>
+      <w:bookmarkEnd w:id="39"/>
     </w:p>
     <w:tbl>
       <w:tblPr>
         <w:tblStyle w:val="Table"/>
-        <w:tblW w:w="5000" w:type="pct"/>
-        <w:tblLook w:val="04A0"/>
+        <w:tblW w:type="pct" w:w="0.0"/>
+        <w:tblLook w:firstRow="1"/>
       </w:tblPr>
       <w:tblGrid/>
       <w:tr>
-        <w:trPr/>
+        <w:trPr>
+          <w:cnfStyle w:firstRow="1"/>
+        </w:trPr>
         <w:tc>
           <w:tcPr>
             <w:tcBorders>
@@ -4827,7 +5342,10 @@
         <w:pStyle w:val="BodyText"/>
       </w:pPr>
       <w:r>
-        <w:t xml:space="preserve">错误必须沿用项目现有 </w:t>
+        <w:t xml:space="preserve">错误必须沿用项目现有</w:t>
+      </w:r>
+      <w:r>
+        <w:t xml:space="preserve"> </w:t>
       </w:r>
       <w:r>
         <w:rPr>
@@ -4836,26 +5354,29 @@
         <w:t xml:space="preserve">HttpError</w:t>
       </w:r>
       <w:r>
-        <w:t xml:space="preserve"> 与错误序列化约定。</w:t>
+        <w:t xml:space="preserve"> </w:t>
+      </w:r>
+      <w:r>
+        <w:t xml:space="preserve">与错误序列化约定。</w:t>
       </w:r>
     </w:p>
     <w:p>
       <w:pPr>
         <w:pStyle w:val="Heading2"/>
       </w:pPr>
-      <w:bookmarkStart w:name="X5a4c770fccb8b1c92b2f681a076d9dda1769342" w:id="39"/>
+      <w:bookmarkStart w:id="40" w:name="原子性与并发"/>
       <w:r>
         <w:t xml:space="preserve">10. 原子性与并发</w:t>
       </w:r>
-      <w:bookmarkEnd w:id="39"/>
-    </w:p>
-    <w:p>
-      <w:pPr>
-        <w:pStyle w:val="Compact"/>
-        <w:numPr>
-          <w:ilvl w:val="0"/>
-          <w:numId w:val="1008"/>
-        </w:numPr>
+      <w:bookmarkEnd w:id="40"/>
+    </w:p>
+    <w:p>
+      <w:pPr>
+        <w:numPr>
+          <w:ilvl w:val="0"/>
+          <w:numId w:val="1009"/>
+        </w:numPr>
+        <w:pStyle w:val="Compact"/>
       </w:pPr>
       <w:r>
         <w:t xml:space="preserve">创建订单时，政策解析、价格校验、订单创建和 snapshot 创建必须位于现有订单事务内；</w:t>
@@ -4863,11 +5384,11 @@
     </w:p>
     <w:p>
       <w:pPr>
-        <w:pStyle w:val="Compact"/>
-        <w:numPr>
-          <w:ilvl w:val="0"/>
-          <w:numId w:val="1008"/>
-        </w:numPr>
+        <w:numPr>
+          <w:ilvl w:val="0"/>
+          <w:numId w:val="1009"/>
+        </w:numPr>
+        <w:pStyle w:val="Compact"/>
       </w:pPr>
       <w:r>
         <w:t xml:space="preserve">政策从 preview 到 confirm 发生变化时必须 409，不得静默接受；</w:t>
@@ -4875,14 +5396,17 @@
     </w:p>
     <w:p>
       <w:pPr>
-        <w:pStyle w:val="Compact"/>
-        <w:numPr>
-          <w:ilvl w:val="0"/>
-          <w:numId w:val="1008"/>
-        </w:numPr>
-      </w:pPr>
-      <w:r>
-        <w:t xml:space="preserve">相同 </w:t>
+        <w:numPr>
+          <w:ilvl w:val="0"/>
+          <w:numId w:val="1009"/>
+        </w:numPr>
+        <w:pStyle w:val="Compact"/>
+      </w:pPr>
+      <w:r>
+        <w:t xml:space="preserve">相同</w:t>
+      </w:r>
+      <w:r>
+        <w:t xml:space="preserve"> </w:t>
       </w:r>
       <w:r>
         <w:rPr>
@@ -4891,16 +5415,19 @@
         <w:t xml:space="preserve">Idempotency-Key</w:t>
       </w:r>
       <w:r>
-        <w:t xml:space="preserve"> 重放返回同一订单与同一 snapshot；</w:t>
-      </w:r>
-    </w:p>
-    <w:p>
-      <w:pPr>
-        <w:pStyle w:val="Compact"/>
-        <w:numPr>
-          <w:ilvl w:val="0"/>
-          <w:numId w:val="1008"/>
-        </w:numPr>
+        <w:t xml:space="preserve"> </w:t>
+      </w:r>
+      <w:r>
+        <w:t xml:space="preserve">重放返回同一订单与同一 snapshot；</w:t>
+      </w:r>
+    </w:p>
+    <w:p>
+      <w:pPr>
+        <w:numPr>
+          <w:ilvl w:val="0"/>
+          <w:numId w:val="1009"/>
+        </w:numPr>
+        <w:pStyle w:val="Compact"/>
       </w:pPr>
       <w:r>
         <w:t xml:space="preserve">不得在事务外创建 snapshot 或异步补写；</w:t>
@@ -4908,11 +5435,11 @@
     </w:p>
     <w:p>
       <w:pPr>
-        <w:pStyle w:val="Compact"/>
-        <w:numPr>
-          <w:ilvl w:val="0"/>
-          <w:numId w:val="1008"/>
-        </w:numPr>
+        <w:numPr>
+          <w:ilvl w:val="0"/>
+          <w:numId w:val="1009"/>
+        </w:numPr>
+        <w:pStyle w:val="Compact"/>
       </w:pPr>
       <w:r>
         <w:t xml:space="preserve">激活/退役政策必须串行化，确保不会短暂出现两个 active policy；</w:t>
@@ -4920,14 +5447,17 @@
     </w:p>
     <w:p>
       <w:pPr>
-        <w:pStyle w:val="Compact"/>
-        <w:numPr>
-          <w:ilvl w:val="0"/>
-          <w:numId w:val="1008"/>
-        </w:numPr>
-      </w:pPr>
-      <w:r>
-        <w:t xml:space="preserve">snapshot 的外键使用 </w:t>
+        <w:numPr>
+          <w:ilvl w:val="0"/>
+          <w:numId w:val="1009"/>
+        </w:numPr>
+        <w:pStyle w:val="Compact"/>
+      </w:pPr>
+      <w:r>
+        <w:t xml:space="preserve">snapshot 的外键使用</w:t>
+      </w:r>
+      <w:r>
+        <w:t xml:space="preserve"> </w:t>
       </w:r>
       <w:r>
         <w:rPr>
@@ -4943,11 +5473,11 @@
       <w:pPr>
         <w:pStyle w:val="Heading2"/>
       </w:pPr>
-      <w:bookmarkStart w:name="Xcaad7908127e06f782f39f2d47e9749328849a0" w:id="40"/>
+      <w:bookmarkStart w:id="41" w:name="迁移与-seed"/>
       <w:r>
         <w:t xml:space="preserve">11. 迁移与 seed</w:t>
       </w:r>
-      <w:bookmarkEnd w:id="40"/>
+      <w:bookmarkEnd w:id="41"/>
     </w:p>
     <w:p>
       <w:pPr>
@@ -4959,11 +5489,11 @@
     </w:p>
     <w:p>
       <w:pPr>
-        <w:pStyle w:val="Compact"/>
-        <w:numPr>
-          <w:ilvl w:val="0"/>
-          <w:numId w:val="1009"/>
-        </w:numPr>
+        <w:numPr>
+          <w:ilvl w:val="0"/>
+          <w:numId w:val="1010"/>
+        </w:numPr>
+        <w:pStyle w:val="Compact"/>
       </w:pPr>
       <w:r>
         <w:t xml:space="preserve">新增 enum、表、FK、CHECK、partial unique index 和必要的不可变保护；</w:t>
@@ -4971,14 +5501,17 @@
     </w:p>
     <w:p>
       <w:pPr>
-        <w:pStyle w:val="Compact"/>
-        <w:numPr>
-          <w:ilvl w:val="0"/>
-          <w:numId w:val="1009"/>
-        </w:numPr>
-      </w:pPr>
-      <w:r>
-        <w:t xml:space="preserve">不修改或回填现有 </w:t>
+        <w:numPr>
+          <w:ilvl w:val="0"/>
+          <w:numId w:val="1010"/>
+        </w:numPr>
+        <w:pStyle w:val="Compact"/>
+      </w:pPr>
+      <w:r>
+        <w:t xml:space="preserve">不修改或回填现有</w:t>
+      </w:r>
+      <w:r>
+        <w:t xml:space="preserve"> </w:t>
       </w:r>
       <w:r>
         <w:rPr>
@@ -5010,14 +5543,17 @@
     </w:p>
     <w:p>
       <w:pPr>
-        <w:pStyle w:val="Compact"/>
-        <w:numPr>
-          <w:ilvl w:val="0"/>
-          <w:numId w:val="1009"/>
-        </w:numPr>
-      </w:pPr>
-      <w:r>
-        <w:t xml:space="preserve">可插入 </w:t>
+        <w:numPr>
+          <w:ilvl w:val="0"/>
+          <w:numId w:val="1010"/>
+        </w:numPr>
+        <w:pStyle w:val="Compact"/>
+      </w:pPr>
+      <w:r>
+        <w:t xml:space="preserve">可插入</w:t>
+      </w:r>
+      <w:r>
+        <w:t xml:space="preserve"> </w:t>
       </w:r>
       <w:r>
         <w:rPr>
@@ -5026,7 +5562,13 @@
         <w:t xml:space="preserve">RP</w:t>
       </w:r>
       <w:r>
-        <w:t xml:space="preserve"> 与 </w:t>
+        <w:t xml:space="preserve"> </w:t>
+      </w:r>
+      <w:r>
+        <w:t xml:space="preserve">与</w:t>
+      </w:r>
+      <w:r>
+        <w:t xml:space="preserve"> </w:t>
       </w:r>
       <w:r>
         <w:rPr>
@@ -5035,16 +5577,19 @@
         <w:t xml:space="preserve">CNY</w:t>
       </w:r>
       <w:r>
-        <w:t xml:space="preserve"> 资产定义；</w:t>
-      </w:r>
-    </w:p>
-    <w:p>
-      <w:pPr>
-        <w:pStyle w:val="Compact"/>
-        <w:numPr>
-          <w:ilvl w:val="0"/>
-          <w:numId w:val="1009"/>
-        </w:numPr>
+        <w:t xml:space="preserve"> </w:t>
+      </w:r>
+      <w:r>
+        <w:t xml:space="preserve">资产定义；</w:t>
+      </w:r>
+    </w:p>
+    <w:p>
+      <w:pPr>
+        <w:numPr>
+          <w:ilvl w:val="0"/>
+          <w:numId w:val="1010"/>
+        </w:numPr>
+        <w:pStyle w:val="Compact"/>
       </w:pPr>
       <w:r>
         <w:t xml:space="preserve">不得插入生产 active ValuePolicy；</w:t>
@@ -5052,14 +5597,17 @@
     </w:p>
     <w:p>
       <w:pPr>
-        <w:pStyle w:val="Compact"/>
-        <w:numPr>
-          <w:ilvl w:val="0"/>
-          <w:numId w:val="1009"/>
-        </w:numPr>
-      </w:pPr>
-      <w:r>
-        <w:t xml:space="preserve">测试数据库可创建 </w:t>
+        <w:numPr>
+          <w:ilvl w:val="0"/>
+          <w:numId w:val="1010"/>
+        </w:numPr>
+        <w:pStyle w:val="Compact"/>
+      </w:pPr>
+      <w:r>
+        <w:t xml:space="preserve">测试数据库可创建</w:t>
+      </w:r>
+      <w:r>
+        <w:t xml:space="preserve"> </w:t>
       </w:r>
       <w:r>
         <w:rPr>
@@ -5068,16 +5616,19 @@
         <w:t xml:space="preserve">100 PTS = 1 CNY</w:t>
       </w:r>
       <w:r>
-        <w:t xml:space="preserve"> 的 active fixture；</w:t>
-      </w:r>
-    </w:p>
-    <w:p>
-      <w:pPr>
-        <w:pStyle w:val="Compact"/>
-        <w:numPr>
-          <w:ilvl w:val="0"/>
-          <w:numId w:val="1009"/>
-        </w:numPr>
+        <w:t xml:space="preserve"> </w:t>
+      </w:r>
+      <w:r>
+        <w:t xml:space="preserve">的 active fixture；</w:t>
+      </w:r>
+    </w:p>
+    <w:p>
+      <w:pPr>
+        <w:numPr>
+          <w:ilvl w:val="0"/>
+          <w:numId w:val="1010"/>
+        </w:numPr>
+        <w:pStyle w:val="Compact"/>
       </w:pPr>
       <w:r>
         <w:t xml:space="preserve">migration 必须同时通过全新数据库重放和已有数据库升级测试；</w:t>
@@ -5085,14 +5636,17 @@
     </w:p>
     <w:p>
       <w:pPr>
-        <w:pStyle w:val="Compact"/>
-        <w:numPr>
-          <w:ilvl w:val="0"/>
-          <w:numId w:val="1009"/>
-        </w:numPr>
-      </w:pPr>
-      <w:r>
-        <w:t xml:space="preserve">禁止使用 </w:t>
+        <w:numPr>
+          <w:ilvl w:val="0"/>
+          <w:numId w:val="1010"/>
+        </w:numPr>
+        <w:pStyle w:val="Compact"/>
+      </w:pPr>
+      <w:r>
+        <w:t xml:space="preserve">禁止使用</w:t>
+      </w:r>
+      <w:r>
+        <w:t xml:space="preserve"> </w:t>
       </w:r>
       <w:r>
         <w:rPr>
@@ -5101,36 +5655,39 @@
         <w:t xml:space="preserve">prisma db push</w:t>
       </w:r>
       <w:r>
-        <w:t xml:space="preserve"> 代替 migration。</w:t>
+        <w:t xml:space="preserve"> </w:t>
+      </w:r>
+      <w:r>
+        <w:t xml:space="preserve">代替 migration。</w:t>
       </w:r>
     </w:p>
     <w:p>
       <w:pPr>
         <w:pStyle w:val="Heading2"/>
       </w:pPr>
-      <w:bookmarkStart w:name="X65a7420d406df9a5d3de94b5cb1619482dfd122" w:id="41"/>
+      <w:bookmarkStart w:id="42" w:name="测试要求"/>
       <w:r>
         <w:t xml:space="preserve">12. 测试要求</w:t>
       </w:r>
-      <w:bookmarkEnd w:id="41"/>
+      <w:bookmarkEnd w:id="42"/>
     </w:p>
     <w:p>
       <w:pPr>
         <w:pStyle w:val="Heading3"/>
       </w:pPr>
-      <w:bookmarkStart w:name="Xa0a4a085f25f6435f8bef31b0ebeb338fe9c849" w:id="42"/>
+      <w:bookmarkStart w:id="43" w:name="纯函数"/>
       <w:r>
         <w:t xml:space="preserve">12.1 纯函数</w:t>
       </w:r>
-      <w:bookmarkEnd w:id="42"/>
-    </w:p>
-    <w:p>
-      <w:pPr>
-        <w:pStyle w:val="Compact"/>
-        <w:numPr>
-          <w:ilvl w:val="0"/>
-          <w:numId w:val="1010"/>
-        </w:numPr>
+      <w:bookmarkEnd w:id="43"/>
+    </w:p>
+    <w:p>
+      <w:pPr>
+        <w:numPr>
+          <w:ilvl w:val="0"/>
+          <w:numId w:val="1011"/>
+        </w:numPr>
+        <w:pStyle w:val="Compact"/>
       </w:pPr>
       <w:r>
         <w:rPr>
@@ -5144,11 +5701,11 @@
     </w:p>
     <w:p>
       <w:pPr>
-        <w:pStyle w:val="Compact"/>
-        <w:numPr>
-          <w:ilvl w:val="0"/>
-          <w:numId w:val="1010"/>
-        </w:numPr>
+        <w:numPr>
+          <w:ilvl w:val="0"/>
+          <w:numId w:val="1011"/>
+        </w:numPr>
+        <w:pStyle w:val="Compact"/>
       </w:pPr>
       <w:r>
         <w:t xml:space="preserve">零积分；</w:t>
@@ -5156,14 +5713,17 @@
     </w:p>
     <w:p>
       <w:pPr>
-        <w:pStyle w:val="Compact"/>
-        <w:numPr>
-          <w:ilvl w:val="0"/>
-          <w:numId w:val="1010"/>
-        </w:numPr>
-      </w:pPr>
-      <w:r>
-        <w:t xml:space="preserve">大于 </w:t>
+        <w:numPr>
+          <w:ilvl w:val="0"/>
+          <w:numId w:val="1011"/>
+        </w:numPr>
+        <w:pStyle w:val="Compact"/>
+      </w:pPr>
+      <w:r>
+        <w:t xml:space="preserve">大于</w:t>
+      </w:r>
+      <w:r>
+        <w:t xml:space="preserve"> </w:t>
       </w:r>
       <w:r>
         <w:rPr>
@@ -5172,16 +5732,19 @@
         <w:t xml:space="preserve">Number.MAX_SAFE_INTEGER</w:t>
       </w:r>
       <w:r>
-        <w:t xml:space="preserve"> 的积分仍精确；</w:t>
-      </w:r>
-    </w:p>
-    <w:p>
-      <w:pPr>
-        <w:pStyle w:val="Compact"/>
-        <w:numPr>
-          <w:ilvl w:val="0"/>
-          <w:numId w:val="1010"/>
-        </w:numPr>
+        <w:t xml:space="preserve"> </w:t>
+      </w:r>
+      <w:r>
+        <w:t xml:space="preserve">的积分仍精确；</w:t>
+      </w:r>
+    </w:p>
+    <w:p>
+      <w:pPr>
+        <w:numPr>
+          <w:ilvl w:val="0"/>
+          <w:numId w:val="1011"/>
+        </w:numPr>
+        <w:pStyle w:val="Compact"/>
       </w:pPr>
       <w:r>
         <w:t xml:space="preserve">可整除与不可整除比例；</w:t>
@@ -5189,11 +5752,11 @@
     </w:p>
     <w:p>
       <w:pPr>
-        <w:pStyle w:val="Compact"/>
-        <w:numPr>
-          <w:ilvl w:val="0"/>
-          <w:numId w:val="1010"/>
-        </w:numPr>
+        <w:numPr>
+          <w:ilvl w:val="0"/>
+          <w:numId w:val="1011"/>
+        </w:numPr>
+        <w:pStyle w:val="Compact"/>
       </w:pPr>
       <w:r>
         <w:t xml:space="preserve">HALF_EVEN 的偶数/奇数 tie；</w:t>
@@ -5201,11 +5764,11 @@
     </w:p>
     <w:p>
       <w:pPr>
-        <w:pStyle w:val="Compact"/>
-        <w:numPr>
-          <w:ilvl w:val="0"/>
-          <w:numId w:val="1010"/>
-        </w:numPr>
+        <w:numPr>
+          <w:ilvl w:val="0"/>
+          <w:numId w:val="1011"/>
+        </w:numPr>
+        <w:pStyle w:val="Compact"/>
       </w:pPr>
       <w:r>
         <w:t xml:space="preserve">零分母、负数和非法策略被拒绝；</w:t>
@@ -5213,11 +5776,11 @@
     </w:p>
     <w:p>
       <w:pPr>
-        <w:pStyle w:val="Compact"/>
-        <w:numPr>
-          <w:ilvl w:val="0"/>
-          <w:numId w:val="1010"/>
-        </w:numPr>
+        <w:numPr>
+          <w:ilvl w:val="0"/>
+          <w:numId w:val="1011"/>
+        </w:numPr>
+        <w:pStyle w:val="Compact"/>
       </w:pPr>
       <w:r>
         <w:t xml:space="preserve">输入对象不发生突变。</w:t>
@@ -5227,19 +5790,19 @@
       <w:pPr>
         <w:pStyle w:val="Heading3"/>
       </w:pPr>
-      <w:bookmarkStart w:name="X0cef64716066235975c141923e5cb96a13d95d2" w:id="43"/>
+      <w:bookmarkStart w:id="44" w:name="数据库约束"/>
       <w:r>
         <w:t xml:space="preserve">12.2 数据库约束</w:t>
       </w:r>
-      <w:bookmarkEnd w:id="43"/>
-    </w:p>
-    <w:p>
-      <w:pPr>
-        <w:pStyle w:val="Compact"/>
-        <w:numPr>
-          <w:ilvl w:val="0"/>
-          <w:numId w:val="1011"/>
-        </w:numPr>
+      <w:bookmarkEnd w:id="44"/>
+    </w:p>
+    <w:p>
+      <w:pPr>
+        <w:numPr>
+          <w:ilvl w:val="0"/>
+          <w:numId w:val="1012"/>
+        </w:numPr>
+        <w:pStyle w:val="Compact"/>
       </w:pPr>
       <w:r>
         <w:t xml:space="preserve">分子/分母不能为零或负数；</w:t>
@@ -5247,11 +5810,11 @@
     </w:p>
     <w:p>
       <w:pPr>
-        <w:pStyle w:val="Compact"/>
-        <w:numPr>
-          <w:ilvl w:val="0"/>
-          <w:numId w:val="1011"/>
-        </w:numPr>
+        <w:numPr>
+          <w:ilvl w:val="0"/>
+          <w:numId w:val="1012"/>
+        </w:numPr>
+        <w:pStyle w:val="Compact"/>
       </w:pPr>
       <w:r>
         <w:t xml:space="preserve">同一积分资产不能有两个 active policy；</w:t>
@@ -5259,11 +5822,11 @@
     </w:p>
     <w:p>
       <w:pPr>
-        <w:pStyle w:val="Compact"/>
-        <w:numPr>
-          <w:ilvl w:val="0"/>
-          <w:numId w:val="1011"/>
-        </w:numPr>
+        <w:numPr>
+          <w:ilvl w:val="0"/>
+          <w:numId w:val="1012"/>
+        </w:numPr>
+        <w:pStyle w:val="Compact"/>
       </w:pPr>
       <w:r>
         <w:t xml:space="preserve">active policy 经济字段不可修改；</w:t>
@@ -5271,11 +5834,11 @@
     </w:p>
     <w:p>
       <w:pPr>
-        <w:pStyle w:val="Compact"/>
-        <w:numPr>
-          <w:ilvl w:val="0"/>
-          <w:numId w:val="1011"/>
-        </w:numPr>
+        <w:numPr>
+          <w:ilvl w:val="0"/>
+          <w:numId w:val="1012"/>
+        </w:numPr>
+        <w:pStyle w:val="Compact"/>
       </w:pPr>
       <w:r>
         <w:t xml:space="preserve">snapshot 不可更新或删除；</w:t>
@@ -5283,11 +5846,11 @@
     </w:p>
     <w:p>
       <w:pPr>
-        <w:pStyle w:val="Compact"/>
-        <w:numPr>
-          <w:ilvl w:val="0"/>
-          <w:numId w:val="1011"/>
-        </w:numPr>
+        <w:numPr>
+          <w:ilvl w:val="0"/>
+          <w:numId w:val="1012"/>
+        </w:numPr>
+        <w:pStyle w:val="Compact"/>
       </w:pPr>
       <w:r>
         <w:t xml:space="preserve">snapshot 必须关联存在的 Order 和 ValuePolicy；</w:t>
@@ -5295,11 +5858,11 @@
     </w:p>
     <w:p>
       <w:pPr>
-        <w:pStyle w:val="Compact"/>
-        <w:numPr>
-          <w:ilvl w:val="0"/>
-          <w:numId w:val="1011"/>
-        </w:numPr>
+        <w:numPr>
+          <w:ilvl w:val="0"/>
+          <w:numId w:val="1012"/>
+        </w:numPr>
+        <w:pStyle w:val="Compact"/>
       </w:pPr>
       <w:r>
         <w:t xml:space="preserve">生产保护拒绝 active USD/USDT 本位政策。</w:t>
@@ -5309,19 +5872,19 @@
       <w:pPr>
         <w:pStyle w:val="Heading3"/>
       </w:pPr>
-      <w:bookmarkStart w:name="X4991729fd8817c8b03d179417f048e0f6a45a1b" w:id="44"/>
+      <w:bookmarkStart w:id="45" w:name="api-与事务"/>
       <w:r>
         <w:t xml:space="preserve">12.3 API 与事务</w:t>
       </w:r>
-      <w:bookmarkEnd w:id="44"/>
-    </w:p>
-    <w:p>
-      <w:pPr>
-        <w:pStyle w:val="Compact"/>
-        <w:numPr>
-          <w:ilvl w:val="0"/>
-          <w:numId w:val="1012"/>
-        </w:numPr>
+      <w:bookmarkEnd w:id="45"/>
+    </w:p>
+    <w:p>
+      <w:pPr>
+        <w:numPr>
+          <w:ilvl w:val="0"/>
+          <w:numId w:val="1013"/>
+        </w:numPr>
+        <w:pStyle w:val="Compact"/>
       </w:pPr>
       <w:r>
         <w:rPr>
@@ -5330,16 +5893,19 @@
         <w:t xml:space="preserve">off</w:t>
       </w:r>
       <w:r>
-        <w:t xml:space="preserve"> 模式下现有 checkout/order 测试完全不变；</w:t>
-      </w:r>
-    </w:p>
-    <w:p>
-      <w:pPr>
-        <w:pStyle w:val="Compact"/>
-        <w:numPr>
-          <w:ilvl w:val="0"/>
-          <w:numId w:val="1012"/>
-        </w:numPr>
+        <w:t xml:space="preserve"> </w:t>
+      </w:r>
+      <w:r>
+        <w:t xml:space="preserve">模式下现有 checkout/order 测试完全不变；</w:t>
+      </w:r>
+    </w:p>
+    <w:p>
+      <w:pPr>
+        <w:numPr>
+          <w:ilvl w:val="0"/>
+          <w:numId w:val="1013"/>
+        </w:numPr>
+        <w:pStyle w:val="Compact"/>
       </w:pPr>
       <w:r>
         <w:t xml:space="preserve">preview 的积分、CNY 原子金额和 policy ID 正确；</w:t>
@@ -5347,11 +5913,11 @@
     </w:p>
     <w:p>
       <w:pPr>
-        <w:pStyle w:val="Compact"/>
-        <w:numPr>
-          <w:ilvl w:val="0"/>
-          <w:numId w:val="1012"/>
-        </w:numPr>
+        <w:numPr>
+          <w:ilvl w:val="0"/>
+          <w:numId w:val="1013"/>
+        </w:numPr>
+        <w:pStyle w:val="Compact"/>
       </w:pPr>
       <w:r>
         <w:t xml:space="preserve">shadow 模式兼容未发送 policy ID 的旧客户端；</w:t>
@@ -5359,11 +5925,11 @@
     </w:p>
     <w:p>
       <w:pPr>
-        <w:pStyle w:val="Compact"/>
-        <w:numPr>
-          <w:ilvl w:val="0"/>
-          <w:numId w:val="1012"/>
-        </w:numPr>
+        <w:numPr>
+          <w:ilvl w:val="0"/>
+          <w:numId w:val="1013"/>
+        </w:numPr>
+        <w:pStyle w:val="Compact"/>
       </w:pPr>
       <w:r>
         <w:t xml:space="preserve">enforce 模式缺少 policy ID 返回 400；</w:t>
@@ -5371,11 +5937,11 @@
     </w:p>
     <w:p>
       <w:pPr>
-        <w:pStyle w:val="Compact"/>
-        <w:numPr>
-          <w:ilvl w:val="0"/>
-          <w:numId w:val="1012"/>
-        </w:numPr>
+        <w:numPr>
+          <w:ilvl w:val="0"/>
+          <w:numId w:val="1013"/>
+        </w:numPr>
+        <w:pStyle w:val="Compact"/>
       </w:pPr>
       <w:r>
         <w:t xml:space="preserve">stale policy 返回 409 且余额、库存、订单、流水、Settlement 均无变化；</w:t>
@@ -5383,11 +5949,11 @@
     </w:p>
     <w:p>
       <w:pPr>
-        <w:pStyle w:val="Compact"/>
-        <w:numPr>
-          <w:ilvl w:val="0"/>
-          <w:numId w:val="1012"/>
-        </w:numPr>
+        <w:numPr>
+          <w:ilvl w:val="0"/>
+          <w:numId w:val="1013"/>
+        </w:numPr>
+        <w:pStyle w:val="Compact"/>
       </w:pPr>
       <w:r>
         <w:t xml:space="preserve">成功订单只有一个 immutable snapshot；</w:t>
@@ -5395,11 +5961,11 @@
     </w:p>
     <w:p>
       <w:pPr>
-        <w:pStyle w:val="Compact"/>
-        <w:numPr>
-          <w:ilvl w:val="0"/>
-          <w:numId w:val="1012"/>
-        </w:numPr>
+        <w:numPr>
+          <w:ilvl w:val="0"/>
+          <w:numId w:val="1013"/>
+        </w:numPr>
+        <w:pStyle w:val="Compact"/>
       </w:pPr>
       <w:r>
         <w:t xml:space="preserve">policy 后续 retired/替换后，订单详情仍返回原 snapshot；</w:t>
@@ -5407,11 +5973,11 @@
     </w:p>
     <w:p>
       <w:pPr>
-        <w:pStyle w:val="Compact"/>
-        <w:numPr>
-          <w:ilvl w:val="0"/>
-          <w:numId w:val="1012"/>
-        </w:numPr>
+        <w:numPr>
+          <w:ilvl w:val="0"/>
+          <w:numId w:val="1013"/>
+        </w:numPr>
+        <w:pStyle w:val="Compact"/>
       </w:pPr>
       <w:r>
         <w:t xml:space="preserve">同一幂等键并发重试不产生重复 snapshot；</w:t>
@@ -5419,11 +5985,11 @@
     </w:p>
     <w:p>
       <w:pPr>
-        <w:pStyle w:val="Compact"/>
-        <w:numPr>
-          <w:ilvl w:val="0"/>
-          <w:numId w:val="1012"/>
-        </w:numPr>
+        <w:numPr>
+          <w:ilvl w:val="0"/>
+          <w:numId w:val="1013"/>
+        </w:numPr>
+        <w:pStyle w:val="Compact"/>
       </w:pPr>
       <w:r>
         <w:t xml:space="preserve">BigInt API 字段为字符串，不触发 JSON 序列化异常。</w:t>
@@ -5479,11 +6045,11 @@
       <w:pPr>
         <w:pStyle w:val="Heading2"/>
       </w:pPr>
-      <w:bookmarkStart w:name="X1fb6806147a33ab8d1e8cf79f6ec6da283bb5c5" w:id="45"/>
+      <w:bookmarkStart w:id="46" w:name="可观测性"/>
       <w:r>
         <w:t xml:space="preserve">13. 可观测性</w:t>
       </w:r>
-      <w:bookmarkEnd w:id="45"/>
+      <w:bookmarkEnd w:id="46"/>
     </w:p>
     <w:p>
       <w:pPr>
@@ -5541,11 +6107,11 @@
     </w:p>
     <w:p>
       <w:pPr>
-        <w:pStyle w:val="Compact"/>
-        <w:numPr>
-          <w:ilvl w:val="0"/>
-          <w:numId w:val="1013"/>
-        </w:numPr>
+        <w:numPr>
+          <w:ilvl w:val="0"/>
+          <w:numId w:val="1014"/>
+        </w:numPr>
+        <w:pStyle w:val="Compact"/>
       </w:pPr>
       <w:r>
         <w:t xml:space="preserve">shadow/enforce 模式不存在 active CNY policy；</w:t>
@@ -5553,11 +6119,11 @@
     </w:p>
     <w:p>
       <w:pPr>
-        <w:pStyle w:val="Compact"/>
-        <w:numPr>
-          <w:ilvl w:val="0"/>
-          <w:numId w:val="1013"/>
-        </w:numPr>
+        <w:numPr>
+          <w:ilvl w:val="0"/>
+          <w:numId w:val="1014"/>
+        </w:numPr>
+        <w:pStyle w:val="Compact"/>
       </w:pPr>
       <w:r>
         <w:t xml:space="preserve">检测到多个 active policy；</w:t>
@@ -5565,11 +6131,11 @@
     </w:p>
     <w:p>
       <w:pPr>
-        <w:pStyle w:val="Compact"/>
-        <w:numPr>
-          <w:ilvl w:val="0"/>
-          <w:numId w:val="1013"/>
-        </w:numPr>
+        <w:numPr>
+          <w:ilvl w:val="0"/>
+          <w:numId w:val="1014"/>
+        </w:numPr>
+        <w:pStyle w:val="Compact"/>
       </w:pPr>
       <w:r>
         <w:t xml:space="preserve">policy asset kind/scale 不合法；</w:t>
@@ -5577,11 +6143,11 @@
     </w:p>
     <w:p>
       <w:pPr>
-        <w:pStyle w:val="Compact"/>
-        <w:numPr>
-          <w:ilvl w:val="0"/>
-          <w:numId w:val="1013"/>
-        </w:numPr>
+        <w:numPr>
+          <w:ilvl w:val="0"/>
+          <w:numId w:val="1014"/>
+        </w:numPr>
+        <w:pStyle w:val="Compact"/>
       </w:pPr>
       <w:r>
         <w:t xml:space="preserve">成功订单缺少应有 snapshot；</w:t>
@@ -5589,11 +6155,11 @@
     </w:p>
     <w:p>
       <w:pPr>
-        <w:pStyle w:val="Compact"/>
-        <w:numPr>
-          <w:ilvl w:val="0"/>
-          <w:numId w:val="1013"/>
-        </w:numPr>
+        <w:numPr>
+          <w:ilvl w:val="0"/>
+          <w:numId w:val="1014"/>
+        </w:numPr>
+        <w:pStyle w:val="Compact"/>
       </w:pPr>
       <w:r>
         <w:t xml:space="preserve">snapshot 与 Order.price 不一致。</w:t>
@@ -5611,11 +6177,11 @@
       <w:pPr>
         <w:pStyle w:val="Heading2"/>
       </w:pPr>
-      <w:bookmarkStart w:name="X1d10e020b7dc36f4e76d78533249413e1c32023" w:id="46"/>
+      <w:bookmarkStart w:id="47" w:name="建议修改文件"/>
       <w:r>
         <w:t xml:space="preserve">14. 建议修改文件</w:t>
       </w:r>
-      <w:bookmarkEnd w:id="46"/>
+      <w:bookmarkEnd w:id="47"/>
     </w:p>
     <w:p>
       <w:pPr>
@@ -5765,11 +6331,11 @@
       <w:pPr>
         <w:pStyle w:val="Heading2"/>
       </w:pPr>
-      <w:bookmarkStart w:name="X7902864186f4bcae11f9638cad0d5f8d35e7fde" w:id="47"/>
+      <w:bookmarkStart w:id="48" w:name="验证命令"/>
       <w:r>
         <w:t xml:space="preserve">15. 验证命令</w:t>
       </w:r>
-      <w:bookmarkEnd w:id="47"/>
+      <w:bookmarkEnd w:id="48"/>
     </w:p>
     <w:p>
       <w:pPr>
@@ -5861,28 +6427,42 @@
         <w:pStyle w:val="FirstParagraph"/>
       </w:pPr>
       <w:r>
-        <w:t xml:space="preserve">若完整测试受环境依赖阻塞，必须记录具体命令、错误和已完成的替代验证；不得只写“测试通过”而不提供结果。</w:t>
+        <w:t xml:space="preserve">若完整测试受环境依赖阻塞，必须记录具体命令、错误和已完成的替代验证；不得只写</w:t>
+      </w:r>
+      <w:r>
+        <w:t xml:space="preserve">“</w:t>
+      </w:r>
+      <w:r>
+        <w:t xml:space="preserve">测试通过</w:t>
+      </w:r>
+      <w:r>
+        <w:t xml:space="preserve">”</w:t>
+      </w:r>
+      <w:r>
+        <w:t xml:space="preserve">而不提供结果。</w:t>
       </w:r>
     </w:p>
     <w:p>
       <w:pPr>
         <w:pStyle w:val="Heading2"/>
       </w:pPr>
-      <w:bookmarkStart w:name="X66244f44ca523909964ccfdcfd83c188534c638" w:id="48"/>
+      <w:bookmarkStart w:id="49" w:name="分阶段上线"/>
       <w:r>
         <w:t xml:space="preserve">16. 分阶段上线</w:t>
       </w:r>
-      <w:bookmarkEnd w:id="48"/>
+      <w:bookmarkEnd w:id="49"/>
     </w:p>
     <w:tbl>
       <w:tblPr>
         <w:tblStyle w:val="Table"/>
-        <w:tblW w:w="5000" w:type="pct"/>
-        <w:tblLook w:val="04A0"/>
+        <w:tblW w:type="pct" w:w="0.0"/>
+        <w:tblLook w:firstRow="1"/>
       </w:tblPr>
       <w:tblGrid/>
       <w:tr>
-        <w:trPr/>
+        <w:trPr>
+          <w:cnfStyle w:firstRow="1"/>
+        </w:trPr>
         <w:tc>
           <w:tcPr>
             <w:tcBorders>
@@ -6244,11 +6824,11 @@
       <w:pPr>
         <w:pStyle w:val="Heading2"/>
       </w:pPr>
-      <w:bookmarkStart w:name="X03e62838b3dddce82d3dc4d86696f6d66a27fdb" w:id="49"/>
+      <w:bookmarkStart w:id="50" w:name="完成定义"/>
       <w:r>
         <w:t xml:space="preserve">17. 完成定义</w:t>
       </w:r>
-      <w:bookmarkEnd w:id="49"/>
+      <w:bookmarkEnd w:id="50"/>
     </w:p>
     <w:p>
       <w:pPr>
@@ -6260,11 +6840,11 @@
     </w:p>
     <w:p>
       <w:pPr>
-        <w:pStyle w:val="Compact"/>
-        <w:numPr>
-          <w:ilvl w:val="0"/>
-          <w:numId w:val="1014"/>
-        </w:numPr>
+        <w:numPr>
+          <w:ilvl w:val="0"/>
+          <w:numId w:val="1015"/>
+        </w:numPr>
+        <w:pStyle w:val="Compact"/>
       </w:pPr>
       <w:r>
         <w:t xml:space="preserve">migration 可在空库与现有库重放；</w:t>
@@ -6272,11 +6852,11 @@
     </w:p>
     <w:p>
       <w:pPr>
-        <w:pStyle w:val="Compact"/>
-        <w:numPr>
-          <w:ilvl w:val="0"/>
-          <w:numId w:val="1014"/>
-        </w:numPr>
+        <w:numPr>
+          <w:ilvl w:val="0"/>
+          <w:numId w:val="1015"/>
+        </w:numPr>
+        <w:pStyle w:val="Compact"/>
       </w:pPr>
       <w:r>
         <w:rPr>
@@ -6285,16 +6865,19 @@
         <w:t xml:space="preserve">off</w:t>
       </w:r>
       <w:r>
-        <w:t xml:space="preserve"> 模式不改变任何当前用户行为或 API 兼容字段；</w:t>
-      </w:r>
-    </w:p>
-    <w:p>
-      <w:pPr>
-        <w:pStyle w:val="Compact"/>
-        <w:numPr>
-          <w:ilvl w:val="0"/>
-          <w:numId w:val="1014"/>
-        </w:numPr>
+        <w:t xml:space="preserve"> </w:t>
+      </w:r>
+      <w:r>
+        <w:t xml:space="preserve">模式不改变任何当前用户行为或 API 兼容字段；</w:t>
+      </w:r>
+    </w:p>
+    <w:p>
+      <w:pPr>
+        <w:numPr>
+          <w:ilvl w:val="0"/>
+          <w:numId w:val="1015"/>
+        </w:numPr>
+        <w:pStyle w:val="Compact"/>
       </w:pPr>
       <w:r>
         <w:t xml:space="preserve">CNY policy 能精确计算并返回字符串原子金额；</w:t>
@@ -6302,11 +6885,11 @@
     </w:p>
     <w:p>
       <w:pPr>
-        <w:pStyle w:val="Compact"/>
-        <w:numPr>
-          <w:ilvl w:val="0"/>
-          <w:numId w:val="1014"/>
-        </w:numPr>
+        <w:numPr>
+          <w:ilvl w:val="0"/>
+          <w:numId w:val="1015"/>
+        </w:numPr>
+        <w:pStyle w:val="Compact"/>
       </w:pPr>
       <w:r>
         <w:t xml:space="preserve">stale policy 在任何资金/库存副作用前被拒绝；</w:t>
@@ -6314,11 +6897,11 @@
     </w:p>
     <w:p>
       <w:pPr>
-        <w:pStyle w:val="Compact"/>
-        <w:numPr>
-          <w:ilvl w:val="0"/>
-          <w:numId w:val="1014"/>
-        </w:numPr>
+        <w:numPr>
+          <w:ilvl w:val="0"/>
+          <w:numId w:val="1015"/>
+        </w:numPr>
+        <w:pStyle w:val="Compact"/>
       </w:pPr>
       <w:r>
         <w:t xml:space="preserve">新订单 policy/snapshot 在同一事务完成；</w:t>
@@ -6326,11 +6909,11 @@
     </w:p>
     <w:p>
       <w:pPr>
-        <w:pStyle w:val="Compact"/>
-        <w:numPr>
-          <w:ilvl w:val="0"/>
-          <w:numId w:val="1014"/>
-        </w:numPr>
+        <w:numPr>
+          <w:ilvl w:val="0"/>
+          <w:numId w:val="1015"/>
+        </w:numPr>
+        <w:pStyle w:val="Compact"/>
       </w:pPr>
       <w:r>
         <w:t xml:space="preserve">历史订单不被回填或重估；</w:t>
@@ -6338,11 +6921,11 @@
     </w:p>
     <w:p>
       <w:pPr>
-        <w:pStyle w:val="Compact"/>
-        <w:numPr>
-          <w:ilvl w:val="0"/>
-          <w:numId w:val="1014"/>
-        </w:numPr>
+        <w:numPr>
+          <w:ilvl w:val="0"/>
+          <w:numId w:val="1015"/>
+        </w:numPr>
+        <w:pStyle w:val="Compact"/>
       </w:pPr>
       <w:r>
         <w:t xml:space="preserve">相关 build、测试和快速验证通过；</w:t>
@@ -6350,11 +6933,11 @@
     </w:p>
     <w:p>
       <w:pPr>
-        <w:pStyle w:val="Compact"/>
-        <w:numPr>
-          <w:ilvl w:val="0"/>
-          <w:numId w:val="1014"/>
-        </w:numPr>
+        <w:numPr>
+          <w:ilvl w:val="0"/>
+          <w:numId w:val="1015"/>
+        </w:numPr>
+        <w:pStyle w:val="Compact"/>
       </w:pPr>
       <w:r>
         <w:t xml:space="preserve">git diff 不包含真实支付、USDT、会员或无关重构；</w:t>
@@ -6362,11 +6945,11 @@
     </w:p>
     <w:p>
       <w:pPr>
-        <w:pStyle w:val="Compact"/>
-        <w:numPr>
-          <w:ilvl w:val="0"/>
-          <w:numId w:val="1014"/>
-        </w:numPr>
+        <w:numPr>
+          <w:ilvl w:val="0"/>
+          <w:numId w:val="1015"/>
+        </w:numPr>
+        <w:pStyle w:val="Compact"/>
       </w:pPr>
       <w:r>
         <w:t xml:space="preserve">Agent 输出修改文件、迁移、测试结果、风险和未决事项；</w:t>
@@ -6374,11 +6957,11 @@
     </w:p>
     <w:p>
       <w:pPr>
-        <w:pStyle w:val="Compact"/>
-        <w:numPr>
-          <w:ilvl w:val="0"/>
-          <w:numId w:val="1014"/>
-        </w:numPr>
+        <w:numPr>
+          <w:ilvl w:val="0"/>
+          <w:numId w:val="1015"/>
+        </w:numPr>
+        <w:pStyle w:val="Compact"/>
       </w:pPr>
       <w:r>
         <w:t xml:space="preserve">Agent 不自行 push、合并、创建 PR 或激活生产 policy。</w:t>
@@ -6388,11 +6971,11 @@
       <w:pPr>
         <w:pStyle w:val="Heading2"/>
       </w:pPr>
-      <w:bookmarkStart w:name="X4a40f1ca37817a456c5cf70ee9546d4af14f44c" w:id="50"/>
+      <w:bookmarkStart w:id="51" w:name="agent-执行指令"/>
       <w:r>
         <w:t xml:space="preserve">18. Agent 执行指令</w:t>
       </w:r>
-      <w:bookmarkEnd w:id="50"/>
+      <w:bookmarkEnd w:id="51"/>
     </w:p>
     <w:p>
       <w:pPr>
@@ -6404,11 +6987,11 @@
     </w:p>
     <w:p>
       <w:pPr>
-        <w:pStyle w:val="Compact"/>
-        <w:numPr>
-          <w:ilvl w:val="0"/>
-          <w:numId w:val="1015"/>
-        </w:numPr>
+        <w:numPr>
+          <w:ilvl w:val="0"/>
+          <w:numId w:val="1016"/>
+        </w:numPr>
+        <w:pStyle w:val="Compact"/>
       </w:pPr>
       <w:r>
         <w:t xml:space="preserve">完整阅读本 Spec 与上位 Spec；</w:t>
@@ -6416,11 +6999,11 @@
     </w:p>
     <w:p>
       <w:pPr>
-        <w:pStyle w:val="Compact"/>
-        <w:numPr>
-          <w:ilvl w:val="0"/>
-          <w:numId w:val="1015"/>
-        </w:numPr>
+        <w:numPr>
+          <w:ilvl w:val="0"/>
+          <w:numId w:val="1016"/>
+        </w:numPr>
+        <w:pStyle w:val="Compact"/>
       </w:pPr>
       <w:r>
         <w:t xml:space="preserve">先检查代码与测试，输出拟修改文件清单；</w:t>
@@ -6428,11 +7011,11 @@
     </w:p>
     <w:p>
       <w:pPr>
-        <w:pStyle w:val="Compact"/>
-        <w:numPr>
-          <w:ilvl w:val="0"/>
-          <w:numId w:val="1015"/>
-        </w:numPr>
+        <w:numPr>
+          <w:ilvl w:val="0"/>
+          <w:numId w:val="1016"/>
+        </w:numPr>
+        <w:pStyle w:val="Compact"/>
       </w:pPr>
       <w:r>
         <w:t xml:space="preserve">严格在本文范围内实现，不自行扩大到 ledger/VC/支付；</w:t>
@@ -6440,11 +7023,11 @@
     </w:p>
     <w:p>
       <w:pPr>
-        <w:pStyle w:val="Compact"/>
-        <w:numPr>
-          <w:ilvl w:val="0"/>
-          <w:numId w:val="1015"/>
-        </w:numPr>
+        <w:numPr>
+          <w:ilvl w:val="0"/>
+          <w:numId w:val="1016"/>
+        </w:numPr>
+        <w:pStyle w:val="Compact"/>
       </w:pPr>
       <w:r>
         <w:t xml:space="preserve">遇到 D-02、生产 seed 或业务语义不明确时停止相关部分并报告，不擅自决定；</w:t>
@@ -6452,11 +7035,11 @@
     </w:p>
     <w:p>
       <w:pPr>
-        <w:pStyle w:val="Compact"/>
-        <w:numPr>
-          <w:ilvl w:val="0"/>
-          <w:numId w:val="1015"/>
-        </w:numPr>
+        <w:numPr>
+          <w:ilvl w:val="0"/>
+          <w:numId w:val="1016"/>
+        </w:numPr>
+        <w:pStyle w:val="Compact"/>
       </w:pPr>
       <w:r>
         <w:t xml:space="preserve">保留当前工作区中不属于自己的改动；</w:t>
@@ -6464,14 +7047,946 @@
     </w:p>
     <w:p>
       <w:pPr>
-        <w:pStyle w:val="Compact"/>
-        <w:numPr>
-          <w:ilvl w:val="0"/>
-          <w:numId w:val="1015"/>
-        </w:numPr>
+        <w:numPr>
+          <w:ilvl w:val="0"/>
+          <w:numId w:val="1016"/>
+        </w:numPr>
+        <w:pStyle w:val="Compact"/>
       </w:pPr>
       <w:r>
         <w:t xml:space="preserve">实施后运行验证、检查 diff，并按完成定义逐项报告。</w:t>
+      </w:r>
+    </w:p>
+    <w:p>
+      <w:pPr>
+        <w:pStyle w:val="Heading2"/>
+      </w:pPr>
+      <w:bookmarkStart w:id="52" w:name="implementation-status2026-08-18-closure"/>
+      <w:r>
+        <w:t xml:space="preserve">19. Implementation status（2026-08-18 closure）</w:t>
+      </w:r>
+      <w:bookmarkEnd w:id="52"/>
+    </w:p>
+    <w:p>
+      <w:pPr>
+        <w:pStyle w:val="FirstParagraph"/>
+      </w:pPr>
+      <w:r>
+        <w:t xml:space="preserve">状态：</w:t>
+      </w:r>
+      <w:r>
+        <w:rPr>
+          <w:b/>
+        </w:rPr>
+        <w:t xml:space="preserve">Implemented — Production Activation Blocked by D-02/D-03</w:t>
+      </w:r>
+    </w:p>
+    <w:p>
+      <w:pPr>
+        <w:pStyle w:val="Heading3"/>
+      </w:pPr>
+      <w:bookmarkStart w:id="53" w:name="实现证据"/>
+      <w:r>
+        <w:t xml:space="preserve">19.1 实现证据</w:t>
+      </w:r>
+      <w:bookmarkEnd w:id="53"/>
+    </w:p>
+    <w:tbl>
+      <w:tblPr>
+        <w:tblStyle w:val="Table"/>
+        <w:tblW w:type="pct" w:w="5000.0"/>
+        <w:tblLook w:firstRow="1"/>
+      </w:tblPr>
+      <w:tblGrid>
+        <w:gridCol w:w="3960"/>
+        <w:gridCol w:w="3960"/>
+      </w:tblGrid>
+      <w:tr>
+        <w:trPr>
+          <w:cnfStyle w:firstRow="1"/>
+        </w:trPr>
+        <w:tc>
+          <w:tcPr>
+            <w:tcBorders>
+              <w:bottom w:val="single"/>
+            </w:tcBorders>
+            <w:vAlign w:val="bottom"/>
+          </w:tcPr>
+          <w:p>
+            <w:pPr>
+              <w:pStyle w:val="Compact"/>
+              <w:jc w:val="left"/>
+            </w:pPr>
+            <w:r>
+              <w:t xml:space="preserve">项</w:t>
+            </w:r>
+          </w:p>
+        </w:tc>
+        <w:tc>
+          <w:tcPr>
+            <w:tcBorders>
+              <w:bottom w:val="single"/>
+            </w:tcBorders>
+            <w:vAlign w:val="bottom"/>
+          </w:tcPr>
+          <w:p>
+            <w:pPr>
+              <w:pStyle w:val="Compact"/>
+              <w:jc w:val="left"/>
+            </w:pPr>
+            <w:r>
+              <w:t xml:space="preserve">证据</w:t>
+            </w:r>
+          </w:p>
+        </w:tc>
+      </w:tr>
+      <w:tr>
+        <w:tc>
+          <w:p>
+            <w:pPr>
+              <w:pStyle w:val="Compact"/>
+              <w:jc w:val="left"/>
+            </w:pPr>
+            <w:r>
+              <w:t xml:space="preserve">PR #144 已合并</w:t>
+            </w:r>
+          </w:p>
+        </w:tc>
+        <w:tc>
+          <w:p>
+            <w:pPr>
+              <w:pStyle w:val="Compact"/>
+              <w:jc w:val="left"/>
+            </w:pPr>
+            <w:r>
+              <w:rPr>
+                <w:rStyle w:val="VerbatimChar"/>
+              </w:rPr>
+              <w:t xml:space="preserve">origin/develop@c6d21bb</w:t>
+            </w:r>
+            <w:r>
+              <w:t xml:space="preserve"> </w:t>
+            </w:r>
+            <w:r>
+              <w:rPr>
+                <w:rStyle w:val="VerbatimChar"/>
+              </w:rPr>
+              <w:t xml:space="preserve">feat(value-policy): add CNY value policy phase 1 foundation (#144)</w:t>
+            </w:r>
+          </w:p>
+        </w:tc>
+      </w:tr>
+      <w:tr>
+        <w:tc>
+          <w:p>
+            <w:pPr>
+              <w:pStyle w:val="Compact"/>
+              <w:jc w:val="left"/>
+            </w:pPr>
+            <w:r>
+              <w:t xml:space="preserve">合并前功能提交</w:t>
+            </w:r>
+          </w:p>
+        </w:tc>
+        <w:tc>
+          <w:p>
+            <w:pPr>
+              <w:pStyle w:val="Compact"/>
+              <w:jc w:val="left"/>
+            </w:pPr>
+            <w:r>
+              <w:rPr>
+                <w:rStyle w:val="VerbatimChar"/>
+              </w:rPr>
+              <w:t xml:space="preserve">b71abc0</w:t>
+            </w:r>
+            <w:r>
+              <w:t xml:space="preserve">、</w:t>
+            </w:r>
+            <w:r>
+              <w:rPr>
+                <w:rStyle w:val="VerbatimChar"/>
+              </w:rPr>
+              <w:t xml:space="preserve">915dc41</w:t>
+            </w:r>
+          </w:p>
+        </w:tc>
+      </w:tr>
+      <w:tr>
+        <w:tc>
+          <w:p>
+            <w:pPr>
+              <w:pStyle w:val="Compact"/>
+              <w:jc w:val="left"/>
+            </w:pPr>
+            <w:r>
+              <w:t xml:space="preserve">Closure 分支</w:t>
+            </w:r>
+          </w:p>
+        </w:tc>
+        <w:tc>
+          <w:p>
+            <w:pPr>
+              <w:pStyle w:val="Compact"/>
+              <w:jc w:val="left"/>
+            </w:pPr>
+            <w:r>
+              <w:rPr>
+                <w:rStyle w:val="VerbatimChar"/>
+              </w:rPr>
+              <w:t xml:space="preserve">feat/cny-value-policy-phase-1-closure</w:t>
+            </w:r>
+          </w:p>
+        </w:tc>
+      </w:tr>
+      <w:tr>
+        <w:tc>
+          <w:p>
+            <w:pPr>
+              <w:pStyle w:val="Compact"/>
+              <w:jc w:val="left"/>
+            </w:pPr>
+            <w:r>
+              <w:t xml:space="preserve">Foundation migration</w:t>
+            </w:r>
+          </w:p>
+        </w:tc>
+        <w:tc>
+          <w:p>
+            <w:pPr>
+              <w:pStyle w:val="Compact"/>
+              <w:jc w:val="left"/>
+            </w:pPr>
+            <w:r>
+              <w:rPr>
+                <w:rStyle w:val="VerbatimChar"/>
+              </w:rPr>
+              <w:t xml:space="preserve">server/prisma/migrations/20260817180000_add_value_policy_foundation/</w:t>
+            </w:r>
+            <w:r>
+              <w:t xml:space="preserve">（已合并，禁止原地修改）</w:t>
+            </w:r>
+          </w:p>
+        </w:tc>
+      </w:tr>
+      <w:tr>
+        <w:tc>
+          <w:p>
+            <w:pPr>
+              <w:pStyle w:val="Compact"/>
+              <w:jc w:val="left"/>
+            </w:pPr>
+            <w:r>
+              <w:t xml:space="preserve">Closure migration</w:t>
+            </w:r>
+          </w:p>
+        </w:tc>
+        <w:tc>
+          <w:p>
+            <w:pPr>
+              <w:pStyle w:val="Compact"/>
+              <w:jc w:val="left"/>
+            </w:pPr>
+            <w:r>
+              <w:rPr>
+                <w:rStyle w:val="VerbatimChar"/>
+              </w:rPr>
+              <w:t xml:space="preserve">server/prisma/migrations/20260818120000_value_policy_phase1_closure/</w:t>
+            </w:r>
+          </w:p>
+        </w:tc>
+      </w:tr>
+      <w:tr>
+        <w:tc>
+          <w:p>
+            <w:pPr>
+              <w:pStyle w:val="Compact"/>
+              <w:jc w:val="left"/>
+            </w:pPr>
+            <w:r>
+              <w:t xml:space="preserve">内部状态推进</w:t>
+            </w:r>
+          </w:p>
+        </w:tc>
+        <w:tc>
+          <w:p>
+            <w:pPr>
+              <w:pStyle w:val="Compact"/>
+              <w:jc w:val="left"/>
+            </w:pPr>
+            <w:r>
+              <w:rPr>
+                <w:rStyle w:val="VerbatimChar"/>
+              </w:rPr>
+              <w:t xml:space="preserve">server/src/modules/valuePolicy/governance.ts</w:t>
+            </w:r>
+            <w:r>
+              <w:t xml:space="preserve">（无公开 HTTP 激活 API）</w:t>
+            </w:r>
+          </w:p>
+        </w:tc>
+      </w:tr>
+      <w:tr>
+        <w:tc>
+          <w:p>
+            <w:pPr>
+              <w:pStyle w:val="Compact"/>
+              <w:jc w:val="left"/>
+            </w:pPr>
+            <w:r>
+              <w:t xml:space="preserve">只读审计</w:t>
+            </w:r>
+          </w:p>
+        </w:tc>
+        <w:tc>
+          <w:p>
+            <w:pPr>
+              <w:pStyle w:val="Compact"/>
+              <w:jc w:val="left"/>
+            </w:pPr>
+            <w:r>
+              <w:rPr>
+                <w:rStyle w:val="VerbatimChar"/>
+              </w:rPr>
+              <w:t xml:space="preserve">npm --prefix server run value-policy:audit</w:t>
+            </w:r>
+          </w:p>
+        </w:tc>
+      </w:tr>
+      <w:tr>
+        <w:tc>
+          <w:p>
+            <w:pPr>
+              <w:pStyle w:val="Compact"/>
+              <w:jc w:val="left"/>
+            </w:pPr>
+            <w:r>
+              <w:t xml:space="preserve">告警契约</w:t>
+            </w:r>
+          </w:p>
+        </w:tc>
+        <w:tc>
+          <w:p>
+            <w:pPr>
+              <w:pStyle w:val="Compact"/>
+              <w:jc w:val="left"/>
+            </w:pPr>
+            <w:r>
+              <w:rPr>
+                <w:rStyle w:val="VerbatimChar"/>
+              </w:rPr>
+              <w:t xml:space="preserve">docs/operations/value-policy-alerts.md</w:t>
+            </w:r>
+            <w:r>
+              <w:t xml:space="preserve"> </w:t>
+            </w:r>
+            <w:r>
+              <w:t xml:space="preserve">+</w:t>
+            </w:r>
+            <w:r>
+              <w:t xml:space="preserve"> </w:t>
+            </w:r>
+            <w:r>
+              <w:rPr>
+                <w:rStyle w:val="VerbatimChar"/>
+              </w:rPr>
+              <w:t xml:space="preserve">server/src/modules/valuePolicy/alertContract.ts</w:t>
+            </w:r>
+          </w:p>
+        </w:tc>
+      </w:tr>
+      <w:tr>
+        <w:tc>
+          <w:p>
+            <w:pPr>
+              <w:pStyle w:val="Compact"/>
+              <w:jc w:val="left"/>
+            </w:pPr>
+            <w:r>
+              <w:t xml:space="preserve">运行手册</w:t>
+            </w:r>
+          </w:p>
+        </w:tc>
+        <w:tc>
+          <w:p>
+            <w:pPr>
+              <w:pStyle w:val="Compact"/>
+              <w:jc w:val="left"/>
+            </w:pPr>
+            <w:r>
+              <w:rPr>
+                <w:rStyle w:val="VerbatimChar"/>
+              </w:rPr>
+              <w:t xml:space="preserve">docs/operations/value-policy-runbook.md</w:t>
+            </w:r>
+          </w:p>
+        </w:tc>
+      </w:tr>
+    </w:tbl>
+    <w:p>
+      <w:pPr>
+        <w:pStyle w:val="Heading3"/>
+      </w:pPr>
+      <w:bookmarkStart w:id="54" w:name="已完成"/>
+      <w:r>
+        <w:t xml:space="preserve">19.2 已完成</w:t>
+      </w:r>
+      <w:bookmarkEnd w:id="54"/>
+    </w:p>
+    <w:p>
+      <w:pPr>
+        <w:numPr>
+          <w:ilvl w:val="0"/>
+          <w:numId w:val="1017"/>
+        </w:numPr>
+        <w:pStyle w:val="Compact"/>
+      </w:pPr>
+      <w:r>
+        <w:rPr>
+          <w:rStyle w:val="VerbatimChar"/>
+        </w:rPr>
+        <w:t xml:space="preserve">off</w:t>
+      </w:r>
+      <w:r>
+        <w:t xml:space="preserve"> </w:t>
+      </w:r>
+      <w:r>
+        <w:t xml:space="preserve">/</w:t>
+      </w:r>
+      <w:r>
+        <w:t xml:space="preserve"> </w:t>
+      </w:r>
+      <w:r>
+        <w:rPr>
+          <w:rStyle w:val="VerbatimChar"/>
+        </w:rPr>
+        <w:t xml:space="preserve">shadow</w:t>
+      </w:r>
+      <w:r>
+        <w:t xml:space="preserve"> </w:t>
+      </w:r>
+      <w:r>
+        <w:t xml:space="preserve">/</w:t>
+      </w:r>
+      <w:r>
+        <w:t xml:space="preserve"> </w:t>
+      </w:r>
+      <w:r>
+        <w:rPr>
+          <w:rStyle w:val="VerbatimChar"/>
+        </w:rPr>
+        <w:t xml:space="preserve">enforce</w:t>
+      </w:r>
+      <w:r>
+        <w:t xml:space="preserve"> </w:t>
+      </w:r>
+      <w:r>
+        <w:t xml:space="preserve">模式与错误码矩阵</w:t>
+      </w:r>
+    </w:p>
+    <w:p>
+      <w:pPr>
+        <w:numPr>
+          <w:ilvl w:val="0"/>
+          <w:numId w:val="1017"/>
+        </w:numPr>
+        <w:pStyle w:val="Compact"/>
+      </w:pPr>
+      <w:r>
+        <w:t xml:space="preserve">CNY</w:t>
+      </w:r>
+      <w:r>
+        <w:t xml:space="preserve"> </w:t>
+      </w:r>
+      <w:r>
+        <w:rPr>
+          <w:rStyle w:val="VerbatimChar"/>
+        </w:rPr>
+        <w:t xml:space="preserve">ValuePolicy</w:t>
+      </w:r>
+      <w:r>
+        <w:t xml:space="preserve"> </w:t>
+      </w:r>
+      <w:r>
+        <w:t xml:space="preserve">+</w:t>
+      </w:r>
+      <w:r>
+        <w:t xml:space="preserve"> </w:t>
+      </w:r>
+      <w:r>
+        <w:rPr>
+          <w:rStyle w:val="VerbatimChar"/>
+        </w:rPr>
+        <w:t xml:space="preserve">OrderPricingSnapshot</w:t>
+      </w:r>
+      <w:r>
+        <w:t xml:space="preserve"> </w:t>
+      </w:r>
+      <w:r>
+        <w:t xml:space="preserve">同事务落库</w:t>
+      </w:r>
+    </w:p>
+    <w:p>
+      <w:pPr>
+        <w:numPr>
+          <w:ilvl w:val="0"/>
+          <w:numId w:val="1017"/>
+        </w:numPr>
+        <w:pStyle w:val="Compact"/>
+      </w:pPr>
+      <w:r>
+        <w:t xml:space="preserve">状态机与时间戳由数据库 CHECK/trigger 保护</w:t>
+      </w:r>
+    </w:p>
+    <w:p>
+      <w:pPr>
+        <w:numPr>
+          <w:ilvl w:val="0"/>
+          <w:numId w:val="1017"/>
+        </w:numPr>
+        <w:pStyle w:val="Compact"/>
+      </w:pPr>
+      <w:r>
+        <w:t xml:space="preserve">Asset/policy 典型并发按同一 advisory lock 消除 40P01</w:t>
+      </w:r>
+    </w:p>
+    <w:p>
+      <w:pPr>
+        <w:numPr>
+          <w:ilvl w:val="0"/>
+          <w:numId w:val="1017"/>
+        </w:numPr>
+        <w:pStyle w:val="Compact"/>
+      </w:pPr>
+      <w:r>
+        <w:t xml:space="preserve">指标语义与事务提交一致</w:t>
+      </w:r>
+    </w:p>
+    <w:p>
+      <w:pPr>
+        <w:numPr>
+          <w:ilvl w:val="0"/>
+          <w:numId w:val="1017"/>
+        </w:numPr>
+        <w:pStyle w:val="Compact"/>
+      </w:pPr>
+      <w:r>
+        <w:t xml:space="preserve">只读审计命令</w:t>
+      </w:r>
+    </w:p>
+    <w:p>
+      <w:pPr>
+        <w:numPr>
+          <w:ilvl w:val="0"/>
+          <w:numId w:val="1017"/>
+        </w:numPr>
+        <w:pStyle w:val="Compact"/>
+      </w:pPr>
+      <w:r>
+        <w:t xml:space="preserve">生产配置守卫：</w:t>
+      </w:r>
+      <w:r>
+        <w:rPr>
+          <w:rStyle w:val="VerbatimChar"/>
+        </w:rPr>
+        <w:t xml:space="preserve">MONEXUS_DEPLOY_ENV=production</w:t>
+      </w:r>
+      <w:r>
+        <w:t xml:space="preserve"> </w:t>
+      </w:r>
+      <w:r>
+        <w:t xml:space="preserve">时强制</w:t>
+      </w:r>
+      <w:r>
+        <w:t xml:space="preserve"> </w:t>
+      </w:r>
+      <w:r>
+        <w:rPr>
+          <w:rStyle w:val="VerbatimChar"/>
+        </w:rPr>
+        <w:t xml:space="preserve">off</w:t>
+      </w:r>
+    </w:p>
+    <w:p>
+      <w:pPr>
+        <w:pStyle w:val="Heading3"/>
+      </w:pPr>
+      <w:bookmarkStart w:id="55" w:name="生产激活-gates未完成且不得由工程自行决定"/>
+      <w:r>
+        <w:t xml:space="preserve">19.3 生产激活 gates（未完成，且不得由工程自行决定）</w:t>
+      </w:r>
+      <w:bookmarkEnd w:id="55"/>
+    </w:p>
+    <w:p>
+      <w:pPr>
+        <w:numPr>
+          <w:ilvl w:val="0"/>
+          <w:numId w:val="1018"/>
+        </w:numPr>
+        <w:pStyle w:val="Compact"/>
+      </w:pPr>
+      <w:r>
+        <w:t xml:space="preserve">D-02 生产积分面值未批准</w:t>
+      </w:r>
+    </w:p>
+    <w:p>
+      <w:pPr>
+        <w:numPr>
+          <w:ilvl w:val="0"/>
+          <w:numId w:val="1018"/>
+        </w:numPr>
+        <w:pStyle w:val="Compact"/>
+      </w:pPr>
+      <w:r>
+        <w:t xml:space="preserve">D-03 生产披露文案未批准</w:t>
+      </w:r>
+    </w:p>
+    <w:p>
+      <w:pPr>
+        <w:numPr>
+          <w:ilvl w:val="0"/>
+          <w:numId w:val="1018"/>
+        </w:numPr>
+        <w:pStyle w:val="Compact"/>
+      </w:pPr>
+      <w:r>
+        <w:t xml:space="preserve">双人审批后台入口（创建人 ≠ 审批人）未开放；当前 schema 无 actor 字段</w:t>
+      </w:r>
+    </w:p>
+    <w:p>
+      <w:pPr>
+        <w:numPr>
+          <w:ilvl w:val="0"/>
+          <w:numId w:val="1018"/>
+        </w:numPr>
+        <w:pStyle w:val="Compact"/>
+      </w:pPr>
+      <w:r>
+        <w:t xml:space="preserve">未创建生产 active ValuePolicy</w:t>
+      </w:r>
+    </w:p>
+    <w:p>
+      <w:pPr>
+        <w:numPr>
+          <w:ilvl w:val="0"/>
+          <w:numId w:val="1018"/>
+        </w:numPr>
+        <w:pStyle w:val="Compact"/>
+      </w:pPr>
+      <w:r>
+        <w:t xml:space="preserve">生产</w:t>
+      </w:r>
+      <w:r>
+        <w:t xml:space="preserve"> </w:t>
+      </w:r>
+      <w:r>
+        <w:rPr>
+          <w:rStyle w:val="VerbatimChar"/>
+        </w:rPr>
+        <w:t xml:space="preserve">POINT_VALUE_POLICY_MODE</w:t>
+      </w:r>
+      <w:r>
+        <w:t xml:space="preserve"> </w:t>
+      </w:r>
+      <w:r>
+        <w:t xml:space="preserve">必须保持</w:t>
+      </w:r>
+      <w:r>
+        <w:t xml:space="preserve"> </w:t>
+      </w:r>
+      <w:r>
+        <w:rPr>
+          <w:rStyle w:val="VerbatimChar"/>
+        </w:rPr>
+        <w:t xml:space="preserve">off</w:t>
+      </w:r>
+    </w:p>
+    <w:p>
+      <w:pPr>
+        <w:pStyle w:val="Heading3"/>
+      </w:pPr>
+      <w:bookmarkStart w:id="56" w:name="明确不属于本-phase-1-的后续范围"/>
+      <w:r>
+        <w:t xml:space="preserve">19.4 明确不属于本 Phase 1 的后续范围</w:t>
+      </w:r>
+      <w:bookmarkEnd w:id="56"/>
+    </w:p>
+    <w:p>
+      <w:pPr>
+        <w:pStyle w:val="FirstParagraph"/>
+      </w:pPr>
+      <w:r>
+        <w:t xml:space="preserve">以下属于</w:t>
+      </w:r>
+      <w:r>
+        <w:t xml:space="preserve"> </w:t>
+      </w:r>
+      <w:r>
+        <w:rPr>
+          <w:rStyle w:val="VerbatimChar"/>
+        </w:rPr>
+        <w:t xml:space="preserve">SPEC-VALUE-LEDGER-001</w:t>
+      </w:r>
+      <w:r>
+        <w:t xml:space="preserve"> </w:t>
+      </w:r>
+      <w:r>
+        <w:t xml:space="preserve">后续阶段，不是本次 closure 的未完成代码：</w:t>
+      </w:r>
+    </w:p>
+    <w:p>
+      <w:pPr>
+        <w:numPr>
+          <w:ilvl w:val="0"/>
+          <w:numId w:val="1019"/>
+        </w:numPr>
+        <w:pStyle w:val="Compact"/>
+      </w:pPr>
+      <w:r>
+        <w:t xml:space="preserve">LedgerAccount / LedgerTransaction / LedgerEntry</w:t>
+      </w:r>
+    </w:p>
+    <w:p>
+      <w:pPr>
+        <w:numPr>
+          <w:ilvl w:val="0"/>
+          <w:numId w:val="1019"/>
+        </w:numPr>
+        <w:pStyle w:val="Compact"/>
+      </w:pPr>
+      <w:r>
+        <w:t xml:space="preserve">EntitlementLot / ConsumptionAllocation</w:t>
+      </w:r>
+    </w:p>
+    <w:p>
+      <w:pPr>
+        <w:numPr>
+          <w:ilvl w:val="0"/>
+          <w:numId w:val="1019"/>
+        </w:numPr>
+        <w:pStyle w:val="Compact"/>
+      </w:pPr>
+      <w:r>
+        <w:t xml:space="preserve">RP/VC/XP 拆分</w:t>
+      </w:r>
+    </w:p>
+    <w:p>
+      <w:pPr>
+        <w:numPr>
+          <w:ilvl w:val="0"/>
+          <w:numId w:val="1019"/>
+        </w:numPr>
+        <w:pStyle w:val="Compact"/>
+      </w:pPr>
+      <w:r>
+        <w:t xml:space="preserve">FxQuote</w:t>
+      </w:r>
+    </w:p>
+    <w:p>
+      <w:pPr>
+        <w:numPr>
+          <w:ilvl w:val="0"/>
+          <w:numId w:val="1019"/>
+        </w:numPr>
+        <w:pStyle w:val="Compact"/>
+      </w:pPr>
+      <w:r>
+        <w:t xml:space="preserve">真实 CNY/USD/USDT 支付</w:t>
+      </w:r>
+    </w:p>
+    <w:p>
+      <w:pPr>
+        <w:numPr>
+          <w:ilvl w:val="0"/>
+          <w:numId w:val="1019"/>
+        </w:numPr>
+        <w:pStyle w:val="Compact"/>
+      </w:pPr>
+      <w:r>
+        <w:t xml:space="preserve">用户充值、转账、提现或现金赎回</w:t>
+      </w:r>
+    </w:p>
+    <w:p>
+      <w:pPr>
+        <w:numPr>
+          <w:ilvl w:val="0"/>
+          <w:numId w:val="1019"/>
+        </w:numPr>
+        <w:pStyle w:val="Compact"/>
+      </w:pPr>
+      <w:r>
+        <w:t xml:space="preserve">商家真实货币出款</w:t>
+      </w:r>
+    </w:p>
+    <w:p>
+      <w:pPr>
+        <w:numPr>
+          <w:ilvl w:val="0"/>
+          <w:numId w:val="1019"/>
+        </w:numPr>
+        <w:pStyle w:val="Compact"/>
+      </w:pPr>
+      <w:r>
+        <w:t xml:space="preserve">SettlementV2 / Payout / Reconciliation</w:t>
+      </w:r>
+    </w:p>
+    <w:p>
+      <w:pPr>
+        <w:numPr>
+          <w:ilvl w:val="0"/>
+          <w:numId w:val="1019"/>
+        </w:numPr>
+        <w:pStyle w:val="Compact"/>
+      </w:pPr>
+      <w:r>
+        <w:t xml:space="preserve">前端生产参考价值展示</w:t>
+      </w:r>
+    </w:p>
+    <w:p>
+      <w:pPr>
+        <w:numPr>
+          <w:ilvl w:val="0"/>
+          <w:numId w:val="1019"/>
+        </w:numPr>
+        <w:pStyle w:val="Compact"/>
+      </w:pPr>
+      <w:r>
+        <w:t xml:space="preserve">多租户</w:t>
+      </w:r>
+    </w:p>
+    <w:p>
+      <w:pPr>
+        <w:numPr>
+          <w:ilvl w:val="0"/>
+          <w:numId w:val="1019"/>
+        </w:numPr>
+        <w:pStyle w:val="Compact"/>
+      </w:pPr>
+      <w:r>
+        <w:t xml:space="preserve">生产 active policy</w:t>
+      </w:r>
+    </w:p>
+    <w:p>
+      <w:pPr>
+        <w:numPr>
+          <w:ilvl w:val="0"/>
+          <w:numId w:val="1019"/>
+        </w:numPr>
+        <w:pStyle w:val="Compact"/>
+      </w:pPr>
+      <w:r>
+        <w:t xml:space="preserve">自行决定</w:t>
+      </w:r>
+      <w:r>
+        <w:t xml:space="preserve"> </w:t>
+      </w:r>
+      <w:r>
+        <w:rPr>
+          <w:rStyle w:val="VerbatimChar"/>
+        </w:rPr>
+        <w:t xml:space="preserve">100 PTS = 1 CNY</w:t>
+      </w:r>
+    </w:p>
+    <w:p>
+      <w:pPr>
+        <w:pStyle w:val="Heading3"/>
+      </w:pPr>
+      <w:bookmarkStart w:id="57" w:name="migration-政策"/>
+      <w:r>
+        <w:t xml:space="preserve">19.5 Migration 政策</w:t>
+      </w:r>
+      <w:bookmarkEnd w:id="57"/>
+    </w:p>
+    <w:p>
+      <w:pPr>
+        <w:pStyle w:val="FirstParagraph"/>
+      </w:pPr>
+      <w:r>
+        <w:t xml:space="preserve">已合并的</w:t>
+      </w:r>
+      <w:r>
+        <w:t xml:space="preserve"> </w:t>
+      </w:r>
+      <w:r>
+        <w:rPr>
+          <w:rStyle w:val="VerbatimChar"/>
+        </w:rPr>
+        <w:t xml:space="preserve">20260817180000_add_value_policy_foundation</w:t>
+      </w:r>
+      <w:r>
+        <w:t xml:space="preserve"> </w:t>
+      </w:r>
+      <w:r>
+        <w:t xml:space="preserve">不得原地修改。</w:t>
+      </w:r>
+      <w:r>
+        <w:t xml:space="preserve"> </w:t>
+      </w:r>
+      <w:r>
+        <w:t xml:space="preserve">部署后只允许 forward-fix。禁止</w:t>
+      </w:r>
+      <w:r>
+        <w:t xml:space="preserve"> </w:t>
+      </w:r>
+      <w:r>
+        <w:rPr>
+          <w:rStyle w:val="VerbatimChar"/>
+        </w:rPr>
+        <w:t xml:space="preserve">prisma db push</w:t>
+      </w:r>
+      <w:r>
+        <w:t xml:space="preserve">。禁止回滚历史 migration。</w:t>
+      </w:r>
+    </w:p>
+    <w:p>
+      <w:pPr>
+        <w:pStyle w:val="Heading3"/>
+      </w:pPr>
+      <w:bookmarkStart w:id="58" w:name="docx-同步"/>
+      <w:r>
+        <w:t xml:space="preserve">19.6 DOCX 同步</w:t>
+      </w:r>
+      <w:bookmarkEnd w:id="58"/>
+    </w:p>
+    <w:p>
+      <w:pPr>
+        <w:pStyle w:val="FirstParagraph"/>
+      </w:pPr>
+      <w:r>
+        <w:t xml:space="preserve">两个正式 Spec 的权威正文是 Markdown。DOCX 由</w:t>
+      </w:r>
+      <w:r>
+        <w:t xml:space="preserve"> </w:t>
+      </w:r>
+      <w:r>
+        <w:rPr>
+          <w:rStyle w:val="VerbatimChar"/>
+        </w:rPr>
+        <w:t xml:space="preserve">scripts/sync-value-policy-specs-docx.sh</w:t>
+      </w:r>
+      <w:r>
+        <w:t xml:space="preserve">（pandoc）从 Markdown 重新生成，</w:t>
+      </w:r>
+      <w:r>
+        <w:t xml:space="preserve"> </w:t>
+      </w:r>
+      <w:r>
+        <w:t xml:space="preserve">并用反向</w:t>
+      </w:r>
+      <w:r>
+        <w:t xml:space="preserve"> </w:t>
+      </w:r>
+      <w:r>
+        <w:rPr>
+          <w:rStyle w:val="VerbatimChar"/>
+        </w:rPr>
+        <w:t xml:space="preserve">pandoc -t plain</w:t>
+      </w:r>
+      <w:r>
+        <w:t xml:space="preserve"> </w:t>
+      </w:r>
+      <w:r>
+        <w:t xml:space="preserve">校验关键状态句。禁止手工改 DOCX。</w:t>
       </w:r>
     </w:p>
     <w:sectPr/>
@@ -6607,7 +8122,7 @@
       </w:pPr>
     </w:lvl>
   </w:abstractNum>
-  <w:abstractNum w:abstractNumId="99211">
+  <w:abstractNum w:abstractNumId="99411">
     <w:nsid w:val="ea454b4c"/>
     <w:multiLevelType w:val="multilevel"/>
     <w:lvl w:ilvl="0">
@@ -6624,7 +8139,7 @@
     </w:lvl>
     <w:lvl w:ilvl="1">
       <w:start w:val="1"/>
-      <w:numFmt w:val="lowerLetter"/>
+      <w:numFmt w:val="decimal"/>
       <w:lvlText w:val="%2."/>
       <w:lvlJc w:val="left"/>
       <w:pPr>
@@ -6636,7 +8151,7 @@
     </w:lvl>
     <w:lvl w:ilvl="2">
       <w:start w:val="1"/>
-      <w:numFmt w:val="lowerRoman"/>
+      <w:numFmt w:val="decimal"/>
       <w:lvlText w:val="%3."/>
       <w:lvlJc w:val="left"/>
       <w:pPr>
@@ -6660,7 +8175,7 @@
     </w:lvl>
     <w:lvl w:ilvl="4">
       <w:start w:val="1"/>
-      <w:numFmt w:val="lowerLetter"/>
+      <w:numFmt w:val="decimal"/>
       <w:lvlText w:val="%5."/>
       <w:lvlJc w:val="left"/>
       <w:pPr>
@@ -6672,7 +8187,7 @@
     </w:lvl>
     <w:lvl w:ilvl="5">
       <w:start w:val="1"/>
-      <w:numFmt w:val="lowerRoman"/>
+      <w:numFmt w:val="decimal"/>
       <w:lvlText w:val="%6."/>
       <w:lvlJc w:val="left"/>
       <w:pPr>
@@ -6696,7 +8211,7 @@
     </w:lvl>
     <w:lvl w:ilvl="7">
       <w:start w:val="1"/>
-      <w:numFmt w:val="lowerLetter"/>
+      <w:numFmt w:val="decimal"/>
       <w:lvlText w:val="%8."/>
       <w:lvlJc w:val="left"/>
       <w:pPr>
@@ -6708,7 +8223,7 @@
     </w:lvl>
     <w:lvl w:ilvl="8">
       <w:start w:val="1"/>
-      <w:numFmt w:val="lowerRoman"/>
+      <w:numFmt w:val="decimal"/>
       <w:lvlText w:val="%9."/>
       <w:lvlJc w:val="left"/>
       <w:pPr>
@@ -6826,7 +8341,7 @@
     <w:abstractNumId w:val="990"/>
   </w:num>
   <w:num w:numId="1001">
-    <w:abstractNumId w:val="99211"/>
+    <w:abstractNumId w:val="99411"/>
     <w:lvlOverride w:ilvl="0">
       <w:startOverride w:val="1"/>
     </w:lvlOverride>
@@ -6862,7 +8377,7 @@
     <w:abstractNumId w:val="991"/>
   </w:num>
   <w:num w:numId="1004">
-    <w:abstractNumId w:val="99211"/>
+    <w:abstractNumId w:val="99411"/>
     <w:lvlOverride w:ilvl="0">
       <w:startOverride w:val="1"/>
     </w:lvlOverride>
@@ -6901,7 +8416,7 @@
     <w:abstractNumId w:val="991"/>
   </w:num>
   <w:num w:numId="1008">
-    <w:abstractNumId w:val="99211"/>
+    <w:abstractNumId w:val="99411"/>
     <w:lvlOverride w:ilvl="0">
       <w:startOverride w:val="1"/>
     </w:lvlOverride>
@@ -6931,7 +8446,7 @@
     </w:lvlOverride>
   </w:num>
   <w:num w:numId="1009">
-    <w:abstractNumId w:val="99211"/>
+    <w:abstractNumId w:val="99411"/>
     <w:lvlOverride w:ilvl="0">
       <w:startOverride w:val="1"/>
     </w:lvlOverride>
@@ -6961,19 +8476,7 @@
     </w:lvlOverride>
   </w:num>
   <w:num w:numId="1010">
-    <w:abstractNumId w:val="991"/>
-  </w:num>
-  <w:num w:numId="1011">
-    <w:abstractNumId w:val="991"/>
-  </w:num>
-  <w:num w:numId="1012">
-    <w:abstractNumId w:val="991"/>
-  </w:num>
-  <w:num w:numId="1013">
-    <w:abstractNumId w:val="991"/>
-  </w:num>
-  <w:num w:numId="1014">
-    <w:abstractNumId w:val="99211"/>
+    <w:abstractNumId w:val="99411"/>
     <w:lvlOverride w:ilvl="0">
       <w:startOverride w:val="1"/>
     </w:lvlOverride>
@@ -7002,8 +8505,20 @@
       <w:startOverride w:val="1"/>
     </w:lvlOverride>
   </w:num>
+  <w:num w:numId="1011">
+    <w:abstractNumId w:val="991"/>
+  </w:num>
+  <w:num w:numId="1012">
+    <w:abstractNumId w:val="991"/>
+  </w:num>
+  <w:num w:numId="1013">
+    <w:abstractNumId w:val="991"/>
+  </w:num>
+  <w:num w:numId="1014">
+    <w:abstractNumId w:val="991"/>
+  </w:num>
   <w:num w:numId="1015">
-    <w:abstractNumId w:val="99211"/>
+    <w:abstractNumId w:val="99411"/>
     <w:lvlOverride w:ilvl="0">
       <w:startOverride w:val="1"/>
     </w:lvlOverride>
@@ -7032,6 +8547,45 @@
       <w:startOverride w:val="1"/>
     </w:lvlOverride>
   </w:num>
+  <w:num w:numId="1016">
+    <w:abstractNumId w:val="99411"/>
+    <w:lvlOverride w:ilvl="0">
+      <w:startOverride w:val="1"/>
+    </w:lvlOverride>
+    <w:lvlOverride w:ilvl="1">
+      <w:startOverride w:val="1"/>
+    </w:lvlOverride>
+    <w:lvlOverride w:ilvl="2">
+      <w:startOverride w:val="1"/>
+    </w:lvlOverride>
+    <w:lvlOverride w:ilvl="3">
+      <w:startOverride w:val="1"/>
+    </w:lvlOverride>
+    <w:lvlOverride w:ilvl="4">
+      <w:startOverride w:val="1"/>
+    </w:lvlOverride>
+    <w:lvlOverride w:ilvl="5">
+      <w:startOverride w:val="1"/>
+    </w:lvlOverride>
+    <w:lvlOverride w:ilvl="6">
+      <w:startOverride w:val="1"/>
+    </w:lvlOverride>
+    <w:lvlOverride w:ilvl="7">
+      <w:startOverride w:val="1"/>
+    </w:lvlOverride>
+    <w:lvlOverride w:ilvl="8">
+      <w:startOverride w:val="1"/>
+    </w:lvlOverride>
+  </w:num>
+  <w:num w:numId="1017">
+    <w:abstractNumId w:val="991"/>
+  </w:num>
+  <w:num w:numId="1018">
+    <w:abstractNumId w:val="991"/>
+  </w:num>
+  <w:num w:numId="1019">
+    <w:abstractNumId w:val="991"/>
+  </w:num>
 </w:numbering>
 </file>
 
@@ -7040,7 +8594,7 @@
   <w:docDefaults>
     <w:rPrDefault>
       <w:rPr>
-        <w:rFonts w:asciiTheme="minorHAnsi" w:hAnsiTheme="minorHAnsi" w:eastAsiaTheme="minorHAnsi" w:cstheme="minorBidi"/>
+        <w:rFonts w:asciiTheme="minorHAnsi" w:eastAsiaTheme="minorHAnsi" w:hAnsiTheme="minorHAnsi" w:cstheme="minorBidi"/>
         <w:sz w:val="24"/>
         <w:szCs w:val="24"/>
         <w:lang w:val="en-US" w:eastAsia="en-US" w:bidi="ar-SA"/>
@@ -7053,7 +8607,7 @@
     </w:pPrDefault>
   </w:docDefaults>
   <w:latentStyles w:defLockedState="0" w:defUIPriority="0" w:defSemiHidden="0" w:defUnhideWhenUsed="0" w:defQFormat="0" w:count="276"/>
-  <w:style w:type="paragraph" w:styleId="Normal" w:default="1">
+  <w:style w:type="paragraph" w:default="1" w:styleId="Normal">
     <w:name w:val="Normal"/>
     <w:qFormat/>
   </w:style>
@@ -7061,18 +8615,18 @@
     <w:name w:val="Body Text"/>
     <w:basedOn w:val="Normal"/>
     <w:link w:val="BodyTextChar"/>
-    <w:qFormat/>
     <w:pPr>
       <w:spacing w:before="180" w:after="180"/>
     </w:pPr>
+    <w:qFormat/>
   </w:style>
-  <w:style w:type="paragraph" w:styleId="FirstParagraph" w:customStyle="1">
+  <w:style w:type="paragraph" w:customStyle="1" w:styleId="FirstParagraph">
     <w:name w:val="First Paragraph"/>
     <w:basedOn w:val="BodyText"/>
     <w:next w:val="BodyText"/>
     <w:qFormat/>
   </w:style>
-  <w:style w:type="paragraph" w:styleId="Compact" w:customStyle="1">
+  <w:style w:type="paragraph" w:customStyle="1" w:styleId="Compact">
     <w:name w:val="Compact"/>
     <w:basedOn w:val="BodyText"/>
     <w:qFormat/>
@@ -7092,7 +8646,7 @@
       <w:jc w:val="center"/>
     </w:pPr>
     <w:rPr>
-      <w:rFonts w:asciiTheme="majorHAnsi" w:hAnsiTheme="majorHAnsi" w:eastAsiaTheme="majorEastAsia" w:cstheme="majorBidi"/>
+      <w:rFonts w:asciiTheme="majorHAnsi" w:eastAsiaTheme="majorEastAsia" w:hAnsiTheme="majorHAnsi" w:cstheme="majorBidi"/>
       <w:b/>
       <w:bCs/>
       <w:color w:val="345A8A" w:themeColor="accent1" w:themeShade="B5"/>
@@ -7116,7 +8670,7 @@
       <w:szCs w:val="30"/>
     </w:rPr>
   </w:style>
-  <w:style w:type="paragraph" w:styleId="Author" w:customStyle="1">
+  <w:style w:type="paragraph" w:customStyle="1" w:styleId="Author">
     <w:name w:val="Author"/>
     <w:next w:val="BodyText"/>
     <w:qFormat/>
@@ -7136,7 +8690,7 @@
       <w:jc w:val="center"/>
     </w:pPr>
   </w:style>
-  <w:style w:type="paragraph" w:styleId="Abstract" w:customStyle="1">
+  <w:style w:type="paragraph" w:customStyle="1" w:styleId="Abstract">
     <w:name w:val="Abstract"/>
     <w:basedOn w:val="Normal"/>
     <w:next w:val="BodyText"/>
@@ -7172,7 +8726,7 @@
       <w:outlineLvl w:val="0"/>
     </w:pPr>
     <w:rPr>
-      <w:rFonts w:asciiTheme="majorHAnsi" w:hAnsiTheme="majorHAnsi" w:eastAsiaTheme="majorEastAsia" w:cstheme="majorBidi"/>
+      <w:rFonts w:asciiTheme="majorHAnsi" w:eastAsiaTheme="majorEastAsia" w:hAnsiTheme="majorHAnsi" w:cstheme="majorBidi"/>
       <w:b/>
       <w:bCs/>
       <w:color w:val="4F81BD" w:themeColor="accent1"/>
@@ -7194,7 +8748,7 @@
       <w:outlineLvl w:val="1"/>
     </w:pPr>
     <w:rPr>
-      <w:rFonts w:asciiTheme="majorHAnsi" w:hAnsiTheme="majorHAnsi" w:eastAsiaTheme="majorEastAsia" w:cstheme="majorBidi"/>
+      <w:rFonts w:asciiTheme="majorHAnsi" w:eastAsiaTheme="majorEastAsia" w:hAnsiTheme="majorHAnsi" w:cstheme="majorBidi"/>
       <w:b/>
       <w:bCs/>
       <w:color w:val="4F81BD" w:themeColor="accent1"/>
@@ -7216,7 +8770,7 @@
       <w:outlineLvl w:val="2"/>
     </w:pPr>
     <w:rPr>
-      <w:rFonts w:asciiTheme="majorHAnsi" w:hAnsiTheme="majorHAnsi" w:eastAsiaTheme="majorEastAsia" w:cstheme="majorBidi"/>
+      <w:rFonts w:asciiTheme="majorHAnsi" w:eastAsiaTheme="majorEastAsia" w:hAnsiTheme="majorHAnsi" w:cstheme="majorBidi"/>
       <w:b/>
       <w:bCs/>
       <w:color w:val="4F81BD" w:themeColor="accent1"/>
@@ -7238,9 +8792,9 @@
       <w:outlineLvl w:val="3"/>
     </w:pPr>
     <w:rPr>
-      <w:rFonts w:asciiTheme="majorHAnsi" w:hAnsiTheme="majorHAnsi" w:eastAsiaTheme="majorEastAsia" w:cstheme="majorBidi"/>
+      <w:rFonts w:asciiTheme="majorHAnsi" w:eastAsiaTheme="majorEastAsia" w:hAnsiTheme="majorHAnsi" w:cstheme="majorBidi"/>
+      <w:i/>
       <w:bCs/>
-      <w:i/>
       <w:color w:val="4F81BD" w:themeColor="accent1"/>
       <w:sz w:val="24"/>
       <w:szCs w:val="24"/>
@@ -7260,7 +8814,7 @@
       <w:outlineLvl w:val="4"/>
     </w:pPr>
     <w:rPr>
-      <w:rFonts w:asciiTheme="majorHAnsi" w:hAnsiTheme="majorHAnsi" w:eastAsiaTheme="majorEastAsia" w:cstheme="majorBidi"/>
+      <w:rFonts w:asciiTheme="majorHAnsi" w:eastAsiaTheme="majorEastAsia" w:hAnsiTheme="majorHAnsi" w:cstheme="majorBidi"/>
       <w:iCs/>
       <w:color w:val="4F81BD" w:themeColor="accent1"/>
       <w:sz w:val="24"/>
@@ -7281,7 +8835,7 @@
       <w:outlineLvl w:val="5"/>
     </w:pPr>
     <w:rPr>
-      <w:rFonts w:asciiTheme="majorHAnsi" w:hAnsiTheme="majorHAnsi" w:eastAsiaTheme="majorEastAsia" w:cstheme="majorBidi"/>
+      <w:rFonts w:asciiTheme="majorHAnsi" w:eastAsiaTheme="majorEastAsia" w:hAnsiTheme="majorHAnsi" w:cstheme="majorBidi"/>
       <w:color w:val="4F81BD" w:themeColor="accent1"/>
       <w:sz w:val="24"/>
       <w:szCs w:val="24"/>
@@ -7301,7 +8855,7 @@
       <w:outlineLvl w:val="6"/>
     </w:pPr>
     <w:rPr>
-      <w:rFonts w:asciiTheme="majorHAnsi" w:hAnsiTheme="majorHAnsi" w:eastAsiaTheme="majorEastAsia" w:cstheme="majorBidi"/>
+      <w:rFonts w:asciiTheme="majorHAnsi" w:eastAsiaTheme="majorEastAsia" w:hAnsiTheme="majorHAnsi" w:cstheme="majorBidi"/>
       <w:color w:val="4F81BD" w:themeColor="accent1"/>
       <w:sz w:val="24"/>
       <w:szCs w:val="24"/>
@@ -7321,7 +8875,7 @@
       <w:outlineLvl w:val="7"/>
     </w:pPr>
     <w:rPr>
-      <w:rFonts w:asciiTheme="majorHAnsi" w:hAnsiTheme="majorHAnsi" w:eastAsiaTheme="majorEastAsia" w:cstheme="majorBidi"/>
+      <w:rFonts w:asciiTheme="majorHAnsi" w:eastAsiaTheme="majorEastAsia" w:hAnsiTheme="majorHAnsi" w:cstheme="majorBidi"/>
       <w:color w:val="4F81BD" w:themeColor="accent1"/>
       <w:sz w:val="24"/>
       <w:szCs w:val="24"/>
@@ -7341,7 +8895,7 @@
       <w:outlineLvl w:val="8"/>
     </w:pPr>
     <w:rPr>
-      <w:rFonts w:asciiTheme="majorHAnsi" w:hAnsiTheme="majorHAnsi" w:eastAsiaTheme="majorEastAsia" w:cstheme="majorBidi"/>
+      <w:rFonts w:asciiTheme="majorHAnsi" w:eastAsiaTheme="majorEastAsia" w:hAnsiTheme="majorHAnsi" w:cstheme="majorBidi"/>
       <w:color w:val="4F81BD" w:themeColor="accent1"/>
       <w:sz w:val="24"/>
       <w:szCs w:val="24"/>
@@ -7356,7 +8910,7 @@
     <w:qFormat/>
     <w:pPr>
       <w:spacing w:before="100" w:after="100"/>
-      <w:ind w:left="480" w:right="480" w:firstLine="0"/>
+      <w:ind w:firstLine="0" w:left="480" w:right="480"/>
     </w:pPr>
   </w:style>
   <w:style w:type="paragraph" w:styleId="FootnoteText">
@@ -7367,12 +8921,12 @@
     <w:unhideWhenUsed/>
     <w:qFormat/>
   </w:style>
-  <w:style w:type="character" w:styleId="DefaultParagraphFont" w:default="1">
+  <w:style w:type="character" w:default="1" w:styleId="DefaultParagraphFont">
     <w:name w:val="Default Paragraph Font"/>
     <w:semiHidden/>
     <w:unhideWhenUsed/>
   </w:style>
-  <w:style w:type="table" w:styleId="Table" w:default="1">
+  <w:style w:type="table" w:default="1" w:styleId="Table">
     <w:name w:val="Table"/>
     <w:basedOn w:val="TableNormal"/>
     <w:semiHidden/>
@@ -7388,7 +8942,7 @@
       </w:tblCellMar>
     </w:tblPr>
   </w:style>
-  <w:style w:type="paragraph" w:styleId="DefinitionTerm" w:customStyle="1">
+  <w:style w:type="paragraph" w:customStyle="1" w:styleId="DefinitionTerm">
     <w:name w:val="Definition Term"/>
     <w:basedOn w:val="Normal"/>
     <w:next w:val="Definition"/>
@@ -7401,7 +8955,7 @@
       <w:b/>
     </w:rPr>
   </w:style>
-  <w:style w:type="paragraph" w:styleId="Definition" w:customStyle="1">
+  <w:style w:type="paragraph" w:customStyle="1" w:styleId="Definition">
     <w:name w:val="Definition"/>
     <w:basedOn w:val="Normal"/>
   </w:style>
@@ -7416,34 +8970,34 @@
       <w:i/>
     </w:rPr>
   </w:style>
-  <w:style w:type="paragraph" w:styleId="TableCaption" w:customStyle="1">
+  <w:style w:type="paragraph" w:customStyle="1" w:styleId="TableCaption">
     <w:name w:val="Table Caption"/>
     <w:basedOn w:val="Caption"/>
     <w:pPr>
       <w:keepNext/>
     </w:pPr>
   </w:style>
-  <w:style w:type="paragraph" w:styleId="ImageCaption" w:customStyle="1">
+  <w:style w:type="paragraph" w:customStyle="1" w:styleId="ImageCaption">
     <w:name w:val="Image Caption"/>
     <w:basedOn w:val="Caption"/>
   </w:style>
-  <w:style w:type="paragraph" w:styleId="Figure" w:customStyle="1">
+  <w:style w:type="paragraph" w:customStyle="1" w:styleId="Figure">
     <w:name w:val="Figure"/>
     <w:basedOn w:val="Normal"/>
   </w:style>
-  <w:style w:type="paragraph" w:styleId="CaptionedFigure" w:customStyle="1">
+  <w:style w:type="paragraph" w:customStyle="1" w:styleId="CaptionedFigure">
     <w:name w:val="Captioned Figure"/>
     <w:basedOn w:val="Figure"/>
     <w:pPr>
       <w:keepNext/>
     </w:pPr>
   </w:style>
-  <w:style w:type="character" w:styleId="BodyTextChar" w:customStyle="1">
+  <w:style w:type="character" w:customStyle="1" w:styleId="BodyTextChar">
     <w:name w:val="Body Text Char"/>
     <w:basedOn w:val="DefaultParagraphFont"/>
     <w:link w:val="BodyText"/>
   </w:style>
-  <w:style w:type="character" w:styleId="VerbatimChar" w:customStyle="1">
+  <w:style w:type="character" w:customStyle="1" w:styleId="VerbatimChar">
     <w:name w:val="Verbatim Char"/>
     <w:basedOn w:val="BodyTextChar"/>
     <w:rPr>
@@ -7477,13 +9031,13 @@
       <w:outlineLvl w:val="9"/>
     </w:pPr>
     <w:rPr>
-      <w:rFonts w:asciiTheme="majorHAnsi" w:hAnsiTheme="majorHAnsi" w:eastAsiaTheme="majorEastAsia" w:cstheme="majorBidi"/>
+      <w:rFonts w:asciiTheme="majorHAnsi" w:eastAsiaTheme="majorEastAsia" w:hAnsiTheme="majorHAnsi" w:cstheme="majorBidi"/>
       <w:b w:val="0"/>
       <w:bCs w:val="0"/>
       <w:color w:val="365F91" w:themeColor="accent1" w:themeShade="BF"/>
     </w:rPr>
   </w:style>
-  <w:style w:type="paragraph" w:styleId="SourceCode" w:customStyle="1">
+  <w:style w:type="paragraph" w:customStyle="1" w:styleId="SourceCode">
     <w:name w:val="Source Code"/>
     <w:basedOn w:val="Normal"/>
     <w:link w:val="VerbatimChar"/>
@@ -7491,223 +9045,223 @@
       <w:wordWrap w:val="off"/>
     </w:pPr>
   </w:style>
-  <w:style w:type="character" w:styleId="KeywordTok" w:customStyle="1">
+  <w:style w:type="character" w:customStyle="1" w:styleId="KeywordTok">
     <w:name w:val="KeywordTok"/>
     <w:basedOn w:val="VerbatimChar"/>
     <w:rPr>
+      <w:color w:val="007020"/>
       <w:b/>
-      <w:color w:val="007020"/>
     </w:rPr>
   </w:style>
-  <w:style w:type="character" w:styleId="DataTypeTok" w:customStyle="1">
+  <w:style w:type="character" w:customStyle="1" w:styleId="DataTypeTok">
     <w:name w:val="DataTypeTok"/>
     <w:basedOn w:val="VerbatimChar"/>
     <w:rPr>
       <w:color w:val="902000"/>
     </w:rPr>
   </w:style>
-  <w:style w:type="character" w:styleId="DecValTok" w:customStyle="1">
+  <w:style w:type="character" w:customStyle="1" w:styleId="DecValTok">
     <w:name w:val="DecValTok"/>
     <w:basedOn w:val="VerbatimChar"/>
     <w:rPr>
       <w:color w:val="40a070"/>
     </w:rPr>
   </w:style>
-  <w:style w:type="character" w:styleId="BaseNTok" w:customStyle="1">
+  <w:style w:type="character" w:customStyle="1" w:styleId="BaseNTok">
     <w:name w:val="BaseNTok"/>
     <w:basedOn w:val="VerbatimChar"/>
     <w:rPr>
       <w:color w:val="40a070"/>
     </w:rPr>
   </w:style>
-  <w:style w:type="character" w:styleId="FloatTok" w:customStyle="1">
+  <w:style w:type="character" w:customStyle="1" w:styleId="FloatTok">
     <w:name w:val="FloatTok"/>
     <w:basedOn w:val="VerbatimChar"/>
     <w:rPr>
       <w:color w:val="40a070"/>
     </w:rPr>
   </w:style>
-  <w:style w:type="character" w:styleId="ConstantTok" w:customStyle="1">
+  <w:style w:type="character" w:customStyle="1" w:styleId="ConstantTok">
     <w:name w:val="ConstantTok"/>
     <w:basedOn w:val="VerbatimChar"/>
     <w:rPr>
       <w:color w:val="880000"/>
     </w:rPr>
   </w:style>
-  <w:style w:type="character" w:styleId="CharTok" w:customStyle="1">
+  <w:style w:type="character" w:customStyle="1" w:styleId="CharTok">
     <w:name w:val="CharTok"/>
     <w:basedOn w:val="VerbatimChar"/>
     <w:rPr>
       <w:color w:val="4070a0"/>
     </w:rPr>
   </w:style>
-  <w:style w:type="character" w:styleId="SpecialCharTok" w:customStyle="1">
+  <w:style w:type="character" w:customStyle="1" w:styleId="SpecialCharTok">
     <w:name w:val="SpecialCharTok"/>
     <w:basedOn w:val="VerbatimChar"/>
     <w:rPr>
       <w:color w:val="4070a0"/>
     </w:rPr>
   </w:style>
-  <w:style w:type="character" w:styleId="StringTok" w:customStyle="1">
+  <w:style w:type="character" w:customStyle="1" w:styleId="StringTok">
     <w:name w:val="StringTok"/>
     <w:basedOn w:val="VerbatimChar"/>
     <w:rPr>
       <w:color w:val="4070a0"/>
     </w:rPr>
   </w:style>
-  <w:style w:type="character" w:styleId="VerbatimStringTok" w:customStyle="1">
+  <w:style w:type="character" w:customStyle="1" w:styleId="VerbatimStringTok">
     <w:name w:val="VerbatimStringTok"/>
     <w:basedOn w:val="VerbatimChar"/>
     <w:rPr>
       <w:color w:val="4070a0"/>
     </w:rPr>
   </w:style>
-  <w:style w:type="character" w:styleId="SpecialStringTok" w:customStyle="1">
+  <w:style w:type="character" w:customStyle="1" w:styleId="SpecialStringTok">
     <w:name w:val="SpecialStringTok"/>
     <w:basedOn w:val="VerbatimChar"/>
     <w:rPr>
       <w:color w:val="bb6688"/>
     </w:rPr>
   </w:style>
-  <w:style w:type="character" w:styleId="ImportTok" w:customStyle="1">
+  <w:style w:type="character" w:customStyle="1" w:styleId="ImportTok">
     <w:name w:val="ImportTok"/>
     <w:basedOn w:val="VerbatimChar"/>
     <w:rPr/>
   </w:style>
-  <w:style w:type="character" w:styleId="CommentTok" w:customStyle="1">
+  <w:style w:type="character" w:customStyle="1" w:styleId="CommentTok">
     <w:name w:val="CommentTok"/>
     <w:basedOn w:val="VerbatimChar"/>
     <w:rPr>
+      <w:color w:val="60a0b0"/>
       <w:i/>
-      <w:color w:val="60a0b0"/>
     </w:rPr>
   </w:style>
-  <w:style w:type="character" w:styleId="DocumentationTok" w:customStyle="1">
+  <w:style w:type="character" w:customStyle="1" w:styleId="DocumentationTok">
     <w:name w:val="DocumentationTok"/>
     <w:basedOn w:val="VerbatimChar"/>
     <w:rPr>
+      <w:color w:val="ba2121"/>
       <w:i/>
-      <w:color w:val="ba2121"/>
     </w:rPr>
   </w:style>
-  <w:style w:type="character" w:styleId="AnnotationTok" w:customStyle="1">
+  <w:style w:type="character" w:customStyle="1" w:styleId="AnnotationTok">
     <w:name w:val="AnnotationTok"/>
     <w:basedOn w:val="VerbatimChar"/>
     <w:rPr>
+      <w:color w:val="60a0b0"/>
       <w:b/>
       <w:i/>
-      <w:color w:val="60a0b0"/>
     </w:rPr>
   </w:style>
-  <w:style w:type="character" w:styleId="CommentVarTok" w:customStyle="1">
+  <w:style w:type="character" w:customStyle="1" w:styleId="CommentVarTok">
     <w:name w:val="CommentVarTok"/>
     <w:basedOn w:val="VerbatimChar"/>
     <w:rPr>
+      <w:color w:val="60a0b0"/>
       <w:b/>
       <w:i/>
-      <w:color w:val="60a0b0"/>
     </w:rPr>
   </w:style>
-  <w:style w:type="character" w:styleId="OtherTok" w:customStyle="1">
+  <w:style w:type="character" w:customStyle="1" w:styleId="OtherTok">
     <w:name w:val="OtherTok"/>
     <w:basedOn w:val="VerbatimChar"/>
     <w:rPr>
       <w:color w:val="007020"/>
     </w:rPr>
   </w:style>
-  <w:style w:type="character" w:styleId="FunctionTok" w:customStyle="1">
+  <w:style w:type="character" w:customStyle="1" w:styleId="FunctionTok">
     <w:name w:val="FunctionTok"/>
     <w:basedOn w:val="VerbatimChar"/>
     <w:rPr>
       <w:color w:val="06287e"/>
     </w:rPr>
   </w:style>
-  <w:style w:type="character" w:styleId="VariableTok" w:customStyle="1">
+  <w:style w:type="character" w:customStyle="1" w:styleId="VariableTok">
     <w:name w:val="VariableTok"/>
     <w:basedOn w:val="VerbatimChar"/>
     <w:rPr>
       <w:color w:val="19177c"/>
     </w:rPr>
   </w:style>
-  <w:style w:type="character" w:styleId="ControlFlowTok" w:customStyle="1">
+  <w:style w:type="character" w:customStyle="1" w:styleId="ControlFlowTok">
     <w:name w:val="ControlFlowTok"/>
     <w:basedOn w:val="VerbatimChar"/>
     <w:rPr>
+      <w:color w:val="007020"/>
       <w:b/>
-      <w:color w:val="007020"/>
     </w:rPr>
   </w:style>
-  <w:style w:type="character" w:styleId="OperatorTok" w:customStyle="1">
+  <w:style w:type="character" w:customStyle="1" w:styleId="OperatorTok">
     <w:name w:val="OperatorTok"/>
     <w:basedOn w:val="VerbatimChar"/>
     <w:rPr>
       <w:color w:val="666666"/>
     </w:rPr>
   </w:style>
-  <w:style w:type="character" w:styleId="BuiltInTok" w:customStyle="1">
+  <w:style w:type="character" w:customStyle="1" w:styleId="BuiltInTok">
     <w:name w:val="BuiltInTok"/>
     <w:basedOn w:val="VerbatimChar"/>
     <w:rPr/>
   </w:style>
-  <w:style w:type="character" w:styleId="ExtensionTok" w:customStyle="1">
+  <w:style w:type="character" w:customStyle="1" w:styleId="ExtensionTok">
     <w:name w:val="ExtensionTok"/>
     <w:basedOn w:val="VerbatimChar"/>
     <w:rPr/>
   </w:style>
-  <w:style w:type="character" w:styleId="PreprocessorTok" w:customStyle="1">
+  <w:style w:type="character" w:customStyle="1" w:styleId="PreprocessorTok">
     <w:name w:val="PreprocessorTok"/>
     <w:basedOn w:val="VerbatimChar"/>
     <w:rPr>
       <w:color w:val="bc7a00"/>
     </w:rPr>
   </w:style>
-  <w:style w:type="character" w:styleId="AttributeTok" w:customStyle="1">
+  <w:style w:type="character" w:customStyle="1" w:styleId="AttributeTok">
     <w:name w:val="AttributeTok"/>
     <w:basedOn w:val="VerbatimChar"/>
     <w:rPr>
       <w:color w:val="7d9029"/>
     </w:rPr>
   </w:style>
-  <w:style w:type="character" w:styleId="RegionMarkerTok" w:customStyle="1">
+  <w:style w:type="character" w:customStyle="1" w:styleId="RegionMarkerTok">
     <w:name w:val="RegionMarkerTok"/>
     <w:basedOn w:val="VerbatimChar"/>
     <w:rPr/>
   </w:style>
-  <w:style w:type="character" w:styleId="InformationTok" w:customStyle="1">
+  <w:style w:type="character" w:customStyle="1" w:styleId="InformationTok">
     <w:name w:val="InformationTok"/>
     <w:basedOn w:val="VerbatimChar"/>
     <w:rPr>
+      <w:color w:val="60a0b0"/>
       <w:b/>
       <w:i/>
-      <w:color w:val="60a0b0"/>
     </w:rPr>
   </w:style>
-  <w:style w:type="character" w:styleId="WarningTok" w:customStyle="1">
+  <w:style w:type="character" w:customStyle="1" w:styleId="WarningTok">
     <w:name w:val="WarningTok"/>
     <w:basedOn w:val="VerbatimChar"/>
     <w:rPr>
+      <w:color w:val="60a0b0"/>
       <w:b/>
       <w:i/>
-      <w:color w:val="60a0b0"/>
     </w:rPr>
   </w:style>
-  <w:style w:type="character" w:styleId="AlertTok" w:customStyle="1">
+  <w:style w:type="character" w:customStyle="1" w:styleId="AlertTok">
     <w:name w:val="AlertTok"/>
     <w:basedOn w:val="VerbatimChar"/>
     <w:rPr>
+      <w:color w:val="ff0000"/>
       <w:b/>
-      <w:color w:val="ff0000"/>
     </w:rPr>
   </w:style>
-  <w:style w:type="character" w:styleId="ErrorTok" w:customStyle="1">
+  <w:style w:type="character" w:customStyle="1" w:styleId="ErrorTok">
     <w:name w:val="ErrorTok"/>
     <w:basedOn w:val="VerbatimChar"/>
     <w:rPr>
+      <w:color w:val="ff0000"/>
       <w:b/>
-      <w:color w:val="ff0000"/>
     </w:rPr>
   </w:style>
-  <w:style w:type="character" w:styleId="NormalTok" w:customStyle="1">
+  <w:style w:type="character" w:customStyle="1" w:styleId="NormalTok">
     <w:name w:val="NormalTok"/>
     <w:basedOn w:val="VerbatimChar"/>
     <w:rPr/>

</xml_diff>